<commit_message>
Spud offset: NOD pre-drill-else-main rule (decision 47); F-11 moves to Unresolved; Fig 4, registry, manuscript draft and reports updated
</commit_message>
<xml_diff>
--- a/manuscript/paper2_draft.docx
+++ b/manuscript/paper2_draft.docx
@@ -9305,7 +9305,16 @@
           <w:sz w:val="20"/>
           <w:szCs w:val="20"/>
         </w:rPr>
-        <w:t>Spud date was compared across three sources for every wellbore: the WITSML spud_date field, free-text spud language in the wellbore's earliest DDRs, and the NOD entry date. Table 4 summarises the outcome, and Fig. 4 plots the offset (WITSML spud date minus the NOD entry date closest to the first report; for some wellbores NOD records both a main and a pre-drill entry date) by category. The categories were assigned by inspection of the three sources for each wellbore; the rules below were formalised afterwards to describe those assignments, and they reproduce every assignment. Exact: the WITSML date is within one day of the NOD date, and the first report or free-text spud follows it by at most one day. Definitional offset: the WITSML date is within 8 days of the NOD date and the free-text operational start follows it by 2 to 20 days. WITSML data-entry error: the WITSML date differs from the first report or free-text spud by more than 30 days while the NOD date agrees with them within 3 days. Wellbore-identity conflation: the WITSML date is within 7 days of the first report but more than a year from the NOD date. Inherited: the sidetrack carries its parent's spud date. Two technical sidetracks share a NOD record with their parent leg by the depth matching of Section 3.5 (15/9-19 BT2 with 19 B); the sidetrack is left unresolved and the parent leg is classed as a definitional offset when it has no free-text spud date of its own. Everything else is unresolved.</w:t>
+        <w:t xml:space="preserve">Spud date was compared across three sources for every wellbore: the WITSML spud_date field, free-text spud language in the wellbore's earliest DDRs, and the NOD entry date. Table 4 summarises the outcome, and Fig. 4 plots the offset (WITSML spud date minus the NOD pre-drill entry date where NOD records one, since it marks the start of top-hole drilling, and otherwise the NOD main entry date) by category. The categories were first assigned by inspection of the three sources for each wellbore; the rules below were formalised afterwards to describe those assignments. Applied mechanically, they reproduce 25 of the 26 assignments: 15/9-F-11 was assigned Exact by inspection, but NOD records a pre-drill entry on 6 April 2012, 335 days before the WITSML spud date, so the rules leave it unresolved. Exact: the WITSML date is within one day of the NOD date, and the first report or free-text spud follows it by at most one day. Definitional offset: the WITSML date is within 8 days of the NOD date and the free-text operational start follows it by 2 to 20 days. WITSML data-entry error: the WITSML date differs from the first report or free-text spud by more than 30 days while the NOD date agrees with them within 3 days. Wellbore-identity conflation: the WITSML date is within 7 days of the first report but more than a year from the NOD date. Inherited: the sidetrack carries its parent's spud date. Two technical sidetracks share a NOD record with their parent leg by the depth matching of Section 3.5 (15/9-19 BT2 with 19 B); the sidetrack is left unresolved and the parent leg is classed as a definitional offset when it has no free-text spud date of its own. Everything else is unresolved. </w:t>
+      </w:r>
+      <w:r>
+        <w:rPr>
+          <w:rFonts w:ascii="Times New Roman" w:cs="Times New Roman" w:eastAsia="Times New Roman" w:hAnsi="Times New Roman"/>
+          <w:sz w:val="20"/>
+          <w:szCs w:val="20"/>
+          <w:highlight w:val="yellow"/>
+        </w:rPr>
+        <w:t>[TJ: 15/9-F-11 was assigned Exact by inspection and becomes Unresolved under the stated NOD date rule (decision 47); confirm which category the paper reports.]</w:t>
       </w:r>
     </w:p>
     <w:p>
@@ -9511,7 +9520,7 @@
                 <w:sz w:val="18"/>
                 <w:szCs w:val="18"/>
               </w:rPr>
-              <w:t xml:space="preserve">7</w:t>
+              <w:t>6</w:t>
             </w:r>
           </w:p>
         </w:tc>
@@ -9543,7 +9552,7 @@
                 <w:sz w:val="18"/>
                 <w:szCs w:val="18"/>
               </w:rPr>
-              <w:t>15/9-19 A, F-10, F-11, F-15 A, F-15 B, F-15 C, F-15 D</w:t>
+              <w:t>15/9-19 A, F-10, F-15 A, F-15 B, F-15 C, F-15 D</w:t>
             </w:r>
           </w:p>
         </w:tc>
@@ -10021,7 +10030,7 @@
                 <w:sz w:val="18"/>
                 <w:szCs w:val="18"/>
               </w:rPr>
-              <w:t xml:space="preserve">4</w:t>
+              <w:t>5</w:t>
             </w:r>
           </w:p>
         </w:tc>
@@ -10053,7 +10062,7 @@
                 <w:sz w:val="18"/>
                 <w:szCs w:val="18"/>
               </w:rPr>
-              <w:t>15/9-19 BT2, 19 S, 19 ST2, F-9</w:t>
+              <w:t>15/9-19 BT2, 19 S, 19 ST2, F-9, F-11</w:t>
             </w:r>
           </w:p>
         </w:tc>
@@ -22972,7 +22981,7 @@
           <w:sz w:val="20"/>
           <w:szCs w:val="20"/>
         </w:rPr>
-        <w:t>Fig. 4: Spud date offset (WITSML spud date minus the NOD entry date closest to the first report) for 25 wellbores, coloured by validation category. 15/9-F-11 T2 is excluded because NOD does not register it separately.</w:t>
+        <w:t>Fig. 4: Spud date offset (WITSML spud date minus the NOD pre-drill entry date where recorded, otherwise the NOD main entry date) for 25 wellbores, coloured by validation category. 15/9-F-11 T2 is excluded because NOD does not register it separately.</w:t>
       </w:r>
     </w:p>
     <w:p>

</xml_diff>

<commit_message>
F-11 spud stays Unresolved (decision 48); pre-drill first-report sentence in Section 5.5; F-11 open note removed; registry 227 entries
Co-Authored-By: Claude Sonnet 5.5 <noreply@anthropic.com>
</commit_message>
<xml_diff>
--- a/manuscript/paper2_draft.docx
+++ b/manuscript/paper2_draft.docx
@@ -9305,16 +9305,7 @@
           <w:sz w:val="20"/>
           <w:szCs w:val="20"/>
         </w:rPr>
-        <w:t xml:space="preserve">Spud date was compared across three sources for every wellbore: the WITSML spud_date field, free-text spud language in the wellbore's earliest DDRs, and the NOD entry date. Table 4 summarises the outcome, and Fig. 4 plots the offset (WITSML spud date minus the NOD pre-drill entry date where NOD records one, since it marks the start of top-hole drilling, and otherwise the NOD main entry date) by category. The categories were first assigned by inspection of the three sources for each wellbore; the rules below were formalised afterwards to describe those assignments. Applied mechanically, they reproduce 25 of the 26 assignments: 15/9-F-11 was assigned Exact by inspection, but NOD records a pre-drill entry on 6 April 2012, 335 days before the WITSML spud date, so the rules leave it unresolved. Exact: the WITSML date is within one day of the NOD date, and the first report or free-text spud follows it by at most one day. Definitional offset: the WITSML date is within 8 days of the NOD date and the free-text operational start follows it by 2 to 20 days. WITSML data-entry error: the WITSML date differs from the first report or free-text spud by more than 30 days while the NOD date agrees with them within 3 days. Wellbore-identity conflation: the WITSML date is within 7 days of the first report but more than a year from the NOD date. Inherited: the sidetrack carries its parent's spud date. Two technical sidetracks share a NOD record with their parent leg by the depth matching of Section 3.5 (15/9-19 BT2 with 19 B); the sidetrack is left unresolved and the parent leg is classed as a definitional offset when it has no free-text spud date of its own. Everything else is unresolved. </w:t>
-      </w:r>
-      <w:r>
-        <w:rPr>
-          <w:rFonts w:ascii="Times New Roman" w:cs="Times New Roman" w:eastAsia="Times New Roman" w:hAnsi="Times New Roman"/>
-          <w:sz w:val="20"/>
-          <w:szCs w:val="20"/>
-          <w:highlight w:val="yellow"/>
-        </w:rPr>
-        <w:t>[TJ: 15/9-F-11 was assigned Exact by inspection and becomes Unresolved under the stated NOD date rule (decision 47); confirm which category the paper reports.]</w:t>
+        <w:t>Spud date was compared across three sources for every wellbore: the WITSML spud_date field, free-text spud language in the wellbore's earliest DDRs, and the NOD entry date. Table 4 summarises the outcome, and Fig. 4 plots the offset (WITSML spud date minus the NOD pre-drill entry date where NOD records one, since it marks the start of top-hole drilling, and otherwise the NOD main entry date) by category. The categories were first assigned by inspection of the three sources for each wellbore; the rules below were formalised afterwards to describe those assignments. For the four other wellbores with NOD pre-drill dates (15/9-F-4, F-5, F-14 and F-15), the first report in the archive coincides with the pre-drill entry date (the same day, or one day later for F-4), which supports using the pre-drill date as the spud reference. Applied mechanically, the rules reproduce 25 of the 26 assignments. 15/9-F-11 was assigned Exact by inspection but is unresolved under the rule: NOD records a pre-drill campaign (6 to 17 April 2012) that is absent from the DDR archive; the archive's 2013 reports describe a fresh spud from seabed, including the 30-inch conductor, so the relationship between the two campaigns cannot be determined from these records. Exact: the WITSML date is within one day of the NOD date, and the first report or free-text spud follows it by at most one day. Definitional offset: the WITSML date is within 8 days of the NOD date and the free-text operational start follows it by 2 to 20 days. WITSML data-entry error: the WITSML date differs from the first report or free-text spud by more than 30 days while the NOD date agrees with them within 3 days. Wellbore-identity conflation: the WITSML date is within 7 days of the first report but more than a year from the NOD date. Inherited: the sidetrack carries its parent's spud date. Two technical sidetracks share a NOD record with their parent leg by the depth matching of Section 3.5 (15/9-19 BT2 with 19 B); the sidetrack is left unresolved and the parent leg is classed as a definitional offset when it has no free-text spud date of its own. Everything else is unresolved.</w:t>
       </w:r>
     </w:p>
     <w:p>
@@ -10062,7 +10053,7 @@
                 <w:sz w:val="18"/>
                 <w:szCs w:val="18"/>
               </w:rPr>
-              <w:t>15/9-19 BT2, 19 S, 19 ST2, F-9, F-11</w:t>
+              <w:t>15/9-19 BT2, 19 S, 19 ST2, F-9, F-11 (NOD records a pre-drill campaign, 6 to 17 April 2012, that is absent from the DDR archive; the 2013 reports describe a fresh spud from seabed, so the relationship between the campaigns cannot be determined from these records)</w:t>
             </w:r>
           </w:p>
         </w:tc>
@@ -23012,7 +23003,7 @@
           <w:sz w:val="20"/>
           <w:szCs w:val="20"/>
         </w:rPr>
-        <w:t>Every quantitative figure in this paper traces to an entry in the numbers registry published in the repository (225 entries, each with the producing script and function, the SHA-256 of its input files and an execution timestamp). The audit estimates in Section 5.2 are derived arithmetically from registry entries, and the arithmetic is shown in the text.</w:t>
+        <w:t>Every quantitative figure in this paper traces to an entry in the numbers registry published in the repository (227 entries, each with the producing script and function, the SHA-256 of its input files and an execution timestamp). The audit estimates in Section 5.2 are derived arithmetically from registry entries, and the arithmetic is shown in the text.</w:t>
       </w:r>
     </w:p>
     <w:sectPr>

</xml_diff>

<commit_message>
Review fixes to Stage 12 draft: figures, F-1 category, phase labels, Table 4 Rule column, Fig 2 report-count axis, registry 232 entries
Co-Authored-By: Claude Sonnet 5.5 <noreply@anthropic.com>
</commit_message>
<xml_diff>
--- a/manuscript/paper2_draft.docx
+++ b/manuscript/paper2_draft.docx
@@ -136,7 +136,7 @@
           <w:sz w:val="20"/>
           <w:szCs w:val="20"/>
         </w:rPr>
-        <w:t>Of 24 wellbores with a defensible NOD counterpart, 22 agree exactly on total depth. 15/9-F-15 differs by 15 m, and 15/9-19 S differs by 227 m because the archive does not cover that wellbore's final drilling. All three naming mismatches between the two registers follow the Norwegian designation convention for technical sidetracks. Spud date comparison identified four WITSML data-entry errors, eight definitional offsets, and one wellbore-identity conflation. The archive also stores placeholder values in 515 fields (331 depth sentinels, 7 zero depths, 176 literal "None" strings and one date sentinel) that a simple null test does not detect.</w:t>
+        <w:t>Of 24 wellbores with a defensible NOD counterpart, 22 agree exactly on total depth. 15/9-F-15 differs by 15 m, and 15/9-19 S differs by 227 m because the archive does not cover that wellbore's final drilling. All three naming mismatches between the two registers follow the Norwegian designation convention for technical sidetracks. Spud date comparison identified four WITSML data-entry errors, eight definitional offsets, and one NOD entry date that marks a later drilling campaign. The archive also stores placeholder values in 515 fields (331 depth sentinels, 7 zero depths, 176 literal "None" strings and one date sentinel) that a simple null test does not detect.</w:t>
       </w:r>
     </w:p>
     <w:p>
@@ -150,7 +150,7 @@
           <w:sz w:val="20"/>
           <w:szCs w:val="20"/>
         </w:rPr>
-        <w:t xml:space="preserve">Sidetrack kick-off depths were recovered for all 15 sidetracks by one rule, and the four wellbores of the 15/9-F-1 family share their hole above </w:t>
+        <w:t>Sidetrack kick-off depths were recovered for all 15 sidetracks by one rule; where NOD records a kick-off point (</w:t>
       </w:r>
       <w:r>
         <w:rPr>
@@ -159,7 +159,7 @@
           <w:szCs w:val="20"/>
           <w:highlight w:val="yellow"/>
         </w:rPr>
-        <w:t>1,364 m</w:t>
+        <w:t>12</w:t>
       </w:r>
       <w:r>
         <w:rPr>
@@ -167,7 +167,24 @@
           <w:sz w:val="20"/>
           <w:szCs w:val="20"/>
         </w:rPr>
-        <w:t xml:space="preserve"> MD. The output is an open depth-time-phase dataset of 1,421 records, with per-wellbore durations to total depth, published with the classifier code. It supports days-versus-depth benchmarking and records-based screening of legacy wellbores, and the method transfers to other WITSML 1.4.0.0 archives.</w:t>
+        <w:t xml:space="preserve"> of 15), the recovered depth agrees within 10 m for </w:t>
+      </w:r>
+      <w:r>
+        <w:rPr>
+          <w:rFonts w:ascii="Times New Roman" w:cs="Times New Roman" w:eastAsia="Times New Roman" w:hAnsi="Times New Roman"/>
+          <w:sz w:val="20"/>
+          <w:szCs w:val="20"/>
+          <w:highlight w:val="yellow"/>
+        </w:rPr>
+        <w:t>10</w:t>
+      </w:r>
+      <w:r>
+        <w:rPr>
+          <w:rFonts w:ascii="Times New Roman" w:cs="Times New Roman" w:eastAsia="Times New Roman" w:hAnsi="Times New Roman"/>
+          <w:sz w:val="20"/>
+          <w:szCs w:val="20"/>
+        </w:rPr>
+        <w:t>. The output is an open depth-time-phase dataset of 1,421 records, with per-wellbore durations to total depth, published with the classifier code. It supports days-versus-depth benchmarking and records-based screening of legacy wellbores, and the method transfers to other WITSML 1.4-series drillReport archives.</w:t>
       </w:r>
     </w:p>
     <w:p>
@@ -429,7 +446,7 @@
           <w:sz w:val="20"/>
           <w:szCs w:val="20"/>
         </w:rPr>
-        <w:t>Each DDR's sum24Hr narrative is classified into one of 13 phases: Spud/Conductor, Surface casing, Intermediate drilling, Intermediate casing, Reservoir drilling, Liner/Casing run, Cementing, Completion, P&amp;A, Logging/Testing, Workover, Waiting/Downtime, and Rig move/Setup. A narrative that matches no pattern is left Unclassified. Each phase carries a fixed priority from 1 (highest) to 13 (lowest) and a set of case-insensitive regular expressions, and a DDR is assigned to the highest-priority phase with any matching pattern. Before matching, vulgar-fraction characters (½, ¼, ¾, ⅛) are replaced with ASCII equivalents, because drilling reports frequently express hole and casing sizes with these glyphs. The priority order is the order listed above. Hole and casing size separate the drilling phases: 36 in. hole and 30 in. conductor (Spud/Conductor), 26 in. hole and 20 in. casing (Surface casing), 17½ in. hole (Intermediate drilling), 13⅜, 10¾ and 14 in. casing (Intermediate casing), 12¼, 8½ and 6 in. hole and coring (Reservoir drilling), and 9⅝ and 7 in. liner or casing (Liner/Casing run); the remaining phases are matched on keywords alone. Every regular expression is listed in the repository file src/classifier_v3.py.</w:t>
+        <w:t>Each DDR's sum24Hr narrative is classified into one of 13 phases: Spud/Conductor, Surface hole and casing, Intermediate drilling, Intermediate casing, 12¼ in. and smaller hole, Liner/Casing run, Cementing, Completion, P&amp;A, Logging/Testing, Workover, Waiting/Downtime, and Rig move/Setup. A narrative that matches no pattern is left Unclassified. Each phase carries a fixed priority from 1 (highest) to 13 (lowest) and a set of case-insensitive regular expressions, and a DDR is assigned to the highest-priority phase with any matching pattern. Before matching, vulgar-fraction characters (½, ¼, ¾, ⅛) are replaced with ASCII equivalents, because drilling reports frequently express hole and casing sizes with these glyphs. The priority order is the order listed above. Hole and casing size separate the drilling phases: 36 in. hole and 30 in. conductor (Spud/Conductor), 26 in. hole and 20 in. casing (Surface hole and casing), 17½ in. hole (Intermediate drilling), 13⅜, 10¾ and 14 in. casing (Intermediate casing), 12¼, 8½ and 6 in. hole and coring (12¼ in. and smaller hole), and 9⅝ and 7 in. liner or casing (Liner/Casing run); the remaining phases are matched on keywords alone. Phase names describe the hole and casing sizes each pattern group matches; on Volve platform wells the 12¼ in. hole is usually the section above the reservoir. Every regular expression is listed in the repository file src/classifier_v3.py.</w:t>
       </w:r>
     </w:p>
     <w:p>
@@ -2399,7 +2416,7 @@
                 <w:sz w:val="18"/>
                 <w:szCs w:val="18"/>
               </w:rPr>
-              <w:t xml:space="preserve">Reservoir drilling</w:t>
+              <w:t>12¼ in. and smaller hole</w:t>
             </w:r>
           </w:p>
         </w:tc>
@@ -3215,7 +3232,7 @@
                 <w:sz w:val="18"/>
                 <w:szCs w:val="18"/>
               </w:rPr>
-              <w:t xml:space="preserve">Surface casing</w:t>
+              <w:t>Surface hole and casing</w:t>
             </w:r>
           </w:p>
         </w:tc>
@@ -3993,7 +4010,7 @@
           <w:sz w:val="20"/>
           <w:szCs w:val="20"/>
         </w:rPr>
-        <w:t>The timeline dataset contains one row per DDR with a genuine md_m value. Of 1,759 DDRs, 331 carry the sentinel and 7 the zero value, giving 1,759 − 331 − 7 = 1,421 rows; recomputing the dataset from the raw XML gave the same 1,421 rows as the earlier analysis, identical in every column. Each row carries wellbore identifier, report date, days from the wellbore's first report with a recorded depth, measured depth, assigned phase, and source filename. Days are therefore counted from each wellbore's first row with a usable depth, not from its first DDR. Fig. 2 plots days from the first report with recorded depth against measured depth for all 26 wellbores.</w:t>
+        <w:t>The timeline dataset contains one row per DDR with a genuine md_m value. Of 1,759 DDRs, 331 carry the sentinel and 7 the zero value, giving 1,759 − 331 − 7 = 1,421 rows; recomputing the dataset from the raw XML gave the same 1,421 rows as the earlier analysis, identical in every column. Each row carries wellbore identifier, report date, days from the wellbore's first report with a recorded depth, measured depth, assigned phase, and source filename. Days are therefore counted from each wellbore's first row with a usable depth, not from its first DDR. Fig. 2 plots report number against measured depth for all 26 wellbores. The report number counts every DDR of a wellbore, with or without a recorded depth, and is 1 for the wellbore's first report with a recorded depth; it is the unit of the reports to TD in Table 6, which starts at the wellbore's first report whether or not that report carries a depth.</w:t>
       </w:r>
     </w:p>
     <w:p>
@@ -9305,7 +9322,7 @@
           <w:sz w:val="20"/>
           <w:szCs w:val="20"/>
         </w:rPr>
-        <w:t>Spud date was compared across three sources for every wellbore: the WITSML spud_date field, free-text spud language in the wellbore's earliest DDRs, and the NOD entry date. Table 4 summarises the outcome, and Fig. 4 plots the offset (WITSML spud date minus the NOD pre-drill entry date where NOD records one, since it marks the start of top-hole drilling, and otherwise the NOD main entry date) by category. The categories were first assigned by inspection of the three sources for each wellbore; the rules below were formalised afterwards to describe those assignments. For the four other wellbores with NOD pre-drill dates (15/9-F-4, F-5, F-14 and F-15), the first report in the archive coincides with the pre-drill entry date (the same day, or one day later for F-4), which supports using the pre-drill date as the spud reference. Applied mechanically, the rules reproduce 25 of the 26 assignments. 15/9-F-11 was assigned Exact by inspection but is unresolved under the rule: NOD records a pre-drill campaign (6 to 17 April 2012) that is absent from the DDR archive; the archive's 2013 reports describe a fresh spud from seabed, including the 30-inch conductor, so the relationship between the two campaigns cannot be determined from these records. Exact: the WITSML date is within one day of the NOD date, and the first report or free-text spud follows it by at most one day. Definitional offset: the WITSML date is within 8 days of the NOD date and the free-text operational start follows it by 2 to 20 days. WITSML data-entry error: the WITSML date differs from the first report or free-text spud by more than 30 days while the NOD date agrees with them within 3 days. Wellbore-identity conflation: the WITSML date is within 7 days of the first report but more than a year from the NOD date. Inherited: the sidetrack carries its parent's spud date. Two technical sidetracks share a NOD record with their parent leg by the depth matching of Section 3.5 (15/9-19 BT2 with 19 B); the sidetrack is left unresolved and the parent leg is classed as a definitional offset when it has no free-text spud date of its own. Everything else is unresolved.</w:t>
+        <w:t>Spud date was compared across three sources for every wellbore: the WITSML spud_date field, free-text spud language in the wellbore's earliest DDRs, and the NOD entry date. Table 4 summarises the outcome, and Fig. 4 plots the offset by category. The offset is the WITSML spud date minus the NOD pre-drill entry date where NOD records one, since it marks the start of top-hole drilling, and otherwise the NOD main entry date. For the four wellbores whose archive contains the NOD pre-drill entry (15/9-F-4, F-5, F-14 and F-15), the first report coincides with that date (the same day, or one day later for F-4), which supports using the pre-drill date as the spud reference. The categories were assigned by inspection of the three sources for each wellbore, and the rules in the Rule column of Table 4 were formalised afterwards to describe those assignments. Applied mechanically, the rules reproduce 25 of the 26 assignments. 15/9-F-11 was assigned Exact by inspection but is unresolved under the rule: NOD records a pre-drill campaign (6 to 17 April 2012) that is absent from the DDR archive; the archive's 2013 reports describe a fresh spud from seabed, including the 30-inch conductor, so the relationship between the two campaigns cannot be determined from these records.</w:t>
       </w:r>
     </w:p>
     <w:p>
@@ -9337,9 +9354,10 @@
         </w:tblBorders>
       </w:tblPr>
       <w:tblGrid>
-        <w:gridCol w:w="3300"/>
-        <w:gridCol w:w="1200"/>
-        <w:gridCol w:w="4860"/>
+        <w:gridCol w:w="1700"/>
+        <w:gridCol w:w="800"/>
+        <w:gridCol w:w="3900"/>
+        <w:gridCol w:w="2960"/>
       </w:tblGrid>
       <w:tr>
         <w:trPr>
@@ -9348,7 +9366,7 @@
         </w:trPr>
         <w:tc>
           <w:tcPr>
-            <w:tcW w:type="dxa" w:w="3300"/>
+            <w:tcW w:type="dxa" w:w="1700"/>
             <w:tcBorders>
               <w:top w:val="single" w:color="808080" w:sz="4"/>
               <w:left w:val="single" w:color="808080" w:sz="4"/>
@@ -9381,7 +9399,7 @@
         </w:tc>
         <w:tc>
           <w:tcPr>
-            <w:tcW w:type="dxa" w:w="1200"/>
+            <w:tcW w:type="dxa" w:w="800"/>
             <w:tcBorders>
               <w:top w:val="single" w:color="808080" w:sz="4"/>
               <w:left w:val="single" w:color="808080" w:sz="4"/>
@@ -9414,7 +9432,40 @@
         </w:tc>
         <w:tc>
           <w:tcPr>
-            <w:tcW w:type="dxa" w:w="4860"/>
+            <w:tcW w:type="dxa" w:w="3900"/>
+            <w:tcBorders>
+              <w:top w:val="single" w:color="808080" w:sz="4"/>
+              <w:left w:val="single" w:color="808080" w:sz="4"/>
+              <w:bottom w:val="single" w:color="808080" w:sz="4"/>
+              <w:right w:val="single" w:color="808080" w:sz="4"/>
+            </w:tcBorders>
+            <w:shd w:fill="E7E6E6" w:color="auto" w:val="clear"/>
+            <w:tcMar>
+              <w:top w:type="dxa" w:w="40"/>
+              <w:left w:type="dxa" w:w="80"/>
+              <w:bottom w:type="dxa" w:w="40"/>
+              <w:right w:type="dxa" w:w="80"/>
+            </w:tcMar>
+          </w:tcPr>
+          <w:p>
+            <w:pPr>
+              <w:jc w:val="left"/>
+            </w:pPr>
+            <w:r>
+              <w:rPr>
+                <w:rFonts w:ascii="Times New Roman" w:cs="Times New Roman" w:eastAsia="Times New Roman" w:hAnsi="Times New Roman"/>
+                <w:b/>
+                <w:bCs/>
+                <w:sz w:val="18"/>
+                <w:szCs w:val="18"/>
+              </w:rPr>
+              <w:t xml:space="preserve">Rule</w:t>
+            </w:r>
+          </w:p>
+        </w:tc>
+        <w:tc>
+          <w:tcPr>
+            <w:tcW w:type="dxa" w:w="2960"/>
             <w:tcBorders>
               <w:top w:val="single" w:color="808080" w:sz="4"/>
               <w:left w:val="single" w:color="808080" w:sz="4"/>
@@ -9449,33 +9500,30 @@
       <w:tr>
         <w:trPr>
           <w:cantSplit/>
-          <w:tblHeader w:val="off"/>
         </w:trPr>
         <w:tc>
           <w:tcPr>
-            <w:tcW w:type="dxa" w:w="3300"/>
-            <w:tcBorders>
-              <w:top w:val="single" w:color="808080" w:sz="4"/>
-              <w:left w:val="single" w:color="808080" w:sz="4"/>
-              <w:bottom w:val="single" w:color="808080" w:sz="4"/>
-              <w:right w:val="single" w:color="808080" w:sz="4"/>
-            </w:tcBorders>
-            <w:tcMar>
-              <w:top w:type="dxa" w:w="40"/>
-              <w:left w:type="dxa" w:w="80"/>
-              <w:bottom w:type="dxa" w:w="40"/>
-              <w:right w:type="dxa" w:w="80"/>
-            </w:tcMar>
-          </w:tcPr>
-          <w:p>
-            <w:pPr>
-              <w:jc w:val="left"/>
-            </w:pPr>
-            <w:r>
-              <w:rPr>
-                <w:rFonts w:ascii="Times New Roman" w:cs="Times New Roman" w:eastAsia="Times New Roman" w:hAnsi="Times New Roman"/>
-                <w:b w:val="false"/>
-                <w:bCs w:val="false"/>
+            <w:tcW w:type="dxa" w:w="1700"/>
+            <w:tcBorders>
+              <w:top w:val="single" w:color="808080" w:sz="4"/>
+              <w:left w:val="single" w:color="808080" w:sz="4"/>
+              <w:bottom w:val="single" w:color="808080" w:sz="4"/>
+              <w:right w:val="single" w:color="808080" w:sz="4"/>
+            </w:tcBorders>
+            <w:tcMar>
+              <w:top w:type="dxa" w:w="40"/>
+              <w:left w:type="dxa" w:w="80"/>
+              <w:bottom w:type="dxa" w:w="40"/>
+              <w:right w:type="dxa" w:w="80"/>
+            </w:tcMar>
+          </w:tcPr>
+          <w:p>
+            <w:pPr>
+              <w:jc w:val="left"/>
+            </w:pPr>
+            <w:r>
+              <w:rPr>
+                <w:rFonts w:ascii="Times New Roman" w:cs="Times New Roman" w:eastAsia="Times New Roman" w:hAnsi="Times New Roman"/>
                 <w:sz w:val="18"/>
                 <w:szCs w:val="18"/>
               </w:rPr>
@@ -9485,65 +9533,91 @@
         </w:tc>
         <w:tc>
           <w:tcPr>
-            <w:tcW w:type="dxa" w:w="1200"/>
-            <w:tcBorders>
-              <w:top w:val="single" w:color="808080" w:sz="4"/>
-              <w:left w:val="single" w:color="808080" w:sz="4"/>
-              <w:bottom w:val="single" w:color="808080" w:sz="4"/>
-              <w:right w:val="single" w:color="808080" w:sz="4"/>
-            </w:tcBorders>
-            <w:tcMar>
-              <w:top w:type="dxa" w:w="40"/>
-              <w:left w:type="dxa" w:w="80"/>
-              <w:bottom w:type="dxa" w:w="40"/>
-              <w:right w:type="dxa" w:w="80"/>
-            </w:tcMar>
-          </w:tcPr>
-          <w:p>
-            <w:pPr>
-              <w:jc w:val="left"/>
-            </w:pPr>
-            <w:r>
-              <w:rPr>
-                <w:rFonts w:ascii="Times New Roman" w:cs="Times New Roman" w:eastAsia="Times New Roman" w:hAnsi="Times New Roman"/>
-                <w:b w:val="false"/>
-                <w:bCs w:val="false"/>
-                <w:sz w:val="18"/>
-                <w:szCs w:val="18"/>
-              </w:rPr>
-              <w:t>6</w:t>
-            </w:r>
-          </w:p>
-        </w:tc>
-        <w:tc>
-          <w:tcPr>
-            <w:tcW w:type="dxa" w:w="4860"/>
-            <w:tcBorders>
-              <w:top w:val="single" w:color="808080" w:sz="4"/>
-              <w:left w:val="single" w:color="808080" w:sz="4"/>
-              <w:bottom w:val="single" w:color="808080" w:sz="4"/>
-              <w:right w:val="single" w:color="808080" w:sz="4"/>
-            </w:tcBorders>
-            <w:tcMar>
-              <w:top w:type="dxa" w:w="40"/>
-              <w:left w:type="dxa" w:w="80"/>
-              <w:bottom w:type="dxa" w:w="40"/>
-              <w:right w:type="dxa" w:w="80"/>
-            </w:tcMar>
-          </w:tcPr>
-          <w:p>
-            <w:pPr>
-              <w:jc w:val="left"/>
-            </w:pPr>
-            <w:r>
-              <w:rPr>
-                <w:rFonts w:ascii="Times New Roman" w:cs="Times New Roman" w:eastAsia="Times New Roman" w:hAnsi="Times New Roman"/>
-                <w:b/>
-                <w:bCs/>
-                <w:sz w:val="18"/>
-                <w:szCs w:val="18"/>
-              </w:rPr>
-              <w:t>15/9-19 A, F-10, F-15 A, F-15 B, F-15 C, F-15 D</w:t>
+            <w:tcW w:type="dxa" w:w="800"/>
+            <w:tcBorders>
+              <w:top w:val="single" w:color="808080" w:sz="4"/>
+              <w:left w:val="single" w:color="808080" w:sz="4"/>
+              <w:bottom w:val="single" w:color="808080" w:sz="4"/>
+              <w:right w:val="single" w:color="808080" w:sz="4"/>
+            </w:tcBorders>
+            <w:tcMar>
+              <w:top w:type="dxa" w:w="40"/>
+              <w:left w:type="dxa" w:w="80"/>
+              <w:bottom w:type="dxa" w:w="40"/>
+              <w:right w:type="dxa" w:w="80"/>
+            </w:tcMar>
+          </w:tcPr>
+          <w:p>
+            <w:pPr>
+              <w:jc w:val="left"/>
+            </w:pPr>
+            <w:r>
+              <w:rPr>
+                <w:rFonts w:ascii="Times New Roman" w:cs="Times New Roman" w:eastAsia="Times New Roman" w:hAnsi="Times New Roman"/>
+                <w:sz w:val="18"/>
+                <w:szCs w:val="18"/>
+              </w:rPr>
+              <w:t xml:space="preserve">6</w:t>
+            </w:r>
+          </w:p>
+        </w:tc>
+        <w:tc>
+          <w:tcPr>
+            <w:tcW w:type="dxa" w:w="3900"/>
+            <w:tcBorders>
+              <w:top w:val="single" w:color="808080" w:sz="4"/>
+              <w:left w:val="single" w:color="808080" w:sz="4"/>
+              <w:bottom w:val="single" w:color="808080" w:sz="4"/>
+              <w:right w:val="single" w:color="808080" w:sz="4"/>
+            </w:tcBorders>
+            <w:tcMar>
+              <w:top w:type="dxa" w:w="40"/>
+              <w:left w:type="dxa" w:w="80"/>
+              <w:bottom w:type="dxa" w:w="40"/>
+              <w:right w:type="dxa" w:w="80"/>
+            </w:tcMar>
+          </w:tcPr>
+          <w:p>
+            <w:pPr>
+              <w:jc w:val="left"/>
+            </w:pPr>
+            <w:r>
+              <w:rPr>
+                <w:rFonts w:ascii="Times New Roman" w:cs="Times New Roman" w:eastAsia="Times New Roman" w:hAnsi="Times New Roman"/>
+                <w:sz w:val="18"/>
+                <w:szCs w:val="18"/>
+              </w:rPr>
+              <w:t xml:space="preserve">R4: WITSML date within 1 day of the NOD date, and the first report or free-text spud follows it by at most 1 day.</w:t>
+            </w:r>
+          </w:p>
+        </w:tc>
+        <w:tc>
+          <w:tcPr>
+            <w:tcW w:type="dxa" w:w="2960"/>
+            <w:tcBorders>
+              <w:top w:val="single" w:color="808080" w:sz="4"/>
+              <w:left w:val="single" w:color="808080" w:sz="4"/>
+              <w:bottom w:val="single" w:color="808080" w:sz="4"/>
+              <w:right w:val="single" w:color="808080" w:sz="4"/>
+            </w:tcBorders>
+            <w:tcMar>
+              <w:top w:type="dxa" w:w="40"/>
+              <w:left w:type="dxa" w:w="80"/>
+              <w:bottom w:type="dxa" w:w="40"/>
+              <w:right w:type="dxa" w:w="80"/>
+            </w:tcMar>
+          </w:tcPr>
+          <w:p>
+            <w:pPr>
+              <w:jc w:val="left"/>
+            </w:pPr>
+            <w:r>
+              <w:rPr>
+                <w:rFonts w:ascii="Times New Roman" w:cs="Times New Roman" w:eastAsia="Times New Roman" w:hAnsi="Times New Roman"/>
+                <w:sz w:val="18"/>
+                <w:szCs w:val="18"/>
+              </w:rPr>
+              <w:t xml:space="preserve">15/9-19 A, F-10, F-15 A, F-15 B, F-15 C, F-15 D</w:t>
             </w:r>
           </w:p>
         </w:tc>
@@ -9551,33 +9625,30 @@
       <w:tr>
         <w:trPr>
           <w:cantSplit/>
-          <w:tblHeader w:val="off"/>
         </w:trPr>
         <w:tc>
           <w:tcPr>
-            <w:tcW w:type="dxa" w:w="3300"/>
-            <w:tcBorders>
-              <w:top w:val="single" w:color="808080" w:sz="4"/>
-              <w:left w:val="single" w:color="808080" w:sz="4"/>
-              <w:bottom w:val="single" w:color="808080" w:sz="4"/>
-              <w:right w:val="single" w:color="808080" w:sz="4"/>
-            </w:tcBorders>
-            <w:tcMar>
-              <w:top w:type="dxa" w:w="40"/>
-              <w:left w:type="dxa" w:w="80"/>
-              <w:bottom w:type="dxa" w:w="40"/>
-              <w:right w:type="dxa" w:w="80"/>
-            </w:tcMar>
-          </w:tcPr>
-          <w:p>
-            <w:pPr>
-              <w:jc w:val="left"/>
-            </w:pPr>
-            <w:r>
-              <w:rPr>
-                <w:rFonts w:ascii="Times New Roman" w:cs="Times New Roman" w:eastAsia="Times New Roman" w:hAnsi="Times New Roman"/>
-                <w:b w:val="false"/>
-                <w:bCs w:val="false"/>
+            <w:tcW w:type="dxa" w:w="1700"/>
+            <w:tcBorders>
+              <w:top w:val="single" w:color="808080" w:sz="4"/>
+              <w:left w:val="single" w:color="808080" w:sz="4"/>
+              <w:bottom w:val="single" w:color="808080" w:sz="4"/>
+              <w:right w:val="single" w:color="808080" w:sz="4"/>
+            </w:tcBorders>
+            <w:tcMar>
+              <w:top w:type="dxa" w:w="40"/>
+              <w:left w:type="dxa" w:w="80"/>
+              <w:bottom w:type="dxa" w:w="40"/>
+              <w:right w:type="dxa" w:w="80"/>
+            </w:tcMar>
+          </w:tcPr>
+          <w:p>
+            <w:pPr>
+              <w:jc w:val="left"/>
+            </w:pPr>
+            <w:r>
+              <w:rPr>
+                <w:rFonts w:ascii="Times New Roman" w:cs="Times New Roman" w:eastAsia="Times New Roman" w:hAnsi="Times New Roman"/>
                 <w:sz w:val="18"/>
                 <w:szCs w:val="18"/>
               </w:rPr>
@@ -9587,29 +9658,27 @@
         </w:tc>
         <w:tc>
           <w:tcPr>
-            <w:tcW w:type="dxa" w:w="1200"/>
-            <w:tcBorders>
-              <w:top w:val="single" w:color="808080" w:sz="4"/>
-              <w:left w:val="single" w:color="808080" w:sz="4"/>
-              <w:bottom w:val="single" w:color="808080" w:sz="4"/>
-              <w:right w:val="single" w:color="808080" w:sz="4"/>
-            </w:tcBorders>
-            <w:tcMar>
-              <w:top w:type="dxa" w:w="40"/>
-              <w:left w:type="dxa" w:w="80"/>
-              <w:bottom w:type="dxa" w:w="40"/>
-              <w:right w:type="dxa" w:w="80"/>
-            </w:tcMar>
-          </w:tcPr>
-          <w:p>
-            <w:pPr>
-              <w:jc w:val="left"/>
-            </w:pPr>
-            <w:r>
-              <w:rPr>
-                <w:rFonts w:ascii="Times New Roman" w:cs="Times New Roman" w:eastAsia="Times New Roman" w:hAnsi="Times New Roman"/>
-                <w:b w:val="false"/>
-                <w:bCs w:val="false"/>
+            <w:tcW w:type="dxa" w:w="800"/>
+            <w:tcBorders>
+              <w:top w:val="single" w:color="808080" w:sz="4"/>
+              <w:left w:val="single" w:color="808080" w:sz="4"/>
+              <w:bottom w:val="single" w:color="808080" w:sz="4"/>
+              <w:right w:val="single" w:color="808080" w:sz="4"/>
+            </w:tcBorders>
+            <w:tcMar>
+              <w:top w:type="dxa" w:w="40"/>
+              <w:left w:type="dxa" w:w="80"/>
+              <w:bottom w:type="dxa" w:w="40"/>
+              <w:right w:type="dxa" w:w="80"/>
+            </w:tcMar>
+          </w:tcPr>
+          <w:p>
+            <w:pPr>
+              <w:jc w:val="left"/>
+            </w:pPr>
+            <w:r>
+              <w:rPr>
+                <w:rFonts w:ascii="Times New Roman" w:cs="Times New Roman" w:eastAsia="Times New Roman" w:hAnsi="Times New Roman"/>
                 <w:sz w:val="18"/>
                 <w:szCs w:val="18"/>
               </w:rPr>
@@ -9619,33 +9688,61 @@
         </w:tc>
         <w:tc>
           <w:tcPr>
-            <w:tcW w:type="dxa" w:w="4860"/>
-            <w:tcBorders>
-              <w:top w:val="single" w:color="808080" w:sz="4"/>
-              <w:left w:val="single" w:color="808080" w:sz="4"/>
-              <w:bottom w:val="single" w:color="808080" w:sz="4"/>
-              <w:right w:val="single" w:color="808080" w:sz="4"/>
-            </w:tcBorders>
-            <w:tcMar>
-              <w:top w:type="dxa" w:w="40"/>
-              <w:left w:type="dxa" w:w="80"/>
-              <w:bottom w:type="dxa" w:w="40"/>
-              <w:right w:type="dxa" w:w="80"/>
-            </w:tcMar>
-          </w:tcPr>
-          <w:p>
-            <w:pPr>
-              <w:jc w:val="left"/>
-            </w:pPr>
-            <w:r>
-              <w:rPr>
-                <w:rFonts w:ascii="Times New Roman" w:cs="Times New Roman" w:eastAsia="Times New Roman" w:hAnsi="Times New Roman"/>
-                <w:b w:val="false"/>
-                <w:bCs w:val="false"/>
-                <w:sz w:val="18"/>
-                <w:szCs w:val="18"/>
-              </w:rPr>
-              <w:t>Administrative spud precedes operational start by days to weeks (15/9-19 B, F-1 A, F-1 B, F-1 C, F-5, F-9 A, F-11 B, F-14)</w:t>
+            <w:tcW w:type="dxa" w:w="3900"/>
+            <w:tcBorders>
+              <w:top w:val="single" w:color="808080" w:sz="4"/>
+              <w:left w:val="single" w:color="808080" w:sz="4"/>
+              <w:bottom w:val="single" w:color="808080" w:sz="4"/>
+              <w:right w:val="single" w:color="808080" w:sz="4"/>
+            </w:tcBorders>
+            <w:tcMar>
+              <w:top w:type="dxa" w:w="40"/>
+              <w:left w:type="dxa" w:w="80"/>
+              <w:bottom w:type="dxa" w:w="40"/>
+              <w:right w:type="dxa" w:w="80"/>
+            </w:tcMar>
+          </w:tcPr>
+          <w:p>
+            <w:pPr>
+              <w:jc w:val="left"/>
+            </w:pPr>
+            <w:r>
+              <w:rPr>
+                <w:rFonts w:ascii="Times New Roman" w:cs="Times New Roman" w:eastAsia="Times New Roman" w:hAnsi="Times New Roman"/>
+                <w:sz w:val="18"/>
+                <w:szCs w:val="18"/>
+              </w:rPr>
+              <w:t xml:space="preserve">R6: WITSML date within 8 days of the NOD date, and the free-text operational start follows it by 2 to 20 days. R5: a parent leg whose NOD record is claimed by a technical sidetrack and that has no free-text spud date of its own (15/9-19 B).</w:t>
+            </w:r>
+          </w:p>
+        </w:tc>
+        <w:tc>
+          <w:tcPr>
+            <w:tcW w:type="dxa" w:w="2960"/>
+            <w:tcBorders>
+              <w:top w:val="single" w:color="808080" w:sz="4"/>
+              <w:left w:val="single" w:color="808080" w:sz="4"/>
+              <w:bottom w:val="single" w:color="808080" w:sz="4"/>
+              <w:right w:val="single" w:color="808080" w:sz="4"/>
+            </w:tcBorders>
+            <w:tcMar>
+              <w:top w:type="dxa" w:w="40"/>
+              <w:left w:type="dxa" w:w="80"/>
+              <w:bottom w:type="dxa" w:w="40"/>
+              <w:right w:type="dxa" w:w="80"/>
+            </w:tcMar>
+          </w:tcPr>
+          <w:p>
+            <w:pPr>
+              <w:jc w:val="left"/>
+            </w:pPr>
+            <w:r>
+              <w:rPr>
+                <w:rFonts w:ascii="Times New Roman" w:cs="Times New Roman" w:eastAsia="Times New Roman" w:hAnsi="Times New Roman"/>
+                <w:sz w:val="18"/>
+                <w:szCs w:val="18"/>
+              </w:rPr>
+              <w:t xml:space="preserve">Administrative spud precedes operational start by days to weeks (15/9-19 B, F-1 A, F-1 B, F-1 C, F-5, F-9 A, F-11 B, F-14)</w:t>
             </w:r>
           </w:p>
         </w:tc>
@@ -9653,33 +9750,30 @@
       <w:tr>
         <w:trPr>
           <w:cantSplit/>
-          <w:tblHeader w:val="off"/>
         </w:trPr>
         <w:tc>
           <w:tcPr>
-            <w:tcW w:type="dxa" w:w="3300"/>
-            <w:tcBorders>
-              <w:top w:val="single" w:color="808080" w:sz="4"/>
-              <w:left w:val="single" w:color="808080" w:sz="4"/>
-              <w:bottom w:val="single" w:color="808080" w:sz="4"/>
-              <w:right w:val="single" w:color="808080" w:sz="4"/>
-            </w:tcBorders>
-            <w:tcMar>
-              <w:top w:type="dxa" w:w="40"/>
-              <w:left w:type="dxa" w:w="80"/>
-              <w:bottom w:type="dxa" w:w="40"/>
-              <w:right w:type="dxa" w:w="80"/>
-            </w:tcMar>
-          </w:tcPr>
-          <w:p>
-            <w:pPr>
-              <w:jc w:val="left"/>
-            </w:pPr>
-            <w:r>
-              <w:rPr>
-                <w:rFonts w:ascii="Times New Roman" w:cs="Times New Roman" w:eastAsia="Times New Roman" w:hAnsi="Times New Roman"/>
-                <w:b w:val="false"/>
-                <w:bCs w:val="false"/>
+            <w:tcW w:type="dxa" w:w="1700"/>
+            <w:tcBorders>
+              <w:top w:val="single" w:color="808080" w:sz="4"/>
+              <w:left w:val="single" w:color="808080" w:sz="4"/>
+              <w:bottom w:val="single" w:color="808080" w:sz="4"/>
+              <w:right w:val="single" w:color="808080" w:sz="4"/>
+            </w:tcBorders>
+            <w:tcMar>
+              <w:top w:type="dxa" w:w="40"/>
+              <w:left w:type="dxa" w:w="80"/>
+              <w:bottom w:type="dxa" w:w="40"/>
+              <w:right w:type="dxa" w:w="80"/>
+            </w:tcMar>
+          </w:tcPr>
+          <w:p>
+            <w:pPr>
+              <w:jc w:val="left"/>
+            </w:pPr>
+            <w:r>
+              <w:rPr>
+                <w:rFonts w:ascii="Times New Roman" w:cs="Times New Roman" w:eastAsia="Times New Roman" w:hAnsi="Times New Roman"/>
                 <w:sz w:val="18"/>
                 <w:szCs w:val="18"/>
               </w:rPr>
@@ -9689,29 +9783,27 @@
         </w:tc>
         <w:tc>
           <w:tcPr>
-            <w:tcW w:type="dxa" w:w="1200"/>
-            <w:tcBorders>
-              <w:top w:val="single" w:color="808080" w:sz="4"/>
-              <w:left w:val="single" w:color="808080" w:sz="4"/>
-              <w:bottom w:val="single" w:color="808080" w:sz="4"/>
-              <w:right w:val="single" w:color="808080" w:sz="4"/>
-            </w:tcBorders>
-            <w:tcMar>
-              <w:top w:type="dxa" w:w="40"/>
-              <w:left w:type="dxa" w:w="80"/>
-              <w:bottom w:type="dxa" w:w="40"/>
-              <w:right w:type="dxa" w:w="80"/>
-            </w:tcMar>
-          </w:tcPr>
-          <w:p>
-            <w:pPr>
-              <w:jc w:val="left"/>
-            </w:pPr>
-            <w:r>
-              <w:rPr>
-                <w:rFonts w:ascii="Times New Roman" w:cs="Times New Roman" w:eastAsia="Times New Roman" w:hAnsi="Times New Roman"/>
-                <w:b w:val="false"/>
-                <w:bCs w:val="false"/>
+            <w:tcW w:type="dxa" w:w="800"/>
+            <w:tcBorders>
+              <w:top w:val="single" w:color="808080" w:sz="4"/>
+              <w:left w:val="single" w:color="808080" w:sz="4"/>
+              <w:bottom w:val="single" w:color="808080" w:sz="4"/>
+              <w:right w:val="single" w:color="808080" w:sz="4"/>
+            </w:tcBorders>
+            <w:tcMar>
+              <w:top w:type="dxa" w:w="40"/>
+              <w:left w:type="dxa" w:w="80"/>
+              <w:bottom w:type="dxa" w:w="40"/>
+              <w:right w:type="dxa" w:w="80"/>
+            </w:tcMar>
+          </w:tcPr>
+          <w:p>
+            <w:pPr>
+              <w:jc w:val="left"/>
+            </w:pPr>
+            <w:r>
+              <w:rPr>
+                <w:rFonts w:ascii="Times New Roman" w:cs="Times New Roman" w:eastAsia="Times New Roman" w:hAnsi="Times New Roman"/>
                 <w:sz w:val="18"/>
                 <w:szCs w:val="18"/>
               </w:rPr>
@@ -9721,29 +9813,57 @@
         </w:tc>
         <w:tc>
           <w:tcPr>
-            <w:tcW w:type="dxa" w:w="4860"/>
-            <w:tcBorders>
-              <w:top w:val="single" w:color="808080" w:sz="4"/>
-              <w:left w:val="single" w:color="808080" w:sz="4"/>
-              <w:bottom w:val="single" w:color="808080" w:sz="4"/>
-              <w:right w:val="single" w:color="808080" w:sz="4"/>
-            </w:tcBorders>
-            <w:tcMar>
-              <w:top w:type="dxa" w:w="40"/>
-              <w:left w:type="dxa" w:w="80"/>
-              <w:bottom w:type="dxa" w:w="40"/>
-              <w:right w:type="dxa" w:w="80"/>
-            </w:tcMar>
-          </w:tcPr>
-          <w:p>
-            <w:pPr>
-              <w:jc w:val="left"/>
-            </w:pPr>
-            <w:r>
-              <w:rPr>
-                <w:rFonts w:ascii="Times New Roman" w:cs="Times New Roman" w:eastAsia="Times New Roman" w:hAnsi="Times New Roman"/>
-                <w:b w:val="false"/>
-                <w:bCs w:val="false"/>
+            <w:tcW w:type="dxa" w:w="3900"/>
+            <w:tcBorders>
+              <w:top w:val="single" w:color="808080" w:sz="4"/>
+              <w:left w:val="single" w:color="808080" w:sz="4"/>
+              <w:bottom w:val="single" w:color="808080" w:sz="4"/>
+              <w:right w:val="single" w:color="808080" w:sz="4"/>
+            </w:tcBorders>
+            <w:tcMar>
+              <w:top w:type="dxa" w:w="40"/>
+              <w:left w:type="dxa" w:w="80"/>
+              <w:bottom w:type="dxa" w:w="40"/>
+              <w:right w:type="dxa" w:w="80"/>
+            </w:tcMar>
+          </w:tcPr>
+          <w:p>
+            <w:pPr>
+              <w:jc w:val="left"/>
+            </w:pPr>
+            <w:r>
+              <w:rPr>
+                <w:rFonts w:ascii="Times New Roman" w:cs="Times New Roman" w:eastAsia="Times New Roman" w:hAnsi="Times New Roman"/>
+                <w:sz w:val="18"/>
+                <w:szCs w:val="18"/>
+              </w:rPr>
+              <w:t xml:space="preserve">R2: WITSML date differs from the first report or free-text spud by more than 30 days, while the NOD date agrees with them within 3 days.</w:t>
+            </w:r>
+          </w:p>
+        </w:tc>
+        <w:tc>
+          <w:tcPr>
+            <w:tcW w:type="dxa" w:w="2960"/>
+            <w:tcBorders>
+              <w:top w:val="single" w:color="808080" w:sz="4"/>
+              <w:left w:val="single" w:color="808080" w:sz="4"/>
+              <w:bottom w:val="single" w:color="808080" w:sz="4"/>
+              <w:right w:val="single" w:color="808080" w:sz="4"/>
+            </w:tcBorders>
+            <w:tcMar>
+              <w:top w:type="dxa" w:w="40"/>
+              <w:left w:type="dxa" w:w="80"/>
+              <w:bottom w:type="dxa" w:w="40"/>
+              <w:right w:type="dxa" w:w="80"/>
+            </w:tcMar>
+          </w:tcPr>
+          <w:p>
+            <w:pPr>
+              <w:jc w:val="left"/>
+            </w:pPr>
+            <w:r>
+              <w:rPr>
+                <w:rFonts w:ascii="Times New Roman" w:cs="Times New Roman" w:eastAsia="Times New Roman" w:hAnsi="Times New Roman"/>
                 <w:sz w:val="18"/>
                 <w:szCs w:val="18"/>
               </w:rPr>
@@ -9755,65 +9875,60 @@
       <w:tr>
         <w:trPr>
           <w:cantSplit/>
-          <w:tblHeader w:val="off"/>
         </w:trPr>
         <w:tc>
           <w:tcPr>
-            <w:tcW w:type="dxa" w:w="3300"/>
-            <w:tcBorders>
-              <w:top w:val="single" w:color="808080" w:sz="4"/>
-              <w:left w:val="single" w:color="808080" w:sz="4"/>
-              <w:bottom w:val="single" w:color="808080" w:sz="4"/>
-              <w:right w:val="single" w:color="808080" w:sz="4"/>
-            </w:tcBorders>
-            <w:tcMar>
-              <w:top w:type="dxa" w:w="40"/>
-              <w:left w:type="dxa" w:w="80"/>
-              <w:bottom w:type="dxa" w:w="40"/>
-              <w:right w:type="dxa" w:w="80"/>
-            </w:tcMar>
-          </w:tcPr>
-          <w:p>
-            <w:pPr>
-              <w:jc w:val="left"/>
-            </w:pPr>
-            <w:r>
-              <w:rPr>
-                <w:rFonts w:ascii="Times New Roman" w:cs="Times New Roman" w:eastAsia="Times New Roman" w:hAnsi="Times New Roman"/>
-                <w:b w:val="false"/>
-                <w:bCs w:val="false"/>
-                <w:sz w:val="18"/>
-                <w:szCs w:val="18"/>
-              </w:rPr>
-              <w:t xml:space="preserve">Wellbore-identity conflation</w:t>
-            </w:r>
-          </w:p>
-        </w:tc>
-        <w:tc>
-          <w:tcPr>
-            <w:tcW w:type="dxa" w:w="1200"/>
-            <w:tcBorders>
-              <w:top w:val="single" w:color="808080" w:sz="4"/>
-              <w:left w:val="single" w:color="808080" w:sz="4"/>
-              <w:bottom w:val="single" w:color="808080" w:sz="4"/>
-              <w:right w:val="single" w:color="808080" w:sz="4"/>
-            </w:tcBorders>
-            <w:tcMar>
-              <w:top w:type="dxa" w:w="40"/>
-              <w:left w:type="dxa" w:w="80"/>
-              <w:bottom w:type="dxa" w:w="40"/>
-              <w:right w:type="dxa" w:w="80"/>
-            </w:tcMar>
-          </w:tcPr>
-          <w:p>
-            <w:pPr>
-              <w:jc w:val="left"/>
-            </w:pPr>
-            <w:r>
-              <w:rPr>
-                <w:rFonts w:ascii="Times New Roman" w:cs="Times New Roman" w:eastAsia="Times New Roman" w:hAnsi="Times New Roman"/>
-                <w:b w:val="false"/>
-                <w:bCs w:val="false"/>
+            <w:tcW w:type="dxa" w:w="1700"/>
+            <w:tcBorders>
+              <w:top w:val="single" w:color="808080" w:sz="4"/>
+              <w:left w:val="single" w:color="808080" w:sz="4"/>
+              <w:bottom w:val="single" w:color="808080" w:sz="4"/>
+              <w:right w:val="single" w:color="808080" w:sz="4"/>
+            </w:tcBorders>
+            <w:tcMar>
+              <w:top w:type="dxa" w:w="40"/>
+              <w:left w:type="dxa" w:w="80"/>
+              <w:bottom w:type="dxa" w:w="40"/>
+              <w:right w:type="dxa" w:w="80"/>
+            </w:tcMar>
+          </w:tcPr>
+          <w:p>
+            <w:pPr>
+              <w:jc w:val="left"/>
+            </w:pPr>
+            <w:r>
+              <w:rPr>
+                <w:rFonts w:ascii="Times New Roman" w:cs="Times New Roman" w:eastAsia="Times New Roman" w:hAnsi="Times New Roman"/>
+                <w:sz w:val="18"/>
+                <w:szCs w:val="18"/>
+              </w:rPr>
+              <w:t xml:space="preserve">NOD date marks later campaign</w:t>
+            </w:r>
+          </w:p>
+        </w:tc>
+        <w:tc>
+          <w:tcPr>
+            <w:tcW w:type="dxa" w:w="800"/>
+            <w:tcBorders>
+              <w:top w:val="single" w:color="808080" w:sz="4"/>
+              <w:left w:val="single" w:color="808080" w:sz="4"/>
+              <w:bottom w:val="single" w:color="808080" w:sz="4"/>
+              <w:right w:val="single" w:color="808080" w:sz="4"/>
+            </w:tcBorders>
+            <w:tcMar>
+              <w:top w:type="dxa" w:w="40"/>
+              <w:left w:type="dxa" w:w="80"/>
+              <w:bottom w:type="dxa" w:w="40"/>
+              <w:right w:type="dxa" w:w="80"/>
+            </w:tcMar>
+          </w:tcPr>
+          <w:p>
+            <w:pPr>
+              <w:jc w:val="left"/>
+            </w:pPr>
+            <w:r>
+              <w:rPr>
+                <w:rFonts w:ascii="Times New Roman" w:cs="Times New Roman" w:eastAsia="Times New Roman" w:hAnsi="Times New Roman"/>
                 <w:sz w:val="18"/>
                 <w:szCs w:val="18"/>
               </w:rPr>
@@ -9823,29 +9938,57 @@
         </w:tc>
         <w:tc>
           <w:tcPr>
-            <w:tcW w:type="dxa" w:w="4860"/>
-            <w:tcBorders>
-              <w:top w:val="single" w:color="808080" w:sz="4"/>
-              <w:left w:val="single" w:color="808080" w:sz="4"/>
-              <w:bottom w:val="single" w:color="808080" w:sz="4"/>
-              <w:right w:val="single" w:color="808080" w:sz="4"/>
-            </w:tcBorders>
-            <w:tcMar>
-              <w:top w:type="dxa" w:w="40"/>
-              <w:left w:type="dxa" w:w="80"/>
-              <w:bottom w:type="dxa" w:w="40"/>
-              <w:right w:type="dxa" w:w="80"/>
-            </w:tcMar>
-          </w:tcPr>
-          <w:p>
-            <w:pPr>
-              <w:jc w:val="left"/>
-            </w:pPr>
-            <w:r>
-              <w:rPr>
-                <w:rFonts w:ascii="Times New Roman" w:cs="Times New Roman" w:eastAsia="Times New Roman" w:hAnsi="Times New Roman"/>
-                <w:b w:val="false"/>
-                <w:bCs w:val="false"/>
+            <w:tcW w:type="dxa" w:w="3900"/>
+            <w:tcBorders>
+              <w:top w:val="single" w:color="808080" w:sz="4"/>
+              <w:left w:val="single" w:color="808080" w:sz="4"/>
+              <w:bottom w:val="single" w:color="808080" w:sz="4"/>
+              <w:right w:val="single" w:color="808080" w:sz="4"/>
+            </w:tcBorders>
+            <w:tcMar>
+              <w:top w:type="dxa" w:w="40"/>
+              <w:left w:type="dxa" w:w="80"/>
+              <w:bottom w:type="dxa" w:w="40"/>
+              <w:right w:type="dxa" w:w="80"/>
+            </w:tcMar>
+          </w:tcPr>
+          <w:p>
+            <w:pPr>
+              <w:jc w:val="left"/>
+            </w:pPr>
+            <w:r>
+              <w:rPr>
+                <w:rFonts w:ascii="Times New Roman" w:cs="Times New Roman" w:eastAsia="Times New Roman" w:hAnsi="Times New Roman"/>
+                <w:sz w:val="18"/>
+                <w:szCs w:val="18"/>
+              </w:rPr>
+              <w:t xml:space="preserve">R3: WITSML date within 7 days of the first report, but more than 1 year from the NOD date.</w:t>
+            </w:r>
+          </w:p>
+        </w:tc>
+        <w:tc>
+          <w:tcPr>
+            <w:tcW w:type="dxa" w:w="2960"/>
+            <w:tcBorders>
+              <w:top w:val="single" w:color="808080" w:sz="4"/>
+              <w:left w:val="single" w:color="808080" w:sz="4"/>
+              <w:bottom w:val="single" w:color="808080" w:sz="4"/>
+              <w:right w:val="single" w:color="808080" w:sz="4"/>
+            </w:tcBorders>
+            <w:tcMar>
+              <w:top w:type="dxa" w:w="40"/>
+              <w:left w:type="dxa" w:w="80"/>
+              <w:bottom w:type="dxa" w:w="40"/>
+              <w:right w:type="dxa" w:w="80"/>
+            </w:tcMar>
+          </w:tcPr>
+          <w:p>
+            <w:pPr>
+              <w:jc w:val="left"/>
+            </w:pPr>
+            <w:r>
+              <w:rPr>
+                <w:rFonts w:ascii="Times New Roman" w:cs="Times New Roman" w:eastAsia="Times New Roman" w:hAnsi="Times New Roman"/>
                 <w:sz w:val="18"/>
                 <w:szCs w:val="18"/>
               </w:rPr>
@@ -9857,33 +10000,30 @@
       <w:tr>
         <w:trPr>
           <w:cantSplit/>
-          <w:tblHeader w:val="off"/>
         </w:trPr>
         <w:tc>
           <w:tcPr>
-            <w:tcW w:type="dxa" w:w="3300"/>
-            <w:tcBorders>
-              <w:top w:val="single" w:color="808080" w:sz="4"/>
-              <w:left w:val="single" w:color="808080" w:sz="4"/>
-              <w:bottom w:val="single" w:color="808080" w:sz="4"/>
-              <w:right w:val="single" w:color="808080" w:sz="4"/>
-            </w:tcBorders>
-            <w:tcMar>
-              <w:top w:type="dxa" w:w="40"/>
-              <w:left w:type="dxa" w:w="80"/>
-              <w:bottom w:type="dxa" w:w="40"/>
-              <w:right w:type="dxa" w:w="80"/>
-            </w:tcMar>
-          </w:tcPr>
-          <w:p>
-            <w:pPr>
-              <w:jc w:val="left"/>
-            </w:pPr>
-            <w:r>
-              <w:rPr>
-                <w:rFonts w:ascii="Times New Roman" w:cs="Times New Roman" w:eastAsia="Times New Roman" w:hAnsi="Times New Roman"/>
-                <w:b w:val="false"/>
-                <w:bCs w:val="false"/>
+            <w:tcW w:type="dxa" w:w="1700"/>
+            <w:tcBorders>
+              <w:top w:val="single" w:color="808080" w:sz="4"/>
+              <w:left w:val="single" w:color="808080" w:sz="4"/>
+              <w:bottom w:val="single" w:color="808080" w:sz="4"/>
+              <w:right w:val="single" w:color="808080" w:sz="4"/>
+            </w:tcBorders>
+            <w:tcMar>
+              <w:top w:type="dxa" w:w="40"/>
+              <w:left w:type="dxa" w:w="80"/>
+              <w:bottom w:type="dxa" w:w="40"/>
+              <w:right w:type="dxa" w:w="80"/>
+            </w:tcMar>
+          </w:tcPr>
+          <w:p>
+            <w:pPr>
+              <w:jc w:val="left"/>
+            </w:pPr>
+            <w:r>
+              <w:rPr>
+                <w:rFonts w:ascii="Times New Roman" w:cs="Times New Roman" w:eastAsia="Times New Roman" w:hAnsi="Times New Roman"/>
                 <w:sz w:val="18"/>
                 <w:szCs w:val="18"/>
               </w:rPr>
@@ -9893,29 +10033,27 @@
         </w:tc>
         <w:tc>
           <w:tcPr>
-            <w:tcW w:type="dxa" w:w="1200"/>
-            <w:tcBorders>
-              <w:top w:val="single" w:color="808080" w:sz="4"/>
-              <w:left w:val="single" w:color="808080" w:sz="4"/>
-              <w:bottom w:val="single" w:color="808080" w:sz="4"/>
-              <w:right w:val="single" w:color="808080" w:sz="4"/>
-            </w:tcBorders>
-            <w:tcMar>
-              <w:top w:type="dxa" w:w="40"/>
-              <w:left w:type="dxa" w:w="80"/>
-              <w:bottom w:type="dxa" w:w="40"/>
-              <w:right w:type="dxa" w:w="80"/>
-            </w:tcMar>
-          </w:tcPr>
-          <w:p>
-            <w:pPr>
-              <w:jc w:val="left"/>
-            </w:pPr>
-            <w:r>
-              <w:rPr>
-                <w:rFonts w:ascii="Times New Roman" w:cs="Times New Roman" w:eastAsia="Times New Roman" w:hAnsi="Times New Roman"/>
-                <w:b w:val="false"/>
-                <w:bCs w:val="false"/>
+            <w:tcW w:type="dxa" w:w="800"/>
+            <w:tcBorders>
+              <w:top w:val="single" w:color="808080" w:sz="4"/>
+              <w:left w:val="single" w:color="808080" w:sz="4"/>
+              <w:bottom w:val="single" w:color="808080" w:sz="4"/>
+              <w:right w:val="single" w:color="808080" w:sz="4"/>
+            </w:tcBorders>
+            <w:tcMar>
+              <w:top w:type="dxa" w:w="40"/>
+              <w:left w:type="dxa" w:w="80"/>
+              <w:bottom w:type="dxa" w:w="40"/>
+              <w:right w:type="dxa" w:w="80"/>
+            </w:tcMar>
+          </w:tcPr>
+          <w:p>
+            <w:pPr>
+              <w:jc w:val="left"/>
+            </w:pPr>
+            <w:r>
+              <w:rPr>
+                <w:rFonts w:ascii="Times New Roman" w:cs="Times New Roman" w:eastAsia="Times New Roman" w:hAnsi="Times New Roman"/>
                 <w:sz w:val="18"/>
                 <w:szCs w:val="18"/>
               </w:rPr>
@@ -9925,29 +10063,57 @@
         </w:tc>
         <w:tc>
           <w:tcPr>
-            <w:tcW w:type="dxa" w:w="4860"/>
-            <w:tcBorders>
-              <w:top w:val="single" w:color="808080" w:sz="4"/>
-              <w:left w:val="single" w:color="808080" w:sz="4"/>
-              <w:bottom w:val="single" w:color="808080" w:sz="4"/>
-              <w:right w:val="single" w:color="808080" w:sz="4"/>
-            </w:tcBorders>
-            <w:tcMar>
-              <w:top w:type="dxa" w:w="40"/>
-              <w:left w:type="dxa" w:w="80"/>
-              <w:bottom w:type="dxa" w:w="40"/>
-              <w:right w:type="dxa" w:w="80"/>
-            </w:tcMar>
-          </w:tcPr>
-          <w:p>
-            <w:pPr>
-              <w:jc w:val="left"/>
-            </w:pPr>
-            <w:r>
-              <w:rPr>
-                <w:rFonts w:ascii="Times New Roman" w:cs="Times New Roman" w:eastAsia="Times New Roman" w:hAnsi="Times New Roman"/>
-                <w:b w:val="false"/>
-                <w:bCs w:val="false"/>
+            <w:tcW w:type="dxa" w:w="3900"/>
+            <w:tcBorders>
+              <w:top w:val="single" w:color="808080" w:sz="4"/>
+              <w:left w:val="single" w:color="808080" w:sz="4"/>
+              <w:bottom w:val="single" w:color="808080" w:sz="4"/>
+              <w:right w:val="single" w:color="808080" w:sz="4"/>
+            </w:tcBorders>
+            <w:tcMar>
+              <w:top w:type="dxa" w:w="40"/>
+              <w:left w:type="dxa" w:w="80"/>
+              <w:bottom w:type="dxa" w:w="40"/>
+              <w:right w:type="dxa" w:w="80"/>
+            </w:tcMar>
+          </w:tcPr>
+          <w:p>
+            <w:pPr>
+              <w:jc w:val="left"/>
+            </w:pPr>
+            <w:r>
+              <w:rPr>
+                <w:rFonts w:ascii="Times New Roman" w:cs="Times New Roman" w:eastAsia="Times New Roman" w:hAnsi="Times New Roman"/>
+                <w:sz w:val="18"/>
+                <w:szCs w:val="18"/>
+              </w:rPr>
+              <w:t xml:space="preserve">R1: the sidetrack carries the same spud date as its parent.</w:t>
+            </w:r>
+          </w:p>
+        </w:tc>
+        <w:tc>
+          <w:tcPr>
+            <w:tcW w:type="dxa" w:w="2960"/>
+            <w:tcBorders>
+              <w:top w:val="single" w:color="808080" w:sz="4"/>
+              <w:left w:val="single" w:color="808080" w:sz="4"/>
+              <w:bottom w:val="single" w:color="808080" w:sz="4"/>
+              <w:right w:val="single" w:color="808080" w:sz="4"/>
+            </w:tcBorders>
+            <w:tcMar>
+              <w:top w:type="dxa" w:w="40"/>
+              <w:left w:type="dxa" w:w="80"/>
+              <w:bottom w:type="dxa" w:w="40"/>
+              <w:right w:type="dxa" w:w="80"/>
+            </w:tcMar>
+          </w:tcPr>
+          <w:p>
+            <w:pPr>
+              <w:jc w:val="left"/>
+            </w:pPr>
+            <w:r>
+              <w:rPr>
+                <w:rFonts w:ascii="Times New Roman" w:cs="Times New Roman" w:eastAsia="Times New Roman" w:hAnsi="Times New Roman"/>
                 <w:sz w:val="18"/>
                 <w:szCs w:val="18"/>
               </w:rPr>
@@ -9959,33 +10125,30 @@
       <w:tr>
         <w:trPr>
           <w:cantSplit/>
-          <w:tblHeader w:val="off"/>
         </w:trPr>
         <w:tc>
           <w:tcPr>
-            <w:tcW w:type="dxa" w:w="3300"/>
-            <w:tcBorders>
-              <w:top w:val="single" w:color="808080" w:sz="4"/>
-              <w:left w:val="single" w:color="808080" w:sz="4"/>
-              <w:bottom w:val="single" w:color="808080" w:sz="4"/>
-              <w:right w:val="single" w:color="808080" w:sz="4"/>
-            </w:tcBorders>
-            <w:tcMar>
-              <w:top w:type="dxa" w:w="40"/>
-              <w:left w:type="dxa" w:w="80"/>
-              <w:bottom w:type="dxa" w:w="40"/>
-              <w:right w:type="dxa" w:w="80"/>
-            </w:tcMar>
-          </w:tcPr>
-          <w:p>
-            <w:pPr>
-              <w:jc w:val="left"/>
-            </w:pPr>
-            <w:r>
-              <w:rPr>
-                <w:rFonts w:ascii="Times New Roman" w:cs="Times New Roman" w:eastAsia="Times New Roman" w:hAnsi="Times New Roman"/>
-                <w:b w:val="false"/>
-                <w:bCs w:val="false"/>
+            <w:tcW w:type="dxa" w:w="1700"/>
+            <w:tcBorders>
+              <w:top w:val="single" w:color="808080" w:sz="4"/>
+              <w:left w:val="single" w:color="808080" w:sz="4"/>
+              <w:bottom w:val="single" w:color="808080" w:sz="4"/>
+              <w:right w:val="single" w:color="808080" w:sz="4"/>
+            </w:tcBorders>
+            <w:tcMar>
+              <w:top w:type="dxa" w:w="40"/>
+              <w:left w:type="dxa" w:w="80"/>
+              <w:bottom w:type="dxa" w:w="40"/>
+              <w:right w:type="dxa" w:w="80"/>
+            </w:tcMar>
+          </w:tcPr>
+          <w:p>
+            <w:pPr>
+              <w:jc w:val="left"/>
+            </w:pPr>
+            <w:r>
+              <w:rPr>
+                <w:rFonts w:ascii="Times New Roman" w:cs="Times New Roman" w:eastAsia="Times New Roman" w:hAnsi="Times New Roman"/>
                 <w:sz w:val="18"/>
                 <w:szCs w:val="18"/>
               </w:rPr>
@@ -9995,65 +10158,91 @@
         </w:tc>
         <w:tc>
           <w:tcPr>
-            <w:tcW w:type="dxa" w:w="1200"/>
-            <w:tcBorders>
-              <w:top w:val="single" w:color="808080" w:sz="4"/>
-              <w:left w:val="single" w:color="808080" w:sz="4"/>
-              <w:bottom w:val="single" w:color="808080" w:sz="4"/>
-              <w:right w:val="single" w:color="808080" w:sz="4"/>
-            </w:tcBorders>
-            <w:tcMar>
-              <w:top w:type="dxa" w:w="40"/>
-              <w:left w:type="dxa" w:w="80"/>
-              <w:bottom w:type="dxa" w:w="40"/>
-              <w:right w:type="dxa" w:w="80"/>
-            </w:tcMar>
-          </w:tcPr>
-          <w:p>
-            <w:pPr>
-              <w:jc w:val="left"/>
-            </w:pPr>
-            <w:r>
-              <w:rPr>
-                <w:rFonts w:ascii="Times New Roman" w:cs="Times New Roman" w:eastAsia="Times New Roman" w:hAnsi="Times New Roman"/>
-                <w:b w:val="false"/>
-                <w:bCs w:val="false"/>
-                <w:sz w:val="18"/>
-                <w:szCs w:val="18"/>
-              </w:rPr>
-              <w:t>5</w:t>
-            </w:r>
-          </w:p>
-        </w:tc>
-        <w:tc>
-          <w:tcPr>
-            <w:tcW w:type="dxa" w:w="4860"/>
-            <w:tcBorders>
-              <w:top w:val="single" w:color="808080" w:sz="4"/>
-              <w:left w:val="single" w:color="808080" w:sz="4"/>
-              <w:bottom w:val="single" w:color="808080" w:sz="4"/>
-              <w:right w:val="single" w:color="808080" w:sz="4"/>
-            </w:tcBorders>
-            <w:tcMar>
-              <w:top w:type="dxa" w:w="40"/>
-              <w:left w:type="dxa" w:w="80"/>
-              <w:bottom w:type="dxa" w:w="40"/>
-              <w:right w:type="dxa" w:w="80"/>
-            </w:tcMar>
-          </w:tcPr>
-          <w:p>
-            <w:pPr>
-              <w:jc w:val="left"/>
-            </w:pPr>
-            <w:r>
-              <w:rPr>
-                <w:rFonts w:ascii="Times New Roman" w:cs="Times New Roman" w:eastAsia="Times New Roman" w:hAnsi="Times New Roman"/>
-                <w:b w:val="false"/>
-                <w:bCs w:val="false"/>
-                <w:sz w:val="18"/>
-                <w:szCs w:val="18"/>
-              </w:rPr>
-              <w:t>15/9-19 BT2, 19 S, 19 ST2, F-9, F-11 (NOD records a pre-drill campaign, 6 to 17 April 2012, that is absent from the DDR archive; the 2013 reports describe a fresh spud from seabed, so the relationship between the campaigns cannot be determined from these records)</w:t>
+            <w:tcW w:type="dxa" w:w="800"/>
+            <w:tcBorders>
+              <w:top w:val="single" w:color="808080" w:sz="4"/>
+              <w:left w:val="single" w:color="808080" w:sz="4"/>
+              <w:bottom w:val="single" w:color="808080" w:sz="4"/>
+              <w:right w:val="single" w:color="808080" w:sz="4"/>
+            </w:tcBorders>
+            <w:tcMar>
+              <w:top w:type="dxa" w:w="40"/>
+              <w:left w:type="dxa" w:w="80"/>
+              <w:bottom w:type="dxa" w:w="40"/>
+              <w:right w:type="dxa" w:w="80"/>
+            </w:tcMar>
+          </w:tcPr>
+          <w:p>
+            <w:pPr>
+              <w:jc w:val="left"/>
+            </w:pPr>
+            <w:r>
+              <w:rPr>
+                <w:rFonts w:ascii="Times New Roman" w:cs="Times New Roman" w:eastAsia="Times New Roman" w:hAnsi="Times New Roman"/>
+                <w:sz w:val="18"/>
+                <w:szCs w:val="18"/>
+              </w:rPr>
+              <w:t xml:space="preserve">5</w:t>
+            </w:r>
+          </w:p>
+        </w:tc>
+        <w:tc>
+          <w:tcPr>
+            <w:tcW w:type="dxa" w:w="3900"/>
+            <w:tcBorders>
+              <w:top w:val="single" w:color="808080" w:sz="4"/>
+              <w:left w:val="single" w:color="808080" w:sz="4"/>
+              <w:bottom w:val="single" w:color="808080" w:sz="4"/>
+              <w:right w:val="single" w:color="808080" w:sz="4"/>
+            </w:tcBorders>
+            <w:tcMar>
+              <w:top w:type="dxa" w:w="40"/>
+              <w:left w:type="dxa" w:w="80"/>
+              <w:bottom w:type="dxa" w:w="40"/>
+              <w:right w:type="dxa" w:w="80"/>
+            </w:tcMar>
+          </w:tcPr>
+          <w:p>
+            <w:pPr>
+              <w:jc w:val="left"/>
+            </w:pPr>
+            <w:r>
+              <w:rPr>
+                <w:rFonts w:ascii="Times New Roman" w:cs="Times New Roman" w:eastAsia="Times New Roman" w:hAnsi="Times New Roman"/>
+                <w:sz w:val="18"/>
+                <w:szCs w:val="18"/>
+              </w:rPr>
+              <w:t xml:space="preserve">R5: a technical sidetrack whose NOD record is its parent leg's (15/9-19 BT2 with 19 B, 19 ST2 with 19 SR). R7: any wellbore that no other rule fits.</w:t>
+            </w:r>
+          </w:p>
+        </w:tc>
+        <w:tc>
+          <w:tcPr>
+            <w:tcW w:type="dxa" w:w="2960"/>
+            <w:tcBorders>
+              <w:top w:val="single" w:color="808080" w:sz="4"/>
+              <w:left w:val="single" w:color="808080" w:sz="4"/>
+              <w:bottom w:val="single" w:color="808080" w:sz="4"/>
+              <w:right w:val="single" w:color="808080" w:sz="4"/>
+            </w:tcBorders>
+            <w:tcMar>
+              <w:top w:type="dxa" w:w="40"/>
+              <w:left w:type="dxa" w:w="80"/>
+              <w:bottom w:type="dxa" w:w="40"/>
+              <w:right w:type="dxa" w:w="80"/>
+            </w:tcMar>
+          </w:tcPr>
+          <w:p>
+            <w:pPr>
+              <w:jc w:val="left"/>
+            </w:pPr>
+            <w:r>
+              <w:rPr>
+                <w:rFonts w:ascii="Times New Roman" w:cs="Times New Roman" w:eastAsia="Times New Roman" w:hAnsi="Times New Roman"/>
+                <w:sz w:val="18"/>
+                <w:szCs w:val="18"/>
+              </w:rPr>
+              <w:t xml:space="preserve">15/9-19 BT2, 19 S, 19 ST2, F-9, F-11 (NOD records a pre-drill campaign, 6 to 17 April 2012, that is absent from the DDR archive; the 2013 reports describe a fresh spud from seabed, so the relationship between the campaigns cannot be determined from these records)</w:t>
             </w:r>
           </w:p>
         </w:tc>
@@ -10061,33 +10250,30 @@
       <w:tr>
         <w:trPr>
           <w:cantSplit/>
-          <w:tblHeader w:val="off"/>
         </w:trPr>
         <w:tc>
           <w:tcPr>
-            <w:tcW w:type="dxa" w:w="3300"/>
-            <w:tcBorders>
-              <w:top w:val="single" w:color="808080" w:sz="4"/>
-              <w:left w:val="single" w:color="808080" w:sz="4"/>
-              <w:bottom w:val="single" w:color="808080" w:sz="4"/>
-              <w:right w:val="single" w:color="808080" w:sz="4"/>
-            </w:tcBorders>
-            <w:tcMar>
-              <w:top w:type="dxa" w:w="40"/>
-              <w:left w:type="dxa" w:w="80"/>
-              <w:bottom w:type="dxa" w:w="40"/>
-              <w:right w:type="dxa" w:w="80"/>
-            </w:tcMar>
-          </w:tcPr>
-          <w:p>
-            <w:pPr>
-              <w:jc w:val="left"/>
-            </w:pPr>
-            <w:r>
-              <w:rPr>
-                <w:rFonts w:ascii="Times New Roman" w:cs="Times New Roman" w:eastAsia="Times New Roman" w:hAnsi="Times New Roman"/>
-                <w:b w:val="false"/>
-                <w:bCs w:val="false"/>
+            <w:tcW w:type="dxa" w:w="1700"/>
+            <w:tcBorders>
+              <w:top w:val="single" w:color="808080" w:sz="4"/>
+              <w:left w:val="single" w:color="808080" w:sz="4"/>
+              <w:bottom w:val="single" w:color="808080" w:sz="4"/>
+              <w:right w:val="single" w:color="808080" w:sz="4"/>
+            </w:tcBorders>
+            <w:tcMar>
+              <w:top w:type="dxa" w:w="40"/>
+              <w:left w:type="dxa" w:w="80"/>
+              <w:bottom w:type="dxa" w:w="40"/>
+              <w:right w:type="dxa" w:w="80"/>
+            </w:tcMar>
+          </w:tcPr>
+          <w:p>
+            <w:pPr>
+              <w:jc w:val="left"/>
+            </w:pPr>
+            <w:r>
+              <w:rPr>
+                <w:rFonts w:ascii="Times New Roman" w:cs="Times New Roman" w:eastAsia="Times New Roman" w:hAnsi="Times New Roman"/>
                 <w:sz w:val="18"/>
                 <w:szCs w:val="18"/>
               </w:rPr>
@@ -10097,29 +10283,27 @@
         </w:tc>
         <w:tc>
           <w:tcPr>
-            <w:tcW w:type="dxa" w:w="1200"/>
-            <w:tcBorders>
-              <w:top w:val="single" w:color="808080" w:sz="4"/>
-              <w:left w:val="single" w:color="808080" w:sz="4"/>
-              <w:bottom w:val="single" w:color="808080" w:sz="4"/>
-              <w:right w:val="single" w:color="808080" w:sz="4"/>
-            </w:tcBorders>
-            <w:tcMar>
-              <w:top w:type="dxa" w:w="40"/>
-              <w:left w:type="dxa" w:w="80"/>
-              <w:bottom w:type="dxa" w:w="40"/>
-              <w:right w:type="dxa" w:w="80"/>
-            </w:tcMar>
-          </w:tcPr>
-          <w:p>
-            <w:pPr>
-              <w:jc w:val="left"/>
-            </w:pPr>
-            <w:r>
-              <w:rPr>
-                <w:rFonts w:ascii="Times New Roman" w:cs="Times New Roman" w:eastAsia="Times New Roman" w:hAnsi="Times New Roman"/>
-                <w:b w:val="false"/>
-                <w:bCs w:val="false"/>
+            <w:tcW w:type="dxa" w:w="800"/>
+            <w:tcBorders>
+              <w:top w:val="single" w:color="808080" w:sz="4"/>
+              <w:left w:val="single" w:color="808080" w:sz="4"/>
+              <w:bottom w:val="single" w:color="808080" w:sz="4"/>
+              <w:right w:val="single" w:color="808080" w:sz="4"/>
+            </w:tcBorders>
+            <w:tcMar>
+              <w:top w:type="dxa" w:w="40"/>
+              <w:left w:type="dxa" w:w="80"/>
+              <w:bottom w:type="dxa" w:w="40"/>
+              <w:right w:type="dxa" w:w="80"/>
+            </w:tcMar>
+          </w:tcPr>
+          <w:p>
+            <w:pPr>
+              <w:jc w:val="left"/>
+            </w:pPr>
+            <w:r>
+              <w:rPr>
+                <w:rFonts w:ascii="Times New Roman" w:cs="Times New Roman" w:eastAsia="Times New Roman" w:hAnsi="Times New Roman"/>
                 <w:sz w:val="18"/>
                 <w:szCs w:val="18"/>
               </w:rPr>
@@ -10129,28 +10313,81 @@
         </w:tc>
         <w:tc>
           <w:tcPr>
-            <w:tcW w:type="dxa" w:w="4860"/>
-            <w:tcBorders>
-              <w:top w:val="single" w:color="808080" w:sz="4"/>
-              <w:left w:val="single" w:color="808080" w:sz="4"/>
-              <w:bottom w:val="single" w:color="808080" w:sz="4"/>
-              <w:right w:val="single" w:color="808080" w:sz="4"/>
-            </w:tcBorders>
-            <w:tcMar>
-              <w:top w:type="dxa" w:w="40"/>
-              <w:left w:type="dxa" w:w="80"/>
-              <w:bottom w:type="dxa" w:w="40"/>
-              <w:right w:type="dxa" w:w="80"/>
-            </w:tcMar>
-          </w:tcPr>
-          <w:p>
-            <w:pPr>
-              <w:jc w:val="left"/>
-            </w:pPr>
+            <w:tcW w:type="dxa" w:w="3900"/>
+            <w:tcBorders>
+              <w:top w:val="single" w:color="808080" w:sz="4"/>
+              <w:left w:val="single" w:color="808080" w:sz="4"/>
+              <w:bottom w:val="single" w:color="808080" w:sz="4"/>
+              <w:right w:val="single" w:color="808080" w:sz="4"/>
+            </w:tcBorders>
+            <w:tcMar>
+              <w:top w:type="dxa" w:w="40"/>
+              <w:left w:type="dxa" w:w="80"/>
+              <w:bottom w:type="dxa" w:w="40"/>
+              <w:right w:type="dxa" w:w="80"/>
+            </w:tcMar>
+          </w:tcPr>
+          <w:p>
+            <w:pPr>
+              <w:jc w:val="left"/>
+            </w:pPr>
+            <w:r>
+              <w:rPr>
+                <w:rFonts w:ascii="Times New Roman" w:cs="Times New Roman" w:eastAsia="Times New Roman" w:hAnsi="Times New Roman"/>
+                <w:sz w:val="18"/>
+                <w:szCs w:val="18"/>
+              </w:rPr>
+              <w:t xml:space="preserve"/>
+            </w:r>
+          </w:p>
+        </w:tc>
+        <w:tc>
+          <w:tcPr>
+            <w:tcW w:type="dxa" w:w="2960"/>
+            <w:tcBorders>
+              <w:top w:val="single" w:color="808080" w:sz="4"/>
+              <w:left w:val="single" w:color="808080" w:sz="4"/>
+              <w:bottom w:val="single" w:color="808080" w:sz="4"/>
+              <w:right w:val="single" w:color="808080" w:sz="4"/>
+            </w:tcBorders>
+            <w:tcMar>
+              <w:top w:type="dxa" w:w="40"/>
+              <w:left w:type="dxa" w:w="80"/>
+              <w:bottom w:type="dxa" w:w="40"/>
+              <w:right w:type="dxa" w:w="80"/>
+            </w:tcMar>
+          </w:tcPr>
+          <w:p>
+            <w:pPr>
+              <w:jc w:val="left"/>
+            </w:pPr>
+            <w:r>
+              <w:rPr>
+                <w:rFonts w:ascii="Times New Roman" w:cs="Times New Roman" w:eastAsia="Times New Roman" w:hAnsi="Times New Roman"/>
+                <w:sz w:val="18"/>
+                <w:szCs w:val="18"/>
+              </w:rPr>
+              <w:t xml:space="preserve"/>
+            </w:r>
           </w:p>
         </w:tc>
       </w:tr>
     </w:tbl>
+    <w:p>
+      <w:pPr>
+        <w:spacing w:after="160"/>
+      </w:pPr>
+      <w:r>
+        <w:rPr>
+          <w:rFonts w:ascii="Times New Roman" w:cs="Times New Roman" w:eastAsia="Times New Roman" w:hAnsi="Times New Roman"/>
+          <w:i/>
+          <w:iCs/>
+          <w:sz w:val="18"/>
+          <w:szCs w:val="18"/>
+        </w:rPr>
+        <w:t>Rules are applied in the order R1 (inherited), R5 (technical sidetrack), R2 (error), R3 (later campaign), R4 (exact), R6 (definitional offset), R7 (unresolved). Unresolved includes 15/9-19 S, F-9 and F-11 (R7).</w:t>
+      </w:r>
+    </w:p>
     <w:p>
       <w:pPr>
         <w:spacing w:after="60"/>
@@ -10181,7 +10418,7 @@
           <w:sz w:val="20"/>
           <w:szCs w:val="20"/>
         </w:rPr>
-        <w:t>15/9-F-1 required particular care. Its WITSML spud_date (28 November 2007) is four days before its first DDR (2 December 2007), which narrates drilling 36 in. hole from the seabed, an ordinary spud-to-first-report gap. The reports of F-1 fall into two campaigns: four reports in December 2007 with a maximum depth of 226 m, and the 2013 reports, in which the well was drilled to its total depth of 3,632 m. NOD, however, records an entry date of 23 July 2013, nearly six years later and about four weeks before the WITSML spud date (20 August 2013) and NOD entry date (23 August 2013) of 15/9-F-1 A, the sidetrack drilled from the same slot. NOD's 15/9-F-1 record most plausibly reflects the 2013 re-entry ahead of the sidetrack campaign, not the 2007 spud. The case is therefore classified as a wellbore-identity conflation: the WITSML value is consistent with the wellbore's own chronology.</w:t>
+        <w:t>15/9-F-1 required particular care. Its WITSML spud_date (28 November 2007) is four days before its first DDR (2 December 2007), which narrates drilling 36 in. hole from the seabed, an ordinary spud-to-first-report gap. The 2007 reports are top-hole only (four reports, maximum depth 226 m). F-1 was drilled to its total depth of 3,632 m in the 2013 campaign, whose first report (22 July 2013) is one day before NOD's entry date (23 July 2013). NOD records no pre-drill date for the 2007 work, unlike F-4, F-5, F-14 and F-15. NOD's date therefore marks the later campaign, not the 2007 spud, and the case is classified as NOD date marks later campaign: the WITSML value is consistent with the wellbore's own chronology.</w:t>
       </w:r>
     </w:p>
     <w:p>
@@ -10667,7 +10904,7 @@
                 <w:sz w:val="18"/>
                 <w:szCs w:val="18"/>
               </w:rPr>
-              <w:t xml:space="preserve">none in WITSML</w:t>
+              <w:t xml:space="preserve">15/9-19 S (per NOD)</w:t>
             </w:r>
           </w:p>
         </w:tc>
@@ -13886,7 +14123,7 @@
           <w:sz w:val="18"/>
           <w:szCs w:val="18"/>
         </w:rPr>
-        <w:t xml:space="preserve"> Depths are m MD. NOD minus DDR is NOD's wlbKickOffPoint minus the recovered depth; blank where NOD has no value.</w:t>
+        <w:t xml:space="preserve"> Depths are m MD. NOD minus DDR is NOD's wlbKickOffPoint minus the recovered depth; blank where NOD has no value. 15/9-19 A: NOD lists 15/9-19 S as its parent wellbore. 15/9-19 S exists as a WITSML wellbore (reports of 1992), but the NOD record that ends on the day 15/9-19 A was entered (15/9-19 SR2, 18 to 25 July 1997) has no WITSML wellbore, so no WITSML parent report precedes the 15/9-19 A reports and its kick-off depth is read from those reports.</w:t>
       </w:r>
     </w:p>
     <w:p>
@@ -15495,7 +15732,7 @@
                 <w:sz w:val="18"/>
                 <w:szCs w:val="18"/>
               </w:rPr>
-              <w:t xml:space="preserve">86</w:t>
+              <w:t xml:space="preserve">86.0</w:t>
             </w:r>
           </w:p>
         </w:tc>
@@ -16324,7 +16561,7 @@
                 <w:szCs w:val="18"/>
                 <w:highlight w:val="yellow"/>
               </w:rPr>
-              <w:t xml:space="preserve">354</w:t>
+              <w:t xml:space="preserve">354.0</w:t>
             </w:r>
           </w:p>
         </w:tc>
@@ -16601,7 +16838,7 @@
                 <w:szCs w:val="18"/>
                 <w:highlight w:val="yellow"/>
               </w:rPr>
-              <w:t xml:space="preserve">106</w:t>
+              <w:t xml:space="preserve">106.0</w:t>
             </w:r>
           </w:p>
         </w:tc>
@@ -17705,7 +17942,7 @@
                 <w:szCs w:val="18"/>
                 <w:highlight w:val="yellow"/>
               </w:rPr>
-              <w:t xml:space="preserve">168</w:t>
+              <w:t xml:space="preserve">168.0</w:t>
             </w:r>
           </w:p>
         </w:tc>
@@ -19638,7 +19875,7 @@
                 <w:szCs w:val="18"/>
                 <w:highlight w:val="yellow"/>
               </w:rPr>
-              <w:t xml:space="preserve">156</w:t>
+              <w:t xml:space="preserve">156.0</w:t>
             </w:r>
           </w:p>
         </w:tc>
@@ -21587,7 +21824,7 @@
           <w:sz w:val="18"/>
           <w:szCs w:val="18"/>
         </w:rPr>
-        <w:t>Gap flag: elapsed days to TD exceed twice the reports to TD. Drilled length is total depth minus the Table 5 kick-off depth for sidetracks (values highlighted in yellow are provisional) and total depth for original wellbores. (indicative): TD is the depth of an abandoned parent leg or stub.</w:t>
+        <w:t>Gap flag: elapsed days to TD exceed twice the reports to TD. Drilled length is total depth minus the Table 5 kick-off depth for sidetracks (values highlighted in yellow are provisional) and total depth for original wellbores; for the original wellbores this is measured depth from the rig datum and includes the water depth. (indicative): TD is the depth of an abandoned parent leg or stub.</w:t>
       </w:r>
     </w:p>
     <w:p>
@@ -21637,7 +21874,7 @@
           <w:sz w:val="20"/>
           <w:szCs w:val="20"/>
         </w:rPr>
-        <w:t>The 1,421-row depth-time-phase dataset converts an archive of narrative reports into a form that can be queried directly. Days-versus-depth curves (Fig. 2) can be compared across wellbores drilled from the same platform, phase durations can be extracted for offset-well planning, and the classified phases locate casing, cementing, and P&amp;A operations in time and depth for each wellbore. Because the classifier is deterministic and the audit quantifies its residual, a user can bound how much of any phase-based statistic may be missing: at the attainable-rate estimate, roughly 199 DDRs of construction content remain unassigned, concentrated in drilling progress reported without a hole size. Table 6 gives elapsed days, reports and metres per report-day to total depth for each wellbore as a first benchmark, with the gap flag marking wellbores whose elapsed time cannot be read as drilling time.</w:t>
+        <w:t>The 1,421-row depth-time-phase dataset converts an archive of narrative reports into a form that can be queried directly. Depth-versus-report-count curves (Fig. 2) can be compared across wellbores drilled from the same platform, phase durations can be extracted for offset-well planning, and the classified phases locate casing, cementing, and P&amp;A operations in time and depth for each wellbore. Because the classifier is deterministic and the audit quantifies its residual, a user can bound how much of any phase-based statistic may be missing: at the attainable-rate estimate, roughly 199 DDRs of construction content remain unassigned, concentrated in drilling progress reported without a hole size. Table 6 gives elapsed days, reports and metres per report-day to total depth for each wellbore as a first benchmark, with the gap flag marking wellbores whose elapsed time cannot be read as drilling time.</w:t>
       </w:r>
     </w:p>
     <w:p>
@@ -21857,7 +22094,7 @@
           <w:sz w:val="20"/>
           <w:szCs w:val="20"/>
         </w:rPr>
-        <w:t>The audit protocol, the placeholder checks, and the wellbore-matching logic transfer directly to any WITSML 1.4.0.0 archive. The pattern set is tuned to the English-language narratives and abbreviations of one operator over one field's life, so applying it elsewhere will require a pattern review, and the audit should be repeated to measure the new residual rather than assuming the Volve figure carries over.</w:t>
+        <w:t>The audit protocol, the placeholder checks, and the wellbore-matching logic transfer directly to WITSML 1.4-series drillReport archives (tested here on 1.4.0.0). The pattern set is tuned to the English-language narratives and abbreviations of one operator over one field's life, so applying it elsewhere will require a pattern review, and the audit should be repeated to measure the new residual rather than assuming the Volve figure carries over.</w:t>
       </w:r>
     </w:p>
     <w:p>
@@ -21916,7 +22153,7 @@
           <w:sz w:val="20"/>
           <w:szCs w:val="20"/>
         </w:rPr>
-        <w:t xml:space="preserve">Two records were assigned to a stratum that does not reflect their operational context, although both were adjudicated correctly on content. The 1980 date sentinel for 15/9-19 A places that wellbore's 1997 drilling in the production-era stratum, and 15/9-F-1's 2013 re-entry reports ahead of the F-1 A sidetrack also fall into the production-era stratum.</w:t>
+        <w:t>Two records were assigned to a stratum that does not reflect their operational context, although both were adjudicated correctly on content. The 1980 date sentinel for 15/9-19 A places that wellbore's 1997 drilling in the production-era stratum, and 15/9-F-1's 2013 drilling campaign reports also fall into the production-era stratum.</w:t>
       </w:r>
     </w:p>
     <w:p>
@@ -22130,7 +22367,7 @@
           <w:sz w:val="20"/>
           <w:szCs w:val="20"/>
         </w:rPr>
-        <w:t xml:space="preserve">The structured spud date should not be used without checking it against the first DDR: four wellbores carry data-entry errors, two sidetracks carry inherited values, and one apparent error is a wellbore-identity conflation in the register.</w:t>
+        <w:t>The structured spud date should not be used without checking it against the first DDR: four wellbores carry data-entry errors, two sidetracks carry inherited values, and one apparent error is a NOD entry date that marks a later drilling campaign.</w:t>
       </w:r>
     </w:p>
     <w:p>
@@ -22495,7 +22732,7 @@
           <w:sz w:val="20"/>
           <w:szCs w:val="20"/>
         </w:rPr>
-        <w:t xml:space="preserve">Energistics. n.d.. </w:t>
+        <w:t xml:space="preserve">Energistics. n.d. </w:t>
       </w:r>
       <w:r>
         <w:rPr>
@@ -22753,13 +22990,14 @@
     </w:p>
     <w:p>
       <w:pPr>
-        <w:spacing w:after="120" w:line="264"/>
+        <w:keepNext/>
+        <w:spacing w:after="120"/>
         <w:jc w:val="center"/>
       </w:pPr>
       <w:r>
         <w:drawing>
           <wp:inline xmlns:a="http://schemas.openxmlformats.org/drawingml/2006/main" xmlns:pic="http://schemas.openxmlformats.org/drawingml/2006/picture">
-            <wp:extent cx="5943600" cy="1722024"/>
+            <wp:extent cx="5943600" cy="1689627"/>
             <wp:docPr id="1" name="Picture 1"/>
             <wp:cNvGraphicFramePr>
               <a:graphicFrameLocks noChangeAspect="1"/>
@@ -22780,7 +23018,7 @@
                   <pic:spPr>
                     <a:xfrm>
                       <a:off x="0" y="0"/>
-                      <a:ext cx="5943600" cy="1722024"/>
+                      <a:ext cx="5943600" cy="1689627"/>
                     </a:xfrm>
                     <a:prstGeom prst="rect"/>
                   </pic:spPr>
@@ -22793,7 +23031,6 @@
     </w:p>
     <w:p>
       <w:pPr>
-        <w:keepNext/>
         <w:spacing w:after="80" w:before="160"/>
       </w:pPr>
       <w:r>
@@ -22809,13 +23046,14 @@
     </w:p>
     <w:p>
       <w:pPr>
-        <w:spacing w:after="120" w:line="264"/>
+        <w:keepNext/>
+        <w:spacing w:after="120"/>
         <w:jc w:val="center"/>
       </w:pPr>
       <w:r>
         <w:drawing>
           <wp:inline xmlns:a="http://schemas.openxmlformats.org/drawingml/2006/main" xmlns:pic="http://schemas.openxmlformats.org/drawingml/2006/picture">
-            <wp:extent cx="5486400" cy="3454586"/>
+            <wp:extent cx="5486400" cy="3473042"/>
             <wp:docPr id="2" name="Picture 2"/>
             <wp:cNvGraphicFramePr>
               <a:graphicFrameLocks noChangeAspect="1"/>
@@ -22836,7 +23074,7 @@
                   <pic:spPr>
                     <a:xfrm>
                       <a:off x="0" y="0"/>
-                      <a:ext cx="5486400" cy="3454586"/>
+                      <a:ext cx="5486400" cy="3473042"/>
                     </a:xfrm>
                     <a:prstGeom prst="rect"/>
                   </pic:spPr>
@@ -22849,7 +23087,6 @@
     </w:p>
     <w:p>
       <w:pPr>
-        <w:keepNext/>
         <w:spacing w:after="80" w:before="160"/>
       </w:pPr>
       <w:r>
@@ -22860,18 +23097,19 @@
           <w:sz w:val="20"/>
           <w:szCs w:val="20"/>
         </w:rPr>
-        <w:t>Fig. 2: Days from first report with recorded depth versus measured depth for all 26 wellbores, coloured by hole section (other phases and unclassified reports in grey).</w:t>
+        <w:t>Fig. 2: Report number (1 = the wellbore's first report with recorded depth) versus measured depth for all 26 wellbores, coloured by hole section (other phases and unclassified reports in grey).</w:t>
       </w:r>
     </w:p>
     <w:p>
       <w:pPr>
-        <w:spacing w:after="120" w:line="264"/>
+        <w:keepNext/>
+        <w:spacing w:after="120"/>
         <w:jc w:val="center"/>
       </w:pPr>
       <w:r>
         <w:drawing>
           <wp:inline xmlns:a="http://schemas.openxmlformats.org/drawingml/2006/main" xmlns:pic="http://schemas.openxmlformats.org/drawingml/2006/picture">
-            <wp:extent cx="4754880" cy="4832711"/>
+            <wp:extent cx="4754880" cy="4641203"/>
             <wp:docPr id="3" name="Picture 3"/>
             <wp:cNvGraphicFramePr>
               <a:graphicFrameLocks noChangeAspect="1"/>
@@ -22892,7 +23130,7 @@
                   <pic:spPr>
                     <a:xfrm>
                       <a:off x="0" y="0"/>
-                      <a:ext cx="4754880" cy="4832711"/>
+                      <a:ext cx="4754880" cy="4641203"/>
                     </a:xfrm>
                     <a:prstGeom prst="rect"/>
                   </pic:spPr>
@@ -22905,7 +23143,6 @@
     </w:p>
     <w:p>
       <w:pPr>
-        <w:keepNext/>
         <w:spacing w:after="80" w:before="160"/>
       </w:pPr>
       <w:r>
@@ -22916,18 +23153,19 @@
           <w:sz w:val="20"/>
           <w:szCs w:val="20"/>
         </w:rPr>
-        <w:t xml:space="preserve">Fig. 3: Reconstructed WITSML maximum MD versus NOD total depth for the 24 matched wellbores, with 1:1 reference line.</w:t>
+        <w:t>Fig. 3: Reconstructed WITSML maximum MD versus NOD total depth for the 24 matched wellbores, with 1:1 reference line. The two unmatched wellbores (15/9-19 B and 15/9-F-11) are not plotted.</w:t>
       </w:r>
     </w:p>
     <w:p>
       <w:pPr>
-        <w:spacing w:after="120" w:line="264"/>
+        <w:keepNext/>
+        <w:spacing w:after="120"/>
         <w:jc w:val="center"/>
       </w:pPr>
       <w:r>
         <w:drawing>
           <wp:inline xmlns:a="http://schemas.openxmlformats.org/drawingml/2006/main" xmlns:pic="http://schemas.openxmlformats.org/drawingml/2006/picture">
-            <wp:extent cx="4937760" cy="4458512"/>
+            <wp:extent cx="4937760" cy="4438996"/>
             <wp:docPr id="4" name="Picture 4"/>
             <wp:cNvGraphicFramePr>
               <a:graphicFrameLocks noChangeAspect="1"/>
@@ -22948,7 +23186,7 @@
                   <pic:spPr>
                     <a:xfrm>
                       <a:off x="0" y="0"/>
-                      <a:ext cx="4937760" cy="4458512"/>
+                      <a:ext cx="4937760" cy="4438996"/>
                     </a:xfrm>
                     <a:prstGeom prst="rect"/>
                   </pic:spPr>
@@ -22961,7 +23199,6 @@
     </w:p>
     <w:p>
       <w:pPr>
-        <w:keepNext/>
         <w:spacing w:after="80" w:before="160"/>
       </w:pPr>
       <w:r>
@@ -22972,7 +23209,7 @@
           <w:sz w:val="20"/>
           <w:szCs w:val="20"/>
         </w:rPr>
-        <w:t>Fig. 4: Spud date offset (WITSML spud date minus the NOD pre-drill entry date where recorded, otherwise the NOD main entry date) for 25 wellbores, coloured by validation category. 15/9-F-11 T2 is excluded because NOD does not register it separately.</w:t>
+        <w:t>Fig. 4: Spud date offset (WITSML spud date minus the NOD pre-drill entry date where recorded, otherwise the NOD main entry date) for 25 wellbores, coloured by validation category. The bar of 15/9-F-1 (offset -2,064 days) is clipped at -400 days and labelled with its value. 15/9-F-11 T2 is excluded because NOD does not register it separately.</w:t>
       </w:r>
     </w:p>
     <w:p>
@@ -23003,7 +23240,7 @@
           <w:sz w:val="20"/>
           <w:szCs w:val="20"/>
         </w:rPr>
-        <w:t>Every quantitative figure in this paper traces to an entry in the numbers registry published in the repository (227 entries, each with the producing script and function, the SHA-256 of its input files and an execution timestamp). The audit estimates in Section 5.2 are derived arithmetically from registry entries, and the arithmetic is shown in the text.</w:t>
+        <w:t>Every quantitative figure in this paper traces to an entry in the numbers registry published in the repository (232 entries, each with the producing script and function, the SHA-256 of its input files and an execution timestamp). The audit estimates in Section 5.2 are derived arithmetically from registry entries, and the arithmetic is shown in the text.</w:t>
       </w:r>
     </w:p>
     <w:sectPr>

</xml_diff>

<commit_message>
Fig. 2 uses Table 6's report count (from first report, sentinel excluded); decision 51 updated
Co-Authored-By: Claude Sonnet 5.5 <noreply@anthropic.com>
</commit_message>
<xml_diff>
--- a/manuscript/paper2_draft.docx
+++ b/manuscript/paper2_draft.docx
@@ -4010,7 +4010,7 @@
           <w:sz w:val="20"/>
           <w:szCs w:val="20"/>
         </w:rPr>
-        <w:t>The timeline dataset contains one row per DDR with a genuine md_m value. Of 1,759 DDRs, 331 carry the sentinel and 7 the zero value, giving 1,759 − 331 − 7 = 1,421 rows; recomputing the dataset from the raw XML gave the same 1,421 rows as the earlier analysis, identical in every column. Each row carries wellbore identifier, report date, days from the wellbore's first report with a recorded depth, measured depth, assigned phase, and source filename. Days are therefore counted from each wellbore's first row with a usable depth, not from its first DDR. Fig. 2 plots report number against measured depth for all 26 wellbores. The report number counts every DDR of a wellbore, with or without a recorded depth, and is 1 for the wellbore's first report with a recorded depth; it is the unit of the reports to TD in Table 6, which starts at the wellbore's first report whether or not that report carries a depth.</w:t>
+        <w:t>The timeline dataset contains one row per DDR with a genuine md_m value. Of 1,759 DDRs, 331 carry the sentinel and 7 the zero value, giving 1,759 − 331 − 7 = 1,421 rows; recomputing the dataset from the raw XML gave the same 1,421 rows as the earlier analysis, identical in every column. Each row carries wellbore identifier, report date, days from the wellbore's first report with a recorded depth, measured depth, assigned phase, and source filename. Days are therefore counted from each wellbore's first row with a usable depth, not from its first DDR. Fig. 2 plots report number against measured depth for all 26 wellbores. The report number counts every DDR of a wellbore from its first report (1980 sentinel excluded), with or without a recorded depth, so it is the same count as the reports to TD of Table 6; only reports with a valid depth are plotted. The days_from_first_ddr column of the dataset is unchanged from v2.</w:t>
       </w:r>
     </w:p>
     <w:p>
@@ -23097,7 +23097,7 @@
           <w:sz w:val="20"/>
           <w:szCs w:val="20"/>
         </w:rPr>
-        <w:t>Fig. 2: Report number (1 = the wellbore's first report with recorded depth) versus measured depth for all 26 wellbores, coloured by hole section (other phases and unclassified reports in grey).</w:t>
+        <w:t>Fig. 2: Report number (1 = the wellbore's first report, as counted in Table 6) versus measured depth for all 26 wellbores, coloured by hole section (other phases and unclassified reports in grey).</w:t>
       </w:r>
     </w:p>
     <w:p>

</xml_diff>

<commit_message>
Kick-off sign-off applied (15 of 15 approved, none changed); PROVISIONAL flags, highlighting and DRAFT notes removed; AI disclosure updated; registry 234 entries
Co-Authored-By: Claude Sonnet 5.5 <noreply@anthropic.com>
</commit_message>
<xml_diff>
--- a/manuscript/paper2_draft.docx
+++ b/manuscript/paper2_draft.docx
@@ -61,23 +61,6 @@
           <w:highlight w:val="yellow"/>
         </w:rPr>
         <w:t xml:space="preserve">[TJ: the proposal author block reads "Department of Mining and Energy". Change the affiliation to Independent Researcher in the IPTC author portal before uploading; the portal, not this file, sets the published front matter.]</w:t>
-      </w:r>
-    </w:p>
-    <w:p>
-      <w:pPr>
-        <w:spacing w:after="240"/>
-        <w:jc w:val="center"/>
-      </w:pPr>
-      <w:r>
-        <w:rPr>
-          <w:rFonts w:ascii="Times New Roman" w:cs="Times New Roman" w:eastAsia="Times New Roman" w:hAnsi="Times New Roman"/>
-          <w:b/>
-          <w:bCs/>
-          <w:sz w:val="20"/>
-          <w:szCs w:val="20"/>
-          <w:highlight w:val="yellow"/>
-        </w:rPr>
-        <w:t>[TJ: DRAFT built from the numbers registry on 24 October 2026. Yellow highlighting marks PROVISIONAL values derived from the AI-proposed kick-off depths; they are not final until the author columns of outputs/kickoff_signoff.xlsx are filled.]</w:t>
       </w:r>
     </w:p>
     <w:p>
@@ -150,41 +133,7 @@
           <w:sz w:val="20"/>
           <w:szCs w:val="20"/>
         </w:rPr>
-        <w:t>Sidetrack kick-off depths were recovered for all 15 sidetracks by one rule; where NOD records a kick-off point (</w:t>
-      </w:r>
-      <w:r>
-        <w:rPr>
-          <w:rFonts w:ascii="Times New Roman" w:cs="Times New Roman" w:eastAsia="Times New Roman" w:hAnsi="Times New Roman"/>
-          <w:sz w:val="20"/>
-          <w:szCs w:val="20"/>
-          <w:highlight w:val="yellow"/>
-        </w:rPr>
-        <w:t>12</w:t>
-      </w:r>
-      <w:r>
-        <w:rPr>
-          <w:rFonts w:ascii="Times New Roman" w:cs="Times New Roman" w:eastAsia="Times New Roman" w:hAnsi="Times New Roman"/>
-          <w:sz w:val="20"/>
-          <w:szCs w:val="20"/>
-        </w:rPr>
-        <w:t xml:space="preserve"> of 15), the recovered depth agrees within 10 m for </w:t>
-      </w:r>
-      <w:r>
-        <w:rPr>
-          <w:rFonts w:ascii="Times New Roman" w:cs="Times New Roman" w:eastAsia="Times New Roman" w:hAnsi="Times New Roman"/>
-          <w:sz w:val="20"/>
-          <w:szCs w:val="20"/>
-          <w:highlight w:val="yellow"/>
-        </w:rPr>
-        <w:t>10</w:t>
-      </w:r>
-      <w:r>
-        <w:rPr>
-          <w:rFonts w:ascii="Times New Roman" w:cs="Times New Roman" w:eastAsia="Times New Roman" w:hAnsi="Times New Roman"/>
-          <w:sz w:val="20"/>
-          <w:szCs w:val="20"/>
-        </w:rPr>
-        <w:t>. The output is an open depth-time-phase dataset of 1,421 records, with per-wellbore durations to total depth, published with the classifier code. It supports days-versus-depth benchmarking and records-based screening of legacy wellbores, and the method transfers to other WITSML 1.4-series drillReport archives.</w:t>
+        <w:t>Sidetrack kick-off depths were recovered for all 15 sidetracks by one rule; where NOD records a kick-off point (12 of 15), the recovered depth agrees within 10 m for 10. The output is an open depth-time-phase dataset of 1,421 records, with per-wellbore durations to total depth, published with the classifier code. It supports days-versus-depth benchmarking and records-based screening of legacy wellbores, and the method transfers to other WITSML 1.4-series drillReport archives.</w:t>
       </w:r>
     </w:p>
     <w:p>
@@ -554,41 +503,7 @@
           <w:sz w:val="20"/>
           <w:szCs w:val="20"/>
         </w:rPr>
-        <w:t xml:space="preserve">For the 15/9-19 series, the DDR narratives show the physical events behind the designations, and the NOD wellbore histories (NOD 2026b, 2026c, 2026d) are consistent with them. In 15/9-19 B the drillstring became stuck at 3,272 m; the string was backed off and cut, a sidetrack plug was set, and new hole was kicked off from </w:t>
-      </w:r>
-      <w:r>
-        <w:rPr>
-          <w:rFonts w:ascii="Times New Roman" w:cs="Times New Roman" w:eastAsia="Times New Roman" w:hAnsi="Times New Roman"/>
-          <w:sz w:val="20"/>
-          <w:szCs w:val="20"/>
-          <w:highlight w:val="yellow"/>
-        </w:rPr>
-        <w:t>2,911 m</w:t>
-      </w:r>
-      <w:r>
-        <w:rPr>
-          <w:rFonts w:ascii="Times New Roman" w:cs="Times New Roman" w:eastAsia="Times New Roman" w:hAnsi="Times New Roman"/>
-          <w:sz w:val="20"/>
-          <w:szCs w:val="20"/>
-        </w:rPr>
-        <w:t xml:space="preserve"> under the identity 15/9-19 BT2, whose first report reads "REPORTING TRANSFERRED FROM 15/9-19B". 15/9-19 S shows the same sequence: stuck pipe at approximately 2,741 m, a backed-off and cut string, sidetrack language in the narrative ("MU BHA FOR SIDE TRACK"), and new hole from approximately </w:t>
-      </w:r>
-      <w:r>
-        <w:rPr>
-          <w:rFonts w:ascii="Times New Roman" w:cs="Times New Roman" w:eastAsia="Times New Roman" w:hAnsi="Times New Roman"/>
-          <w:sz w:val="20"/>
-          <w:szCs w:val="20"/>
-          <w:highlight w:val="yellow"/>
-        </w:rPr>
-        <w:t>1,536 m</w:t>
-      </w:r>
-      <w:r>
-        <w:rPr>
-          <w:rFonts w:ascii="Times New Roman" w:cs="Times New Roman" w:eastAsia="Times New Roman" w:hAnsi="Times New Roman"/>
-          <w:sz w:val="20"/>
-          <w:szCs w:val="20"/>
-        </w:rPr>
-        <w:t xml:space="preserve"> under the identity 15/9-19 ST2. In each case NOD records the final total depth against the parent designation.</w:t>
+        <w:t>For the 15/9-19 series, the DDR narratives show the physical events behind the designations, and the NOD wellbore histories (NOD 2026b, 2026c, 2026d) are consistent with them. In 15/9-19 B the drillstring became stuck at 3,272 m; the string was backed off and cut, a sidetrack plug was set, and new hole was kicked off from 2,911 m under the identity 15/9-19 BT2, whose first report reads "REPORTING TRANSFERRED FROM 15/9-19B". 15/9-19 S shows the same sequence: stuck pipe at approximately 2,741 m, a backed-off and cut string, sidetrack language in the narrative ("MU BHA FOR SIDE TRACK"), and new hole from approximately 1,536 m under the identity 15/9-19 ST2. In each case NOD records the final total depth against the parent designation.</w:t>
       </w:r>
     </w:p>
     <w:p>
@@ -10465,109 +10380,7 @@
           <w:sz w:val="20"/>
           <w:szCs w:val="20"/>
         </w:rPr>
-        <w:t xml:space="preserve">All 15 sidetracks by designation (15/9-19 A, 19 B, 19 BT2 and 19 ST2, F-1 A, F-1 B and F-1 C, F-9 A, F-11 A, F-11 B and F-11 T2, and F-15 A to F-15 D) yielded a kick-off depth (Table 5). For </w:t>
-      </w:r>
-      <w:r>
-        <w:rPr>
-          <w:rFonts w:ascii="Times New Roman" w:cs="Times New Roman" w:eastAsia="Times New Roman" w:hAnsi="Times New Roman"/>
-          <w:sz w:val="20"/>
-          <w:szCs w:val="20"/>
-          <w:highlight w:val="yellow"/>
-        </w:rPr>
-        <w:t>11</w:t>
-      </w:r>
-      <w:r>
-        <w:rPr>
-          <w:rFonts w:ascii="Times New Roman" w:cs="Times New Roman" w:eastAsia="Times New Roman" w:hAnsi="Times New Roman"/>
-          <w:sz w:val="20"/>
-          <w:szCs w:val="20"/>
-        </w:rPr>
-        <w:t xml:space="preserve"> the depth is written in the narrative; for </w:t>
-      </w:r>
-      <w:r>
-        <w:rPr>
-          <w:rFonts w:ascii="Times New Roman" w:cs="Times New Roman" w:eastAsia="Times New Roman" w:hAnsi="Times New Roman"/>
-          <w:sz w:val="20"/>
-          <w:szCs w:val="20"/>
-          <w:highlight w:val="yellow"/>
-        </w:rPr>
-        <w:t>3</w:t>
-      </w:r>
-      <w:r>
-        <w:rPr>
-          <w:rFonts w:ascii="Times New Roman" w:cs="Times New Roman" w:eastAsia="Times New Roman" w:hAnsi="Times New Roman"/>
-          <w:sz w:val="20"/>
-          <w:szCs w:val="20"/>
-        </w:rPr>
-        <w:t xml:space="preserve"> (15/9-F-1 A, F-1 B and F-15 D) the narrative names the kick-off event but not the depth, which is taken from the measured depth of the same report; for </w:t>
-      </w:r>
-      <w:r>
-        <w:rPr>
-          <w:rFonts w:ascii="Times New Roman" w:cs="Times New Roman" w:eastAsia="Times New Roman" w:hAnsi="Times New Roman"/>
-          <w:sz w:val="20"/>
-          <w:szCs w:val="20"/>
-          <w:highlight w:val="yellow"/>
-        </w:rPr>
-        <w:t>1</w:t>
-      </w:r>
-      <w:r>
-        <w:rPr>
-          <w:rFonts w:ascii="Times New Roman" w:cs="Times New Roman" w:eastAsia="Times New Roman" w:hAnsi="Times New Roman"/>
-          <w:sz w:val="20"/>
-          <w:szCs w:val="20"/>
-        </w:rPr>
-        <w:t xml:space="preserve"> (15/9-19 ST2) both reports at the transition are empty and the depth is the measured depth there, the weakest case. For 15/9-F-1 C the last F-1 B report of 22 February 2014 reads "Commenced time drilling to1364 m. 50% formation obtained at 1364 m.", and the first F-1 C report drills 17 1/2 in. hole from that depth, so the kick-off is </w:t>
-      </w:r>
-      <w:r>
-        <w:rPr>
-          <w:rFonts w:ascii="Times New Roman" w:cs="Times New Roman" w:eastAsia="Times New Roman" w:hAnsi="Times New Roman"/>
-          <w:sz w:val="20"/>
-          <w:szCs w:val="20"/>
-          <w:highlight w:val="yellow"/>
-        </w:rPr>
-        <w:t>1,364 m</w:t>
-      </w:r>
-      <w:r>
-        <w:rPr>
-          <w:rFonts w:ascii="Times New Roman" w:cs="Times New Roman" w:eastAsia="Times New Roman" w:hAnsi="Times New Roman"/>
-          <w:sz w:val="20"/>
-          <w:szCs w:val="20"/>
-        </w:rPr>
-        <w:t xml:space="preserve">. The depth of </w:t>
-      </w:r>
-      <w:r>
-        <w:rPr>
-          <w:rFonts w:ascii="Times New Roman" w:cs="Times New Roman" w:eastAsia="Times New Roman" w:hAnsi="Times New Roman"/>
-          <w:sz w:val="20"/>
-          <w:szCs w:val="20"/>
-          <w:highlight w:val="yellow"/>
-        </w:rPr>
-        <w:t>3,059 m</w:t>
-      </w:r>
-      <w:r>
-        <w:rPr>
-          <w:rFonts w:ascii="Times New Roman" w:cs="Times New Roman" w:eastAsia="Times New Roman" w:hAnsi="Times New Roman"/>
-          <w:sz w:val="20"/>
-          <w:szCs w:val="20"/>
-        </w:rPr>
-        <w:t xml:space="preserve"> that the narratives report on 13 March 2014 is the start of the 8 1/2 in. section, after casing was run, not the kick-off. 15/9-19 A is a sidetrack whose kick-off is the top of a milled window at </w:t>
-      </w:r>
-      <w:r>
-        <w:rPr>
-          <w:rFonts w:ascii="Times New Roman" w:cs="Times New Roman" w:eastAsia="Times New Roman" w:hAnsi="Times New Roman"/>
-          <w:sz w:val="20"/>
-          <w:szCs w:val="20"/>
-          <w:highlight w:val="yellow"/>
-        </w:rPr>
-        <w:t>2,178 m</w:t>
-      </w:r>
-      <w:r>
-        <w:rPr>
-          <w:rFonts w:ascii="Times New Roman" w:cs="Times New Roman" w:eastAsia="Times New Roman" w:hAnsi="Times New Roman"/>
-          <w:sz w:val="20"/>
-          <w:szCs w:val="20"/>
-        </w:rPr>
-        <w:t xml:space="preserve"> (window milled from 2,178 to 2,183 m), a depth that NOD also records.</w:t>
+        <w:t>All 15 sidetracks by designation (15/9-19 A, 19 B, 19 BT2 and 19 ST2, F-1 A, F-1 B and F-1 C, F-9 A, F-11 A, F-11 B and F-11 T2, and F-15 A to F-15 D) yielded a kick-off depth (Table 5). For 11 the depth is written in the narrative; for 3 (15/9-F-1 A, F-1 B and F-15 D) the narrative names the kick-off event but not the depth, which is taken from the measured depth of the same report; for 1 (15/9-19 ST2) both reports at the transition are empty and the depth is the measured depth there, the weakest case. For 15/9-F-1 C the last F-1 B report of 22 February 2014 reads "Commenced time drilling to1364 m. 50% formation obtained at 1364 m.", and the first F-1 C report drills 17 1/2 in. hole from that depth, so the kick-off is 1,364 m. The depth of 3,059 m that the narratives report on 13 March 2014 is the start of the 8 1/2 in. section, after casing was run, not the kick-off. 15/9-19 A is a sidetrack whose kick-off is the top of a milled window at 2,178 m (window milled from 2,178 to 2,183 m), a depth that NOD also records.</w:t>
       </w:r>
     </w:p>
     <w:p>
@@ -10933,7 +10746,6 @@
                 <w:rFonts w:ascii="Times New Roman" w:cs="Times New Roman" w:eastAsia="Times New Roman" w:hAnsi="Times New Roman"/>
                 <w:sz w:val="18"/>
                 <w:szCs w:val="18"/>
-                <w:highlight w:val="yellow"/>
               </w:rPr>
               <w:t xml:space="preserve">2,178</w:t>
             </w:r>
@@ -11024,7 +10836,6 @@
                 <w:rFonts w:ascii="Times New Roman" w:cs="Times New Roman" w:eastAsia="Times New Roman" w:hAnsi="Times New Roman"/>
                 <w:sz w:val="18"/>
                 <w:szCs w:val="18"/>
-                <w:highlight w:val="yellow"/>
               </w:rPr>
               <w:t xml:space="preserve">0</w:t>
             </w:r>
@@ -11150,7 +10961,6 @@
                 <w:rFonts w:ascii="Times New Roman" w:cs="Times New Roman" w:eastAsia="Times New Roman" w:hAnsi="Times New Roman"/>
                 <w:sz w:val="18"/>
                 <w:szCs w:val="18"/>
-                <w:highlight w:val="yellow"/>
               </w:rPr>
               <w:t xml:space="preserve">2,231</w:t>
             </w:r>
@@ -11241,7 +11051,6 @@
                 <w:rFonts w:ascii="Times New Roman" w:cs="Times New Roman" w:eastAsia="Times New Roman" w:hAnsi="Times New Roman"/>
                 <w:sz w:val="18"/>
                 <w:szCs w:val="18"/>
-                <w:highlight w:val="yellow"/>
               </w:rPr>
               <w:t xml:space="preserve">-31</w:t>
             </w:r>
@@ -11367,7 +11176,6 @@
                 <w:rFonts w:ascii="Times New Roman" w:cs="Times New Roman" w:eastAsia="Times New Roman" w:hAnsi="Times New Roman"/>
                 <w:sz w:val="18"/>
                 <w:szCs w:val="18"/>
-                <w:highlight w:val="yellow"/>
               </w:rPr>
               <w:t xml:space="preserve">2,911</w:t>
             </w:r>
@@ -11458,7 +11266,6 @@
                 <w:rFonts w:ascii="Times New Roman" w:cs="Times New Roman" w:eastAsia="Times New Roman" w:hAnsi="Times New Roman"/>
                 <w:sz w:val="18"/>
                 <w:szCs w:val="18"/>
-                <w:highlight w:val="yellow"/>
               </w:rPr>
               <w:t xml:space="preserve"/>
             </w:r>
@@ -11584,7 +11391,6 @@
                 <w:rFonts w:ascii="Times New Roman" w:cs="Times New Roman" w:eastAsia="Times New Roman" w:hAnsi="Times New Roman"/>
                 <w:sz w:val="18"/>
                 <w:szCs w:val="18"/>
-                <w:highlight w:val="yellow"/>
               </w:rPr>
               <w:t xml:space="preserve">1,536</w:t>
             </w:r>
@@ -11675,7 +11481,6 @@
                 <w:rFonts w:ascii="Times New Roman" w:cs="Times New Roman" w:eastAsia="Times New Roman" w:hAnsi="Times New Roman"/>
                 <w:sz w:val="18"/>
                 <w:szCs w:val="18"/>
-                <w:highlight w:val="yellow"/>
               </w:rPr>
               <w:t xml:space="preserve"/>
             </w:r>
@@ -11801,7 +11606,6 @@
                 <w:rFonts w:ascii="Times New Roman" w:cs="Times New Roman" w:eastAsia="Times New Roman" w:hAnsi="Times New Roman"/>
                 <w:sz w:val="18"/>
                 <w:szCs w:val="18"/>
-                <w:highlight w:val="yellow"/>
               </w:rPr>
               <w:t xml:space="preserve">2,620</w:t>
             </w:r>
@@ -11892,7 +11696,6 @@
                 <w:rFonts w:ascii="Times New Roman" w:cs="Times New Roman" w:eastAsia="Times New Roman" w:hAnsi="Times New Roman"/>
                 <w:sz w:val="18"/>
                 <w:szCs w:val="18"/>
-                <w:highlight w:val="yellow"/>
               </w:rPr>
               <w:t xml:space="preserve">0</w:t>
             </w:r>
@@ -12018,7 +11821,6 @@
                 <w:rFonts w:ascii="Times New Roman" w:cs="Times New Roman" w:eastAsia="Times New Roman" w:hAnsi="Times New Roman"/>
                 <w:sz w:val="18"/>
                 <w:szCs w:val="18"/>
-                <w:highlight w:val="yellow"/>
               </w:rPr>
               <w:t xml:space="preserve">2,617</w:t>
             </w:r>
@@ -12109,7 +11911,6 @@
                 <w:rFonts w:ascii="Times New Roman" w:cs="Times New Roman" w:eastAsia="Times New Roman" w:hAnsi="Times New Roman"/>
                 <w:sz w:val="18"/>
                 <w:szCs w:val="18"/>
-                <w:highlight w:val="yellow"/>
               </w:rPr>
               <w:t xml:space="preserve">-13</w:t>
             </w:r>
@@ -12235,7 +12036,6 @@
                 <w:rFonts w:ascii="Times New Roman" w:cs="Times New Roman" w:eastAsia="Times New Roman" w:hAnsi="Times New Roman"/>
                 <w:sz w:val="18"/>
                 <w:szCs w:val="18"/>
-                <w:highlight w:val="yellow"/>
               </w:rPr>
               <w:t xml:space="preserve">1,364</w:t>
             </w:r>
@@ -12326,7 +12126,6 @@
                 <w:rFonts w:ascii="Times New Roman" w:cs="Times New Roman" w:eastAsia="Times New Roman" w:hAnsi="Times New Roman"/>
                 <w:sz w:val="18"/>
                 <w:szCs w:val="18"/>
-                <w:highlight w:val="yellow"/>
               </w:rPr>
               <w:t xml:space="preserve">0</w:t>
             </w:r>
@@ -12452,7 +12251,6 @@
                 <w:rFonts w:ascii="Times New Roman" w:cs="Times New Roman" w:eastAsia="Times New Roman" w:hAnsi="Times New Roman"/>
                 <w:sz w:val="18"/>
                 <w:szCs w:val="18"/>
-                <w:highlight w:val="yellow"/>
               </w:rPr>
               <w:t xml:space="preserve">421.5</w:t>
             </w:r>
@@ -12543,7 +12341,6 @@
                 <w:rFonts w:ascii="Times New Roman" w:cs="Times New Roman" w:eastAsia="Times New Roman" w:hAnsi="Times New Roman"/>
                 <w:sz w:val="18"/>
                 <w:szCs w:val="18"/>
-                <w:highlight w:val="yellow"/>
               </w:rPr>
               <w:t xml:space="preserve">+6.5</w:t>
             </w:r>
@@ -12669,7 +12466,6 @@
                 <w:rFonts w:ascii="Times New Roman" w:cs="Times New Roman" w:eastAsia="Times New Roman" w:hAnsi="Times New Roman"/>
                 <w:sz w:val="18"/>
                 <w:szCs w:val="18"/>
-                <w:highlight w:val="yellow"/>
               </w:rPr>
               <w:t xml:space="preserve">246</w:t>
             </w:r>
@@ -12760,7 +12556,6 @@
                 <w:rFonts w:ascii="Times New Roman" w:cs="Times New Roman" w:eastAsia="Times New Roman" w:hAnsi="Times New Roman"/>
                 <w:sz w:val="18"/>
                 <w:szCs w:val="18"/>
-                <w:highlight w:val="yellow"/>
               </w:rPr>
               <w:t xml:space="preserve"/>
             </w:r>
@@ -12886,7 +12681,6 @@
                 <w:rFonts w:ascii="Times New Roman" w:cs="Times New Roman" w:eastAsia="Times New Roman" w:hAnsi="Times New Roman"/>
                 <w:sz w:val="18"/>
                 <w:szCs w:val="18"/>
-                <w:highlight w:val="yellow"/>
               </w:rPr>
               <w:t xml:space="preserve">2,586</w:t>
             </w:r>
@@ -12977,7 +12771,6 @@
                 <w:rFonts w:ascii="Times New Roman" w:cs="Times New Roman" w:eastAsia="Times New Roman" w:hAnsi="Times New Roman"/>
                 <w:sz w:val="18"/>
                 <w:szCs w:val="18"/>
-                <w:highlight w:val="yellow"/>
               </w:rPr>
               <w:t xml:space="preserve">-8</w:t>
             </w:r>
@@ -13103,7 +12896,6 @@
                 <w:rFonts w:ascii="Times New Roman" w:cs="Times New Roman" w:eastAsia="Times New Roman" w:hAnsi="Times New Roman"/>
                 <w:sz w:val="18"/>
                 <w:szCs w:val="18"/>
-                <w:highlight w:val="yellow"/>
               </w:rPr>
               <w:t xml:space="preserve">2,589</w:t>
             </w:r>
@@ -13194,7 +12986,6 @@
                 <w:rFonts w:ascii="Times New Roman" w:cs="Times New Roman" w:eastAsia="Times New Roman" w:hAnsi="Times New Roman"/>
                 <w:sz w:val="18"/>
                 <w:szCs w:val="18"/>
-                <w:highlight w:val="yellow"/>
               </w:rPr>
               <w:t xml:space="preserve">-3</w:t>
             </w:r>
@@ -13320,7 +13111,6 @@
                 <w:rFonts w:ascii="Times New Roman" w:cs="Times New Roman" w:eastAsia="Times New Roman" w:hAnsi="Times New Roman"/>
                 <w:sz w:val="18"/>
                 <w:szCs w:val="18"/>
-                <w:highlight w:val="yellow"/>
               </w:rPr>
               <w:t xml:space="preserve">1,381</w:t>
             </w:r>
@@ -13411,7 +13201,6 @@
                 <w:rFonts w:ascii="Times New Roman" w:cs="Times New Roman" w:eastAsia="Times New Roman" w:hAnsi="Times New Roman"/>
                 <w:sz w:val="18"/>
                 <w:szCs w:val="18"/>
-                <w:highlight w:val="yellow"/>
               </w:rPr>
               <w:t xml:space="preserve">0</w:t>
             </w:r>
@@ -13537,7 +13326,6 @@
                 <w:rFonts w:ascii="Times New Roman" w:cs="Times New Roman" w:eastAsia="Times New Roman" w:hAnsi="Times New Roman"/>
                 <w:sz w:val="18"/>
                 <w:szCs w:val="18"/>
-                <w:highlight w:val="yellow"/>
               </w:rPr>
               <w:t xml:space="preserve">3,185</w:t>
             </w:r>
@@ -13628,7 +13416,6 @@
                 <w:rFonts w:ascii="Times New Roman" w:cs="Times New Roman" w:eastAsia="Times New Roman" w:hAnsi="Times New Roman"/>
                 <w:sz w:val="18"/>
                 <w:szCs w:val="18"/>
-                <w:highlight w:val="yellow"/>
               </w:rPr>
               <w:t xml:space="preserve">0</w:t>
             </w:r>
@@ -13754,7 +13541,6 @@
                 <w:rFonts w:ascii="Times New Roman" w:cs="Times New Roman" w:eastAsia="Times New Roman" w:hAnsi="Times New Roman"/>
                 <w:sz w:val="18"/>
                 <w:szCs w:val="18"/>
-                <w:highlight w:val="yellow"/>
               </w:rPr>
               <w:t xml:space="preserve">2,566</w:t>
             </w:r>
@@ -13845,7 +13631,6 @@
                 <w:rFonts w:ascii="Times New Roman" w:cs="Times New Roman" w:eastAsia="Times New Roman" w:hAnsi="Times New Roman"/>
                 <w:sz w:val="18"/>
                 <w:szCs w:val="18"/>
-                <w:highlight w:val="yellow"/>
               </w:rPr>
               <w:t xml:space="preserve">+9</w:t>
             </w:r>
@@ -13971,7 +13756,6 @@
                 <w:rFonts w:ascii="Times New Roman" w:cs="Times New Roman" w:eastAsia="Times New Roman" w:hAnsi="Times New Roman"/>
                 <w:sz w:val="18"/>
                 <w:szCs w:val="18"/>
-                <w:highlight w:val="yellow"/>
               </w:rPr>
               <w:t xml:space="preserve">1,380</w:t>
             </w:r>
@@ -14062,7 +13846,6 @@
                 <w:rFonts w:ascii="Times New Roman" w:cs="Times New Roman" w:eastAsia="Times New Roman" w:hAnsi="Times New Roman"/>
                 <w:sz w:val="18"/>
                 <w:szCs w:val="18"/>
-                <w:highlight w:val="yellow"/>
               </w:rPr>
               <w:t xml:space="preserve">0</w:t>
             </w:r>
@@ -14111,19 +13894,8 @@
           <w:iCs/>
           <w:sz w:val="18"/>
           <w:szCs w:val="18"/>
-          <w:highlight w:val="yellow"/>
         </w:rPr>
-        <w:t>[TJ: DRAFT. Values highlighted in yellow are PROVISIONAL: the kick-off depths were proposed by an AI tool from the narratives and are pending author verification (outputs/kickoff_signoff.xlsx). Remove this note and the highlighting once the author columns are filled.]</w:t>
-      </w:r>
-      <w:r>
-        <w:rPr>
-          <w:rFonts w:ascii="Times New Roman" w:cs="Times New Roman" w:eastAsia="Times New Roman" w:hAnsi="Times New Roman"/>
-          <w:i/>
-          <w:iCs/>
-          <w:sz w:val="18"/>
-          <w:szCs w:val="18"/>
-        </w:rPr>
-        <w:t xml:space="preserve"> Depths are m MD. NOD minus DDR is NOD's wlbKickOffPoint minus the recovered depth; blank where NOD has no value. 15/9-19 A: NOD lists 15/9-19 S as its parent wellbore. 15/9-19 S exists as a WITSML wellbore (reports of 1992), but the NOD record that ends on the day 15/9-19 A was entered (15/9-19 SR2, 18 to 25 July 1997) has no WITSML wellbore, so no WITSML parent report precedes the 15/9-19 A reports and its kick-off depth is read from those reports.</w:t>
+        <w:t>Depths are m MD. NOD minus DDR is NOD's wlbKickOffPoint minus the recovered depth; blank where NOD has no value. 15/9-19 A: NOD lists 15/9-19 S as its parent wellbore. 15/9-19 S exists as a WITSML wellbore (reports of 1992), but the NOD record that ends on the day 15/9-19 A was entered (15/9-19 SR2, 18 to 25 July 1997) has no WITSML wellbore, so no WITSML parent report precedes the 15/9-19 A reports and its kick-off depth is read from those reports.</w:t>
       </w:r>
     </w:p>
     <w:p>
@@ -14151,109 +13923,7 @@
           <w:sz w:val="20"/>
           <w:szCs w:val="20"/>
         </w:rPr>
-        <w:t xml:space="preserve">NOD's wlbKickOffPoint is available for </w:t>
-      </w:r>
-      <w:r>
-        <w:rPr>
-          <w:rFonts w:ascii="Times New Roman" w:cs="Times New Roman" w:eastAsia="Times New Roman" w:hAnsi="Times New Roman"/>
-          <w:sz w:val="20"/>
-          <w:szCs w:val="20"/>
-          <w:highlight w:val="yellow"/>
-        </w:rPr>
-        <w:t>12</w:t>
-      </w:r>
-      <w:r>
-        <w:rPr>
-          <w:rFonts w:ascii="Times New Roman" w:cs="Times New Roman" w:eastAsia="Times New Roman" w:hAnsi="Times New Roman"/>
-          <w:sz w:val="20"/>
-          <w:szCs w:val="20"/>
-        </w:rPr>
-        <w:t xml:space="preserve"> of the 15 sidetracks. It equals the recovered depth for </w:t>
-      </w:r>
-      <w:r>
-        <w:rPr>
-          <w:rFonts w:ascii="Times New Roman" w:cs="Times New Roman" w:eastAsia="Times New Roman" w:hAnsi="Times New Roman"/>
-          <w:sz w:val="20"/>
-          <w:szCs w:val="20"/>
-          <w:highlight w:val="yellow"/>
-        </w:rPr>
-        <w:t>6</w:t>
-      </w:r>
-      <w:r>
-        <w:rPr>
-          <w:rFonts w:ascii="Times New Roman" w:cs="Times New Roman" w:eastAsia="Times New Roman" w:hAnsi="Times New Roman"/>
-          <w:sz w:val="20"/>
-          <w:szCs w:val="20"/>
-        </w:rPr>
-        <w:t xml:space="preserve"> (15/9-19 A, F-1 A, F-1 C, F-15 A, F-15 B and F-15 D), differs by 10 m or less for </w:t>
-      </w:r>
-      <w:r>
-        <w:rPr>
-          <w:rFonts w:ascii="Times New Roman" w:cs="Times New Roman" w:eastAsia="Times New Roman" w:hAnsi="Times New Roman"/>
-          <w:sz w:val="20"/>
-          <w:szCs w:val="20"/>
-          <w:highlight w:val="yellow"/>
-        </w:rPr>
-        <w:t>4</w:t>
-      </w:r>
-      <w:r>
-        <w:rPr>
-          <w:rFonts w:ascii="Times New Roman" w:cs="Times New Roman" w:eastAsia="Times New Roman" w:hAnsi="Times New Roman"/>
-          <w:sz w:val="20"/>
-          <w:szCs w:val="20"/>
-        </w:rPr>
-        <w:t xml:space="preserve"> (15/9-F-9 A, F-11 A, F-11 B and F-15 C), and by more for </w:t>
-      </w:r>
-      <w:r>
-        <w:rPr>
-          <w:rFonts w:ascii="Times New Roman" w:cs="Times New Roman" w:eastAsia="Times New Roman" w:hAnsi="Times New Roman"/>
-          <w:sz w:val="20"/>
-          <w:szCs w:val="20"/>
-          <w:highlight w:val="yellow"/>
-        </w:rPr>
-        <w:t>2</w:t>
-      </w:r>
-      <w:r>
-        <w:rPr>
-          <w:rFonts w:ascii="Times New Roman" w:cs="Times New Roman" w:eastAsia="Times New Roman" w:hAnsi="Times New Roman"/>
-          <w:sz w:val="20"/>
-          <w:szCs w:val="20"/>
-        </w:rPr>
-        <w:t xml:space="preserve"> (15/9-19 B, 31 m; 15/9-F-1 B, 13 m). NOD has no kick-off value for </w:t>
-      </w:r>
-      <w:r>
-        <w:rPr>
-          <w:rFonts w:ascii="Times New Roman" w:cs="Times New Roman" w:eastAsia="Times New Roman" w:hAnsi="Times New Roman"/>
-          <w:sz w:val="20"/>
-          <w:szCs w:val="20"/>
-          <w:highlight w:val="yellow"/>
-        </w:rPr>
-        <w:t>3</w:t>
-      </w:r>
-      <w:r>
-        <w:rPr>
-          <w:rFonts w:ascii="Times New Roman" w:cs="Times New Roman" w:eastAsia="Times New Roman" w:hAnsi="Times New Roman"/>
-          <w:sz w:val="20"/>
-          <w:szCs w:val="20"/>
-        </w:rPr>
-        <w:t xml:space="preserve"> (15/9-19 BT2, 19 ST2 and F-11 T2). The least certain depths are 15/9-19 ST2, which rests on the measured depth alone, and 15/9-F-11 B, where the narrative reports cement and new formation drilled from </w:t>
-      </w:r>
-      <w:r>
-        <w:rPr>
-          <w:rFonts w:ascii="Times New Roman" w:cs="Times New Roman" w:eastAsia="Times New Roman" w:hAnsi="Times New Roman"/>
-          <w:sz w:val="20"/>
-          <w:szCs w:val="20"/>
-          <w:highlight w:val="yellow"/>
-        </w:rPr>
-        <w:t>2,531 to 2,589 m</w:t>
-      </w:r>
-      <w:r>
-        <w:rPr>
-          <w:rFonts w:ascii="Times New Roman" w:cs="Times New Roman" w:eastAsia="Times New Roman" w:hAnsi="Times New Roman"/>
-          <w:sz w:val="20"/>
-          <w:szCs w:val="20"/>
-        </w:rPr>
-        <w:t xml:space="preserve"> and the end of the interval is taken as the departure.</w:t>
+        <w:t>NOD's wlbKickOffPoint is available for 12 of the 15 sidetracks. It equals the recovered depth for 6 (15/9-19 A, F-1 A, F-1 C, F-15 A, F-15 B and F-15 D), differs by 10 m or less for 4 (15/9-F-9 A, F-11 A, F-11 B and F-15 C), and by more for 2 (15/9-19 B, 31 m; 15/9-F-1 B, 13 m). NOD has no kick-off value for 3 (15/9-19 BT2, 19 ST2 and F-11 T2). The least certain depths are 15/9-19 ST2, which rests on the measured depth alone, and 15/9-F-11 B, where the narrative reports cement and new formation drilled from 2,531 to 2,589 m and the end of the interval is taken as the departure.</w:t>
       </w:r>
     </w:p>
     <w:p>
@@ -14870,7 +14540,6 @@
                 <w:rFonts w:ascii="Times New Roman" w:cs="Times New Roman" w:eastAsia="Times New Roman" w:hAnsi="Times New Roman"/>
                 <w:sz w:val="18"/>
                 <w:szCs w:val="18"/>
-                <w:highlight w:val="yellow"/>
               </w:rPr>
               <w:t xml:space="preserve">1,953</w:t>
             </w:r>
@@ -14901,7 +14570,6 @@
                 <w:rFonts w:ascii="Times New Roman" w:cs="Times New Roman" w:eastAsia="Times New Roman" w:hAnsi="Times New Roman"/>
                 <w:sz w:val="18"/>
                 <w:szCs w:val="18"/>
-                <w:highlight w:val="yellow"/>
               </w:rPr>
               <w:t xml:space="preserve">67.3</w:t>
             </w:r>
@@ -15147,7 +14815,6 @@
                 <w:rFonts w:ascii="Times New Roman" w:cs="Times New Roman" w:eastAsia="Times New Roman" w:hAnsi="Times New Roman"/>
                 <w:sz w:val="18"/>
                 <w:szCs w:val="18"/>
-                <w:highlight w:val="yellow"/>
               </w:rPr>
               <w:t xml:space="preserve">1,041</w:t>
             </w:r>
@@ -15178,7 +14845,6 @@
                 <w:rFonts w:ascii="Times New Roman" w:cs="Times New Roman" w:eastAsia="Times New Roman" w:hAnsi="Times New Roman"/>
                 <w:sz w:val="18"/>
                 <w:szCs w:val="18"/>
-                <w:highlight w:val="yellow"/>
               </w:rPr>
               <w:t xml:space="preserve">54.8</w:t>
             </w:r>
@@ -15424,7 +15090,6 @@
                 <w:rFonts w:ascii="Times New Roman" w:cs="Times New Roman" w:eastAsia="Times New Roman" w:hAnsi="Times New Roman"/>
                 <w:sz w:val="18"/>
                 <w:szCs w:val="18"/>
-                <w:highlight w:val="yellow"/>
               </w:rPr>
               <w:t xml:space="preserve">1,339</w:t>
             </w:r>
@@ -15455,7 +15120,6 @@
                 <w:rFonts w:ascii="Times New Roman" w:cs="Times New Roman" w:eastAsia="Times New Roman" w:hAnsi="Times New Roman"/>
                 <w:sz w:val="18"/>
                 <w:szCs w:val="18"/>
-                <w:highlight w:val="yellow"/>
               </w:rPr>
               <w:t xml:space="preserve">36.2</w:t>
             </w:r>
@@ -15976,7 +15640,6 @@
                 <w:rFonts w:ascii="Times New Roman" w:cs="Times New Roman" w:eastAsia="Times New Roman" w:hAnsi="Times New Roman"/>
                 <w:sz w:val="18"/>
                 <w:szCs w:val="18"/>
-                <w:highlight w:val="yellow"/>
               </w:rPr>
               <w:t xml:space="preserve">3,105</w:t>
             </w:r>
@@ -16007,7 +15670,6 @@
                 <w:rFonts w:ascii="Times New Roman" w:cs="Times New Roman" w:eastAsia="Times New Roman" w:hAnsi="Times New Roman"/>
                 <w:sz w:val="18"/>
                 <w:szCs w:val="18"/>
-                <w:highlight w:val="yellow"/>
               </w:rPr>
               <w:t xml:space="preserve">45.7</w:t>
             </w:r>
@@ -16528,7 +16190,6 @@
                 <w:rFonts w:ascii="Times New Roman" w:cs="Times New Roman" w:eastAsia="Times New Roman" w:hAnsi="Times New Roman"/>
                 <w:sz w:val="18"/>
                 <w:szCs w:val="18"/>
-                <w:highlight w:val="yellow"/>
               </w:rPr>
               <w:t xml:space="preserve">1,062</w:t>
             </w:r>
@@ -16559,7 +16220,6 @@
                 <w:rFonts w:ascii="Times New Roman" w:cs="Times New Roman" w:eastAsia="Times New Roman" w:hAnsi="Times New Roman"/>
                 <w:sz w:val="18"/>
                 <w:szCs w:val="18"/>
-                <w:highlight w:val="yellow"/>
               </w:rPr>
               <w:t xml:space="preserve">354.0</w:t>
             </w:r>
@@ -16805,7 +16465,6 @@
                 <w:rFonts w:ascii="Times New Roman" w:cs="Times New Roman" w:eastAsia="Times New Roman" w:hAnsi="Times New Roman"/>
                 <w:sz w:val="18"/>
                 <w:szCs w:val="18"/>
-                <w:highlight w:val="yellow"/>
               </w:rPr>
               <w:t xml:space="preserve">848</w:t>
             </w:r>
@@ -16836,7 +16495,6 @@
                 <w:rFonts w:ascii="Times New Roman" w:cs="Times New Roman" w:eastAsia="Times New Roman" w:hAnsi="Times New Roman"/>
                 <w:sz w:val="18"/>
                 <w:szCs w:val="18"/>
-                <w:highlight w:val="yellow"/>
               </w:rPr>
               <w:t xml:space="preserve">106.0</w:t>
             </w:r>
@@ -17082,7 +16740,6 @@
                 <w:rFonts w:ascii="Times New Roman" w:cs="Times New Roman" w:eastAsia="Times New Roman" w:hAnsi="Times New Roman"/>
                 <w:sz w:val="18"/>
                 <w:szCs w:val="18"/>
-                <w:highlight w:val="yellow"/>
               </w:rPr>
               <w:t xml:space="preserve">2,730</w:t>
             </w:r>
@@ -17113,7 +16770,6 @@
                 <w:rFonts w:ascii="Times New Roman" w:cs="Times New Roman" w:eastAsia="Times New Roman" w:hAnsi="Times New Roman"/>
                 <w:sz w:val="18"/>
                 <w:szCs w:val="18"/>
-                <w:highlight w:val="yellow"/>
               </w:rPr>
               <w:t xml:space="preserve">124.1</w:t>
             </w:r>
@@ -17909,7 +17565,6 @@
                 <w:rFonts w:ascii="Times New Roman" w:cs="Times New Roman" w:eastAsia="Times New Roman" w:hAnsi="Times New Roman"/>
                 <w:sz w:val="18"/>
                 <w:szCs w:val="18"/>
-                <w:highlight w:val="yellow"/>
               </w:rPr>
               <w:t xml:space="preserve">1,176</w:t>
             </w:r>
@@ -17940,7 +17595,6 @@
                 <w:rFonts w:ascii="Times New Roman" w:cs="Times New Roman" w:eastAsia="Times New Roman" w:hAnsi="Times New Roman"/>
                 <w:sz w:val="18"/>
                 <w:szCs w:val="18"/>
-                <w:highlight w:val="yellow"/>
               </w:rPr>
               <w:t xml:space="preserve">168.0</w:t>
             </w:r>
@@ -18186,7 +17840,6 @@
                 <w:rFonts w:ascii="Times New Roman" w:cs="Times New Roman" w:eastAsia="Times New Roman" w:hAnsi="Times New Roman"/>
                 <w:sz w:val="18"/>
                 <w:szCs w:val="18"/>
-                <w:highlight w:val="yellow"/>
               </w:rPr>
               <w:t xml:space="preserve">2,181</w:t>
             </w:r>
@@ -18217,7 +17870,6 @@
                 <w:rFonts w:ascii="Times New Roman" w:cs="Times New Roman" w:eastAsia="Times New Roman" w:hAnsi="Times New Roman"/>
                 <w:sz w:val="18"/>
                 <w:szCs w:val="18"/>
-                <w:highlight w:val="yellow"/>
               </w:rPr>
               <w:t xml:space="preserve">145.4</w:t>
             </w:r>
@@ -18463,7 +18115,6 @@
                 <w:rFonts w:ascii="Times New Roman" w:cs="Times New Roman" w:eastAsia="Times New Roman" w:hAnsi="Times New Roman"/>
                 <w:sz w:val="18"/>
                 <w:szCs w:val="18"/>
-                <w:highlight w:val="yellow"/>
               </w:rPr>
               <w:t xml:space="preserve">4,316.1</w:t>
             </w:r>
@@ -18494,7 +18145,6 @@
                 <w:rFonts w:ascii="Times New Roman" w:cs="Times New Roman" w:eastAsia="Times New Roman" w:hAnsi="Times New Roman"/>
                 <w:sz w:val="18"/>
                 <w:szCs w:val="18"/>
-                <w:highlight w:val="yellow"/>
               </w:rPr>
               <w:t xml:space="preserve">100.4</w:t>
             </w:r>
@@ -19565,7 +19215,6 @@
                 <w:rFonts w:ascii="Times New Roman" w:cs="Times New Roman" w:eastAsia="Times New Roman" w:hAnsi="Times New Roman"/>
                 <w:sz w:val="18"/>
                 <w:szCs w:val="18"/>
-                <w:highlight w:val="yellow"/>
               </w:rPr>
               <w:t xml:space="preserve">2,714</w:t>
             </w:r>
@@ -19596,7 +19245,6 @@
                 <w:rFonts w:ascii="Times New Roman" w:cs="Times New Roman" w:eastAsia="Times New Roman" w:hAnsi="Times New Roman"/>
                 <w:sz w:val="18"/>
                 <w:szCs w:val="18"/>
-                <w:highlight w:val="yellow"/>
               </w:rPr>
               <w:t xml:space="preserve">108.6</w:t>
             </w:r>
@@ -19842,7 +19490,6 @@
                 <w:rFonts w:ascii="Times New Roman" w:cs="Times New Roman" w:eastAsia="Times New Roman" w:hAnsi="Times New Roman"/>
                 <w:sz w:val="18"/>
                 <w:szCs w:val="18"/>
-                <w:highlight w:val="yellow"/>
               </w:rPr>
               <w:t xml:space="preserve">312</w:t>
             </w:r>
@@ -19873,7 +19520,6 @@
                 <w:rFonts w:ascii="Times New Roman" w:cs="Times New Roman" w:eastAsia="Times New Roman" w:hAnsi="Times New Roman"/>
                 <w:sz w:val="18"/>
                 <w:szCs w:val="18"/>
-                <w:highlight w:val="yellow"/>
               </w:rPr>
               <w:t xml:space="preserve">156.0</w:t>
             </w:r>
@@ -20119,7 +19765,6 @@
                 <w:rFonts w:ascii="Times New Roman" w:cs="Times New Roman" w:eastAsia="Times New Roman" w:hAnsi="Times New Roman"/>
                 <w:sz w:val="18"/>
                 <w:szCs w:val="18"/>
-                <w:highlight w:val="yellow"/>
               </w:rPr>
               <w:t xml:space="preserve">666</w:t>
             </w:r>
@@ -20150,7 +19795,6 @@
                 <w:rFonts w:ascii="Times New Roman" w:cs="Times New Roman" w:eastAsia="Times New Roman" w:hAnsi="Times New Roman"/>
                 <w:sz w:val="18"/>
                 <w:szCs w:val="18"/>
-                <w:highlight w:val="yellow"/>
               </w:rPr>
               <w:t xml:space="preserve">24.7</w:t>
             </w:r>
@@ -20396,7 +20040,6 @@
                 <w:rFonts w:ascii="Times New Roman" w:cs="Times New Roman" w:eastAsia="Times New Roman" w:hAnsi="Times New Roman"/>
                 <w:sz w:val="18"/>
                 <w:szCs w:val="18"/>
-                <w:highlight w:val="yellow"/>
               </w:rPr>
               <w:t xml:space="preserve">3,305</w:t>
             </w:r>
@@ -20427,7 +20070,6 @@
                 <w:rFonts w:ascii="Times New Roman" w:cs="Times New Roman" w:eastAsia="Times New Roman" w:hAnsi="Times New Roman"/>
                 <w:sz w:val="18"/>
                 <w:szCs w:val="18"/>
-                <w:highlight w:val="yellow"/>
               </w:rPr>
               <w:t xml:space="preserve">150.2</w:t>
             </w:r>
@@ -21773,7 +21415,6 @@
                 <w:rFonts w:ascii="Times New Roman" w:cs="Times New Roman" w:eastAsia="Times New Roman" w:hAnsi="Times New Roman"/>
                 <w:sz w:val="18"/>
                 <w:szCs w:val="18"/>
-                <w:highlight w:val="yellow"/>
               </w:rPr>
               <w:t xml:space="preserve">784.5</w:t>
             </w:r>
@@ -21804,7 +21445,6 @@
                 <w:rFonts w:ascii="Times New Roman" w:cs="Times New Roman" w:eastAsia="Times New Roman" w:hAnsi="Times New Roman"/>
                 <w:sz w:val="18"/>
                 <w:szCs w:val="18"/>
-                <w:highlight w:val="yellow"/>
               </w:rPr>
               <w:t xml:space="preserve">130.8</w:t>
             </w:r>
@@ -21824,7 +21464,7 @@
           <w:sz w:val="18"/>
           <w:szCs w:val="18"/>
         </w:rPr>
-        <w:t>Gap flag: elapsed days to TD exceed twice the reports to TD. Drilled length is total depth minus the Table 5 kick-off depth for sidetracks (values highlighted in yellow are provisional) and total depth for original wellbores; for the original wellbores this is measured depth from the rig datum and includes the water depth. (indicative): TD is the depth of an abandoned parent leg or stub.</w:t>
+        <w:t>Gap flag: elapsed days to TD exceed twice the reports to TD. Drilled length is total depth minus the Table 5 kick-off depth for sidetracks and total depth for original wellbores; for the original wellbores this is measured depth from the rig datum and includes the water depth. (indicative): TD is the depth of an abandoned parent leg or stub.</w:t>
       </w:r>
     </w:p>
     <w:p>
@@ -22044,24 +21684,7 @@
           <w:sz w:val="20"/>
           <w:szCs w:val="20"/>
         </w:rPr>
-        <w:t xml:space="preserve">Assessments of depleted fields for CO2 storage, and decommissioning reviews generally, rely on an inventory of existing wellbores and on evidence of how each was constructed and abandoned. The reconstruction shows three ways in which a national register alone gives an incomplete inventory. First, abandoned parent legs below technical sidetracks (15/9-19 B to 3,272 m and 15/9-F-11 to 347 m) exist physically but are not separate register entries. Second, wellbores that share a physical interval, such as the four wellbores of the 15/9-F-1 family, which share the hole above </w:t>
-      </w:r>
-      <w:r>
-        <w:rPr>
-          <w:rFonts w:ascii="Times New Roman" w:cs="Times New Roman" w:eastAsia="Times New Roman" w:hAnsi="Times New Roman"/>
-          <w:sz w:val="20"/>
-          <w:szCs w:val="20"/>
-          <w:highlight w:val="yellow"/>
-        </w:rPr>
-        <w:t>1,364 m</w:t>
-      </w:r>
-      <w:r>
-        <w:rPr>
-          <w:rFonts w:ascii="Times New Roman" w:cs="Times New Roman" w:eastAsia="Times New Roman" w:hAnsi="Times New Roman"/>
-          <w:sz w:val="20"/>
-          <w:szCs w:val="20"/>
-        </w:rPr>
-        <w:t xml:space="preserve"> MD, are not independent penetrations above their kick-off depths. Third, the archive can simply stop: 15/9-19 S has no reports covering its final 227 m. A screening assessment should record a gap of this kind as an evidence gap rather than infer the missing history. The phase-classified timeline gives the starting point for locating the casing, cementing, and plugging records that such an assessment needs.</w:t>
+        <w:t>Assessments of depleted fields for CO2 storage, and decommissioning reviews generally, rely on an inventory of existing wellbores and on evidence of how each was constructed and abandoned. The reconstruction shows three ways in which a national register alone gives an incomplete inventory. First, abandoned parent legs below technical sidetracks (15/9-19 B to 3,272 m and 15/9-F-11 to 347 m) exist physically but are not separate register entries. Second, wellbores that share a physical interval, such as the four wellbores of the 15/9-F-1 family, which share the hole above 1,364 m MD, are not independent penetrations above their kick-off depths. Third, the archive can simply stop: 15/9-19 S has no reports covering its final 227 m. A screening assessment should record a gap of this kind as an evidence gap rather than infer the missing history. The phase-classified timeline gives the starting point for locating the casing, cementing, and plugging records that such an assessment needs.</w:t>
       </w:r>
     </w:p>
     <w:p>
@@ -22181,58 +21804,7 @@
           <w:sz w:val="20"/>
           <w:szCs w:val="20"/>
         </w:rPr>
-        <w:t>Kick-off depths were read from the narratives by one rule, and two rest on weaker evidence: 15/9-19 ST2 on the measured depth alone and 15/9-F-11 B on an interval of cement and new formation (</w:t>
-      </w:r>
-      <w:r>
-        <w:rPr>
-          <w:rFonts w:ascii="Times New Roman" w:cs="Times New Roman" w:eastAsia="Times New Roman" w:hAnsi="Times New Roman"/>
-          <w:sz w:val="20"/>
-          <w:szCs w:val="20"/>
-          <w:highlight w:val="yellow"/>
-        </w:rPr>
-        <w:t>2,531 to 2,589 m</w:t>
-      </w:r>
-      <w:r>
-        <w:rPr>
-          <w:rFonts w:ascii="Times New Roman" w:cs="Times New Roman" w:eastAsia="Times New Roman" w:hAnsi="Times New Roman"/>
-          <w:sz w:val="20"/>
-          <w:szCs w:val="20"/>
-        </w:rPr>
-        <w:t xml:space="preserve">). NOD gives no kick-off point for three sidetracks. All four wellbores of the 15/9-F-1 family (F-1, F-1 A, F-1 B and F-1 C) share the hole above </w:t>
-      </w:r>
-      <w:r>
-        <w:rPr>
-          <w:rFonts w:ascii="Times New Roman" w:cs="Times New Roman" w:eastAsia="Times New Roman" w:hAnsi="Times New Roman"/>
-          <w:sz w:val="20"/>
-          <w:szCs w:val="20"/>
-          <w:highlight w:val="yellow"/>
-        </w:rPr>
-        <w:t>1,364 m</w:t>
-      </w:r>
-      <w:r>
-        <w:rPr>
-          <w:rFonts w:ascii="Times New Roman" w:cs="Times New Roman" w:eastAsia="Times New Roman" w:hAnsi="Times New Roman"/>
-          <w:sz w:val="20"/>
-          <w:szCs w:val="20"/>
-        </w:rPr>
-        <w:t xml:space="preserve"> MD, and F-1, F-1 A and F-1 B share it above approximately </w:t>
-      </w:r>
-      <w:r>
-        <w:rPr>
-          <w:rFonts w:ascii="Times New Roman" w:cs="Times New Roman" w:eastAsia="Times New Roman" w:hAnsi="Times New Roman"/>
-          <w:sz w:val="20"/>
-          <w:szCs w:val="20"/>
-          <w:highlight w:val="yellow"/>
-        </w:rPr>
-        <w:t>2,617 to 2,620 m</w:t>
-      </w:r>
-      <w:r>
-        <w:rPr>
-          <w:rFonts w:ascii="Times New Roman" w:cs="Times New Roman" w:eastAsia="Times New Roman" w:hAnsi="Times New Roman"/>
-          <w:sz w:val="20"/>
-          <w:szCs w:val="20"/>
-        </w:rPr>
-        <w:t xml:space="preserve"> MD; any formation-level analysis treating them as independent must account for this. Metres per report-day are rates per reported day, not per elapsed day, and the elapsed time to total depth is affected by gaps between reports in the archive (the gap flag in Table 6).</w:t>
+        <w:t>Kick-off depths were read from the narratives by one rule, and two rest on weaker evidence: 15/9-19 ST2 on the measured depth alone and 15/9-F-11 B on an interval of cement and new formation (2,531 to 2,589 m). NOD gives no kick-off point for three sidetracks. All four wellbores of the 15/9-F-1 family (F-1, F-1 A, F-1 B and F-1 C) share the hole above 1,364 m MD, and F-1, F-1 A and F-1 B share it above approximately 2,617 to 2,620 m MD; any formation-level analysis treating them as independent must account for this. Metres per report-day are rates per reported day, not per elapsed day, and the elapsed time to total depth is affected by gaps between reports in the archive (the gap flag in Table 6).</w:t>
       </w:r>
     </w:p>
     <w:p>
@@ -22385,24 +21957,7 @@
           <w:sz w:val="20"/>
           <w:szCs w:val="20"/>
         </w:rPr>
-        <w:t xml:space="preserve">Sidetrack kick-off depths were recovered for all 15 sidetracks by one rule; for 15/9-F-1 C the kick-off is </w:t>
-      </w:r>
-      <w:r>
-        <w:rPr>
-          <w:rFonts w:ascii="Times New Roman" w:cs="Times New Roman" w:eastAsia="Times New Roman" w:hAnsi="Times New Roman"/>
-          <w:sz w:val="20"/>
-          <w:szCs w:val="20"/>
-          <w:highlight w:val="yellow"/>
-        </w:rPr>
-        <w:t>1,364 m</w:t>
-      </w:r>
-      <w:r>
-        <w:rPr>
-          <w:rFonts w:ascii="Times New Roman" w:cs="Times New Roman" w:eastAsia="Times New Roman" w:hAnsi="Times New Roman"/>
-          <w:sz w:val="20"/>
-          <w:szCs w:val="20"/>
-        </w:rPr>
-        <w:t>, not the 3,059 m start of the 8 1/2 in. section, and the four wellbores of the 15/9-F-1 family share their hole above that depth.</w:t>
+        <w:t>Sidetrack kick-off depths were recovered for all 15 sidetracks by one rule; for 15/9-F-1 C the kick-off is 1,364 m, not the 3,059 m start of the 8 1/2 in. section, and the four wellbores of the 15/9-F-1 family share their hole above that depth.</w:t>
       </w:r>
     </w:p>
     <w:p>
@@ -22497,24 +22052,7 @@
           <w:sz w:val="20"/>
           <w:szCs w:val="20"/>
         </w:rPr>
-        <w:t xml:space="preserve">Generative AI (Anthropic Claude, used through Claude Code) built and ran the reproducible analysis pipeline from the raw data and was used to assist with debugging, checking arithmetic and editing the manuscript text. The sidetrack kick-off depths were proposed by the AI tool from the narratives and </w:t>
-      </w:r>
-      <w:r>
-        <w:rPr>
-          <w:rFonts w:ascii="Times New Roman" w:cs="Times New Roman" w:eastAsia="Times New Roman" w:hAnsi="Times New Roman"/>
-          <w:sz w:val="20"/>
-          <w:szCs w:val="20"/>
-          <w:highlight w:val="yellow"/>
-        </w:rPr>
-        <w:t>verified by the author</w:t>
-      </w:r>
-      <w:r>
-        <w:rPr>
-          <w:rFonts w:ascii="Times New Roman" w:cs="Times New Roman" w:eastAsia="Times New Roman" w:hAnsi="Times New Roman"/>
-          <w:sz w:val="20"/>
-          <w:szCs w:val="20"/>
-        </w:rPr>
-        <w:t>. The author made all 50 audit adjudications, reviewed all AI-assisted content, and takes full responsibility for the paper.</w:t>
+        <w:t>Generative AI (Anthropic Claude, used through Claude Code) built and ran the reproducible analysis pipeline from the raw data and was used to assist with debugging, checking arithmetic and editing the manuscript text. The sidetrack kick-off depths were proposed by the AI tool from the narratives under one rule. The author rejected the tool's first proposals for three sidetracks (15/9-19 A, 15/9-F-9 A and 15/9-F-11 B) and kept the earlier values, then reviewed all 15 depths and approved every one without change. The author made all 50 audit adjudications, reviewed all AI-assisted content, and takes full responsibility for the paper.</w:t>
       </w:r>
     </w:p>
     <w:p>
@@ -23240,7 +22778,7 @@
           <w:sz w:val="20"/>
           <w:szCs w:val="20"/>
         </w:rPr>
-        <w:t>Every quantitative figure in this paper traces to an entry in the numbers registry published in the repository (232 entries, each with the producing script and function, the SHA-256 of its input files and an execution timestamp). The audit estimates in Section 5.2 are derived arithmetically from registry entries, and the arithmetic is shown in the text.</w:t>
+        <w:t>Every quantitative figure in this paper traces to an entry in the numbers registry published in the repository (234 entries, each with the producing script and function, the SHA-256 of its input files and an execution timestamp). The audit estimates in Section 5.2 are derived arithmetically from registry entries, and the arithmetic is shown in the text.</w:t>
       </w:r>
     </w:p>
     <w:sectPr>

</xml_diff>

<commit_message>
Pre-push fixes: mojibake CSV columns renamed, Section 5.6 kick-off sentence, email and workspace host redacted, decisions 53 to 56
Co-Authored-By: Claude Sonnet 5.5 <noreply@anthropic.com>
</commit_message>
<xml_diff>
--- a/manuscript/paper2_draft.docx
+++ b/manuscript/paper2_draft.docx
@@ -10366,7 +10366,7 @@
           <w:sz w:val="20"/>
           <w:szCs w:val="20"/>
         </w:rPr>
-        <w:t>Because the structured kick-off field is sparse, kick-off depth was recovered from the DDRs. The kick-off depth of a sidetrack is the depth at which it leaves its parent wellbore. It was read from the parent's last and the sidetrack's first reports by one rule applied to all sidetracks: the depth at which the narrative first reports new formation or departure from the parent hole; where none is stated, the depth at which the kick-off or window is started (for casing exits by a milled window, the top of the window); and where the narrative is empty, the measured depth at the parent-to-child transition.</w:t>
+        <w:t>Because the structured kick-off field is sparse, kick-off depth was recovered from the DDRs. The kick-off depth of a sidetrack is the depth at which it leaves its parent wellbore. Kick-off here means the depth at which a sidetrack departs its parent wellbore, not the depth at which an original wellbore begins to build angle; the structured kick-off field of 15/9-19 S (562 m in all its reports) is consistent with the latter and is not used. It was read from the parent's last and the sidetrack's first reports by one rule applied to all sidetracks: the depth at which the narrative first reports new formation or departure from the parent hole; where none is stated, the depth at which the kick-off or window is started (for casing exits by a milled window, the top of the window); and where the narrative is empty, the measured depth at the parent-to-child transition.</w:t>
       </w:r>
     </w:p>
     <w:p>
@@ -22778,7 +22778,7 @@
           <w:sz w:val="20"/>
           <w:szCs w:val="20"/>
         </w:rPr>
-        <w:t>Every quantitative figure in this paper traces to an entry in the numbers registry published in the repository (234 entries, each with the producing script and function, the SHA-256 of its input files and an execution timestamp). The audit estimates in Section 5.2 are derived arithmetically from registry entries, and the arithmetic is shown in the text.</w:t>
+        <w:t>Every quantitative figure in this paper traces to an entry in the numbers registry published in the repository (235 entries, each with the producing script and function, the SHA-256 of its input files and an execution timestamp). The audit estimates in Section 5.2 are derived arithmetically from registry entries, and the arithmetic is shown in the text.</w:t>
       </w:r>
     </w:p>
     <w:sectPr>

</xml_diff>

<commit_message>
Stage 13: README rewritten, CITATION.cff updated, availability check recorded, resolved confirmation note removed
Co-Authored-By: Claude Sonnet 5.5 <noreply@anthropic.com>
</commit_message>
<xml_diff>
--- a/manuscript/paper2_draft.docx
+++ b/manuscript/paper2_draft.docx
@@ -22083,16 +22083,7 @@
           <w:sz w:val="20"/>
           <w:szCs w:val="20"/>
         </w:rPr>
-        <w:t xml:space="preserve">The classifier (v3), the extraction and analysis code, the 1,421-row timeline dataset, the audit adjudications (file name, wellbore, date, stratum, call and miss reason), the NOD comparison tables, the kick-off and duration tables, and a numbers registry tracing every reported figure to the script that produced it are available at https://github.com/985185/volve-well-construction-timeline. DDR narrative text is not redistributed: the Volve data are available from Equinor under the Equinor Open Data Licence (https://www.equinor.com/energy/volve-data-sharing), and the repository holds only file names, dates, depths, categories and quotes of 15 words or fewer. </w:t>
-      </w:r>
-      <w:r>
-        <w:rPr>
-          <w:rFonts w:ascii="Times New Roman" w:cs="Times New Roman" w:eastAsia="Times New Roman" w:hAnsi="Times New Roman"/>
-          <w:sz w:val="20"/>
-          <w:szCs w:val="20"/>
-          <w:highlight w:val="yellow"/>
-        </w:rPr>
-        <w:t>[TJ: confirm every item listed is in the public repository before you upload the manuscript; Stage 13 checks this.]</w:t>
+        <w:t>The classifier (v3), the extraction and analysis code, the 1,421-row timeline dataset, the audit adjudications (file name, wellbore, date, stratum, call and miss reason), the NOD comparison tables, the kick-off and duration tables, and a numbers registry tracing every reported figure to the script that produced it are available at https://github.com/985185/volve-well-construction-timeline. DDR narrative text is not redistributed: the Volve data are available from Equinor under the Equinor Open Data Licence (https://www.equinor.com/energy/volve-data-sharing), and the repository holds only file names, dates, depths, categories and quotes of 15 words or fewer.</w:t>
       </w:r>
     </w:p>
     <w:p>

</xml_diff>

<commit_message>
Manuscript review round 2: Introduction, Background, Sections 3.1 to 3.5 and 5.2, new Tables 1 and 2, Appendix B, labelling words, NOD guidelines citation; tables renumbered; registry 239 entries; PDF
Co-Authored-By: Claude Sonnet 5.5 <noreply@anthropic.com>
</commit_message>
<xml_diff>
--- a/manuscript/paper2_draft.docx
+++ b/manuscript/paper2_draft.docx
@@ -105,7 +105,7 @@
           <w:sz w:val="20"/>
           <w:szCs w:val="20"/>
         </w:rPr>
-        <w:t xml:space="preserve">A deterministic, priority-ordered, rule-based classifier assigns each DDR's 24-hour narrative to one of 13 phases. The final classifier version assigns 1,303 DDRs (74.1%). A stratified audit of 50 records, drawn from the 383 unclassified DDRs that carry a genuine narrative, found 26 (52%) describing construction operations the classifier missed: drilling progress reported without a hole size, non-standard abbreviations, and operations such as fishing and fracturing for which no pattern exists. Scaled to the sampled population, this gives an estimated attainable classification rate of 85.4% (95% confidence interval 82.5 to 88.3%).</w:t>
+        <w:t>A deterministic, priority-ordered, rule-based classifier assigns each DDR's 24-hour narrative to one of 13 phases. It assigns 1,303 DDRs (74.1%). A stratified audit of 50 records, drawn from the 383 unclassified DDRs that carry a genuine narrative, found 26 (52%) describing construction operations the classifier missed: drilling progress reported without a hole size, non-standard abbreviations, and operations such as fishing and fracturing for which no pattern exists. Scaled to the sampled population, this gives an estimated attainable classification rate of 85.4% (95% confidence interval 82.5 to 88.3%).</w:t>
       </w:r>
     </w:p>
     <w:p>
@@ -119,7 +119,7 @@
           <w:sz w:val="20"/>
           <w:szCs w:val="20"/>
         </w:rPr>
-        <w:t>Of 24 wellbores with a defensible NOD counterpart, 22 agree exactly on total depth. 15/9-F-15 differs by 15 m, and 15/9-19 S differs by 227 m because the archive does not cover that wellbore's final drilling. All three naming mismatches between the two registers follow the Norwegian designation convention for technical sidetracks. Spud date comparison identified four WITSML data-entry errors, eight definitional offsets, and one NOD entry date that marks a later drilling campaign. The archive also stores placeholder values in 515 fields (331 depth sentinels, 7 zero depths, 176 literal "None" strings and one date sentinel) that a simple null test does not detect.</w:t>
+        <w:t>Of 24 wellbores with a defensible NOD counterpart, 22 agree exactly on total depth. 15/9-F-15 differs by 15 m, and 15/9-19 S differs by 227 m because the DDR archive does not cover that wellbore's final drilling. All three naming mismatches between the two registers follow the Norwegian designation convention for technical sidetracks. Spud date comparison identified four WITSML data-entry errors, eight definitional offsets, and one NOD entry date that marks a later drilling campaign. The archive also stores placeholder values in 515 fields (331 depth sentinels, 7 zero depths, 176 literal "None" strings and one date sentinel) that a simple null test does not detect.</w:t>
       </w:r>
     </w:p>
     <w:p>
@@ -164,35 +164,7 @@
           <w:sz w:val="20"/>
           <w:szCs w:val="20"/>
         </w:rPr>
-        <w:t>Daily Drilling Reports are the primary operational record of a well construction campaign. They log depth progress, casing and cementing operations, formation encounters, and non-productive time on a per-report basis. When captured in the WITSML (Wellsite Information Transfer Standard Markup Language) exchange format (Energistics n.d.), DDRs carry both structured fields (measured depth, spud date, casing depths) and a free-text narrative summarising the preceding 24 hours of operations. Reconstructing a field-scale construction timeline from this archive requires assigning each report to a construction phase, a task complicated by inconsistent terminology, abbreviation, and the heterogeneity of narrative text accumulated over a field's multi-decade life.</w:t>
-      </w:r>
-    </w:p>
-    <w:p>
-      <w:pPr>
-        <w:spacing w:after="120" w:line="264"/>
-        <w:jc w:val="both"/>
-      </w:pPr>
-      <w:r>
-        <w:rPr>
-          <w:rFonts w:ascii="Times New Roman" w:cs="Times New Roman" w:eastAsia="Times New Roman" w:hAnsi="Times New Roman"/>
-          <w:sz w:val="20"/>
-          <w:szCs w:val="20"/>
-        </w:rPr>
-        <w:t xml:space="preserve">This paper reconstructs such a timeline for the Equinor Volve field using 1,759 WITSML DDRs across 26 wellbores. It applies a deterministic, priority-ordered rule-based classifier to the narrative of every report, audits the unclassified residual with a formal stratified sample, and validates total depth and spud date against an independent national register, the NOD FactPages (NOD 2026a). The paper is written to be self-contained: a reader with this text, the openly available Volve dataset (Equinor 2018), and the accompanying repository should be able to reproduce every reported figure.</w:t>
-      </w:r>
-    </w:p>
-    <w:p>
-      <w:pPr>
-        <w:spacing w:after="120" w:line="264"/>
-        <w:jc w:val="both"/>
-      </w:pPr>
-      <w:r>
-        <w:rPr>
-          <w:rFonts w:ascii="Times New Roman" w:cs="Times New Roman" w:eastAsia="Times New Roman" w:hAnsi="Times New Roman"/>
-          <w:sz w:val="20"/>
-          <w:szCs w:val="20"/>
-        </w:rPr>
-        <w:t xml:space="preserve">The contribution is the combination of three elements on a real, openly licensed field archive: a fully transparent classifier, a statistical estimate of what that classifier misses, and validation against a regulator's register across every wellbore rather than a subset. The paper also documents the data-quality characteristics of the Volve DDR archive that any other user of it will meet. The Background section situates the work against published DDR text analytics. The Data and Methods section describes extraction, classification, the audit, and wellbore matching. Data Quality and Results follow, with arithmetic shown at each step, then a Discussion of what the dataset supports, Limitations, and Conclusions.</w:t>
+        <w:t>Daily Drilling Reports are the primary operational record of a well construction campaign. They log depth progress, casing and cementing operations, formation encounters, and non-productive time on a per-report basis. When captured in the WITSML (Wellsite Information Transfer Standard Markup Language) exchange format (Energistics n.d.), DDRs carry both structured fields (measured depth, spud date, casing depths) and a free-text narrative summarising the preceding 24 hours of operations. Reconstructing a field-scale construction timeline from this archive requires assigning each report to a construction phase, a task complicated by inconsistent terminology, abbreviation, and the heterogeneity of narrative text accumulated over a field's multi-decade life. This paper reconstructs such a timeline for the Equinor Volve field using 1,759 WITSML DDRs across 26 wellbores. It applies a deterministic, priority-ordered rule-based classifier to the narrative of every report, audits the unclassified residual with a formal stratified sample, and validates total depth and spud date against an independent national register, the NOD FactPages (NOD 2026a). The contribution is the combination, on a real, openly licensed field archive, of a transparent classifier, an estimate of what that classifier misses, validation against the regulator's register for every wellbore rather than a subset, and a description of the data-quality problems that any other user of the archive will meet. The paper is written to be self-contained: a reader with this text, the openly available Volve dataset (Equinor 2018), and the accompanying repository should be able to reproduce every reported figure.</w:t>
       </w:r>
     </w:p>
     <w:p>
@@ -223,7 +195,7 @@
           <w:sz w:val="20"/>
           <w:szCs w:val="20"/>
         </w:rPr>
-        <w:t>Text analytics on drilling reports has developed alongside operators' interest in extracting structured information from legacy narratives. Sidahmed et al. (2015) mined free-text reports from three wells, building a dictionary of rig terms and acronyms with drilling experts and tracking weighted term frequencies over time to flag recurring operational concerns. Priyadarshy et al. (2017) presented a framework for predicting non-productive time causes from unstructured reports. Hoffimann et al. (2017) applied deep natural language processing to classify sentences in drilling reports from hundreds of wells in a single field as events, symptoms, or actions, and noted the difficulty created by technical symbols, abbreviations, misspellings, and incomplete sentences. Zhang et al. (2022) compared keyword-based and embedding-based methods for detecting operational events in drilling remarks and found that accuracy varied across report formats.</w:t>
+        <w:t>Several studies have extracted structured information from the free text of drilling reports. Sidahmed et al. (2015) mined free-text reports from three wells, building a dictionary of rig terms and acronyms with drilling experts and tracking weighted term frequencies over time to flag recurring operational concerns. Priyadarshy et al. (2017) presented a framework for predicting non-productive time causes from unstructured reports. Hoffimann et al. (2017) applied deep natural language processing to classify sentences in drilling reports from hundreds of wells in a single field as events, symptoms, or actions, and noted the difficulty created by technical symbols, abbreviations, misspellings, and incomplete sentences. Zhang et al. (2022) compared keyword-based and embedding-based methods for detecting operational events in drilling remarks and found that accuracy varied across report formats.</w:t>
       </w:r>
     </w:p>
     <w:p>
@@ -265,7 +237,7 @@
           <w:sz w:val="20"/>
           <w:szCs w:val="20"/>
         </w:rPr>
-        <w:t xml:space="preserve">The common limitation across the published DDR work is that it relies on proprietary or synthetic data, so its results cannot be reproduced or extended by others. The present paper differs in three respects. It uses a deterministic, auditable classifier, trading model sophistication for transparency of every decision. It works exclusively with a real, openly licensed archive. It pairs classification with a stratified audit of the unclassified residual using a documented sampling frame and a Wilson-score interval (Wilson 1927), and with validation of total depth and spud date against a national register for the complete wellbore population.</w:t>
+        <w:t>The common limitation across the published DDR work is that it relies on proprietary or synthetic data, so its results cannot be reproduced or extended by others. The present paper differs in three respects: (1) it uses a deterministic, auditable classifier, trading model sophistication for transparency of every decision; (2) it works exclusively with a real, openly licensed archive; and (3) it pairs classification with a stratified audit of the unclassified residual using a documented sampling frame and a Wilson-score interval (Wilson 1927), and with validation of total depth and spud date against a national register for the complete wellbore population.</w:t>
       </w:r>
     </w:p>
     <w:p>
@@ -315,7 +287,7 @@
           <w:sz w:val="20"/>
           <w:szCs w:val="20"/>
         </w:rPr>
-        <w:t>The Volve field (block 15/9, Norwegian North Sea), operated by Equinor (formerly Statoil), was released as an open dataset after decommissioning (Equinor 2018). The DDR archive was extracted from the dataset's WITSML 1.4.0.0 XML files (1,759 files, 21,315,879 bytes, each recorded with a SHA-256 hash) into a single table holding 1,759 rows, one per DDR, with no duplicate wellbore and date pairs. The rows cover 26 wellbores in 11 well families: the exploration well 15/9-19 and the platform wells 15/9-F-1, F-4, F-5, F-7, F-9, F-10, F-11, F-12, F-14, and F-15. Columns include the source XML filename, well and wellbore identifiers, report date, spud date (WITSML dTimSpud), measured depth (md_m), kick-off depth (md_kickoff_m), last casing depth (md_csg_last_m), operational parameters, and the free-text 24-hour narrative (sum24Hr). Every field is kept as a raw string at extraction, so placeholder values stay visible, and the table is regenerated from the raw files by the published code.</w:t>
+        <w:t>The DDR archive was extracted from the Volve dataset's WITSML 1.4.0.0 XML files (1,759 files, 21,315,879 bytes, each recorded with a SHA-256 hash) into a single table holding 1,759 rows, one per DDR, with no duplicate wellbore and date pairs. The rows cover 26 wellbores in 11 well families: the exploration well 15/9-19 and the platform wells 15/9-F-1, F-4, F-5, F-7, F-9, F-10, F-11, F-12, F-14, and F-15. Columns include the source XML filename, well and wellbore identifiers, report date, spud date (WITSML dTimSpud), measured depth (md_m), kick-off depth (md_kickoff_m), last casing depth (md_csg_last_m), operational parameters, and the free-text 24-hour narrative (sum24Hr). Every field is kept as a raw string at extraction, so placeholder values stay visible, and the table is regenerated from the raw files by the published code.</w:t>
       </w:r>
     </w:p>
     <w:p>
@@ -330,6 +302,1029 @@
           <w:szCs w:val="20"/>
         </w:rPr>
         <w:t xml:space="preserve">The md_m field is stored as a string and contains two placeholder values: the literal '-999.99', used as a missing-value sentinel, and the literal '0'. Both are excluded, and the remaining values cast to a numeric type, before any depth arithmetic.</w:t>
+      </w:r>
+    </w:p>
+    <w:p>
+      <w:pPr>
+        <w:spacing w:after="120" w:line="264"/>
+        <w:jc w:val="both"/>
+      </w:pPr>
+      <w:r>
+        <w:rPr>
+          <w:rFonts w:ascii="Times New Roman" w:cs="Times New Roman" w:eastAsia="Times New Roman" w:hAnsi="Times New Roman"/>
+          <w:sz w:val="20"/>
+          <w:szCs w:val="20"/>
+        </w:rPr>
+        <w:t>Table 1 shows one report as stored in the archive, abridged: the structured fields the pipeline uses and the free-text summary that the classifier reads. The example is a real construction report whose summary contains the one-half sign. Text is quoted in fragments of at most 15 words, and "..." marks omitted text.</w:t>
+      </w:r>
+    </w:p>
+    <w:p>
+      <w:pPr>
+        <w:keepNext/>
+        <w:spacing w:after="80" w:before="160"/>
+      </w:pPr>
+      <w:r>
+        <w:rPr>
+          <w:rFonts w:ascii="Times New Roman" w:cs="Times New Roman" w:eastAsia="Times New Roman" w:hAnsi="Times New Roman"/>
+          <w:b/>
+          <w:bCs/>
+          <w:sz w:val="20"/>
+          <w:szCs w:val="20"/>
+        </w:rPr>
+        <w:t>Table 1: Example DDR as stored in the archive (abridged)</w:t>
+      </w:r>
+    </w:p>
+    <w:tbl>
+      <w:tblPr>
+        <w:tblW w:type="dxa" w:w="9360"/>
+        <w:tblBorders>
+          <w:top w:val="single" w:color="auto" w:sz="4"/>
+          <w:left w:val="single" w:color="auto" w:sz="4"/>
+          <w:bottom w:val="single" w:color="auto" w:sz="4"/>
+          <w:right w:val="single" w:color="auto" w:sz="4"/>
+          <w:insideH w:val="single" w:color="auto" w:sz="4"/>
+          <w:insideV w:val="single" w:color="auto" w:sz="4"/>
+        </w:tblBorders>
+      </w:tblPr>
+      <w:tblGrid>
+        <w:gridCol w:w="1700"/>
+        <w:gridCol w:w="4300"/>
+        <w:gridCol w:w="3360"/>
+      </w:tblGrid>
+      <w:tr>
+        <w:trPr>
+          <w:cantSplit/>
+          <w:tblHeader/>
+        </w:trPr>
+        <w:tc>
+          <w:tcPr>
+            <w:tcW w:type="dxa" w:w="1700"/>
+            <w:tcBorders>
+              <w:top w:val="single" w:color="808080" w:sz="4"/>
+              <w:left w:val="single" w:color="808080" w:sz="4"/>
+              <w:bottom w:val="single" w:color="808080" w:sz="4"/>
+              <w:right w:val="single" w:color="808080" w:sz="4"/>
+            </w:tcBorders>
+            <w:shd w:fill="E7E6E6" w:color="auto" w:val="clear"/>
+            <w:tcMar>
+              <w:top w:type="dxa" w:w="40"/>
+              <w:left w:type="dxa" w:w="80"/>
+              <w:bottom w:type="dxa" w:w="40"/>
+              <w:right w:type="dxa" w:w="80"/>
+            </w:tcMar>
+          </w:tcPr>
+          <w:p>
+            <w:pPr>
+              <w:jc w:val="left"/>
+            </w:pPr>
+            <w:r>
+              <w:rPr>
+                <w:rFonts w:ascii="Times New Roman" w:cs="Times New Roman" w:eastAsia="Times New Roman" w:hAnsi="Times New Roman"/>
+                <w:b/>
+                <w:bCs/>
+                <w:sz w:val="18"/>
+                <w:szCs w:val="18"/>
+              </w:rPr>
+              <w:t xml:space="preserve">Field</w:t>
+            </w:r>
+          </w:p>
+        </w:tc>
+        <w:tc>
+          <w:tcPr>
+            <w:tcW w:type="dxa" w:w="4300"/>
+            <w:tcBorders>
+              <w:top w:val="single" w:color="808080" w:sz="4"/>
+              <w:left w:val="single" w:color="808080" w:sz="4"/>
+              <w:bottom w:val="single" w:color="808080" w:sz="4"/>
+              <w:right w:val="single" w:color="808080" w:sz="4"/>
+            </w:tcBorders>
+            <w:shd w:fill="E7E6E6" w:color="auto" w:val="clear"/>
+            <w:tcMar>
+              <w:top w:type="dxa" w:w="40"/>
+              <w:left w:type="dxa" w:w="80"/>
+              <w:bottom w:type="dxa" w:w="40"/>
+              <w:right w:type="dxa" w:w="80"/>
+            </w:tcMar>
+          </w:tcPr>
+          <w:p>
+            <w:pPr>
+              <w:jc w:val="left"/>
+            </w:pPr>
+            <w:r>
+              <w:rPr>
+                <w:rFonts w:ascii="Times New Roman" w:cs="Times New Roman" w:eastAsia="Times New Roman" w:hAnsi="Times New Roman"/>
+                <w:b/>
+                <w:bCs/>
+                <w:sz w:val="18"/>
+                <w:szCs w:val="18"/>
+              </w:rPr>
+              <w:t xml:space="preserve">Value</w:t>
+            </w:r>
+          </w:p>
+        </w:tc>
+        <w:tc>
+          <w:tcPr>
+            <w:tcW w:type="dxa" w:w="3360"/>
+            <w:tcBorders>
+              <w:top w:val="single" w:color="808080" w:sz="4"/>
+              <w:left w:val="single" w:color="808080" w:sz="4"/>
+              <w:bottom w:val="single" w:color="808080" w:sz="4"/>
+              <w:right w:val="single" w:color="808080" w:sz="4"/>
+            </w:tcBorders>
+            <w:shd w:fill="E7E6E6" w:color="auto" w:val="clear"/>
+            <w:tcMar>
+              <w:top w:type="dxa" w:w="40"/>
+              <w:left w:type="dxa" w:w="80"/>
+              <w:bottom w:type="dxa" w:w="40"/>
+              <w:right w:type="dxa" w:w="80"/>
+            </w:tcMar>
+          </w:tcPr>
+          <w:p>
+            <w:pPr>
+              <w:jc w:val="left"/>
+            </w:pPr>
+            <w:r>
+              <w:rPr>
+                <w:rFonts w:ascii="Times New Roman" w:cs="Times New Roman" w:eastAsia="Times New Roman" w:hAnsi="Times New Roman"/>
+                <w:b/>
+                <w:bCs/>
+                <w:sz w:val="18"/>
+                <w:szCs w:val="18"/>
+              </w:rPr>
+              <w:t xml:space="preserve">Meaning</w:t>
+            </w:r>
+          </w:p>
+        </w:tc>
+      </w:tr>
+      <w:tr>
+        <w:trPr>
+          <w:cantSplit/>
+        </w:trPr>
+        <w:tc>
+          <w:tcPr>
+            <w:tcW w:type="dxa" w:w="1700"/>
+            <w:tcBorders>
+              <w:top w:val="single" w:color="808080" w:sz="4"/>
+              <w:left w:val="single" w:color="808080" w:sz="4"/>
+              <w:bottom w:val="single" w:color="808080" w:sz="4"/>
+              <w:right w:val="single" w:color="808080" w:sz="4"/>
+            </w:tcBorders>
+            <w:tcMar>
+              <w:top w:type="dxa" w:w="40"/>
+              <w:left w:type="dxa" w:w="80"/>
+              <w:bottom w:type="dxa" w:w="40"/>
+              <w:right w:type="dxa" w:w="80"/>
+            </w:tcMar>
+          </w:tcPr>
+          <w:p>
+            <w:pPr>
+              <w:jc w:val="left"/>
+            </w:pPr>
+            <w:r>
+              <w:rPr>
+                <w:rFonts w:ascii="Times New Roman" w:cs="Times New Roman" w:eastAsia="Times New Roman" w:hAnsi="Times New Roman"/>
+                <w:sz w:val="18"/>
+                <w:szCs w:val="18"/>
+              </w:rPr>
+              <w:t xml:space="preserve">wellbore</w:t>
+            </w:r>
+          </w:p>
+        </w:tc>
+        <w:tc>
+          <w:tcPr>
+            <w:tcW w:type="dxa" w:w="4300"/>
+            <w:tcBorders>
+              <w:top w:val="single" w:color="808080" w:sz="4"/>
+              <w:left w:val="single" w:color="808080" w:sz="4"/>
+              <w:bottom w:val="single" w:color="808080" w:sz="4"/>
+              <w:right w:val="single" w:color="808080" w:sz="4"/>
+            </w:tcBorders>
+            <w:tcMar>
+              <w:top w:type="dxa" w:w="40"/>
+              <w:left w:type="dxa" w:w="80"/>
+              <w:bottom w:type="dxa" w:w="40"/>
+              <w:right w:type="dxa" w:w="80"/>
+            </w:tcMar>
+          </w:tcPr>
+          <w:p>
+            <w:pPr>
+              <w:jc w:val="left"/>
+            </w:pPr>
+            <w:r>
+              <w:rPr>
+                <w:rFonts w:ascii="Times New Roman" w:cs="Times New Roman" w:eastAsia="Times New Roman" w:hAnsi="Times New Roman"/>
+                <w:sz w:val="18"/>
+                <w:szCs w:val="18"/>
+              </w:rPr>
+              <w:t xml:space="preserve">15/9-F-5</w:t>
+            </w:r>
+          </w:p>
+        </w:tc>
+        <w:tc>
+          <w:tcPr>
+            <w:tcW w:type="dxa" w:w="3360"/>
+            <w:tcBorders>
+              <w:top w:val="single" w:color="808080" w:sz="4"/>
+              <w:left w:val="single" w:color="808080" w:sz="4"/>
+              <w:bottom w:val="single" w:color="808080" w:sz="4"/>
+              <w:right w:val="single" w:color="808080" w:sz="4"/>
+            </w:tcBorders>
+            <w:tcMar>
+              <w:top w:type="dxa" w:w="40"/>
+              <w:left w:type="dxa" w:w="80"/>
+              <w:bottom w:type="dxa" w:w="40"/>
+              <w:right w:type="dxa" w:w="80"/>
+            </w:tcMar>
+          </w:tcPr>
+          <w:p>
+            <w:pPr>
+              <w:jc w:val="left"/>
+            </w:pPr>
+            <w:r>
+              <w:rPr>
+                <w:rFonts w:ascii="Times New Roman" w:cs="Times New Roman" w:eastAsia="Times New Roman" w:hAnsi="Times New Roman"/>
+                <w:sz w:val="18"/>
+                <w:szCs w:val="18"/>
+              </w:rPr>
+              <w:t xml:space="preserve">the wellbore the report belongs to</w:t>
+            </w:r>
+          </w:p>
+        </w:tc>
+      </w:tr>
+      <w:tr>
+        <w:trPr>
+          <w:cantSplit/>
+        </w:trPr>
+        <w:tc>
+          <w:tcPr>
+            <w:tcW w:type="dxa" w:w="1700"/>
+            <w:tcBorders>
+              <w:top w:val="single" w:color="808080" w:sz="4"/>
+              <w:left w:val="single" w:color="808080" w:sz="4"/>
+              <w:bottom w:val="single" w:color="808080" w:sz="4"/>
+              <w:right w:val="single" w:color="808080" w:sz="4"/>
+            </w:tcBorders>
+            <w:tcMar>
+              <w:top w:type="dxa" w:w="40"/>
+              <w:left w:type="dxa" w:w="80"/>
+              <w:bottom w:type="dxa" w:w="40"/>
+              <w:right w:type="dxa" w:w="80"/>
+            </w:tcMar>
+          </w:tcPr>
+          <w:p>
+            <w:pPr>
+              <w:jc w:val="left"/>
+            </w:pPr>
+            <w:r>
+              <w:rPr>
+                <w:rFonts w:ascii="Times New Roman" w:cs="Times New Roman" w:eastAsia="Times New Roman" w:hAnsi="Times New Roman"/>
+                <w:sz w:val="18"/>
+                <w:szCs w:val="18"/>
+              </w:rPr>
+              <w:t xml:space="preserve">date_report</w:t>
+            </w:r>
+          </w:p>
+        </w:tc>
+        <w:tc>
+          <w:tcPr>
+            <w:tcW w:type="dxa" w:w="4300"/>
+            <w:tcBorders>
+              <w:top w:val="single" w:color="808080" w:sz="4"/>
+              <w:left w:val="single" w:color="808080" w:sz="4"/>
+              <w:bottom w:val="single" w:color="808080" w:sz="4"/>
+              <w:right w:val="single" w:color="808080" w:sz="4"/>
+            </w:tcBorders>
+            <w:tcMar>
+              <w:top w:type="dxa" w:w="40"/>
+              <w:left w:type="dxa" w:w="80"/>
+              <w:bottom w:type="dxa" w:w="40"/>
+              <w:right w:type="dxa" w:w="80"/>
+            </w:tcMar>
+          </w:tcPr>
+          <w:p>
+            <w:pPr>
+              <w:jc w:val="left"/>
+            </w:pPr>
+            <w:r>
+              <w:rPr>
+                <w:rFonts w:ascii="Times New Roman" w:cs="Times New Roman" w:eastAsia="Times New Roman" w:hAnsi="Times New Roman"/>
+                <w:sz w:val="18"/>
+                <w:szCs w:val="18"/>
+              </w:rPr>
+              <w:t xml:space="preserve">2007-12-21</w:t>
+            </w:r>
+          </w:p>
+        </w:tc>
+        <w:tc>
+          <w:tcPr>
+            <w:tcW w:type="dxa" w:w="3360"/>
+            <w:tcBorders>
+              <w:top w:val="single" w:color="808080" w:sz="4"/>
+              <w:left w:val="single" w:color="808080" w:sz="4"/>
+              <w:bottom w:val="single" w:color="808080" w:sz="4"/>
+              <w:right w:val="single" w:color="808080" w:sz="4"/>
+            </w:tcBorders>
+            <w:tcMar>
+              <w:top w:type="dxa" w:w="40"/>
+              <w:left w:type="dxa" w:w="80"/>
+              <w:bottom w:type="dxa" w:w="40"/>
+              <w:right w:type="dxa" w:w="80"/>
+            </w:tcMar>
+          </w:tcPr>
+          <w:p>
+            <w:pPr>
+              <w:jc w:val="left"/>
+            </w:pPr>
+            <w:r>
+              <w:rPr>
+                <w:rFonts w:ascii="Times New Roman" w:cs="Times New Roman" w:eastAsia="Times New Roman" w:hAnsi="Times New Roman"/>
+                <w:sz w:val="18"/>
+                <w:szCs w:val="18"/>
+              </w:rPr>
+              <w:t xml:space="preserve">the day the report covers</w:t>
+            </w:r>
+          </w:p>
+        </w:tc>
+      </w:tr>
+      <w:tr>
+        <w:trPr>
+          <w:cantSplit/>
+        </w:trPr>
+        <w:tc>
+          <w:tcPr>
+            <w:tcW w:type="dxa" w:w="1700"/>
+            <w:tcBorders>
+              <w:top w:val="single" w:color="808080" w:sz="4"/>
+              <w:left w:val="single" w:color="808080" w:sz="4"/>
+              <w:bottom w:val="single" w:color="808080" w:sz="4"/>
+              <w:right w:val="single" w:color="808080" w:sz="4"/>
+            </w:tcBorders>
+            <w:tcMar>
+              <w:top w:type="dxa" w:w="40"/>
+              <w:left w:type="dxa" w:w="80"/>
+              <w:bottom w:type="dxa" w:w="40"/>
+              <w:right w:type="dxa" w:w="80"/>
+            </w:tcMar>
+          </w:tcPr>
+          <w:p>
+            <w:pPr>
+              <w:jc w:val="left"/>
+            </w:pPr>
+            <w:r>
+              <w:rPr>
+                <w:rFonts w:ascii="Times New Roman" w:cs="Times New Roman" w:eastAsia="Times New Roman" w:hAnsi="Times New Roman"/>
+                <w:sz w:val="18"/>
+                <w:szCs w:val="18"/>
+              </w:rPr>
+              <w:t xml:space="preserve">md (m)</w:t>
+            </w:r>
+          </w:p>
+        </w:tc>
+        <w:tc>
+          <w:tcPr>
+            <w:tcW w:type="dxa" w:w="4300"/>
+            <w:tcBorders>
+              <w:top w:val="single" w:color="808080" w:sz="4"/>
+              <w:left w:val="single" w:color="808080" w:sz="4"/>
+              <w:bottom w:val="single" w:color="808080" w:sz="4"/>
+              <w:right w:val="single" w:color="808080" w:sz="4"/>
+            </w:tcBorders>
+            <w:tcMar>
+              <w:top w:type="dxa" w:w="40"/>
+              <w:left w:type="dxa" w:w="80"/>
+              <w:bottom w:type="dxa" w:w="40"/>
+              <w:right w:type="dxa" w:w="80"/>
+            </w:tcMar>
+          </w:tcPr>
+          <w:p>
+            <w:pPr>
+              <w:jc w:val="left"/>
+            </w:pPr>
+            <w:r>
+              <w:rPr>
+                <w:rFonts w:ascii="Times New Roman" w:cs="Times New Roman" w:eastAsia="Times New Roman" w:hAnsi="Times New Roman"/>
+                <w:sz w:val="18"/>
+                <w:szCs w:val="18"/>
+              </w:rPr>
+              <w:t xml:space="preserve">1,415</w:t>
+            </w:r>
+          </w:p>
+        </w:tc>
+        <w:tc>
+          <w:tcPr>
+            <w:tcW w:type="dxa" w:w="3360"/>
+            <w:tcBorders>
+              <w:top w:val="single" w:color="808080" w:sz="4"/>
+              <w:left w:val="single" w:color="808080" w:sz="4"/>
+              <w:bottom w:val="single" w:color="808080" w:sz="4"/>
+              <w:right w:val="single" w:color="808080" w:sz="4"/>
+            </w:tcBorders>
+            <w:tcMar>
+              <w:top w:type="dxa" w:w="40"/>
+              <w:left w:type="dxa" w:w="80"/>
+              <w:bottom w:type="dxa" w:w="40"/>
+              <w:right w:type="dxa" w:w="80"/>
+            </w:tcMar>
+          </w:tcPr>
+          <w:p>
+            <w:pPr>
+              <w:jc w:val="left"/>
+            </w:pPr>
+            <w:r>
+              <w:rPr>
+                <w:rFonts w:ascii="Times New Roman" w:cs="Times New Roman" w:eastAsia="Times New Roman" w:hAnsi="Times New Roman"/>
+                <w:sz w:val="18"/>
+                <w:szCs w:val="18"/>
+              </w:rPr>
+              <w:t xml:space="preserve">measured depth reached, along the hole</w:t>
+            </w:r>
+          </w:p>
+        </w:tc>
+      </w:tr>
+      <w:tr>
+        <w:trPr>
+          <w:cantSplit/>
+        </w:trPr>
+        <w:tc>
+          <w:tcPr>
+            <w:tcW w:type="dxa" w:w="1700"/>
+            <w:tcBorders>
+              <w:top w:val="single" w:color="808080" w:sz="4"/>
+              <w:left w:val="single" w:color="808080" w:sz="4"/>
+              <w:bottom w:val="single" w:color="808080" w:sz="4"/>
+              <w:right w:val="single" w:color="808080" w:sz="4"/>
+            </w:tcBorders>
+            <w:tcMar>
+              <w:top w:type="dxa" w:w="40"/>
+              <w:left w:type="dxa" w:w="80"/>
+              <w:bottom w:type="dxa" w:w="40"/>
+              <w:right w:type="dxa" w:w="80"/>
+            </w:tcMar>
+          </w:tcPr>
+          <w:p>
+            <w:pPr>
+              <w:jc w:val="left"/>
+            </w:pPr>
+            <w:r>
+              <w:rPr>
+                <w:rFonts w:ascii="Times New Roman" w:cs="Times New Roman" w:eastAsia="Times New Roman" w:hAnsi="Times New Roman"/>
+                <w:sz w:val="18"/>
+                <w:szCs w:val="18"/>
+              </w:rPr>
+              <w:t xml:space="preserve">dTimSpud</w:t>
+            </w:r>
+          </w:p>
+        </w:tc>
+        <w:tc>
+          <w:tcPr>
+            <w:tcW w:type="dxa" w:w="4300"/>
+            <w:tcBorders>
+              <w:top w:val="single" w:color="808080" w:sz="4"/>
+              <w:left w:val="single" w:color="808080" w:sz="4"/>
+              <w:bottom w:val="single" w:color="808080" w:sz="4"/>
+              <w:right w:val="single" w:color="808080" w:sz="4"/>
+            </w:tcBorders>
+            <w:tcMar>
+              <w:top w:type="dxa" w:w="40"/>
+              <w:left w:type="dxa" w:w="80"/>
+              <w:bottom w:type="dxa" w:w="40"/>
+              <w:right w:type="dxa" w:w="80"/>
+            </w:tcMar>
+          </w:tcPr>
+          <w:p>
+            <w:pPr>
+              <w:jc w:val="left"/>
+            </w:pPr>
+            <w:r>
+              <w:rPr>
+                <w:rFonts w:ascii="Times New Roman" w:cs="Times New Roman" w:eastAsia="Times New Roman" w:hAnsi="Times New Roman"/>
+                <w:sz w:val="18"/>
+                <w:szCs w:val="18"/>
+              </w:rPr>
+              <w:t xml:space="preserve">2007-11-11</w:t>
+            </w:r>
+          </w:p>
+        </w:tc>
+        <w:tc>
+          <w:tcPr>
+            <w:tcW w:type="dxa" w:w="3360"/>
+            <w:tcBorders>
+              <w:top w:val="single" w:color="808080" w:sz="4"/>
+              <w:left w:val="single" w:color="808080" w:sz="4"/>
+              <w:bottom w:val="single" w:color="808080" w:sz="4"/>
+              <w:right w:val="single" w:color="808080" w:sz="4"/>
+            </w:tcBorders>
+            <w:tcMar>
+              <w:top w:type="dxa" w:w="40"/>
+              <w:left w:type="dxa" w:w="80"/>
+              <w:bottom w:type="dxa" w:w="40"/>
+              <w:right w:type="dxa" w:w="80"/>
+            </w:tcMar>
+          </w:tcPr>
+          <w:p>
+            <w:pPr>
+              <w:jc w:val="left"/>
+            </w:pPr>
+            <w:r>
+              <w:rPr>
+                <w:rFonts w:ascii="Times New Roman" w:cs="Times New Roman" w:eastAsia="Times New Roman" w:hAnsi="Times New Roman"/>
+                <w:sz w:val="18"/>
+                <w:szCs w:val="18"/>
+              </w:rPr>
+              <w:t xml:space="preserve">spud date in the report header, the same in every report of the wellbore</w:t>
+            </w:r>
+          </w:p>
+        </w:tc>
+      </w:tr>
+      <w:tr>
+        <w:trPr>
+          <w:cantSplit/>
+        </w:trPr>
+        <w:tc>
+          <w:tcPr>
+            <w:tcW w:type="dxa" w:w="1700"/>
+            <w:tcBorders>
+              <w:top w:val="single" w:color="808080" w:sz="4"/>
+              <w:left w:val="single" w:color="808080" w:sz="4"/>
+              <w:bottom w:val="single" w:color="808080" w:sz="4"/>
+              <w:right w:val="single" w:color="808080" w:sz="4"/>
+            </w:tcBorders>
+            <w:tcMar>
+              <w:top w:type="dxa" w:w="40"/>
+              <w:left w:type="dxa" w:w="80"/>
+              <w:bottom w:type="dxa" w:w="40"/>
+              <w:right w:type="dxa" w:w="80"/>
+            </w:tcMar>
+          </w:tcPr>
+          <w:p>
+            <w:pPr>
+              <w:jc w:val="left"/>
+            </w:pPr>
+            <w:r>
+              <w:rPr>
+                <w:rFonts w:ascii="Times New Roman" w:cs="Times New Roman" w:eastAsia="Times New Roman" w:hAnsi="Times New Roman"/>
+                <w:sz w:val="18"/>
+                <w:szCs w:val="18"/>
+              </w:rPr>
+              <w:t xml:space="preserve">md_kickoff</w:t>
+            </w:r>
+          </w:p>
+        </w:tc>
+        <w:tc>
+          <w:tcPr>
+            <w:tcW w:type="dxa" w:w="4300"/>
+            <w:tcBorders>
+              <w:top w:val="single" w:color="808080" w:sz="4"/>
+              <w:left w:val="single" w:color="808080" w:sz="4"/>
+              <w:bottom w:val="single" w:color="808080" w:sz="4"/>
+              <w:right w:val="single" w:color="808080" w:sz="4"/>
+            </w:tcBorders>
+            <w:tcMar>
+              <w:top w:type="dxa" w:w="40"/>
+              <w:left w:type="dxa" w:w="80"/>
+              <w:bottom w:type="dxa" w:w="40"/>
+              <w:right w:type="dxa" w:w="80"/>
+            </w:tcMar>
+          </w:tcPr>
+          <w:p>
+            <w:pPr>
+              <w:jc w:val="left"/>
+            </w:pPr>
+            <w:r>
+              <w:rPr>
+                <w:rFonts w:ascii="Times New Roman" w:cs="Times New Roman" w:eastAsia="Times New Roman" w:hAnsi="Times New Roman"/>
+                <w:sz w:val="18"/>
+                <w:szCs w:val="18"/>
+              </w:rPr>
+              <w:t xml:space="preserve">absent</w:t>
+            </w:r>
+          </w:p>
+        </w:tc>
+        <w:tc>
+          <w:tcPr>
+            <w:tcW w:type="dxa" w:w="3360"/>
+            <w:tcBorders>
+              <w:top w:val="single" w:color="808080" w:sz="4"/>
+              <w:left w:val="single" w:color="808080" w:sz="4"/>
+              <w:bottom w:val="single" w:color="808080" w:sz="4"/>
+              <w:right w:val="single" w:color="808080" w:sz="4"/>
+            </w:tcBorders>
+            <w:tcMar>
+              <w:top w:type="dxa" w:w="40"/>
+              <w:left w:type="dxa" w:w="80"/>
+              <w:bottom w:type="dxa" w:w="40"/>
+              <w:right w:type="dxa" w:w="80"/>
+            </w:tcMar>
+          </w:tcPr>
+          <w:p>
+            <w:pPr>
+              <w:jc w:val="left"/>
+            </w:pPr>
+            <w:r>
+              <w:rPr>
+                <w:rFonts w:ascii="Times New Roman" w:cs="Times New Roman" w:eastAsia="Times New Roman" w:hAnsi="Times New Roman"/>
+                <w:sz w:val="18"/>
+                <w:szCs w:val="18"/>
+              </w:rPr>
+              <w:t xml:space="preserve">kick-off depth field: empty in this report, and populated in only 14.10% of all reports</w:t>
+            </w:r>
+          </w:p>
+        </w:tc>
+      </w:tr>
+      <w:tr>
+        <w:trPr>
+          <w:cantSplit/>
+        </w:trPr>
+        <w:tc>
+          <w:tcPr>
+            <w:tcW w:type="dxa" w:w="1700"/>
+            <w:tcBorders>
+              <w:top w:val="single" w:color="808080" w:sz="4"/>
+              <w:left w:val="single" w:color="808080" w:sz="4"/>
+              <w:bottom w:val="single" w:color="808080" w:sz="4"/>
+              <w:right w:val="single" w:color="808080" w:sz="4"/>
+            </w:tcBorders>
+            <w:tcMar>
+              <w:top w:type="dxa" w:w="40"/>
+              <w:left w:type="dxa" w:w="80"/>
+              <w:bottom w:type="dxa" w:w="40"/>
+              <w:right w:type="dxa" w:w="80"/>
+            </w:tcMar>
+          </w:tcPr>
+          <w:p>
+            <w:pPr>
+              <w:jc w:val="left"/>
+            </w:pPr>
+            <w:r>
+              <w:rPr>
+                <w:rFonts w:ascii="Times New Roman" w:cs="Times New Roman" w:eastAsia="Times New Roman" w:hAnsi="Times New Roman"/>
+                <w:sz w:val="18"/>
+                <w:szCs w:val="18"/>
+              </w:rPr>
+              <w:t xml:space="preserve">md_csg_last (m)</w:t>
+            </w:r>
+          </w:p>
+        </w:tc>
+        <w:tc>
+          <w:tcPr>
+            <w:tcW w:type="dxa" w:w="4300"/>
+            <w:tcBorders>
+              <w:top w:val="single" w:color="808080" w:sz="4"/>
+              <w:left w:val="single" w:color="808080" w:sz="4"/>
+              <w:bottom w:val="single" w:color="808080" w:sz="4"/>
+              <w:right w:val="single" w:color="808080" w:sz="4"/>
+            </w:tcBorders>
+            <w:tcMar>
+              <w:top w:type="dxa" w:w="40"/>
+              <w:left w:type="dxa" w:w="80"/>
+              <w:bottom w:type="dxa" w:w="40"/>
+              <w:right w:type="dxa" w:w="80"/>
+            </w:tcMar>
+          </w:tcPr>
+          <w:p>
+            <w:pPr>
+              <w:jc w:val="left"/>
+            </w:pPr>
+            <w:r>
+              <w:rPr>
+                <w:rFonts w:ascii="Times New Roman" w:cs="Times New Roman" w:eastAsia="Times New Roman" w:hAnsi="Times New Roman"/>
+                <w:sz w:val="18"/>
+                <w:szCs w:val="18"/>
+              </w:rPr>
+              <w:t xml:space="preserve">220.8</w:t>
+            </w:r>
+          </w:p>
+        </w:tc>
+        <w:tc>
+          <w:tcPr>
+            <w:tcW w:type="dxa" w:w="3360"/>
+            <w:tcBorders>
+              <w:top w:val="single" w:color="808080" w:sz="4"/>
+              <w:left w:val="single" w:color="808080" w:sz="4"/>
+              <w:bottom w:val="single" w:color="808080" w:sz="4"/>
+              <w:right w:val="single" w:color="808080" w:sz="4"/>
+            </w:tcBorders>
+            <w:tcMar>
+              <w:top w:type="dxa" w:w="40"/>
+              <w:left w:type="dxa" w:w="80"/>
+              <w:bottom w:type="dxa" w:w="40"/>
+              <w:right w:type="dxa" w:w="80"/>
+            </w:tcMar>
+          </w:tcPr>
+          <w:p>
+            <w:pPr>
+              <w:jc w:val="left"/>
+            </w:pPr>
+            <w:r>
+              <w:rPr>
+                <w:rFonts w:ascii="Times New Roman" w:cs="Times New Roman" w:eastAsia="Times New Roman" w:hAnsi="Times New Roman"/>
+                <w:sz w:val="18"/>
+                <w:szCs w:val="18"/>
+              </w:rPr>
+              <w:t xml:space="preserve">depth of the last casing shoe</w:t>
+            </w:r>
+          </w:p>
+        </w:tc>
+      </w:tr>
+      <w:tr>
+        <w:trPr>
+          <w:cantSplit/>
+        </w:trPr>
+        <w:tc>
+          <w:tcPr>
+            <w:tcW w:type="dxa" w:w="1700"/>
+            <w:tcBorders>
+              <w:top w:val="single" w:color="808080" w:sz="4"/>
+              <w:left w:val="single" w:color="808080" w:sz="4"/>
+              <w:bottom w:val="single" w:color="808080" w:sz="4"/>
+              <w:right w:val="single" w:color="808080" w:sz="4"/>
+            </w:tcBorders>
+            <w:tcMar>
+              <w:top w:type="dxa" w:w="40"/>
+              <w:left w:type="dxa" w:w="80"/>
+              <w:bottom w:type="dxa" w:w="40"/>
+              <w:right w:type="dxa" w:w="80"/>
+            </w:tcMar>
+          </w:tcPr>
+          <w:p>
+            <w:pPr>
+              <w:jc w:val="left"/>
+            </w:pPr>
+            <w:r>
+              <w:rPr>
+                <w:rFonts w:ascii="Times New Roman" w:cs="Times New Roman" w:eastAsia="Times New Roman" w:hAnsi="Times New Roman"/>
+                <w:sz w:val="18"/>
+                <w:szCs w:val="18"/>
+              </w:rPr>
+              <w:t xml:space="preserve">forecast24hr</w:t>
+            </w:r>
+          </w:p>
+        </w:tc>
+        <w:tc>
+          <w:tcPr>
+            <w:tcW w:type="dxa" w:w="4300"/>
+            <w:tcBorders>
+              <w:top w:val="single" w:color="808080" w:sz="4"/>
+              <w:left w:val="single" w:color="808080" w:sz="4"/>
+              <w:bottom w:val="single" w:color="808080" w:sz="4"/>
+              <w:right w:val="single" w:color="808080" w:sz="4"/>
+            </w:tcBorders>
+            <w:tcMar>
+              <w:top w:type="dxa" w:w="40"/>
+              <w:left w:type="dxa" w:w="80"/>
+              <w:bottom w:type="dxa" w:w="40"/>
+              <w:right w:type="dxa" w:w="80"/>
+            </w:tcMar>
+          </w:tcPr>
+          <w:p>
+            <w:pPr>
+              <w:jc w:val="left"/>
+            </w:pPr>
+            <w:r>
+              <w:rPr>
+                <w:rFonts w:ascii="Times New Roman" w:cs="Times New Roman" w:eastAsia="Times New Roman" w:hAnsi="Times New Roman"/>
+                <w:sz w:val="18"/>
+                <w:szCs w:val="18"/>
+              </w:rPr>
+              <w:t xml:space="preserve">Complete handling of 17½" BHA. Rig up for running 13 3/8" casing ...</w:t>
+            </w:r>
+          </w:p>
+        </w:tc>
+        <w:tc>
+          <w:tcPr>
+            <w:tcW w:type="dxa" w:w="3360"/>
+            <w:tcBorders>
+              <w:top w:val="single" w:color="808080" w:sz="4"/>
+              <w:left w:val="single" w:color="808080" w:sz="4"/>
+              <w:bottom w:val="single" w:color="808080" w:sz="4"/>
+              <w:right w:val="single" w:color="808080" w:sz="4"/>
+            </w:tcBorders>
+            <w:tcMar>
+              <w:top w:type="dxa" w:w="40"/>
+              <w:left w:type="dxa" w:w="80"/>
+              <w:bottom w:type="dxa" w:w="40"/>
+              <w:right w:type="dxa" w:w="80"/>
+            </w:tcMar>
+          </w:tcPr>
+          <w:p>
+            <w:pPr>
+              <w:jc w:val="left"/>
+            </w:pPr>
+            <w:r>
+              <w:rPr>
+                <w:rFonts w:ascii="Times New Roman" w:cs="Times New Roman" w:eastAsia="Times New Roman" w:hAnsi="Times New Roman"/>
+                <w:sz w:val="18"/>
+                <w:szCs w:val="18"/>
+              </w:rPr>
+              <w:t xml:space="preserve">the plan for the next 24 hours</w:t>
+            </w:r>
+          </w:p>
+        </w:tc>
+      </w:tr>
+      <w:tr>
+        <w:trPr>
+          <w:cantSplit/>
+        </w:trPr>
+        <w:tc>
+          <w:tcPr>
+            <w:tcW w:type="dxa" w:w="1700"/>
+            <w:tcBorders>
+              <w:top w:val="single" w:color="808080" w:sz="4"/>
+              <w:left w:val="single" w:color="808080" w:sz="4"/>
+              <w:bottom w:val="single" w:color="808080" w:sz="4"/>
+              <w:right w:val="single" w:color="808080" w:sz="4"/>
+            </w:tcBorders>
+            <w:tcMar>
+              <w:top w:type="dxa" w:w="40"/>
+              <w:left w:type="dxa" w:w="80"/>
+              <w:bottom w:type="dxa" w:w="40"/>
+              <w:right w:type="dxa" w:w="80"/>
+            </w:tcMar>
+          </w:tcPr>
+          <w:p>
+            <w:pPr>
+              <w:jc w:val="left"/>
+            </w:pPr>
+            <w:r>
+              <w:rPr>
+                <w:rFonts w:ascii="Times New Roman" w:cs="Times New Roman" w:eastAsia="Times New Roman" w:hAnsi="Times New Roman"/>
+                <w:sz w:val="18"/>
+                <w:szCs w:val="18"/>
+              </w:rPr>
+              <w:t xml:space="preserve">sum24Hr (abridged)</w:t>
+            </w:r>
+          </w:p>
+        </w:tc>
+        <w:tc>
+          <w:tcPr>
+            <w:tcW w:type="dxa" w:w="4300"/>
+            <w:tcBorders>
+              <w:top w:val="single" w:color="808080" w:sz="4"/>
+              <w:left w:val="single" w:color="808080" w:sz="4"/>
+              <w:bottom w:val="single" w:color="808080" w:sz="4"/>
+              <w:right w:val="single" w:color="808080" w:sz="4"/>
+            </w:tcBorders>
+            <w:tcMar>
+              <w:top w:type="dxa" w:w="40"/>
+              <w:left w:type="dxa" w:w="80"/>
+              <w:bottom w:type="dxa" w:w="40"/>
+              <w:right w:type="dxa" w:w="80"/>
+            </w:tcMar>
+          </w:tcPr>
+          <w:p>
+            <w:pPr>
+              <w:jc w:val="left"/>
+            </w:pPr>
+            <w:r>
+              <w:rPr>
+                <w:rFonts w:ascii="Times New Roman" w:cs="Times New Roman" w:eastAsia="Times New Roman" w:hAnsi="Times New Roman"/>
+                <w:sz w:val="18"/>
+                <w:szCs w:val="18"/>
+              </w:rPr>
+              <w:t xml:space="preserve">Drilled 17 1/2" section from 1101 m to 1415 m MD. Circulated well clean. ... POOH with 17½" BHA. Had tight spot at 1123 m, rotated through. ... Tight spots at 796, 775, 519 and 481m, pulled through with 10-15 MT overpull.</w:t>
+            </w:r>
+          </w:p>
+        </w:tc>
+        <w:tc>
+          <w:tcPr>
+            <w:tcW w:type="dxa" w:w="3360"/>
+            <w:tcBorders>
+              <w:top w:val="single" w:color="808080" w:sz="4"/>
+              <w:left w:val="single" w:color="808080" w:sz="4"/>
+              <w:bottom w:val="single" w:color="808080" w:sz="4"/>
+              <w:right w:val="single" w:color="808080" w:sz="4"/>
+            </w:tcBorders>
+            <w:tcMar>
+              <w:top w:type="dxa" w:w="40"/>
+              <w:left w:type="dxa" w:w="80"/>
+              <w:bottom w:type="dxa" w:w="40"/>
+              <w:right w:type="dxa" w:w="80"/>
+            </w:tcMar>
+          </w:tcPr>
+          <w:p>
+            <w:pPr>
+              <w:jc w:val="left"/>
+            </w:pPr>
+            <w:r>
+              <w:rPr>
+                <w:rFonts w:ascii="Times New Roman" w:cs="Times New Roman" w:eastAsia="Times New Roman" w:hAnsi="Times New Roman"/>
+                <w:sz w:val="18"/>
+                <w:szCs w:val="18"/>
+              </w:rPr>
+              <w:t xml:space="preserve">free-text summary of the past 24 hours: the text the classifier reads</w:t>
+            </w:r>
+          </w:p>
+        </w:tc>
+      </w:tr>
+      <w:tr>
+        <w:trPr>
+          <w:cantSplit/>
+        </w:trPr>
+        <w:tc>
+          <w:tcPr>
+            <w:tcW w:type="dxa" w:w="1700"/>
+            <w:tcBorders>
+              <w:top w:val="single" w:color="808080" w:sz="4"/>
+              <w:left w:val="single" w:color="808080" w:sz="4"/>
+              <w:bottom w:val="single" w:color="808080" w:sz="4"/>
+              <w:right w:val="single" w:color="808080" w:sz="4"/>
+            </w:tcBorders>
+            <w:tcMar>
+              <w:top w:type="dxa" w:w="40"/>
+              <w:left w:type="dxa" w:w="80"/>
+              <w:bottom w:type="dxa" w:w="40"/>
+              <w:right w:type="dxa" w:w="80"/>
+            </w:tcMar>
+          </w:tcPr>
+          <w:p>
+            <w:pPr>
+              <w:jc w:val="left"/>
+            </w:pPr>
+            <w:r>
+              <w:rPr>
+                <w:rFonts w:ascii="Times New Roman" w:cs="Times New Roman" w:eastAsia="Times New Roman" w:hAnsi="Times New Roman"/>
+                <w:sz w:val="18"/>
+                <w:szCs w:val="18"/>
+              </w:rPr>
+              <w:t xml:space="preserve">Phase assigned</w:t>
+            </w:r>
+          </w:p>
+        </w:tc>
+        <w:tc>
+          <w:tcPr>
+            <w:tcW w:type="dxa" w:w="4300"/>
+            <w:tcBorders>
+              <w:top w:val="single" w:color="808080" w:sz="4"/>
+              <w:left w:val="single" w:color="808080" w:sz="4"/>
+              <w:bottom w:val="single" w:color="808080" w:sz="4"/>
+              <w:right w:val="single" w:color="808080" w:sz="4"/>
+            </w:tcBorders>
+            <w:tcMar>
+              <w:top w:type="dxa" w:w="40"/>
+              <w:left w:type="dxa" w:w="80"/>
+              <w:bottom w:type="dxa" w:w="40"/>
+              <w:right w:type="dxa" w:w="80"/>
+            </w:tcMar>
+          </w:tcPr>
+          <w:p>
+            <w:pPr>
+              <w:jc w:val="left"/>
+            </w:pPr>
+            <w:r>
+              <w:rPr>
+                <w:rFonts w:ascii="Times New Roman" w:cs="Times New Roman" w:eastAsia="Times New Roman" w:hAnsi="Times New Roman"/>
+                <w:sz w:val="18"/>
+                <w:szCs w:val="18"/>
+              </w:rPr>
+              <w:t xml:space="preserve">Intermediate drilling (priority 3)</w:t>
+            </w:r>
+          </w:p>
+        </w:tc>
+        <w:tc>
+          <w:tcPr>
+            <w:tcW w:type="dxa" w:w="3360"/>
+            <w:tcBorders>
+              <w:top w:val="single" w:color="808080" w:sz="4"/>
+              <w:left w:val="single" w:color="808080" w:sz="4"/>
+              <w:bottom w:val="single" w:color="808080" w:sz="4"/>
+              <w:right w:val="single" w:color="808080" w:sz="4"/>
+            </w:tcBorders>
+            <w:tcMar>
+              <w:top w:type="dxa" w:w="40"/>
+              <w:left w:type="dxa" w:w="80"/>
+              <w:bottom w:type="dxa" w:w="40"/>
+              <w:right w:type="dxa" w:w="80"/>
+            </w:tcMar>
+          </w:tcPr>
+          <w:p>
+            <w:pPr>
+              <w:jc w:val="left"/>
+            </w:pPr>
+            <w:r>
+              <w:rPr>
+                <w:rFonts w:ascii="Times New Roman" w:cs="Times New Roman" w:eastAsia="Times New Roman" w:hAnsi="Times New Roman"/>
+                <w:sz w:val="18"/>
+                <w:szCs w:val="18"/>
+              </w:rPr>
+              <w:t xml:space="preserve">the classifier's result: the 17 1/2 in. section matches the Intermediate drilling patterns, in either spelling of the size</w:t>
+            </w:r>
+          </w:p>
+        </w:tc>
+      </w:tr>
+    </w:tbl>
+    <w:p>
+      <w:pPr>
+        <w:spacing w:after="160"/>
+      </w:pPr>
+      <w:r>
+        <w:rPr>
+          <w:rFonts w:ascii="Times New Roman" w:cs="Times New Roman" w:eastAsia="Times New Roman" w:hAnsi="Times New Roman"/>
+          <w:i/>
+          <w:iCs/>
+          <w:sz w:val="18"/>
+          <w:szCs w:val="18"/>
+        </w:rPr>
+        <w:t>The summary has 49 words, of which 40 are shown. Source file 15_9_F_5_2007_12_21.xml.</w:t>
       </w:r>
     </w:p>
     <w:p>
@@ -362,7 +1357,7 @@
           <w:sz w:val="20"/>
           <w:szCs w:val="20"/>
         </w:rPr>
-        <w:t xml:space="preserve">Norwegian wellbore names follow guidelines issued by the national regulator (NOD 2026e). Three suffix conventions matter here. "S" denotes an exploration wellbore planned to be deviated; letters A, B, and so on denote sidetracks; "R" denotes a re-entered exploration wellbore. A technical sidetrack, drilled to bypass a mechanical problem such as stuck pipe rather than to reach a new target, is designated T2 for the first, T3 for the next, and so on. The Volve WITSML archive uses the technical-sidetrack designations 15/9-19 BT2, 15/9-19 ST2, and 15/9-F-11 T2, none of which appears as a separate entry in the NOD register for the field. Section 5.4 shows that this one convention explains every naming mismatch between the two registers.</w:t>
+        <w:t>Norwegian wellbore names follow guidelines issued by the national regulator (NOD 2025). Three suffix conventions matter here. "S" denotes an exploration wellbore planned to be deviated; letters A, B, and so on denote sidetracks; "R" denotes a re-entered exploration wellbore. A technical sidetrack, drilled to bypass a mechanical problem such as stuck pipe rather than to reach a new target, is designated T2 for the first, T3 for the next, and so on. The Volve WITSML archive uses the technical-sidetrack designations 15/9-19 BT2, 15/9-19 ST2, and 15/9-F-11 T2, none of which appears as a separate entry in the NOD register for the field. Section 5.4 shows that this one convention explains every naming mismatch between the two registers.</w:t>
       </w:r>
     </w:p>
     <w:p>
@@ -395,7 +1390,7 @@
           <w:sz w:val="20"/>
           <w:szCs w:val="20"/>
         </w:rPr>
-        <w:t>Each DDR's sum24Hr narrative is classified into one of 13 phases: Spud/Conductor, Surface hole and casing, Intermediate drilling, Intermediate casing, 12¼ in. and smaller hole, Liner/Casing run, Cementing, Completion, P&amp;A, Logging/Testing, Workover, Waiting/Downtime, and Rig move/Setup. A narrative that matches no pattern is left Unclassified. Each phase carries a fixed priority from 1 (highest) to 13 (lowest) and a set of case-insensitive regular expressions, and a DDR is assigned to the highest-priority phase with any matching pattern. Before matching, vulgar-fraction characters (½, ¼, ¾, ⅛) are replaced with ASCII equivalents, because drilling reports frequently express hole and casing sizes with these glyphs. The priority order is the order listed above. Hole and casing size separate the drilling phases: 36 in. hole and 30 in. conductor (Spud/Conductor), 26 in. hole and 20 in. casing (Surface hole and casing), 17½ in. hole (Intermediate drilling), 13⅜, 10¾ and 14 in. casing (Intermediate casing), 12¼, 8½ and 6 in. hole and coring (12¼ in. and smaller hole), and 9⅝ and 7 in. liner or casing (Liner/Casing run); the remaining phases are matched on keywords alone. Phase names describe the hole and casing sizes each pattern group matches; on Volve platform wells the 12¼ in. hole is usually the section above the reservoir. Every regular expression is listed in the repository file src/classifier_v3.py.</w:t>
+        <w:t>Each DDR's sum24Hr narrative is classified into one of 13 phases: Spud/Conductor, Surface hole and casing, Intermediate drilling, Intermediate casing, 12¼ in. and smaller hole, Liner/Casing run, Cementing, Completion, P&amp;A, Logging/Testing, Workover, Waiting/Downtime, and Rig move/Setup. A narrative that matches no pattern is left Unclassified. Each phase carries a fixed priority from 1 (highest) to 13 (lowest) and a set of case-insensitive regular expressions, and a DDR is assigned to the highest-priority phase with any matching pattern. Before matching, fraction characters such as ½ and ¼, routine in the mixed units of drilling reports, are stored as single special characters that a pattern written as "1/2" does not match, so they are converted first. The priority order is the order listed above. Hole and casing size separate the drilling phases: 36 in. hole and 30 in. conductor (Spud/Conductor), 26 in. hole and 20 in. casing (Surface hole and casing), 17½ in. hole (Intermediate drilling), 13⅜, 10¾ and 14 in. casing (Intermediate casing), 12¼, 8½ and 6 in. hole and coring (12¼ in. and smaller hole), and 9⅝ and 7 in. liner or casing (Liner/Casing run); the remaining phases are matched on keywords alone. Phase names describe the hole and casing sizes each pattern group matches; on Volve platform wells the 12¼ in. hole is usually the section above the reservoir. Every regular expression is listed in the repository file src/classifier_v3.py.</w:t>
       </w:r>
     </w:p>
     <w:p>
@@ -409,7 +1404,1820 @@
           <w:sz w:val="20"/>
           <w:szCs w:val="20"/>
         </w:rPr>
-        <w:t xml:space="preserve">Three versions of the classifier were developed, each refining the pattern set for individual phases. The final version, v3, is used throughout this paper.</w:t>
+        <w:t>Table 2 lists the 13 phases in priority order with representative triggers taken from the pattern table of the repository (outputs/stage4_priority_rules.csv). Sizes are matched in the spellings found in the reports, for example 17 1/2 or 17.5; words are matched without regard to case; each phase has further patterns that are not shown.</w:t>
+      </w:r>
+    </w:p>
+    <w:p>
+      <w:pPr>
+        <w:keepNext/>
+        <w:spacing w:after="80" w:before="160"/>
+      </w:pPr>
+      <w:r>
+        <w:rPr>
+          <w:rFonts w:ascii="Times New Roman" w:cs="Times New Roman" w:eastAsia="Times New Roman" w:hAnsi="Times New Roman"/>
+          <w:b/>
+          <w:bCs/>
+          <w:sz w:val="20"/>
+          <w:szCs w:val="20"/>
+        </w:rPr>
+        <w:t>Table 2: Phases in priority order with representative triggers</w:t>
+      </w:r>
+    </w:p>
+    <w:tbl>
+      <w:tblPr>
+        <w:tblW w:type="dxa" w:w="9360"/>
+        <w:tblBorders>
+          <w:top w:val="single" w:color="auto" w:sz="4"/>
+          <w:left w:val="single" w:color="auto" w:sz="4"/>
+          <w:bottom w:val="single" w:color="auto" w:sz="4"/>
+          <w:right w:val="single" w:color="auto" w:sz="4"/>
+          <w:insideH w:val="single" w:color="auto" w:sz="4"/>
+          <w:insideV w:val="single" w:color="auto" w:sz="4"/>
+        </w:tblBorders>
+      </w:tblPr>
+      <w:tblGrid>
+        <w:gridCol w:w="800"/>
+        <w:gridCol w:w="2400"/>
+        <w:gridCol w:w="2100"/>
+        <w:gridCol w:w="4060"/>
+      </w:tblGrid>
+      <w:tr>
+        <w:trPr>
+          <w:cantSplit/>
+          <w:tblHeader/>
+        </w:trPr>
+        <w:tc>
+          <w:tcPr>
+            <w:tcW w:type="dxa" w:w="800"/>
+            <w:tcBorders>
+              <w:top w:val="single" w:color="808080" w:sz="4"/>
+              <w:left w:val="single" w:color="808080" w:sz="4"/>
+              <w:bottom w:val="single" w:color="808080" w:sz="4"/>
+              <w:right w:val="single" w:color="808080" w:sz="4"/>
+            </w:tcBorders>
+            <w:shd w:fill="E7E6E6" w:color="auto" w:val="clear"/>
+            <w:tcMar>
+              <w:top w:type="dxa" w:w="40"/>
+              <w:left w:type="dxa" w:w="80"/>
+              <w:bottom w:type="dxa" w:w="40"/>
+              <w:right w:type="dxa" w:w="80"/>
+            </w:tcMar>
+          </w:tcPr>
+          <w:p>
+            <w:pPr>
+              <w:jc w:val="left"/>
+            </w:pPr>
+            <w:r>
+              <w:rPr>
+                <w:rFonts w:ascii="Times New Roman" w:cs="Times New Roman" w:eastAsia="Times New Roman" w:hAnsi="Times New Roman"/>
+                <w:b/>
+                <w:bCs/>
+                <w:sz w:val="18"/>
+                <w:szCs w:val="18"/>
+              </w:rPr>
+              <w:t xml:space="preserve">Priority</w:t>
+            </w:r>
+          </w:p>
+        </w:tc>
+        <w:tc>
+          <w:tcPr>
+            <w:tcW w:type="dxa" w:w="2400"/>
+            <w:tcBorders>
+              <w:top w:val="single" w:color="808080" w:sz="4"/>
+              <w:left w:val="single" w:color="808080" w:sz="4"/>
+              <w:bottom w:val="single" w:color="808080" w:sz="4"/>
+              <w:right w:val="single" w:color="808080" w:sz="4"/>
+            </w:tcBorders>
+            <w:shd w:fill="E7E6E6" w:color="auto" w:val="clear"/>
+            <w:tcMar>
+              <w:top w:type="dxa" w:w="40"/>
+              <w:left w:type="dxa" w:w="80"/>
+              <w:bottom w:type="dxa" w:w="40"/>
+              <w:right w:type="dxa" w:w="80"/>
+            </w:tcMar>
+          </w:tcPr>
+          <w:p>
+            <w:pPr>
+              <w:jc w:val="left"/>
+            </w:pPr>
+            <w:r>
+              <w:rPr>
+                <w:rFonts w:ascii="Times New Roman" w:cs="Times New Roman" w:eastAsia="Times New Roman" w:hAnsi="Times New Roman"/>
+                <w:b/>
+                <w:bCs/>
+                <w:sz w:val="18"/>
+                <w:szCs w:val="18"/>
+              </w:rPr>
+              <w:t xml:space="preserve">Phase</w:t>
+            </w:r>
+          </w:p>
+        </w:tc>
+        <w:tc>
+          <w:tcPr>
+            <w:tcW w:type="dxa" w:w="2100"/>
+            <w:tcBorders>
+              <w:top w:val="single" w:color="808080" w:sz="4"/>
+              <w:left w:val="single" w:color="808080" w:sz="4"/>
+              <w:bottom w:val="single" w:color="808080" w:sz="4"/>
+              <w:right w:val="single" w:color="808080" w:sz="4"/>
+            </w:tcBorders>
+            <w:shd w:fill="E7E6E6" w:color="auto" w:val="clear"/>
+            <w:tcMar>
+              <w:top w:type="dxa" w:w="40"/>
+              <w:left w:type="dxa" w:w="80"/>
+              <w:bottom w:type="dxa" w:w="40"/>
+              <w:right w:type="dxa" w:w="80"/>
+            </w:tcMar>
+          </w:tcPr>
+          <w:p>
+            <w:pPr>
+              <w:jc w:val="left"/>
+            </w:pPr>
+            <w:r>
+              <w:rPr>
+                <w:rFonts w:ascii="Times New Roman" w:cs="Times New Roman" w:eastAsia="Times New Roman" w:hAnsi="Times New Roman"/>
+                <w:b/>
+                <w:bCs/>
+                <w:sz w:val="18"/>
+                <w:szCs w:val="18"/>
+              </w:rPr>
+              <w:t xml:space="preserve">Hole and casing sizes (in.)</w:t>
+            </w:r>
+          </w:p>
+        </w:tc>
+        <w:tc>
+          <w:tcPr>
+            <w:tcW w:type="dxa" w:w="4060"/>
+            <w:tcBorders>
+              <w:top w:val="single" w:color="808080" w:sz="4"/>
+              <w:left w:val="single" w:color="808080" w:sz="4"/>
+              <w:bottom w:val="single" w:color="808080" w:sz="4"/>
+              <w:right w:val="single" w:color="808080" w:sz="4"/>
+            </w:tcBorders>
+            <w:shd w:fill="E7E6E6" w:color="auto" w:val="clear"/>
+            <w:tcMar>
+              <w:top w:type="dxa" w:w="40"/>
+              <w:left w:type="dxa" w:w="80"/>
+              <w:bottom w:type="dxa" w:w="40"/>
+              <w:right w:type="dxa" w:w="80"/>
+            </w:tcMar>
+          </w:tcPr>
+          <w:p>
+            <w:pPr>
+              <w:jc w:val="left"/>
+            </w:pPr>
+            <w:r>
+              <w:rPr>
+                <w:rFonts w:ascii="Times New Roman" w:cs="Times New Roman" w:eastAsia="Times New Roman" w:hAnsi="Times New Roman"/>
+                <w:b/>
+                <w:bCs/>
+                <w:sz w:val="18"/>
+                <w:szCs w:val="18"/>
+              </w:rPr>
+              <w:t xml:space="preserve">Example trigger words</w:t>
+            </w:r>
+          </w:p>
+        </w:tc>
+      </w:tr>
+      <w:tr>
+        <w:trPr>
+          <w:cantSplit/>
+        </w:trPr>
+        <w:tc>
+          <w:tcPr>
+            <w:tcW w:type="dxa" w:w="800"/>
+            <w:tcBorders>
+              <w:top w:val="single" w:color="808080" w:sz="4"/>
+              <w:left w:val="single" w:color="808080" w:sz="4"/>
+              <w:bottom w:val="single" w:color="808080" w:sz="4"/>
+              <w:right w:val="single" w:color="808080" w:sz="4"/>
+            </w:tcBorders>
+            <w:tcMar>
+              <w:top w:type="dxa" w:w="40"/>
+              <w:left w:type="dxa" w:w="80"/>
+              <w:bottom w:type="dxa" w:w="40"/>
+              <w:right w:type="dxa" w:w="80"/>
+            </w:tcMar>
+          </w:tcPr>
+          <w:p>
+            <w:pPr>
+              <w:jc w:val="left"/>
+            </w:pPr>
+            <w:r>
+              <w:rPr>
+                <w:rFonts w:ascii="Times New Roman" w:cs="Times New Roman" w:eastAsia="Times New Roman" w:hAnsi="Times New Roman"/>
+                <w:sz w:val="18"/>
+                <w:szCs w:val="18"/>
+              </w:rPr>
+              <w:t xml:space="preserve">1</w:t>
+            </w:r>
+          </w:p>
+        </w:tc>
+        <w:tc>
+          <w:tcPr>
+            <w:tcW w:type="dxa" w:w="2400"/>
+            <w:tcBorders>
+              <w:top w:val="single" w:color="808080" w:sz="4"/>
+              <w:left w:val="single" w:color="808080" w:sz="4"/>
+              <w:bottom w:val="single" w:color="808080" w:sz="4"/>
+              <w:right w:val="single" w:color="808080" w:sz="4"/>
+            </w:tcBorders>
+            <w:tcMar>
+              <w:top w:type="dxa" w:w="40"/>
+              <w:left w:type="dxa" w:w="80"/>
+              <w:bottom w:type="dxa" w:w="40"/>
+              <w:right w:type="dxa" w:w="80"/>
+            </w:tcMar>
+          </w:tcPr>
+          <w:p>
+            <w:pPr>
+              <w:jc w:val="left"/>
+            </w:pPr>
+            <w:r>
+              <w:rPr>
+                <w:rFonts w:ascii="Times New Roman" w:cs="Times New Roman" w:eastAsia="Times New Roman" w:hAnsi="Times New Roman"/>
+                <w:sz w:val="18"/>
+                <w:szCs w:val="18"/>
+              </w:rPr>
+              <w:t xml:space="preserve">Spud/Conductor</w:t>
+            </w:r>
+          </w:p>
+        </w:tc>
+        <w:tc>
+          <w:tcPr>
+            <w:tcW w:type="dxa" w:w="2100"/>
+            <w:tcBorders>
+              <w:top w:val="single" w:color="808080" w:sz="4"/>
+              <w:left w:val="single" w:color="808080" w:sz="4"/>
+              <w:bottom w:val="single" w:color="808080" w:sz="4"/>
+              <w:right w:val="single" w:color="808080" w:sz="4"/>
+            </w:tcBorders>
+            <w:tcMar>
+              <w:top w:type="dxa" w:w="40"/>
+              <w:left w:type="dxa" w:w="80"/>
+              <w:bottom w:type="dxa" w:w="40"/>
+              <w:right w:type="dxa" w:w="80"/>
+            </w:tcMar>
+          </w:tcPr>
+          <w:p>
+            <w:pPr>
+              <w:jc w:val="left"/>
+            </w:pPr>
+            <w:r>
+              <w:rPr>
+                <w:rFonts w:ascii="Times New Roman" w:cs="Times New Roman" w:eastAsia="Times New Roman" w:hAnsi="Times New Roman"/>
+                <w:sz w:val="18"/>
+                <w:szCs w:val="18"/>
+              </w:rPr>
+              <w:t xml:space="preserve">36, 30</w:t>
+            </w:r>
+          </w:p>
+        </w:tc>
+        <w:tc>
+          <w:tcPr>
+            <w:tcW w:type="dxa" w:w="4060"/>
+            <w:tcBorders>
+              <w:top w:val="single" w:color="808080" w:sz="4"/>
+              <w:left w:val="single" w:color="808080" w:sz="4"/>
+              <w:bottom w:val="single" w:color="808080" w:sz="4"/>
+              <w:right w:val="single" w:color="808080" w:sz="4"/>
+            </w:tcBorders>
+            <w:tcMar>
+              <w:top w:type="dxa" w:w="40"/>
+              <w:left w:type="dxa" w:w="80"/>
+              <w:bottom w:type="dxa" w:w="40"/>
+              <w:right w:type="dxa" w:w="80"/>
+            </w:tcMar>
+          </w:tcPr>
+          <w:p>
+            <w:pPr>
+              <w:jc w:val="left"/>
+            </w:pPr>
+            <w:r>
+              <w:rPr>
+                <w:rFonts w:ascii="Times New Roman" w:cs="Times New Roman" w:eastAsia="Times New Roman" w:hAnsi="Times New Roman"/>
+                <w:sz w:val="18"/>
+                <w:szCs w:val="18"/>
+              </w:rPr>
+              <w:t xml:space="preserve">spud, tagged sea bt</w:t>
+            </w:r>
+          </w:p>
+        </w:tc>
+      </w:tr>
+      <w:tr>
+        <w:trPr>
+          <w:cantSplit/>
+        </w:trPr>
+        <w:tc>
+          <w:tcPr>
+            <w:tcW w:type="dxa" w:w="800"/>
+            <w:tcBorders>
+              <w:top w:val="single" w:color="808080" w:sz="4"/>
+              <w:left w:val="single" w:color="808080" w:sz="4"/>
+              <w:bottom w:val="single" w:color="808080" w:sz="4"/>
+              <w:right w:val="single" w:color="808080" w:sz="4"/>
+            </w:tcBorders>
+            <w:tcMar>
+              <w:top w:type="dxa" w:w="40"/>
+              <w:left w:type="dxa" w:w="80"/>
+              <w:bottom w:type="dxa" w:w="40"/>
+              <w:right w:type="dxa" w:w="80"/>
+            </w:tcMar>
+          </w:tcPr>
+          <w:p>
+            <w:pPr>
+              <w:jc w:val="left"/>
+            </w:pPr>
+            <w:r>
+              <w:rPr>
+                <w:rFonts w:ascii="Times New Roman" w:cs="Times New Roman" w:eastAsia="Times New Roman" w:hAnsi="Times New Roman"/>
+                <w:sz w:val="18"/>
+                <w:szCs w:val="18"/>
+              </w:rPr>
+              <w:t xml:space="preserve">2</w:t>
+            </w:r>
+          </w:p>
+        </w:tc>
+        <w:tc>
+          <w:tcPr>
+            <w:tcW w:type="dxa" w:w="2400"/>
+            <w:tcBorders>
+              <w:top w:val="single" w:color="808080" w:sz="4"/>
+              <w:left w:val="single" w:color="808080" w:sz="4"/>
+              <w:bottom w:val="single" w:color="808080" w:sz="4"/>
+              <w:right w:val="single" w:color="808080" w:sz="4"/>
+            </w:tcBorders>
+            <w:tcMar>
+              <w:top w:type="dxa" w:w="40"/>
+              <w:left w:type="dxa" w:w="80"/>
+              <w:bottom w:type="dxa" w:w="40"/>
+              <w:right w:type="dxa" w:w="80"/>
+            </w:tcMar>
+          </w:tcPr>
+          <w:p>
+            <w:pPr>
+              <w:jc w:val="left"/>
+            </w:pPr>
+            <w:r>
+              <w:rPr>
+                <w:rFonts w:ascii="Times New Roman" w:cs="Times New Roman" w:eastAsia="Times New Roman" w:hAnsi="Times New Roman"/>
+                <w:sz w:val="18"/>
+                <w:szCs w:val="18"/>
+              </w:rPr>
+              <w:t xml:space="preserve">Surface hole and casing</w:t>
+            </w:r>
+          </w:p>
+        </w:tc>
+        <w:tc>
+          <w:tcPr>
+            <w:tcW w:type="dxa" w:w="2100"/>
+            <w:tcBorders>
+              <w:top w:val="single" w:color="808080" w:sz="4"/>
+              <w:left w:val="single" w:color="808080" w:sz="4"/>
+              <w:bottom w:val="single" w:color="808080" w:sz="4"/>
+              <w:right w:val="single" w:color="808080" w:sz="4"/>
+            </w:tcBorders>
+            <w:tcMar>
+              <w:top w:type="dxa" w:w="40"/>
+              <w:left w:type="dxa" w:w="80"/>
+              <w:bottom w:type="dxa" w:w="40"/>
+              <w:right w:type="dxa" w:w="80"/>
+            </w:tcMar>
+          </w:tcPr>
+          <w:p>
+            <w:pPr>
+              <w:jc w:val="left"/>
+            </w:pPr>
+            <w:r>
+              <w:rPr>
+                <w:rFonts w:ascii="Times New Roman" w:cs="Times New Roman" w:eastAsia="Times New Roman" w:hAnsi="Times New Roman"/>
+                <w:sz w:val="18"/>
+                <w:szCs w:val="18"/>
+              </w:rPr>
+              <w:t xml:space="preserve">26, 20</w:t>
+            </w:r>
+          </w:p>
+        </w:tc>
+        <w:tc>
+          <w:tcPr>
+            <w:tcW w:type="dxa" w:w="4060"/>
+            <w:tcBorders>
+              <w:top w:val="single" w:color="808080" w:sz="4"/>
+              <w:left w:val="single" w:color="808080" w:sz="4"/>
+              <w:bottom w:val="single" w:color="808080" w:sz="4"/>
+              <w:right w:val="single" w:color="808080" w:sz="4"/>
+            </w:tcBorders>
+            <w:tcMar>
+              <w:top w:type="dxa" w:w="40"/>
+              <w:left w:type="dxa" w:w="80"/>
+              <w:bottom w:type="dxa" w:w="40"/>
+              <w:right w:type="dxa" w:w="80"/>
+            </w:tcMar>
+          </w:tcPr>
+          <w:p>
+            <w:pPr>
+              <w:jc w:val="left"/>
+            </w:pPr>
+            <w:r>
+              <w:rPr>
+                <w:rFonts w:ascii="Times New Roman" w:cs="Times New Roman" w:eastAsia="Times New Roman" w:hAnsi="Times New Roman"/>
+                <w:sz w:val="18"/>
+                <w:szCs w:val="18"/>
+              </w:rPr>
+              <w:t xml:space="preserve">none</w:t>
+            </w:r>
+          </w:p>
+        </w:tc>
+      </w:tr>
+      <w:tr>
+        <w:trPr>
+          <w:cantSplit/>
+        </w:trPr>
+        <w:tc>
+          <w:tcPr>
+            <w:tcW w:type="dxa" w:w="800"/>
+            <w:tcBorders>
+              <w:top w:val="single" w:color="808080" w:sz="4"/>
+              <w:left w:val="single" w:color="808080" w:sz="4"/>
+              <w:bottom w:val="single" w:color="808080" w:sz="4"/>
+              <w:right w:val="single" w:color="808080" w:sz="4"/>
+            </w:tcBorders>
+            <w:tcMar>
+              <w:top w:type="dxa" w:w="40"/>
+              <w:left w:type="dxa" w:w="80"/>
+              <w:bottom w:type="dxa" w:w="40"/>
+              <w:right w:type="dxa" w:w="80"/>
+            </w:tcMar>
+          </w:tcPr>
+          <w:p>
+            <w:pPr>
+              <w:jc w:val="left"/>
+            </w:pPr>
+            <w:r>
+              <w:rPr>
+                <w:rFonts w:ascii="Times New Roman" w:cs="Times New Roman" w:eastAsia="Times New Roman" w:hAnsi="Times New Roman"/>
+                <w:sz w:val="18"/>
+                <w:szCs w:val="18"/>
+              </w:rPr>
+              <w:t xml:space="preserve">3</w:t>
+            </w:r>
+          </w:p>
+        </w:tc>
+        <w:tc>
+          <w:tcPr>
+            <w:tcW w:type="dxa" w:w="2400"/>
+            <w:tcBorders>
+              <w:top w:val="single" w:color="808080" w:sz="4"/>
+              <w:left w:val="single" w:color="808080" w:sz="4"/>
+              <w:bottom w:val="single" w:color="808080" w:sz="4"/>
+              <w:right w:val="single" w:color="808080" w:sz="4"/>
+            </w:tcBorders>
+            <w:tcMar>
+              <w:top w:type="dxa" w:w="40"/>
+              <w:left w:type="dxa" w:w="80"/>
+              <w:bottom w:type="dxa" w:w="40"/>
+              <w:right w:type="dxa" w:w="80"/>
+            </w:tcMar>
+          </w:tcPr>
+          <w:p>
+            <w:pPr>
+              <w:jc w:val="left"/>
+            </w:pPr>
+            <w:r>
+              <w:rPr>
+                <w:rFonts w:ascii="Times New Roman" w:cs="Times New Roman" w:eastAsia="Times New Roman" w:hAnsi="Times New Roman"/>
+                <w:sz w:val="18"/>
+                <w:szCs w:val="18"/>
+              </w:rPr>
+              <w:t xml:space="preserve">Intermediate drilling</w:t>
+            </w:r>
+          </w:p>
+        </w:tc>
+        <w:tc>
+          <w:tcPr>
+            <w:tcW w:type="dxa" w:w="2100"/>
+            <w:tcBorders>
+              <w:top w:val="single" w:color="808080" w:sz="4"/>
+              <w:left w:val="single" w:color="808080" w:sz="4"/>
+              <w:bottom w:val="single" w:color="808080" w:sz="4"/>
+              <w:right w:val="single" w:color="808080" w:sz="4"/>
+            </w:tcBorders>
+            <w:tcMar>
+              <w:top w:type="dxa" w:w="40"/>
+              <w:left w:type="dxa" w:w="80"/>
+              <w:bottom w:type="dxa" w:w="40"/>
+              <w:right w:type="dxa" w:w="80"/>
+            </w:tcMar>
+          </w:tcPr>
+          <w:p>
+            <w:pPr>
+              <w:jc w:val="left"/>
+            </w:pPr>
+            <w:r>
+              <w:rPr>
+                <w:rFonts w:ascii="Times New Roman" w:cs="Times New Roman" w:eastAsia="Times New Roman" w:hAnsi="Times New Roman"/>
+                <w:sz w:val="18"/>
+                <w:szCs w:val="18"/>
+              </w:rPr>
+              <w:t xml:space="preserve">17 1/2</w:t>
+            </w:r>
+          </w:p>
+        </w:tc>
+        <w:tc>
+          <w:tcPr>
+            <w:tcW w:type="dxa" w:w="4060"/>
+            <w:tcBorders>
+              <w:top w:val="single" w:color="808080" w:sz="4"/>
+              <w:left w:val="single" w:color="808080" w:sz="4"/>
+              <w:bottom w:val="single" w:color="808080" w:sz="4"/>
+              <w:right w:val="single" w:color="808080" w:sz="4"/>
+            </w:tcBorders>
+            <w:tcMar>
+              <w:top w:type="dxa" w:w="40"/>
+              <w:left w:type="dxa" w:w="80"/>
+              <w:bottom w:type="dxa" w:w="40"/>
+              <w:right w:type="dxa" w:w="80"/>
+            </w:tcMar>
+          </w:tcPr>
+          <w:p>
+            <w:pPr>
+              <w:jc w:val="left"/>
+            </w:pPr>
+            <w:r>
+              <w:rPr>
+                <w:rFonts w:ascii="Times New Roman" w:cs="Times New Roman" w:eastAsia="Times New Roman" w:hAnsi="Times New Roman"/>
+                <w:sz w:val="18"/>
+                <w:szCs w:val="18"/>
+              </w:rPr>
+              <w:t xml:space="preserve">none</w:t>
+            </w:r>
+          </w:p>
+        </w:tc>
+      </w:tr>
+      <w:tr>
+        <w:trPr>
+          <w:cantSplit/>
+        </w:trPr>
+        <w:tc>
+          <w:tcPr>
+            <w:tcW w:type="dxa" w:w="800"/>
+            <w:tcBorders>
+              <w:top w:val="single" w:color="808080" w:sz="4"/>
+              <w:left w:val="single" w:color="808080" w:sz="4"/>
+              <w:bottom w:val="single" w:color="808080" w:sz="4"/>
+              <w:right w:val="single" w:color="808080" w:sz="4"/>
+            </w:tcBorders>
+            <w:tcMar>
+              <w:top w:type="dxa" w:w="40"/>
+              <w:left w:type="dxa" w:w="80"/>
+              <w:bottom w:type="dxa" w:w="40"/>
+              <w:right w:type="dxa" w:w="80"/>
+            </w:tcMar>
+          </w:tcPr>
+          <w:p>
+            <w:pPr>
+              <w:jc w:val="left"/>
+            </w:pPr>
+            <w:r>
+              <w:rPr>
+                <w:rFonts w:ascii="Times New Roman" w:cs="Times New Roman" w:eastAsia="Times New Roman" w:hAnsi="Times New Roman"/>
+                <w:sz w:val="18"/>
+                <w:szCs w:val="18"/>
+              </w:rPr>
+              <w:t xml:space="preserve">4</w:t>
+            </w:r>
+          </w:p>
+        </w:tc>
+        <w:tc>
+          <w:tcPr>
+            <w:tcW w:type="dxa" w:w="2400"/>
+            <w:tcBorders>
+              <w:top w:val="single" w:color="808080" w:sz="4"/>
+              <w:left w:val="single" w:color="808080" w:sz="4"/>
+              <w:bottom w:val="single" w:color="808080" w:sz="4"/>
+              <w:right w:val="single" w:color="808080" w:sz="4"/>
+            </w:tcBorders>
+            <w:tcMar>
+              <w:top w:type="dxa" w:w="40"/>
+              <w:left w:type="dxa" w:w="80"/>
+              <w:bottom w:type="dxa" w:w="40"/>
+              <w:right w:type="dxa" w:w="80"/>
+            </w:tcMar>
+          </w:tcPr>
+          <w:p>
+            <w:pPr>
+              <w:jc w:val="left"/>
+            </w:pPr>
+            <w:r>
+              <w:rPr>
+                <w:rFonts w:ascii="Times New Roman" w:cs="Times New Roman" w:eastAsia="Times New Roman" w:hAnsi="Times New Roman"/>
+                <w:sz w:val="18"/>
+                <w:szCs w:val="18"/>
+              </w:rPr>
+              <w:t xml:space="preserve">Intermediate casing</w:t>
+            </w:r>
+          </w:p>
+        </w:tc>
+        <w:tc>
+          <w:tcPr>
+            <w:tcW w:type="dxa" w:w="2100"/>
+            <w:tcBorders>
+              <w:top w:val="single" w:color="808080" w:sz="4"/>
+              <w:left w:val="single" w:color="808080" w:sz="4"/>
+              <w:bottom w:val="single" w:color="808080" w:sz="4"/>
+              <w:right w:val="single" w:color="808080" w:sz="4"/>
+            </w:tcBorders>
+            <w:tcMar>
+              <w:top w:type="dxa" w:w="40"/>
+              <w:left w:type="dxa" w:w="80"/>
+              <w:bottom w:type="dxa" w:w="40"/>
+              <w:right w:type="dxa" w:w="80"/>
+            </w:tcMar>
+          </w:tcPr>
+          <w:p>
+            <w:pPr>
+              <w:jc w:val="left"/>
+            </w:pPr>
+            <w:r>
+              <w:rPr>
+                <w:rFonts w:ascii="Times New Roman" w:cs="Times New Roman" w:eastAsia="Times New Roman" w:hAnsi="Times New Roman"/>
+                <w:sz w:val="18"/>
+                <w:szCs w:val="18"/>
+              </w:rPr>
+              <w:t xml:space="preserve">13 3/8, 10 3/4, 14</w:t>
+            </w:r>
+          </w:p>
+        </w:tc>
+        <w:tc>
+          <w:tcPr>
+            <w:tcW w:type="dxa" w:w="4060"/>
+            <w:tcBorders>
+              <w:top w:val="single" w:color="808080" w:sz="4"/>
+              <w:left w:val="single" w:color="808080" w:sz="4"/>
+              <w:bottom w:val="single" w:color="808080" w:sz="4"/>
+              <w:right w:val="single" w:color="808080" w:sz="4"/>
+            </w:tcBorders>
+            <w:tcMar>
+              <w:top w:type="dxa" w:w="40"/>
+              <w:left w:type="dxa" w:w="80"/>
+              <w:bottom w:type="dxa" w:w="40"/>
+              <w:right w:type="dxa" w:w="80"/>
+            </w:tcMar>
+          </w:tcPr>
+          <w:p>
+            <w:pPr>
+              <w:jc w:val="left"/>
+            </w:pPr>
+            <w:r>
+              <w:rPr>
+                <w:rFonts w:ascii="Times New Roman" w:cs="Times New Roman" w:eastAsia="Times New Roman" w:hAnsi="Times New Roman"/>
+                <w:sz w:val="18"/>
+                <w:szCs w:val="18"/>
+              </w:rPr>
+              <w:t xml:space="preserve">none</w:t>
+            </w:r>
+          </w:p>
+        </w:tc>
+      </w:tr>
+      <w:tr>
+        <w:trPr>
+          <w:cantSplit/>
+        </w:trPr>
+        <w:tc>
+          <w:tcPr>
+            <w:tcW w:type="dxa" w:w="800"/>
+            <w:tcBorders>
+              <w:top w:val="single" w:color="808080" w:sz="4"/>
+              <w:left w:val="single" w:color="808080" w:sz="4"/>
+              <w:bottom w:val="single" w:color="808080" w:sz="4"/>
+              <w:right w:val="single" w:color="808080" w:sz="4"/>
+            </w:tcBorders>
+            <w:tcMar>
+              <w:top w:type="dxa" w:w="40"/>
+              <w:left w:type="dxa" w:w="80"/>
+              <w:bottom w:type="dxa" w:w="40"/>
+              <w:right w:type="dxa" w:w="80"/>
+            </w:tcMar>
+          </w:tcPr>
+          <w:p>
+            <w:pPr>
+              <w:jc w:val="left"/>
+            </w:pPr>
+            <w:r>
+              <w:rPr>
+                <w:rFonts w:ascii="Times New Roman" w:cs="Times New Roman" w:eastAsia="Times New Roman" w:hAnsi="Times New Roman"/>
+                <w:sz w:val="18"/>
+                <w:szCs w:val="18"/>
+              </w:rPr>
+              <w:t xml:space="preserve">5</w:t>
+            </w:r>
+          </w:p>
+        </w:tc>
+        <w:tc>
+          <w:tcPr>
+            <w:tcW w:type="dxa" w:w="2400"/>
+            <w:tcBorders>
+              <w:top w:val="single" w:color="808080" w:sz="4"/>
+              <w:left w:val="single" w:color="808080" w:sz="4"/>
+              <w:bottom w:val="single" w:color="808080" w:sz="4"/>
+              <w:right w:val="single" w:color="808080" w:sz="4"/>
+            </w:tcBorders>
+            <w:tcMar>
+              <w:top w:type="dxa" w:w="40"/>
+              <w:left w:type="dxa" w:w="80"/>
+              <w:bottom w:type="dxa" w:w="40"/>
+              <w:right w:type="dxa" w:w="80"/>
+            </w:tcMar>
+          </w:tcPr>
+          <w:p>
+            <w:pPr>
+              <w:jc w:val="left"/>
+            </w:pPr>
+            <w:r>
+              <w:rPr>
+                <w:rFonts w:ascii="Times New Roman" w:cs="Times New Roman" w:eastAsia="Times New Roman" w:hAnsi="Times New Roman"/>
+                <w:sz w:val="18"/>
+                <w:szCs w:val="18"/>
+              </w:rPr>
+              <w:t xml:space="preserve">12¼ in. and smaller hole</w:t>
+            </w:r>
+          </w:p>
+        </w:tc>
+        <w:tc>
+          <w:tcPr>
+            <w:tcW w:type="dxa" w:w="2100"/>
+            <w:tcBorders>
+              <w:top w:val="single" w:color="808080" w:sz="4"/>
+              <w:left w:val="single" w:color="808080" w:sz="4"/>
+              <w:bottom w:val="single" w:color="808080" w:sz="4"/>
+              <w:right w:val="single" w:color="808080" w:sz="4"/>
+            </w:tcBorders>
+            <w:tcMar>
+              <w:top w:type="dxa" w:w="40"/>
+              <w:left w:type="dxa" w:w="80"/>
+              <w:bottom w:type="dxa" w:w="40"/>
+              <w:right w:type="dxa" w:w="80"/>
+            </w:tcMar>
+          </w:tcPr>
+          <w:p>
+            <w:pPr>
+              <w:jc w:val="left"/>
+            </w:pPr>
+            <w:r>
+              <w:rPr>
+                <w:rFonts w:ascii="Times New Roman" w:cs="Times New Roman" w:eastAsia="Times New Roman" w:hAnsi="Times New Roman"/>
+                <w:sz w:val="18"/>
+                <w:szCs w:val="18"/>
+              </w:rPr>
+              <w:t xml:space="preserve">12 1/4, 8 1/2, 6</w:t>
+            </w:r>
+          </w:p>
+        </w:tc>
+        <w:tc>
+          <w:tcPr>
+            <w:tcW w:type="dxa" w:w="4060"/>
+            <w:tcBorders>
+              <w:top w:val="single" w:color="808080" w:sz="4"/>
+              <w:left w:val="single" w:color="808080" w:sz="4"/>
+              <w:bottom w:val="single" w:color="808080" w:sz="4"/>
+              <w:right w:val="single" w:color="808080" w:sz="4"/>
+            </w:tcBorders>
+            <w:tcMar>
+              <w:top w:type="dxa" w:w="40"/>
+              <w:left w:type="dxa" w:w="80"/>
+              <w:bottom w:type="dxa" w:w="40"/>
+              <w:right w:type="dxa" w:w="80"/>
+            </w:tcMar>
+          </w:tcPr>
+          <w:p>
+            <w:pPr>
+              <w:jc w:val="left"/>
+            </w:pPr>
+            <w:r>
+              <w:rPr>
+                <w:rFonts w:ascii="Times New Roman" w:cs="Times New Roman" w:eastAsia="Times New Roman" w:hAnsi="Times New Roman"/>
+                <w:sz w:val="18"/>
+                <w:szCs w:val="18"/>
+              </w:rPr>
+              <w:t xml:space="preserve">cut core, coring</w:t>
+            </w:r>
+          </w:p>
+        </w:tc>
+      </w:tr>
+      <w:tr>
+        <w:trPr>
+          <w:cantSplit/>
+        </w:trPr>
+        <w:tc>
+          <w:tcPr>
+            <w:tcW w:type="dxa" w:w="800"/>
+            <w:tcBorders>
+              <w:top w:val="single" w:color="808080" w:sz="4"/>
+              <w:left w:val="single" w:color="808080" w:sz="4"/>
+              <w:bottom w:val="single" w:color="808080" w:sz="4"/>
+              <w:right w:val="single" w:color="808080" w:sz="4"/>
+            </w:tcBorders>
+            <w:tcMar>
+              <w:top w:type="dxa" w:w="40"/>
+              <w:left w:type="dxa" w:w="80"/>
+              <w:bottom w:type="dxa" w:w="40"/>
+              <w:right w:type="dxa" w:w="80"/>
+            </w:tcMar>
+          </w:tcPr>
+          <w:p>
+            <w:pPr>
+              <w:jc w:val="left"/>
+            </w:pPr>
+            <w:r>
+              <w:rPr>
+                <w:rFonts w:ascii="Times New Roman" w:cs="Times New Roman" w:eastAsia="Times New Roman" w:hAnsi="Times New Roman"/>
+                <w:sz w:val="18"/>
+                <w:szCs w:val="18"/>
+              </w:rPr>
+              <w:t xml:space="preserve">6</w:t>
+            </w:r>
+          </w:p>
+        </w:tc>
+        <w:tc>
+          <w:tcPr>
+            <w:tcW w:type="dxa" w:w="2400"/>
+            <w:tcBorders>
+              <w:top w:val="single" w:color="808080" w:sz="4"/>
+              <w:left w:val="single" w:color="808080" w:sz="4"/>
+              <w:bottom w:val="single" w:color="808080" w:sz="4"/>
+              <w:right w:val="single" w:color="808080" w:sz="4"/>
+            </w:tcBorders>
+            <w:tcMar>
+              <w:top w:type="dxa" w:w="40"/>
+              <w:left w:type="dxa" w:w="80"/>
+              <w:bottom w:type="dxa" w:w="40"/>
+              <w:right w:type="dxa" w:w="80"/>
+            </w:tcMar>
+          </w:tcPr>
+          <w:p>
+            <w:pPr>
+              <w:jc w:val="left"/>
+            </w:pPr>
+            <w:r>
+              <w:rPr>
+                <w:rFonts w:ascii="Times New Roman" w:cs="Times New Roman" w:eastAsia="Times New Roman" w:hAnsi="Times New Roman"/>
+                <w:sz w:val="18"/>
+                <w:szCs w:val="18"/>
+              </w:rPr>
+              <w:t xml:space="preserve">Liner/Casing run</w:t>
+            </w:r>
+          </w:p>
+        </w:tc>
+        <w:tc>
+          <w:tcPr>
+            <w:tcW w:type="dxa" w:w="2100"/>
+            <w:tcBorders>
+              <w:top w:val="single" w:color="808080" w:sz="4"/>
+              <w:left w:val="single" w:color="808080" w:sz="4"/>
+              <w:bottom w:val="single" w:color="808080" w:sz="4"/>
+              <w:right w:val="single" w:color="808080" w:sz="4"/>
+            </w:tcBorders>
+            <w:tcMar>
+              <w:top w:type="dxa" w:w="40"/>
+              <w:left w:type="dxa" w:w="80"/>
+              <w:bottom w:type="dxa" w:w="40"/>
+              <w:right w:type="dxa" w:w="80"/>
+            </w:tcMar>
+          </w:tcPr>
+          <w:p>
+            <w:pPr>
+              <w:jc w:val="left"/>
+            </w:pPr>
+            <w:r>
+              <w:rPr>
+                <w:rFonts w:ascii="Times New Roman" w:cs="Times New Roman" w:eastAsia="Times New Roman" w:hAnsi="Times New Roman"/>
+                <w:sz w:val="18"/>
+                <w:szCs w:val="18"/>
+              </w:rPr>
+              <w:t xml:space="preserve">9 5/8, 7</w:t>
+            </w:r>
+          </w:p>
+        </w:tc>
+        <w:tc>
+          <w:tcPr>
+            <w:tcW w:type="dxa" w:w="4060"/>
+            <w:tcBorders>
+              <w:top w:val="single" w:color="808080" w:sz="4"/>
+              <w:left w:val="single" w:color="808080" w:sz="4"/>
+              <w:bottom w:val="single" w:color="808080" w:sz="4"/>
+              <w:right w:val="single" w:color="808080" w:sz="4"/>
+            </w:tcBorders>
+            <w:tcMar>
+              <w:top w:type="dxa" w:w="40"/>
+              <w:left w:type="dxa" w:w="80"/>
+              <w:bottom w:type="dxa" w:w="40"/>
+              <w:right w:type="dxa" w:w="80"/>
+            </w:tcMar>
+          </w:tcPr>
+          <w:p>
+            <w:pPr>
+              <w:jc w:val="left"/>
+            </w:pPr>
+            <w:r>
+              <w:rPr>
+                <w:rFonts w:ascii="Times New Roman" w:cs="Times New Roman" w:eastAsia="Times New Roman" w:hAnsi="Times New Roman"/>
+                <w:sz w:val="18"/>
+                <w:szCs w:val="18"/>
+              </w:rPr>
+              <w:t xml:space="preserve">liner, surface tieback</w:t>
+            </w:r>
+          </w:p>
+        </w:tc>
+      </w:tr>
+      <w:tr>
+        <w:trPr>
+          <w:cantSplit/>
+        </w:trPr>
+        <w:tc>
+          <w:tcPr>
+            <w:tcW w:type="dxa" w:w="800"/>
+            <w:tcBorders>
+              <w:top w:val="single" w:color="808080" w:sz="4"/>
+              <w:left w:val="single" w:color="808080" w:sz="4"/>
+              <w:bottom w:val="single" w:color="808080" w:sz="4"/>
+              <w:right w:val="single" w:color="808080" w:sz="4"/>
+            </w:tcBorders>
+            <w:tcMar>
+              <w:top w:type="dxa" w:w="40"/>
+              <w:left w:type="dxa" w:w="80"/>
+              <w:bottom w:type="dxa" w:w="40"/>
+              <w:right w:type="dxa" w:w="80"/>
+            </w:tcMar>
+          </w:tcPr>
+          <w:p>
+            <w:pPr>
+              <w:jc w:val="left"/>
+            </w:pPr>
+            <w:r>
+              <w:rPr>
+                <w:rFonts w:ascii="Times New Roman" w:cs="Times New Roman" w:eastAsia="Times New Roman" w:hAnsi="Times New Roman"/>
+                <w:sz w:val="18"/>
+                <w:szCs w:val="18"/>
+              </w:rPr>
+              <w:t xml:space="preserve">7</w:t>
+            </w:r>
+          </w:p>
+        </w:tc>
+        <w:tc>
+          <w:tcPr>
+            <w:tcW w:type="dxa" w:w="2400"/>
+            <w:tcBorders>
+              <w:top w:val="single" w:color="808080" w:sz="4"/>
+              <w:left w:val="single" w:color="808080" w:sz="4"/>
+              <w:bottom w:val="single" w:color="808080" w:sz="4"/>
+              <w:right w:val="single" w:color="808080" w:sz="4"/>
+            </w:tcBorders>
+            <w:tcMar>
+              <w:top w:type="dxa" w:w="40"/>
+              <w:left w:type="dxa" w:w="80"/>
+              <w:bottom w:type="dxa" w:w="40"/>
+              <w:right w:type="dxa" w:w="80"/>
+            </w:tcMar>
+          </w:tcPr>
+          <w:p>
+            <w:pPr>
+              <w:jc w:val="left"/>
+            </w:pPr>
+            <w:r>
+              <w:rPr>
+                <w:rFonts w:ascii="Times New Roman" w:cs="Times New Roman" w:eastAsia="Times New Roman" w:hAnsi="Times New Roman"/>
+                <w:sz w:val="18"/>
+                <w:szCs w:val="18"/>
+              </w:rPr>
+              <w:t xml:space="preserve">Cementing</w:t>
+            </w:r>
+          </w:p>
+        </w:tc>
+        <w:tc>
+          <w:tcPr>
+            <w:tcW w:type="dxa" w:w="2100"/>
+            <w:tcBorders>
+              <w:top w:val="single" w:color="808080" w:sz="4"/>
+              <w:left w:val="single" w:color="808080" w:sz="4"/>
+              <w:bottom w:val="single" w:color="808080" w:sz="4"/>
+              <w:right w:val="single" w:color="808080" w:sz="4"/>
+            </w:tcBorders>
+            <w:tcMar>
+              <w:top w:type="dxa" w:w="40"/>
+              <w:left w:type="dxa" w:w="80"/>
+              <w:bottom w:type="dxa" w:w="40"/>
+              <w:right w:type="dxa" w:w="80"/>
+            </w:tcMar>
+          </w:tcPr>
+          <w:p>
+            <w:pPr>
+              <w:jc w:val="left"/>
+            </w:pPr>
+            <w:r>
+              <w:rPr>
+                <w:rFonts w:ascii="Times New Roman" w:cs="Times New Roman" w:eastAsia="Times New Roman" w:hAnsi="Times New Roman"/>
+                <w:sz w:val="18"/>
+                <w:szCs w:val="18"/>
+              </w:rPr>
+              <w:t xml:space="preserve">none</w:t>
+            </w:r>
+          </w:p>
+        </w:tc>
+        <w:tc>
+          <w:tcPr>
+            <w:tcW w:type="dxa" w:w="4060"/>
+            <w:tcBorders>
+              <w:top w:val="single" w:color="808080" w:sz="4"/>
+              <w:left w:val="single" w:color="808080" w:sz="4"/>
+              <w:bottom w:val="single" w:color="808080" w:sz="4"/>
+              <w:right w:val="single" w:color="808080" w:sz="4"/>
+            </w:tcBorders>
+            <w:tcMar>
+              <w:top w:type="dxa" w:w="40"/>
+              <w:left w:type="dxa" w:w="80"/>
+              <w:bottom w:type="dxa" w:w="40"/>
+              <w:right w:type="dxa" w:w="80"/>
+            </w:tcMar>
+          </w:tcPr>
+          <w:p>
+            <w:pPr>
+              <w:jc w:val="left"/>
+            </w:pPr>
+            <w:r>
+              <w:rPr>
+                <w:rFonts w:ascii="Times New Roman" w:cs="Times New Roman" w:eastAsia="Times New Roman" w:hAnsi="Times New Roman"/>
+                <w:sz w:val="18"/>
+                <w:szCs w:val="18"/>
+              </w:rPr>
+              <w:t xml:space="preserve">cement, cemented, cementing, bumped plug</w:t>
+            </w:r>
+          </w:p>
+        </w:tc>
+      </w:tr>
+      <w:tr>
+        <w:trPr>
+          <w:cantSplit/>
+        </w:trPr>
+        <w:tc>
+          <w:tcPr>
+            <w:tcW w:type="dxa" w:w="800"/>
+            <w:tcBorders>
+              <w:top w:val="single" w:color="808080" w:sz="4"/>
+              <w:left w:val="single" w:color="808080" w:sz="4"/>
+              <w:bottom w:val="single" w:color="808080" w:sz="4"/>
+              <w:right w:val="single" w:color="808080" w:sz="4"/>
+            </w:tcBorders>
+            <w:tcMar>
+              <w:top w:type="dxa" w:w="40"/>
+              <w:left w:type="dxa" w:w="80"/>
+              <w:bottom w:type="dxa" w:w="40"/>
+              <w:right w:type="dxa" w:w="80"/>
+            </w:tcMar>
+          </w:tcPr>
+          <w:p>
+            <w:pPr>
+              <w:jc w:val="left"/>
+            </w:pPr>
+            <w:r>
+              <w:rPr>
+                <w:rFonts w:ascii="Times New Roman" w:cs="Times New Roman" w:eastAsia="Times New Roman" w:hAnsi="Times New Roman"/>
+                <w:sz w:val="18"/>
+                <w:szCs w:val="18"/>
+              </w:rPr>
+              <w:t xml:space="preserve">8</w:t>
+            </w:r>
+          </w:p>
+        </w:tc>
+        <w:tc>
+          <w:tcPr>
+            <w:tcW w:type="dxa" w:w="2400"/>
+            <w:tcBorders>
+              <w:top w:val="single" w:color="808080" w:sz="4"/>
+              <w:left w:val="single" w:color="808080" w:sz="4"/>
+              <w:bottom w:val="single" w:color="808080" w:sz="4"/>
+              <w:right w:val="single" w:color="808080" w:sz="4"/>
+            </w:tcBorders>
+            <w:tcMar>
+              <w:top w:type="dxa" w:w="40"/>
+              <w:left w:type="dxa" w:w="80"/>
+              <w:bottom w:type="dxa" w:w="40"/>
+              <w:right w:type="dxa" w:w="80"/>
+            </w:tcMar>
+          </w:tcPr>
+          <w:p>
+            <w:pPr>
+              <w:jc w:val="left"/>
+            </w:pPr>
+            <w:r>
+              <w:rPr>
+                <w:rFonts w:ascii="Times New Roman" w:cs="Times New Roman" w:eastAsia="Times New Roman" w:hAnsi="Times New Roman"/>
+                <w:sz w:val="18"/>
+                <w:szCs w:val="18"/>
+              </w:rPr>
+              <w:t xml:space="preserve">Completion</w:t>
+            </w:r>
+          </w:p>
+        </w:tc>
+        <w:tc>
+          <w:tcPr>
+            <w:tcW w:type="dxa" w:w="2100"/>
+            <w:tcBorders>
+              <w:top w:val="single" w:color="808080" w:sz="4"/>
+              <w:left w:val="single" w:color="808080" w:sz="4"/>
+              <w:bottom w:val="single" w:color="808080" w:sz="4"/>
+              <w:right w:val="single" w:color="808080" w:sz="4"/>
+            </w:tcBorders>
+            <w:tcMar>
+              <w:top w:type="dxa" w:w="40"/>
+              <w:left w:type="dxa" w:w="80"/>
+              <w:bottom w:type="dxa" w:w="40"/>
+              <w:right w:type="dxa" w:w="80"/>
+            </w:tcMar>
+          </w:tcPr>
+          <w:p>
+            <w:pPr>
+              <w:jc w:val="left"/>
+            </w:pPr>
+            <w:r>
+              <w:rPr>
+                <w:rFonts w:ascii="Times New Roman" w:cs="Times New Roman" w:eastAsia="Times New Roman" w:hAnsi="Times New Roman"/>
+                <w:sz w:val="18"/>
+                <w:szCs w:val="18"/>
+              </w:rPr>
+              <w:t xml:space="preserve">none</w:t>
+            </w:r>
+          </w:p>
+        </w:tc>
+        <w:tc>
+          <w:tcPr>
+            <w:tcW w:type="dxa" w:w="4060"/>
+            <w:tcBorders>
+              <w:top w:val="single" w:color="808080" w:sz="4"/>
+              <w:left w:val="single" w:color="808080" w:sz="4"/>
+              <w:bottom w:val="single" w:color="808080" w:sz="4"/>
+              <w:right w:val="single" w:color="808080" w:sz="4"/>
+            </w:tcBorders>
+            <w:tcMar>
+              <w:top w:type="dxa" w:w="40"/>
+              <w:left w:type="dxa" w:w="80"/>
+              <w:bottom w:type="dxa" w:w="40"/>
+              <w:right w:type="dxa" w:w="80"/>
+            </w:tcMar>
+          </w:tcPr>
+          <w:p>
+            <w:pPr>
+              <w:jc w:val="left"/>
+            </w:pPr>
+            <w:r>
+              <w:rPr>
+                <w:rFonts w:ascii="Times New Roman" w:cs="Times New Roman" w:eastAsia="Times New Roman" w:hAnsi="Times New Roman"/>
+                <w:sz w:val="18"/>
+                <w:szCs w:val="18"/>
+              </w:rPr>
+              <w:t xml:space="preserve">completion, production packer, packer, tubing</w:t>
+            </w:r>
+          </w:p>
+        </w:tc>
+      </w:tr>
+      <w:tr>
+        <w:trPr>
+          <w:cantSplit/>
+        </w:trPr>
+        <w:tc>
+          <w:tcPr>
+            <w:tcW w:type="dxa" w:w="800"/>
+            <w:tcBorders>
+              <w:top w:val="single" w:color="808080" w:sz="4"/>
+              <w:left w:val="single" w:color="808080" w:sz="4"/>
+              <w:bottom w:val="single" w:color="808080" w:sz="4"/>
+              <w:right w:val="single" w:color="808080" w:sz="4"/>
+            </w:tcBorders>
+            <w:tcMar>
+              <w:top w:type="dxa" w:w="40"/>
+              <w:left w:type="dxa" w:w="80"/>
+              <w:bottom w:type="dxa" w:w="40"/>
+              <w:right w:type="dxa" w:w="80"/>
+            </w:tcMar>
+          </w:tcPr>
+          <w:p>
+            <w:pPr>
+              <w:jc w:val="left"/>
+            </w:pPr>
+            <w:r>
+              <w:rPr>
+                <w:rFonts w:ascii="Times New Roman" w:cs="Times New Roman" w:eastAsia="Times New Roman" w:hAnsi="Times New Roman"/>
+                <w:sz w:val="18"/>
+                <w:szCs w:val="18"/>
+              </w:rPr>
+              <w:t xml:space="preserve">9</w:t>
+            </w:r>
+          </w:p>
+        </w:tc>
+        <w:tc>
+          <w:tcPr>
+            <w:tcW w:type="dxa" w:w="2400"/>
+            <w:tcBorders>
+              <w:top w:val="single" w:color="808080" w:sz="4"/>
+              <w:left w:val="single" w:color="808080" w:sz="4"/>
+              <w:bottom w:val="single" w:color="808080" w:sz="4"/>
+              <w:right w:val="single" w:color="808080" w:sz="4"/>
+            </w:tcBorders>
+            <w:tcMar>
+              <w:top w:type="dxa" w:w="40"/>
+              <w:left w:type="dxa" w:w="80"/>
+              <w:bottom w:type="dxa" w:w="40"/>
+              <w:right w:type="dxa" w:w="80"/>
+            </w:tcMar>
+          </w:tcPr>
+          <w:p>
+            <w:pPr>
+              <w:jc w:val="left"/>
+            </w:pPr>
+            <w:r>
+              <w:rPr>
+                <w:rFonts w:ascii="Times New Roman" w:cs="Times New Roman" w:eastAsia="Times New Roman" w:hAnsi="Times New Roman"/>
+                <w:sz w:val="18"/>
+                <w:szCs w:val="18"/>
+              </w:rPr>
+              <w:t xml:space="preserve">P&amp;A</w:t>
+            </w:r>
+          </w:p>
+        </w:tc>
+        <w:tc>
+          <w:tcPr>
+            <w:tcW w:type="dxa" w:w="2100"/>
+            <w:tcBorders>
+              <w:top w:val="single" w:color="808080" w:sz="4"/>
+              <w:left w:val="single" w:color="808080" w:sz="4"/>
+              <w:bottom w:val="single" w:color="808080" w:sz="4"/>
+              <w:right w:val="single" w:color="808080" w:sz="4"/>
+            </w:tcBorders>
+            <w:tcMar>
+              <w:top w:type="dxa" w:w="40"/>
+              <w:left w:type="dxa" w:w="80"/>
+              <w:bottom w:type="dxa" w:w="40"/>
+              <w:right w:type="dxa" w:w="80"/>
+            </w:tcMar>
+          </w:tcPr>
+          <w:p>
+            <w:pPr>
+              <w:jc w:val="left"/>
+            </w:pPr>
+            <w:r>
+              <w:rPr>
+                <w:rFonts w:ascii="Times New Roman" w:cs="Times New Roman" w:eastAsia="Times New Roman" w:hAnsi="Times New Roman"/>
+                <w:sz w:val="18"/>
+                <w:szCs w:val="18"/>
+              </w:rPr>
+              <w:t xml:space="preserve">none</w:t>
+            </w:r>
+          </w:p>
+        </w:tc>
+        <w:tc>
+          <w:tcPr>
+            <w:tcW w:type="dxa" w:w="4060"/>
+            <w:tcBorders>
+              <w:top w:val="single" w:color="808080" w:sz="4"/>
+              <w:left w:val="single" w:color="808080" w:sz="4"/>
+              <w:bottom w:val="single" w:color="808080" w:sz="4"/>
+              <w:right w:val="single" w:color="808080" w:sz="4"/>
+            </w:tcBorders>
+            <w:tcMar>
+              <w:top w:type="dxa" w:w="40"/>
+              <w:left w:type="dxa" w:w="80"/>
+              <w:bottom w:type="dxa" w:w="40"/>
+              <w:right w:type="dxa" w:w="80"/>
+            </w:tcMar>
+          </w:tcPr>
+          <w:p>
+            <w:pPr>
+              <w:jc w:val="left"/>
+            </w:pPr>
+            <w:r>
+              <w:rPr>
+                <w:rFonts w:ascii="Times New Roman" w:cs="Times New Roman" w:eastAsia="Times New Roman" w:hAnsi="Times New Roman"/>
+                <w:sz w:val="18"/>
+                <w:szCs w:val="18"/>
+              </w:rPr>
+              <w:t xml:space="preserve">EZSV, EVO plug, P&amp;A, abandon</w:t>
+            </w:r>
+          </w:p>
+        </w:tc>
+      </w:tr>
+      <w:tr>
+        <w:trPr>
+          <w:cantSplit/>
+        </w:trPr>
+        <w:tc>
+          <w:tcPr>
+            <w:tcW w:type="dxa" w:w="800"/>
+            <w:tcBorders>
+              <w:top w:val="single" w:color="808080" w:sz="4"/>
+              <w:left w:val="single" w:color="808080" w:sz="4"/>
+              <w:bottom w:val="single" w:color="808080" w:sz="4"/>
+              <w:right w:val="single" w:color="808080" w:sz="4"/>
+            </w:tcBorders>
+            <w:tcMar>
+              <w:top w:type="dxa" w:w="40"/>
+              <w:left w:type="dxa" w:w="80"/>
+              <w:bottom w:type="dxa" w:w="40"/>
+              <w:right w:type="dxa" w:w="80"/>
+            </w:tcMar>
+          </w:tcPr>
+          <w:p>
+            <w:pPr>
+              <w:jc w:val="left"/>
+            </w:pPr>
+            <w:r>
+              <w:rPr>
+                <w:rFonts w:ascii="Times New Roman" w:cs="Times New Roman" w:eastAsia="Times New Roman" w:hAnsi="Times New Roman"/>
+                <w:sz w:val="18"/>
+                <w:szCs w:val="18"/>
+              </w:rPr>
+              <w:t xml:space="preserve">10</w:t>
+            </w:r>
+          </w:p>
+        </w:tc>
+        <w:tc>
+          <w:tcPr>
+            <w:tcW w:type="dxa" w:w="2400"/>
+            <w:tcBorders>
+              <w:top w:val="single" w:color="808080" w:sz="4"/>
+              <w:left w:val="single" w:color="808080" w:sz="4"/>
+              <w:bottom w:val="single" w:color="808080" w:sz="4"/>
+              <w:right w:val="single" w:color="808080" w:sz="4"/>
+            </w:tcBorders>
+            <w:tcMar>
+              <w:top w:type="dxa" w:w="40"/>
+              <w:left w:type="dxa" w:w="80"/>
+              <w:bottom w:type="dxa" w:w="40"/>
+              <w:right w:type="dxa" w:w="80"/>
+            </w:tcMar>
+          </w:tcPr>
+          <w:p>
+            <w:pPr>
+              <w:jc w:val="left"/>
+            </w:pPr>
+            <w:r>
+              <w:rPr>
+                <w:rFonts w:ascii="Times New Roman" w:cs="Times New Roman" w:eastAsia="Times New Roman" w:hAnsi="Times New Roman"/>
+                <w:sz w:val="18"/>
+                <w:szCs w:val="18"/>
+              </w:rPr>
+              <w:t xml:space="preserve">Logging/Testing</w:t>
+            </w:r>
+          </w:p>
+        </w:tc>
+        <w:tc>
+          <w:tcPr>
+            <w:tcW w:type="dxa" w:w="2100"/>
+            <w:tcBorders>
+              <w:top w:val="single" w:color="808080" w:sz="4"/>
+              <w:left w:val="single" w:color="808080" w:sz="4"/>
+              <w:bottom w:val="single" w:color="808080" w:sz="4"/>
+              <w:right w:val="single" w:color="808080" w:sz="4"/>
+            </w:tcBorders>
+            <w:tcMar>
+              <w:top w:type="dxa" w:w="40"/>
+              <w:left w:type="dxa" w:w="80"/>
+              <w:bottom w:type="dxa" w:w="40"/>
+              <w:right w:type="dxa" w:w="80"/>
+            </w:tcMar>
+          </w:tcPr>
+          <w:p>
+            <w:pPr>
+              <w:jc w:val="left"/>
+            </w:pPr>
+            <w:r>
+              <w:rPr>
+                <w:rFonts w:ascii="Times New Roman" w:cs="Times New Roman" w:eastAsia="Times New Roman" w:hAnsi="Times New Roman"/>
+                <w:sz w:val="18"/>
+                <w:szCs w:val="18"/>
+              </w:rPr>
+              <w:t xml:space="preserve">none</w:t>
+            </w:r>
+          </w:p>
+        </w:tc>
+        <w:tc>
+          <w:tcPr>
+            <w:tcW w:type="dxa" w:w="4060"/>
+            <w:tcBorders>
+              <w:top w:val="single" w:color="808080" w:sz="4"/>
+              <w:left w:val="single" w:color="808080" w:sz="4"/>
+              <w:bottom w:val="single" w:color="808080" w:sz="4"/>
+              <w:right w:val="single" w:color="808080" w:sz="4"/>
+            </w:tcBorders>
+            <w:tcMar>
+              <w:top w:type="dxa" w:w="40"/>
+              <w:left w:type="dxa" w:w="80"/>
+              <w:bottom w:type="dxa" w:w="40"/>
+              <w:right w:type="dxa" w:w="80"/>
+            </w:tcMar>
+          </w:tcPr>
+          <w:p>
+            <w:pPr>
+              <w:jc w:val="left"/>
+            </w:pPr>
+            <w:r>
+              <w:rPr>
+                <w:rFonts w:ascii="Times New Roman" w:cs="Times New Roman" w:eastAsia="Times New Roman" w:hAnsi="Times New Roman"/>
+                <w:sz w:val="18"/>
+                <w:szCs w:val="18"/>
+              </w:rPr>
+              <w:t xml:space="preserve">logging, LWD, MWD, VSP</w:t>
+            </w:r>
+          </w:p>
+        </w:tc>
+      </w:tr>
+      <w:tr>
+        <w:trPr>
+          <w:cantSplit/>
+        </w:trPr>
+        <w:tc>
+          <w:tcPr>
+            <w:tcW w:type="dxa" w:w="800"/>
+            <w:tcBorders>
+              <w:top w:val="single" w:color="808080" w:sz="4"/>
+              <w:left w:val="single" w:color="808080" w:sz="4"/>
+              <w:bottom w:val="single" w:color="808080" w:sz="4"/>
+              <w:right w:val="single" w:color="808080" w:sz="4"/>
+            </w:tcBorders>
+            <w:tcMar>
+              <w:top w:type="dxa" w:w="40"/>
+              <w:left w:type="dxa" w:w="80"/>
+              <w:bottom w:type="dxa" w:w="40"/>
+              <w:right w:type="dxa" w:w="80"/>
+            </w:tcMar>
+          </w:tcPr>
+          <w:p>
+            <w:pPr>
+              <w:jc w:val="left"/>
+            </w:pPr>
+            <w:r>
+              <w:rPr>
+                <w:rFonts w:ascii="Times New Roman" w:cs="Times New Roman" w:eastAsia="Times New Roman" w:hAnsi="Times New Roman"/>
+                <w:sz w:val="18"/>
+                <w:szCs w:val="18"/>
+              </w:rPr>
+              <w:t xml:space="preserve">11</w:t>
+            </w:r>
+          </w:p>
+        </w:tc>
+        <w:tc>
+          <w:tcPr>
+            <w:tcW w:type="dxa" w:w="2400"/>
+            <w:tcBorders>
+              <w:top w:val="single" w:color="808080" w:sz="4"/>
+              <w:left w:val="single" w:color="808080" w:sz="4"/>
+              <w:bottom w:val="single" w:color="808080" w:sz="4"/>
+              <w:right w:val="single" w:color="808080" w:sz="4"/>
+            </w:tcBorders>
+            <w:tcMar>
+              <w:top w:type="dxa" w:w="40"/>
+              <w:left w:type="dxa" w:w="80"/>
+              <w:bottom w:type="dxa" w:w="40"/>
+              <w:right w:type="dxa" w:w="80"/>
+            </w:tcMar>
+          </w:tcPr>
+          <w:p>
+            <w:pPr>
+              <w:jc w:val="left"/>
+            </w:pPr>
+            <w:r>
+              <w:rPr>
+                <w:rFonts w:ascii="Times New Roman" w:cs="Times New Roman" w:eastAsia="Times New Roman" w:hAnsi="Times New Roman"/>
+                <w:sz w:val="18"/>
+                <w:szCs w:val="18"/>
+              </w:rPr>
+              <w:t xml:space="preserve">Workover</w:t>
+            </w:r>
+          </w:p>
+        </w:tc>
+        <w:tc>
+          <w:tcPr>
+            <w:tcW w:type="dxa" w:w="2100"/>
+            <w:tcBorders>
+              <w:top w:val="single" w:color="808080" w:sz="4"/>
+              <w:left w:val="single" w:color="808080" w:sz="4"/>
+              <w:bottom w:val="single" w:color="808080" w:sz="4"/>
+              <w:right w:val="single" w:color="808080" w:sz="4"/>
+            </w:tcBorders>
+            <w:tcMar>
+              <w:top w:type="dxa" w:w="40"/>
+              <w:left w:type="dxa" w:w="80"/>
+              <w:bottom w:type="dxa" w:w="40"/>
+              <w:right w:type="dxa" w:w="80"/>
+            </w:tcMar>
+          </w:tcPr>
+          <w:p>
+            <w:pPr>
+              <w:jc w:val="left"/>
+            </w:pPr>
+            <w:r>
+              <w:rPr>
+                <w:rFonts w:ascii="Times New Roman" w:cs="Times New Roman" w:eastAsia="Times New Roman" w:hAnsi="Times New Roman"/>
+                <w:sz w:val="18"/>
+                <w:szCs w:val="18"/>
+              </w:rPr>
+              <w:t xml:space="preserve">none</w:t>
+            </w:r>
+          </w:p>
+        </w:tc>
+        <w:tc>
+          <w:tcPr>
+            <w:tcW w:type="dxa" w:w="4060"/>
+            <w:tcBorders>
+              <w:top w:val="single" w:color="808080" w:sz="4"/>
+              <w:left w:val="single" w:color="808080" w:sz="4"/>
+              <w:bottom w:val="single" w:color="808080" w:sz="4"/>
+              <w:right w:val="single" w:color="808080" w:sz="4"/>
+            </w:tcBorders>
+            <w:tcMar>
+              <w:top w:type="dxa" w:w="40"/>
+              <w:left w:type="dxa" w:w="80"/>
+              <w:bottom w:type="dxa" w:w="40"/>
+              <w:right w:type="dxa" w:w="80"/>
+            </w:tcMar>
+          </w:tcPr>
+          <w:p>
+            <w:pPr>
+              <w:jc w:val="left"/>
+            </w:pPr>
+            <w:r>
+              <w:rPr>
+                <w:rFonts w:ascii="Times New Roman" w:cs="Times New Roman" w:eastAsia="Times New Roman" w:hAnsi="Times New Roman"/>
+                <w:sz w:val="18"/>
+                <w:szCs w:val="18"/>
+              </w:rPr>
+              <w:t xml:space="preserve">workover, coiled tubing, sidetrack, whipstock</w:t>
+            </w:r>
+          </w:p>
+        </w:tc>
+      </w:tr>
+      <w:tr>
+        <w:trPr>
+          <w:cantSplit/>
+        </w:trPr>
+        <w:tc>
+          <w:tcPr>
+            <w:tcW w:type="dxa" w:w="800"/>
+            <w:tcBorders>
+              <w:top w:val="single" w:color="808080" w:sz="4"/>
+              <w:left w:val="single" w:color="808080" w:sz="4"/>
+              <w:bottom w:val="single" w:color="808080" w:sz="4"/>
+              <w:right w:val="single" w:color="808080" w:sz="4"/>
+            </w:tcBorders>
+            <w:tcMar>
+              <w:top w:type="dxa" w:w="40"/>
+              <w:left w:type="dxa" w:w="80"/>
+              <w:bottom w:type="dxa" w:w="40"/>
+              <w:right w:type="dxa" w:w="80"/>
+            </w:tcMar>
+          </w:tcPr>
+          <w:p>
+            <w:pPr>
+              <w:jc w:val="left"/>
+            </w:pPr>
+            <w:r>
+              <w:rPr>
+                <w:rFonts w:ascii="Times New Roman" w:cs="Times New Roman" w:eastAsia="Times New Roman" w:hAnsi="Times New Roman"/>
+                <w:sz w:val="18"/>
+                <w:szCs w:val="18"/>
+              </w:rPr>
+              <w:t xml:space="preserve">12</w:t>
+            </w:r>
+          </w:p>
+        </w:tc>
+        <w:tc>
+          <w:tcPr>
+            <w:tcW w:type="dxa" w:w="2400"/>
+            <w:tcBorders>
+              <w:top w:val="single" w:color="808080" w:sz="4"/>
+              <w:left w:val="single" w:color="808080" w:sz="4"/>
+              <w:bottom w:val="single" w:color="808080" w:sz="4"/>
+              <w:right w:val="single" w:color="808080" w:sz="4"/>
+            </w:tcBorders>
+            <w:tcMar>
+              <w:top w:type="dxa" w:w="40"/>
+              <w:left w:type="dxa" w:w="80"/>
+              <w:bottom w:type="dxa" w:w="40"/>
+              <w:right w:type="dxa" w:w="80"/>
+            </w:tcMar>
+          </w:tcPr>
+          <w:p>
+            <w:pPr>
+              <w:jc w:val="left"/>
+            </w:pPr>
+            <w:r>
+              <w:rPr>
+                <w:rFonts w:ascii="Times New Roman" w:cs="Times New Roman" w:eastAsia="Times New Roman" w:hAnsi="Times New Roman"/>
+                <w:sz w:val="18"/>
+                <w:szCs w:val="18"/>
+              </w:rPr>
+              <w:t xml:space="preserve">Waiting/Downtime</w:t>
+            </w:r>
+          </w:p>
+        </w:tc>
+        <w:tc>
+          <w:tcPr>
+            <w:tcW w:type="dxa" w:w="2100"/>
+            <w:tcBorders>
+              <w:top w:val="single" w:color="808080" w:sz="4"/>
+              <w:left w:val="single" w:color="808080" w:sz="4"/>
+              <w:bottom w:val="single" w:color="808080" w:sz="4"/>
+              <w:right w:val="single" w:color="808080" w:sz="4"/>
+            </w:tcBorders>
+            <w:tcMar>
+              <w:top w:type="dxa" w:w="40"/>
+              <w:left w:type="dxa" w:w="80"/>
+              <w:bottom w:type="dxa" w:w="40"/>
+              <w:right w:type="dxa" w:w="80"/>
+            </w:tcMar>
+          </w:tcPr>
+          <w:p>
+            <w:pPr>
+              <w:jc w:val="left"/>
+            </w:pPr>
+            <w:r>
+              <w:rPr>
+                <w:rFonts w:ascii="Times New Roman" w:cs="Times New Roman" w:eastAsia="Times New Roman" w:hAnsi="Times New Roman"/>
+                <w:sz w:val="18"/>
+                <w:szCs w:val="18"/>
+              </w:rPr>
+              <w:t xml:space="preserve">none</w:t>
+            </w:r>
+          </w:p>
+        </w:tc>
+        <w:tc>
+          <w:tcPr>
+            <w:tcW w:type="dxa" w:w="4060"/>
+            <w:tcBorders>
+              <w:top w:val="single" w:color="808080" w:sz="4"/>
+              <w:left w:val="single" w:color="808080" w:sz="4"/>
+              <w:bottom w:val="single" w:color="808080" w:sz="4"/>
+              <w:right w:val="single" w:color="808080" w:sz="4"/>
+            </w:tcBorders>
+            <w:tcMar>
+              <w:top w:type="dxa" w:w="40"/>
+              <w:left w:type="dxa" w:w="80"/>
+              <w:bottom w:type="dxa" w:w="40"/>
+              <w:right w:type="dxa" w:w="80"/>
+            </w:tcMar>
+          </w:tcPr>
+          <w:p>
+            <w:pPr>
+              <w:jc w:val="left"/>
+            </w:pPr>
+            <w:r>
+              <w:rPr>
+                <w:rFonts w:ascii="Times New Roman" w:cs="Times New Roman" w:eastAsia="Times New Roman" w:hAnsi="Times New Roman"/>
+                <w:sz w:val="18"/>
+                <w:szCs w:val="18"/>
+              </w:rPr>
+              <w:t xml:space="preserve">WOW, waiting on weather, rig maintenance, general maintenance</w:t>
+            </w:r>
+          </w:p>
+        </w:tc>
+      </w:tr>
+      <w:tr>
+        <w:trPr>
+          <w:cantSplit/>
+        </w:trPr>
+        <w:tc>
+          <w:tcPr>
+            <w:tcW w:type="dxa" w:w="800"/>
+            <w:tcBorders>
+              <w:top w:val="single" w:color="808080" w:sz="4"/>
+              <w:left w:val="single" w:color="808080" w:sz="4"/>
+              <w:bottom w:val="single" w:color="808080" w:sz="4"/>
+              <w:right w:val="single" w:color="808080" w:sz="4"/>
+            </w:tcBorders>
+            <w:tcMar>
+              <w:top w:type="dxa" w:w="40"/>
+              <w:left w:type="dxa" w:w="80"/>
+              <w:bottom w:type="dxa" w:w="40"/>
+              <w:right w:type="dxa" w:w="80"/>
+            </w:tcMar>
+          </w:tcPr>
+          <w:p>
+            <w:pPr>
+              <w:jc w:val="left"/>
+            </w:pPr>
+            <w:r>
+              <w:rPr>
+                <w:rFonts w:ascii="Times New Roman" w:cs="Times New Roman" w:eastAsia="Times New Roman" w:hAnsi="Times New Roman"/>
+                <w:sz w:val="18"/>
+                <w:szCs w:val="18"/>
+              </w:rPr>
+              <w:t xml:space="preserve">13</w:t>
+            </w:r>
+          </w:p>
+        </w:tc>
+        <w:tc>
+          <w:tcPr>
+            <w:tcW w:type="dxa" w:w="2400"/>
+            <w:tcBorders>
+              <w:top w:val="single" w:color="808080" w:sz="4"/>
+              <w:left w:val="single" w:color="808080" w:sz="4"/>
+              <w:bottom w:val="single" w:color="808080" w:sz="4"/>
+              <w:right w:val="single" w:color="808080" w:sz="4"/>
+            </w:tcBorders>
+            <w:tcMar>
+              <w:top w:type="dxa" w:w="40"/>
+              <w:left w:type="dxa" w:w="80"/>
+              <w:bottom w:type="dxa" w:w="40"/>
+              <w:right w:type="dxa" w:w="80"/>
+            </w:tcMar>
+          </w:tcPr>
+          <w:p>
+            <w:pPr>
+              <w:jc w:val="left"/>
+            </w:pPr>
+            <w:r>
+              <w:rPr>
+                <w:rFonts w:ascii="Times New Roman" w:cs="Times New Roman" w:eastAsia="Times New Roman" w:hAnsi="Times New Roman"/>
+                <w:sz w:val="18"/>
+                <w:szCs w:val="18"/>
+              </w:rPr>
+              <w:t xml:space="preserve">Rig move/Setup</w:t>
+            </w:r>
+          </w:p>
+        </w:tc>
+        <w:tc>
+          <w:tcPr>
+            <w:tcW w:type="dxa" w:w="2100"/>
+            <w:tcBorders>
+              <w:top w:val="single" w:color="808080" w:sz="4"/>
+              <w:left w:val="single" w:color="808080" w:sz="4"/>
+              <w:bottom w:val="single" w:color="808080" w:sz="4"/>
+              <w:right w:val="single" w:color="808080" w:sz="4"/>
+            </w:tcBorders>
+            <w:tcMar>
+              <w:top w:type="dxa" w:w="40"/>
+              <w:left w:type="dxa" w:w="80"/>
+              <w:bottom w:type="dxa" w:w="40"/>
+              <w:right w:type="dxa" w:w="80"/>
+            </w:tcMar>
+          </w:tcPr>
+          <w:p>
+            <w:pPr>
+              <w:jc w:val="left"/>
+            </w:pPr>
+            <w:r>
+              <w:rPr>
+                <w:rFonts w:ascii="Times New Roman" w:cs="Times New Roman" w:eastAsia="Times New Roman" w:hAnsi="Times New Roman"/>
+                <w:sz w:val="18"/>
+                <w:szCs w:val="18"/>
+              </w:rPr>
+              <w:t xml:space="preserve">none</w:t>
+            </w:r>
+          </w:p>
+        </w:tc>
+        <w:tc>
+          <w:tcPr>
+            <w:tcW w:type="dxa" w:w="4060"/>
+            <w:tcBorders>
+              <w:top w:val="single" w:color="808080" w:sz="4"/>
+              <w:left w:val="single" w:color="808080" w:sz="4"/>
+              <w:bottom w:val="single" w:color="808080" w:sz="4"/>
+              <w:right w:val="single" w:color="808080" w:sz="4"/>
+            </w:tcBorders>
+            <w:tcMar>
+              <w:top w:type="dxa" w:w="40"/>
+              <w:left w:type="dxa" w:w="80"/>
+              <w:bottom w:type="dxa" w:w="40"/>
+              <w:right w:type="dxa" w:w="80"/>
+            </w:tcMar>
+          </w:tcPr>
+          <w:p>
+            <w:pPr>
+              <w:jc w:val="left"/>
+            </w:pPr>
+            <w:r>
+              <w:rPr>
+                <w:rFonts w:ascii="Times New Roman" w:cs="Times New Roman" w:eastAsia="Times New Roman" w:hAnsi="Times New Roman"/>
+                <w:sz w:val="18"/>
+                <w:szCs w:val="18"/>
+              </w:rPr>
+              <w:t xml:space="preserve">skidded rig, positioned rig, mooring, ballast</w:t>
+            </w:r>
+          </w:p>
+        </w:tc>
+      </w:tr>
+    </w:tbl>
+    <w:p>
+      <w:pPr>
+        <w:spacing w:after="160"/>
+      </w:pPr>
+      <w:r>
+        <w:rPr>
+          <w:rFonts w:ascii="Times New Roman" w:cs="Times New Roman" w:eastAsia="Times New Roman" w:hAnsi="Times New Roman"/>
+          <w:i/>
+          <w:iCs/>
+          <w:sz w:val="18"/>
+          <w:szCs w:val="18"/>
+        </w:rPr>
+        <w:t>A report is assigned to the highest-priority phase with a match; a report that matches no pattern is Unclassified.</w:t>
       </w:r>
     </w:p>
     <w:p>
@@ -442,7 +3250,7 @@
           <w:sz w:val="20"/>
           <w:szCs w:val="20"/>
         </w:rPr>
-        <w:t xml:space="preserve">The audit estimates how many unclassified DDRs describe construction operations the pattern set failed to catch. First, a leak check reapplied the complete v3 pattern set to every unclassified record to confirm that no pipeline error had mislabelled a record that should have matched; none had. Second, every unclassified record was assigned to one of eleven descriptive categories (for example BOP_RISER, GENERIC_TRIP, PRODUCTION_MON, and EMPTY_RECORD) using patterns built from direct inspection of the unclassified population. The largest category is BOP and marine riser handling (147 of 456 records, 32.2%). The 73 records in EMPTY_RECORD have a sum24Hr field containing the literal string "None" (Section 4) and cannot be classified by any text method, so they were excluded from the sampling frame, leaving 383 records.</w:t>
+        <w:t>The audit estimates how many unclassified DDRs describe construction operations the pattern set failed to catch. First, a leak check reapplied the complete pattern set to every unclassified record to confirm that no pipeline error had mislabelled a record that should have matched; none had. Second, every unclassified record was assigned to one of eleven descriptive categories (for example BOP_RISER, GENERIC_TRIP, PRODUCTION_MON, and EMPTY_RECORD) using patterns built from direct inspection of the unclassified population. The largest category is BOP and marine riser handling (147 of 456 records, 32.2%). The 73 records in EMPTY_RECORD have a sum24Hr field containing the literal string "None" (Section 4) and cannot be classified by any text method, so they were excluded from the sampling frame, leaving 383 records.</w:t>
       </w:r>
     </w:p>
     <w:p>
@@ -456,7 +3264,7 @@
           <w:sz w:val="20"/>
           <w:szCs w:val="20"/>
         </w:rPr>
-        <w:t>A stratified sample of 50 records was drawn from these 383 with a fixed random seed of 42; the rerun of the analysis from the raw files kept this sample and its strata, after confirming that each of the 50 records maps to exactly one DDR file. Two strata were defined: construction era (DDR within 730 days of the wellbore's first DDR, 296 records) and production era (more than 730 days after, 87 records); 296 + 87 = 383. Allocation was proportional, 39 construction-era and 11 production-era records (39 + 11 = 50). Each sampled record was adjudicated by the author as CONSTRUCTION or NON_CONSTRUCTION according to whether it described explicit drilling progress, coring, casing, cementing, plug activity, fishing, or completion milestones. BOP and riser handling was adjudicated NON_CONSTRUCTION unless it also named a specific hole or casing size.</w:t>
+        <w:t>A stratified sample of 50 records was drawn from these 383. The unclassified reports were split into two strata, an early construction group (reports within 730 days of the wellbore's first report, 296 records) and a later production group (reports more than 730 days after it, 87 records; 296 + 87 = 383), and a random sample was drawn from each in proportion to its size: 39 construction-group and 11 production-group records (39 + 11 = 50). The random draw is recorded in the repository so the same sample can be drawn again; the rerun of the analysis from the raw files kept this sample and its groups, after confirming that each of the 50 records maps to exactly one DDR file. The author read each sampled report and labelled it construction if it described work that builds the well: drilling ahead, coring, running or cementing casing, setting plugs, fishing, or completion. Reports that only described handling the BOP or riser, tripping, waiting or production were labelled non-construction, unless they also named a hole or casing size.</w:t>
       </w:r>
     </w:p>
     <w:p>
@@ -489,7 +3297,7 @@
           <w:sz w:val="20"/>
           <w:szCs w:val="20"/>
         </w:rPr>
-        <w:t>Total depth and spud date were compared with the NOD FactPages (NOD 2026a). The Table View export was filtered to Volve wellbores and matched primarily by exact name. Three WITSML wellbores were matched by depth instead, each a technical sidetrack: 15/9-19 BT2 to NOD 15/9-19 B (both 4,250 m), 15/9-19 ST2 to NOD 15/9-19 SR (both 4,641 m), and 15/9-F-11 T2 to NOD 15/9-F-11 (4,562.1 m and 4,562.0 m). The NOD export was retrieved on 24 October 2026; its rows for the Volve wellbores are identical to an export taken on 8 September 2026 except for the register's own synchronisation date.</w:t>
+        <w:t>Total depth and spud date were compared with the NOD FactPages (NOD 2026a). The Table View export was filtered to Volve wellbores and matched primarily by exact name. Three WITSML wellbores were matched by depth instead, each a technical sidetrack: 15/9-19 BT2 to NOD 15/9-19 B (both 4,250 m), 15/9-19 ST2 to NOD 15/9-19 SR (both 4,641 m), and 15/9-F-11 T2 to NOD 15/9-F-11 (4,562.1 m and 4,562.0 m). The NOD export was retrieved on 24 October 2026; its rows for the Volve wellbores are identical to an export taken on 8 September 2026 except for the register's own synchronisation date. All comparisons are against the current register as accessed in October 2026.</w:t>
       </w:r>
     </w:p>
     <w:p>
@@ -504,39 +3312,6 @@
           <w:szCs w:val="20"/>
         </w:rPr>
         <w:t>For the 15/9-19 series, the DDR narratives show the physical events behind the designations, and the NOD wellbore histories (NOD 2026b, 2026c, 2026d) are consistent with them. In 15/9-19 B the drillstring became stuck at 3,272 m; the string was backed off and cut, a sidetrack plug was set, and new hole was kicked off from 2,911 m under the identity 15/9-19 BT2, whose first report reads "REPORTING TRANSFERRED FROM 15/9-19B". 15/9-19 S shows the same sequence: stuck pipe at approximately 2,741 m, a backed-off and cut string, sidetrack language in the narrative ("MU BHA FOR SIDE TRACK"), and new hole from approximately 1,536 m under the identity 15/9-19 ST2. In each case NOD records the final total depth against the parent designation.</w:t>
-      </w:r>
-    </w:p>
-    <w:p>
-      <w:pPr>
-        <w:pStyle w:val="Heading2"/>
-        <w:keepNext/>
-        <w:spacing w:after="100" w:before="180"/>
-      </w:pPr>
-      <w:r>
-        <w:rPr>
-          <w:rFonts w:ascii="Times New Roman" w:cs="Times New Roman" w:eastAsia="Times New Roman" w:hAnsi="Times New Roman"/>
-          <w:b/>
-          <w:bCs/>
-          <w:i/>
-          <w:iCs/>
-          <w:sz w:val="20"/>
-          <w:szCs w:val="20"/>
-        </w:rPr>
-        <w:t xml:space="preserve">3.6 Changes Since the Conference Proposal</w:t>
-      </w:r>
-    </w:p>
-    <w:p>
-      <w:pPr>
-        <w:spacing w:after="120" w:line="264"/>
-        <w:jc w:val="both"/>
-      </w:pPr>
-      <w:r>
-        <w:rPr>
-          <w:rFonts w:ascii="Times New Roman" w:cs="Times New Roman" w:eastAsia="Times New Roman" w:hAnsi="Times New Roman"/>
-          <w:sz w:val="20"/>
-          <w:szCs w:val="20"/>
-        </w:rPr>
-        <w:t xml:space="preserve">The work reported here supersedes the preliminary figures in the conference proposal for this paper in three respects. The unit of analysis is the wellbore (26) rather than the well. NOD validation was extended from seven wells to the full population. The formal stratified audit described above replaced a preliminary screening of an earlier classifier output, and it finds a substantially larger share of construction content in the unclassified residual than the preliminary screening suggested. The figures in this paper should be used in preference to those in the proposal.</w:t>
       </w:r>
     </w:p>
     <w:p>
@@ -567,7 +3342,7 @@
           <w:sz w:val="20"/>
           <w:szCs w:val="20"/>
         </w:rPr>
-        <w:t xml:space="preserve">A population survey of ten WITSML-derived columns was conducted across all 1,759 DDRs (Table 1).</w:t>
+        <w:t>A population survey of ten WITSML-derived columns was conducted across all 1,759 DDRs (Table 3).</w:t>
       </w:r>
     </w:p>
     <w:p>
@@ -583,7 +3358,7 @@
           <w:sz w:val="20"/>
           <w:szCs w:val="20"/>
         </w:rPr>
-        <w:t xml:space="preserve">Table 1: Field population survey (n = 1,759 DDRs)</w:t>
+        <w:t>Table 3: Field population survey (n = 1,759 DDRs)</w:t>
       </w:r>
     </w:p>
     <w:tbl>
@@ -2107,7 +4882,7 @@
           <w:sz w:val="20"/>
           <w:szCs w:val="20"/>
         </w:rPr>
-        <w:t>A character-level survey of sum24Hr found two non-ASCII characters relevant to classification: the vulgar fraction one-half (½) in 61 DDRs (82 occurrences) and one-quarter (¼) in 10 DDRs (14 occurrences). Both are normalised before pattern matching. One further anomaly is a single record for 15/9-19 A dated 1 January 1980 (filename 15_9_19_A_1980_01_01.xml, narrative "None", no measured depth), 17.6 years before that wellbore's first genuine report on 25 July 1997. It is a date sentinel, not a drilling report. The raw files declare the ISO-8859-1 character encoding; reading them correctly repaired an encoding error that affected 103 narratives in the earlier extraction (for example the character Ø), which changes no phase.</w:t>
+        <w:t>A character-level survey of sum24Hr found two non-ASCII characters relevant to classification: the fraction character one-half (½) in 61 DDRs (82 occurrences) and one-quarter (¼) in 10 DDRs (14 occurrences). Both are normalised before pattern matching. One further anomaly is a single record for 15/9-19 A dated 1 January 1980 (filename 15_9_19_A_1980_01_01.xml, narrative "None", no measured depth), 17.6 years before that wellbore's first genuine report on 25 July 1997. It is a date sentinel, not a drilling report. The raw files declare the ISO-8859-1 character encoding; reading them correctly repaired an encoding error that affected 103 narratives in the earlier extraction (for example, the earlier table held 'due to double 3 Â½" DP' where the raw file reads 'due to double 3 ½" DP'), which changes no phase.</w:t>
       </w:r>
     </w:p>
     <w:p>
@@ -2157,7 +4932,7 @@
           <w:sz w:val="20"/>
           <w:szCs w:val="20"/>
         </w:rPr>
-        <w:t>Applying v3 to all 1,759 DDRs classifies 1,303 records (74.1%) and leaves 456 unclassified (25.9%); 1,303 + 456 = 1,759. The ported classifier was first checked against the earlier extraction: on the narratives of the earlier table it reproduced the 1,303 classified records, every per-phase count, and the earlier phase label of all 1,759 records. Applied to narratives read directly from the raw XML it gave the same phase counts, and the 103 narratives whose encoding was repaired (Section 4) changed no phase. Table 2 gives the phase distribution, and Fig. 1 shows the classified phases on depth-versus-time curves for four representative wellbores.</w:t>
+        <w:t>Applying the classifier to all 1,759 DDRs classifies 1,303 records (74.1%) and leaves 456 unclassified (25.9%); 1,303 + 456 = 1,759. The ported classifier was first checked against the earlier extraction: on the narratives of the earlier table it reproduced the 1,303 classified records, every per-phase count, and the earlier phase label of all 1,759 records. Applied to narratives read directly from the raw XML it gave the same phase counts, and the 103 narratives whose encoding was repaired (Section 4) changed no phase. Table 4 gives the phase distribution, and Fig. 1 shows the classified phases on depth-versus-time curves for four representative wellbores.</w:t>
       </w:r>
     </w:p>
     <w:p>
@@ -2173,7 +4948,7 @@
           <w:sz w:val="20"/>
           <w:szCs w:val="20"/>
         </w:rPr>
-        <w:t xml:space="preserve">Table 2: Phase distribution, v3 classifier</w:t>
+        <w:t>Table 4: Phase distribution</w:t>
       </w:r>
     </w:p>
     <w:tbl>
@@ -3864,7 +6639,7 @@
           <w:sz w:val="20"/>
           <w:szCs w:val="20"/>
         </w:rPr>
-        <w:t xml:space="preserve">Of the 50 sampled records, 26 (52%) were adjudicated CONSTRUCTION and 24 (48%) NON_CONSTRUCTION. The construction-era sample (39 records) split 23 construction to 16 non-construction, and the production-era sample (11 records) split 3 to 8. The 26 misses fall into three groups: NO_HOLE_SIZE, genuine drilling reported without a hole-size dimension (9); OTHER_MISS, operations such as hydraulic fracturing or fishing with no corresponding pattern (10); and NONSTANDARD_TERMINOLOGY, abbreviations such as "CMT" for cement (7); 9 + 10 + 7 = 26.</w:t>
+        <w:t>Of the 50 sampled records, 26 (52%) were labelled CONSTRUCTION and 24 (48%) NON_CONSTRUCTION. The construction-era sample (39 records) split 23 construction to 16 non-construction, and the production-era sample (11 records) split 3 to 8. The 26 misses fall into three groups: NO_HOLE_SIZE, genuine drilling reported without a hole-size dimension (9); OTHER_MISS, operations such as hydraulic fracturing or fishing with no corresponding pattern (10); and NONSTANDARD_TERMINOLOGY, abbreviations such as "CMT" for cement (7); 9 + 10 + 7 = 26.</w:t>
       </w:r>
     </w:p>
     <w:p>
@@ -3878,7 +6653,7 @@
           <w:sz w:val="20"/>
           <w:szCs w:val="20"/>
         </w:rPr>
-        <w:t xml:space="preserve">The sample proportion is 26/50 = 0.520, with a Wilson-score 95% interval of 0.385 to 0.652. Because the sample was drawn from the 383 records with a genuine narrative, the proportion is scaled by that population, not by all 456 unclassified records: 383/1,759 = 0.2177, so the estimated residual miss is 0.520 × 0.2177 = 0.1132, or 11.3 percentage points (approximately 199 DDRs). Adding this to the observed rate (1,303/1,759 = 0.7408) gives an estimated attainable classification rate of 85.4%. Propagating the Wilson interval gives 0.7408 + 0.385 × 0.2177 = 0.825 and 0.7408 + 0.652 × 0.2177 = 0.883, a 95% interval of 82.5 to 88.3%. Weighting the two strata by their population shares (296/383 and 87/383) gives a sample proportion of 0.518 and an attainable rate of 85.3%, so the result does not depend on whether the estimate is stratum-weighted.</w:t>
+        <w:t>26 of the 50 sampled reports (52%) were construction work. Scaled to the 383-report frame this is about 199 reports, so a complete pattern set would classify about 85.4% of the 1,759 reports (95% confidence interval 82.5 to 88.3%). The arithmetic, including the stratum-weighted check, is in Appendix B.</w:t>
       </w:r>
     </w:p>
     <w:p>
@@ -3925,7 +6700,7 @@
           <w:sz w:val="20"/>
           <w:szCs w:val="20"/>
         </w:rPr>
-        <w:t>The timeline dataset contains one row per DDR with a genuine md_m value. Of 1,759 DDRs, 331 carry the sentinel and 7 the zero value, giving 1,759 − 331 − 7 = 1,421 rows; recomputing the dataset from the raw XML gave the same 1,421 rows as the earlier analysis, identical in every column. Each row carries wellbore identifier, report date, days from the wellbore's first report with a recorded depth, measured depth, assigned phase, and source filename. Days are therefore counted from each wellbore's first row with a usable depth, not from its first DDR. Fig. 2 plots report number against measured depth for all 26 wellbores. The report number counts every DDR of a wellbore from its first report (1980 sentinel excluded), with or without a recorded depth, so it is the same count as the reports to TD of Table 6; only reports with a valid depth are plotted. The days_from_first_ddr column of the dataset is unchanged from v2.</w:t>
+        <w:t>The timeline dataset contains one row per DDR with a genuine md_m value. Of 1,759 DDRs, 331 carry the sentinel and 7 the zero value, giving 1,759 − 331 − 7 = 1,421 rows; recomputing the dataset from the raw XML gave the same 1,421 rows as the earlier analysis, identical in every column. Each row carries wellbore identifier, report date, days from the wellbore's first report with a recorded depth, measured depth, assigned phase, and source filename. Days are therefore counted from each wellbore's first row with a usable depth, not from its first DDR. Fig. 2 plots report number against measured depth for all 26 wellbores. The report number counts every DDR of a wellbore from its first report (1980 sentinel excluded), with or without a recorded depth, so it is the same count as the reports to TD of Table 8; only reports with a valid depth are plotted. The days_from_first_ddr column of the dataset is unchanged from the earlier analysis.</w:t>
       </w:r>
     </w:p>
     <w:p>
@@ -3958,7 +6733,7 @@
           <w:sz w:val="20"/>
           <w:szCs w:val="20"/>
         </w:rPr>
-        <w:t xml:space="preserve">Maximum reconstructed measured depth per wellbore was compared with NOD's total depth for all 26 wellbores (Table 3, Fig. 3).</w:t>
+        <w:t>Maximum reconstructed measured depth per wellbore was compared with NOD's total depth for all 26 wellbores (Table 5, Fig. 3).</w:t>
       </w:r>
     </w:p>
     <w:p>
@@ -3974,7 +6749,7 @@
           <w:sz w:val="20"/>
           <w:szCs w:val="20"/>
         </w:rPr>
-        <w:t xml:space="preserve">Table 3: Total depth validation, all 26 wellbores</w:t>
+        <w:t>Table 5: Total depth validation, all 26 wellbores</w:t>
       </w:r>
     </w:p>
     <w:tbl>
@@ -9204,7 +11979,7 @@
           <w:sz w:val="20"/>
           <w:szCs w:val="20"/>
         </w:rPr>
-        <w:t xml:space="preserve">15/9-19 S was an original exploration wellbore targeting the Theta Vest structure north of Sleipner East, planned as deviated, consistent with its "S" suffix. NOD's wellbore history records it as temporarily suspended at 3,569.0 m (2,394.0 m TVD RKB), immediately above the Heimdal sands (NOD 2026d). The WITSML series ends at 3,353 m, 227 m short of NOD's structured total depth (3,580.0 m) and 216 m short of the suspension depth in NOD's history text; the 11.0 m difference between those two NOD values is internal to the register. Table 3 uses the structured field, consistent with every other wellbore. The 227 m gap is a records-coverage gap: the archive does not contain reports for this wellbore's final drilling and suspension.</w:t>
+        <w:t>15/9-19 S was an original exploration wellbore targeting the Theta Vest structure north of Sleipner East, planned as deviated, consistent with its "S" suffix. NOD's wellbore history records it as temporarily suspended at 3,569.0 m (2,394.0 m TVD RKB), immediately above the Heimdal sands (NOD 2026d). The WITSML series ends at 3,353 m, 227 m short of NOD's structured total depth (3,580.0 m) and 216 m short of the suspension depth in NOD's history text; the 11.0 m difference between those two NOD values is internal to the register. Table 5 uses the structured field, consistent with every other wellbore. The 227 m gap is a records-coverage gap: the archive does not contain reports for this wellbore's final drilling and suspension. The archive's reports for this wellbore are incomplete throughout, with 39 reports over 91 days (Table 8), and the cause cannot be determined from the records.</w:t>
       </w:r>
     </w:p>
     <w:p>
@@ -9237,7 +12012,7 @@
           <w:sz w:val="20"/>
           <w:szCs w:val="20"/>
         </w:rPr>
-        <w:t>Spud date was compared across three sources for every wellbore: the WITSML spud_date field, free-text spud language in the wellbore's earliest DDRs, and the NOD entry date. Table 4 summarises the outcome, and Fig. 4 plots the offset by category. The offset is the WITSML spud date minus the NOD pre-drill entry date where NOD records one, since it marks the start of top-hole drilling, and otherwise the NOD main entry date. For the four wellbores whose archive contains the NOD pre-drill entry (15/9-F-4, F-5, F-14 and F-15), the first report coincides with that date (the same day, or one day later for F-4), which supports using the pre-drill date as the spud reference. The categories were assigned by inspection of the three sources for each wellbore, and the rules in the Rule column of Table 4 were formalised afterwards to describe those assignments. Applied mechanically, the rules reproduce 25 of the 26 assignments. 15/9-F-11 was assigned Exact by inspection but is unresolved under the rule: NOD records a pre-drill campaign (6 to 17 April 2012) that is absent from the DDR archive; the archive's 2013 reports describe a fresh spud from seabed, including the 30-inch conductor, so the relationship between the two campaigns cannot be determined from these records.</w:t>
+        <w:t>Spud date was compared across three sources for every wellbore: the WITSML spud_date field, free-text spud language in the wellbore's earliest DDRs, and the NOD entry date. Table 6 summarises the outcome, and Fig. 4 plots the offset by category. The offset is the WITSML spud date minus the NOD pre-drill entry date where NOD records one, since it marks the start of top-hole drilling, and otherwise the NOD main entry date. For the four wellbores whose archive contains the NOD pre-drill entry (15/9-F-4, F-5, F-14 and F-15), the first report coincides with that date (the same day, or one day later for F-4), which supports using the pre-drill date as the spud reference. The categories were assigned by inspection of the three sources for each wellbore, and the rules in the Rule column of Table 6 were formalised afterwards to describe those assignments. Applied mechanically, the rules reproduce 25 of the 26 assignments. 15/9-F-11 was assigned Exact by inspection but is unresolved under the rule: NOD records a pre-drill campaign (6 to 17 April 2012) that is absent from the DDR archive; the archive's 2013 reports describe a fresh spud from seabed, including the 30-inch conductor, so the relationship between the two campaigns cannot be determined from these records.</w:t>
       </w:r>
     </w:p>
     <w:p>
@@ -9253,7 +12028,7 @@
           <w:sz w:val="20"/>
           <w:szCs w:val="20"/>
         </w:rPr>
-        <w:t xml:space="preserve">Table 4: Spud date validation outcomes</w:t>
+        <w:t>Table 6: Spud date validation outcomes</w:t>
       </w:r>
     </w:p>
     <w:tbl>
@@ -10380,7 +13155,7 @@
           <w:sz w:val="20"/>
           <w:szCs w:val="20"/>
         </w:rPr>
-        <w:t>All 15 sidetracks by designation (15/9-19 A, 19 B, 19 BT2 and 19 ST2, F-1 A, F-1 B and F-1 C, F-9 A, F-11 A, F-11 B and F-11 T2, and F-15 A to F-15 D) yielded a kick-off depth (Table 5). For 11 the depth is written in the narrative; for 3 (15/9-F-1 A, F-1 B and F-15 D) the narrative names the kick-off event but not the depth, which is taken from the measured depth of the same report; for 1 (15/9-19 ST2) both reports at the transition are empty and the depth is the measured depth there, the weakest case. For 15/9-F-1 C the last F-1 B report of 22 February 2014 reads "Commenced time drilling to1364 m. 50% formation obtained at 1364 m.", and the first F-1 C report drills 17 1/2 in. hole from that depth, so the kick-off is 1,364 m. The depth of 3,059 m that the narratives report on 13 March 2014 is the start of the 8 1/2 in. section, after casing was run, not the kick-off. 15/9-19 A is a sidetrack whose kick-off is the top of a milled window at 2,178 m (window milled from 2,178 to 2,183 m), a depth that NOD also records.</w:t>
+        <w:t>All 15 sidetracks by designation (15/9-19 A, 19 B, 19 BT2 and 19 ST2, F-1 A, F-1 B and F-1 C, F-9 A, F-11 A, F-11 B and F-11 T2, and F-15 A to F-15 D) yielded a kick-off depth (Table 7). For 11 the depth is written in the narrative; for 3 (15/9-F-1 A, F-1 B and F-15 D) the narrative names the kick-off event but not the depth, which is taken from the measured depth of the same report; for 1 (15/9-19 ST2) both reports at the transition are empty and the depth is the measured depth there, the weakest case. For 15/9-F-1 C the last F-1 B report of 22 February 2014 reads "Commenced time drilling to1364 m. 50% formation obtained at 1364 m.", and the first F-1 C report drills 17 1/2 in. hole from that depth, so the kick-off is 1,364 m. The depth of 3,059 m that the narratives report on 13 March 2014 is the start of the 8 1/2 in. section, after casing was run, not the kick-off. 15/9-19 A is a sidetrack whose kick-off is the top of a milled window at 2,178 m (window milled from 2,178 to 2,183 m), a depth that NOD also records.</w:t>
       </w:r>
     </w:p>
     <w:p>
@@ -10396,7 +13171,7 @@
           <w:sz w:val="20"/>
           <w:szCs w:val="20"/>
         </w:rPr>
-        <w:t>Table 5: Sidetrack kick-off depths, 15 sidetracks</w:t>
+        <w:t>Table 7: Sidetrack kick-off depths, 15 sidetracks</w:t>
       </w:r>
     </w:p>
     <w:tbl>
@@ -13956,7 +16731,7 @@
           <w:sz w:val="20"/>
           <w:szCs w:val="20"/>
         </w:rPr>
-        <w:t>Table 6 gives, for each wellbore, the first report (the 1980 date sentinel excluded), the date total depth was first reached (the maximum valid depth of Table 3), the elapsed calendar days from the first report to that date, the number of reports in that span (inclusive), the drilled length (total depth minus the kick-off depth of Table 5 for the 15 sidetracks, total depth for the other 11) and metres per report-day (drilled length divided by the number of reports). Elapsed days and reports agree where a wellbore was reported daily and differ where the archive has gaps; wellbores whose elapsed days exceed twice their reports are flagged. Seven of the 26 are flagged (15/9-19 S, F-1, F-4, F-5, F-9, F-14 and F-15). F-1 reaches its total depth of 3,632 m on 17 August 2013, 2,085 days after its first report on 2 December 2007, in 31 reports, four of them from 2007. 15/9-19 B (3,272 m) and 15/9-F-11 (347 m) end at the depth of an abandoned parent leg or stub (Section 5.4), so their durations are indicative only. Drilled lengths and rates for sidetracks depend on the kick-off depths of Section 5.6; rates are per reported day, not per elapsed day, and for F-1 they mix two campaigns. Per-phase report counts for each wellbore and well family are published with the duration table.</w:t>
+        <w:t>Table 8 gives, for each wellbore, the first report (the 1980 date sentinel excluded), the date total depth was first reached (the maximum valid depth of Table 5), the elapsed calendar days from the first report to that date, the number of reports in that span (inclusive), the drilled length (total depth minus the kick-off depth of Table 7 for the 15 sidetracks, total depth for the other 11) and metres per report-day (drilled length divided by the number of reports). Elapsed days and reports agree where a wellbore was reported daily and differ where the archive has gaps; wellbores whose elapsed days exceed twice their reports are flagged. Seven of the 26 are flagged (15/9-19 S, F-1, F-4, F-5, F-9, F-14 and F-15). F-1 reaches its total depth of 3,632 m on 17 August 2013, 2,085 days after its first report on 2 December 2007, in 31 reports, four of them from 2007. 15/9-19 B (3,272 m) and 15/9-F-11 (347 m) end at the depth of an abandoned parent leg or stub (Section 5.4), so their durations are indicative only. Drilled lengths and rates for sidetracks depend on the kick-off depths of Section 5.6; rates are per reported day, not per elapsed day, and for F-1 they mix two campaigns. Per-phase report counts for each wellbore and well family are published with the duration table.</w:t>
       </w:r>
     </w:p>
     <w:p>
@@ -13972,7 +16747,7 @@
           <w:sz w:val="20"/>
           <w:szCs w:val="20"/>
         </w:rPr>
-        <w:t>Table 6: Duration to total depth (TD) and drilled length, 26 wellbores</w:t>
+        <w:t>Table 8: Duration to total depth (TD) and drilled length, 26 wellbores</w:t>
       </w:r>
     </w:p>
     <w:tbl>
@@ -21464,7 +24239,7 @@
           <w:sz w:val="18"/>
           <w:szCs w:val="18"/>
         </w:rPr>
-        <w:t>Gap flag: elapsed days to TD exceed twice the reports to TD. Drilled length is total depth minus the Table 5 kick-off depth for sidetracks and total depth for original wellbores; for the original wellbores this is measured depth from the rig datum and includes the water depth. (indicative): TD is the depth of an abandoned parent leg or stub.</w:t>
+        <w:t>Gap flag: elapsed days to TD exceed twice the reports to TD. Drilled length is total depth minus the Table 7 kick-off depth for sidetracks and total depth for original wellbores; for the original wellbores this is measured depth from the rig datum and includes the water depth. (indicative): TD is the depth of an abandoned parent leg or stub.</w:t>
       </w:r>
     </w:p>
     <w:p>
@@ -21514,7 +24289,7 @@
           <w:sz w:val="20"/>
           <w:szCs w:val="20"/>
         </w:rPr>
-        <w:t>The 1,421-row depth-time-phase dataset converts an archive of narrative reports into a form that can be queried directly. Depth-versus-report-count curves (Fig. 2) can be compared across wellbores drilled from the same platform, phase durations can be extracted for offset-well planning, and the classified phases locate casing, cementing, and P&amp;A operations in time and depth for each wellbore. Because the classifier is deterministic and the audit quantifies its residual, a user can bound how much of any phase-based statistic may be missing: at the attainable-rate estimate, roughly 199 DDRs of construction content remain unassigned, concentrated in drilling progress reported without a hole size. Table 6 gives elapsed days, reports and metres per report-day to total depth for each wellbore as a first benchmark, with the gap flag marking wellbores whose elapsed time cannot be read as drilling time.</w:t>
+        <w:t>The 1,421-row depth-time-phase dataset converts an archive of narrative reports into a form that can be queried directly. Depth-versus-report-count curves (Fig. 2) can be compared across wellbores drilled from the same platform, phase durations can be extracted for offset-well planning, and the classified phases locate casing, cementing, and P&amp;A operations in time and depth for each wellbore. Because the classifier is deterministic and the audit quantifies its residual, a user can bound how much of any phase-based statistic may be missing: at the attainable-rate estimate, roughly 199 DDRs of construction content remain unassigned, concentrated in drilling progress reported without a hole size. Table 8 gives elapsed days, reports and metres per report-day to total depth for each wellbore as a first benchmark, with the gap flag marking wellbores whose elapsed time cannot be read as drilling time.</w:t>
       </w:r>
     </w:p>
     <w:p>
@@ -21762,7 +24537,7 @@
           <w:sz w:val="20"/>
           <w:szCs w:val="20"/>
         </w:rPr>
-        <w:t>The audit adjudicated construction content only. Unclassified records describing operations that belong to non-construction phases in the classifier (for example waiting or rig moves) were adjudicated NON_CONSTRUCTION, so the attainable rate is conservative with respect to those phases. The sample of 50 was adjudicated by a single reviewer, the author, and no inter-rater agreement was measured. The interval of 82.5 to 88.3% reflects the modest sample size.</w:t>
+        <w:t>The audit labelled construction content only. Unclassified records describing operations that belong to non-construction phases in the classifier (for example waiting or rig moves) were labelled NON_CONSTRUCTION, so the attainable rate is conservative with respect to those phases. The sample of 50 was labelled by a single reviewer, the author, and no inter-rater agreement was measured. The interval of 82.5 to 88.3% reflects the modest sample size.</w:t>
       </w:r>
     </w:p>
     <w:p>
@@ -21776,7 +24551,7 @@
           <w:sz w:val="20"/>
           <w:szCs w:val="20"/>
         </w:rPr>
-        <w:t>Two records were assigned to a stratum that does not reflect their operational context, although both were adjudicated correctly on content. The 1980 date sentinel for 15/9-19 A places that wellbore's 1997 drilling in the production-era stratum, and 15/9-F-1's 2013 drilling campaign reports also fall into the production-era stratum.</w:t>
+        <w:t>Two records were assigned to a stratum that does not reflect their operational context, although both were labelled correctly on content. The 1980 date sentinel for 15/9-19 A places that wellbore's 1997 drilling in the production-era stratum, and 15/9-F-1's 2013 drilling campaign reports also fall into the production-era stratum.</w:t>
       </w:r>
     </w:p>
     <w:p>
@@ -21804,7 +24579,7 @@
           <w:sz w:val="20"/>
           <w:szCs w:val="20"/>
         </w:rPr>
-        <w:t>Kick-off depths were read from the narratives by one rule, and two rest on weaker evidence: 15/9-19 ST2 on the measured depth alone and 15/9-F-11 B on an interval of cement and new formation (2,531 to 2,589 m). NOD gives no kick-off point for three sidetracks. All four wellbores of the 15/9-F-1 family (F-1, F-1 A, F-1 B and F-1 C) share the hole above 1,364 m MD, and F-1, F-1 A and F-1 B share it above approximately 2,617 to 2,620 m MD; any formation-level analysis treating them as independent must account for this. Metres per report-day are rates per reported day, not per elapsed day, and the elapsed time to total depth is affected by gaps between reports in the archive (the gap flag in Table 6).</w:t>
+        <w:t>Kick-off depths were read from the narratives by one rule, and two rest on weaker evidence: 15/9-19 ST2 on the measured depth alone and 15/9-F-11 B on an interval of cement and new formation (2,531 to 2,589 m). NOD gives no kick-off point for three sidetracks. All four wellbores of the 15/9-F-1 family (F-1, F-1 A, F-1 B and F-1 C) share the hole above 1,364 m MD, and F-1, F-1 A and F-1 B share it above approximately 2,617 to 2,620 m MD; any formation-level analysis treating them as independent must account for this. Metres per report-day are rates per reported day, not per elapsed day, and the elapsed time to total depth is affected by gaps between reports in the archive (the gap flag in Table 8).</w:t>
       </w:r>
     </w:p>
     <w:p>
@@ -21818,7 +24593,7 @@
           <w:sz w:val="20"/>
           <w:szCs w:val="20"/>
         </w:rPr>
-        <w:t xml:space="preserve">No isolated ablation was run for the effect of Unicode normalisation on the classification rate. The survey confirms 61 DDRs contain ½ and 10 contain ¼, and the normalisation handles both, but its effect was not separated from other pattern changes between versions.</w:t>
+        <w:t>No isolated ablation was run for the effect of Unicode normalisation on the classification rate. The survey confirms 61 DDRs contain ½ and 10 contain ¼, and the normalisation handles both, but its effect was not separated from other refinements of the pattern set.</w:t>
       </w:r>
     </w:p>
     <w:p>
@@ -22007,7 +24782,7 @@
           <w:sz w:val="20"/>
           <w:szCs w:val="20"/>
         </w:rPr>
-        <w:t>Future work should enlarge the audit sample with a second independent adjudicator, close the identified pattern gaps, validate the reconstructed timelines against the Final Well Reports and End of Well Reports held in the Volve archive, and extend the duration results to phase-level durations across the campaign.</w:t>
+        <w:t>Future work should enlarge the audit sample with a second independent labeller, close the identified pattern gaps, validate the reconstructed timelines against the Final Well Reports and End of Well Reports held in the Volve archive, and extend the duration results to phase-level durations across the campaign.</w:t>
       </w:r>
     </w:p>
     <w:p>
@@ -22052,7 +24827,7 @@
           <w:sz w:val="20"/>
           <w:szCs w:val="20"/>
         </w:rPr>
-        <w:t>Generative AI (Anthropic Claude, used through Claude Code) built and ran the reproducible analysis pipeline from the raw data and was used to assist with debugging, checking arithmetic and editing the manuscript text. The sidetrack kick-off depths were proposed by the AI tool from the narratives under one rule. The author rejected the tool's first proposals for three sidetracks (15/9-19 A, 15/9-F-9 A and 15/9-F-11 B) and kept the earlier values, then reviewed all 15 depths and approved every one without change. The author made all 50 audit adjudications, reviewed all AI-assisted content, and takes full responsibility for the paper.</w:t>
+        <w:t>Generative AI (Anthropic Claude, used through Claude Code) built and ran the reproducible analysis pipeline from the raw data and was used to assist with debugging, checking arithmetic and editing the manuscript text. The sidetrack kick-off depths were proposed by the AI tool from the narratives under one rule. The author rejected the tool's first proposals for three sidetracks (15/9-19 A, 15/9-F-9 A and 15/9-F-11 B) and kept the earlier values, then reviewed all 15 depths and approved every one without change. The author made all 50 audit labels, reviewed all AI-assisted content, and takes full responsibility for the paper.</w:t>
       </w:r>
     </w:p>
     <w:p>
@@ -22083,7 +24858,7 @@
           <w:sz w:val="20"/>
           <w:szCs w:val="20"/>
         </w:rPr>
-        <w:t>The classifier (v3), the extraction and analysis code, the 1,421-row timeline dataset, the audit adjudications (file name, wellbore, date, stratum, call and miss reason), the NOD comparison tables, the kick-off and duration tables, and a numbers registry tracing every reported figure to the script that produced it are available at https://github.com/985185/volve-well-construction-timeline. DDR narrative text is not redistributed: the Volve data are available from Equinor under the Equinor Open Data Licence (https://www.equinor.com/energy/volve-data-sharing), and the repository holds only file names, dates, depths, categories and quotes of 15 words or fewer. Comparisons with the author's earlier extraction are reported but are not needed to reproduce any figure.</w:t>
+        <w:t>The classifier, the extraction and analysis code, the 1,421-row timeline dataset, the audit labels (file name, wellbore, date, stratum, call and miss reason), the NOD comparison tables, the kick-off and duration tables, and a numbers registry tracing every reported figure to the script that produced it are available at https://github.com/985185/volve-well-construction-timeline. DDR narrative text is not redistributed: the Volve data are available from Equinor under the Equinor Open Data Licence (https://www.equinor.com/energy/volve-data-sharing), and the repository holds only file names, dates, depths, categories and quotes of 15 words or fewer. Comparisons with the author's earlier extraction are reported but are not needed to reproduce any figure.</w:t>
       </w:r>
     </w:p>
     <w:p>
@@ -22335,6 +25110,20 @@
           <w:sz w:val="20"/>
           <w:szCs w:val="20"/>
         </w:rPr>
+        <w:t>Norwegian Offshore Directorate. 2025. Guidelines for Designation of Wells and Wellbores (revision of 28 March 2025). https://www.sodir.no/globalassets/1-sodir/regelverk/tematiske-veiledninger/eng/guidelines-for-designation-of-wells-and-wellbores.pdf (accessed 23 October 2026).</w:t>
+      </w:r>
+    </w:p>
+    <w:p>
+      <w:pPr>
+        <w:spacing w:after="100"/>
+        <w:ind w:left="360" w:hanging="360"/>
+      </w:pPr>
+      <w:r>
+        <w:rPr>
+          <w:rFonts w:ascii="Times New Roman" w:cs="Times New Roman" w:eastAsia="Times New Roman" w:hAnsi="Times New Roman"/>
+          <w:sz w:val="20"/>
+          <w:szCs w:val="20"/>
+        </w:rPr>
         <w:t>Norwegian Offshore Directorate. 2026a. FactPages. https://factpages.sodir.no (accessed 24 October 2026).</w:t>
       </w:r>
     </w:p>
@@ -22378,20 +25167,6 @@
           <w:szCs w:val="20"/>
         </w:rPr>
         <w:t xml:space="preserve">Norwegian Offshore Directorate. 2026d. Wellbore History: 15/9-19 S and 15/9-19 SR. FactPages. https://factpages.sodir.no/en/wellbore/PageView/Exploration/By/ByEntryDate/2105 (accessed 11 September 2026).</w:t>
-      </w:r>
-    </w:p>
-    <w:p>
-      <w:pPr>
-        <w:spacing w:after="100"/>
-        <w:ind w:left="360" w:hanging="360"/>
-      </w:pPr>
-      <w:r>
-        <w:rPr>
-          <w:rFonts w:ascii="Times New Roman" w:cs="Times New Roman" w:eastAsia="Times New Roman" w:hAnsi="Times New Roman"/>
-          <w:sz w:val="20"/>
-          <w:szCs w:val="20"/>
-        </w:rPr>
-        <w:t xml:space="preserve">Norwegian Offshore Directorate. 2026e. Guidelines for Designation of Wells and Wellbores. https://www.sodir.no/globalassets/1-sodir/regelverk/tematiske-veiledninger/eng/guidelines-for-designation-of-wells-and-wellbores.pdf (accessed 23 October 2026).</w:t>
       </w:r>
     </w:p>
     <w:p>
@@ -22626,7 +25401,7 @@
           <w:sz w:val="20"/>
           <w:szCs w:val="20"/>
         </w:rPr>
-        <w:t>Fig. 2: Report number (1 = the wellbore's first report, as counted in Table 6) versus measured depth for all 26 wellbores, coloured by hole section (other phases and unclassified reports in grey).</w:t>
+        <w:t>Fig. 2: Report number (1 = the wellbore's first report, as counted in Table 8) versus measured depth for all 26 wellbores, coloured by hole section (other phases and unclassified reports in grey).</w:t>
       </w:r>
     </w:p>
     <w:p>
@@ -22769,7 +25544,52 @@
           <w:sz w:val="20"/>
           <w:szCs w:val="20"/>
         </w:rPr>
-        <w:t>Every quantitative figure in this paper traces to an entry in the numbers registry published in the repository (235 entries, each with the producing script and function, the SHA-256 of its input files and an execution timestamp). The audit estimates in Section 5.2 are derived arithmetically from registry entries, and the arithmetic is shown in the text.</w:t>
+        <w:t>Every quantitative figure in this paper traces to an entry in the numbers registry published in the repository (239 entries, each with the producing script and function, the SHA-256 of its input files and an execution timestamp). The audit estimates in Section 5.2 are derived arithmetically from registry entries, and the arithmetic is shown in Appendix B.</w:t>
+      </w:r>
+    </w:p>
+    <w:p>
+      <w:pPr>
+        <w:pStyle w:val="Heading1"/>
+        <w:keepNext/>
+        <w:spacing w:after="120" w:before="240"/>
+      </w:pPr>
+      <w:r>
+        <w:rPr>
+          <w:rFonts w:ascii="Times New Roman" w:cs="Times New Roman" w:eastAsia="Times New Roman" w:hAnsi="Times New Roman"/>
+          <w:b/>
+          <w:bCs/>
+          <w:sz w:val="22"/>
+          <w:szCs w:val="22"/>
+        </w:rPr>
+        <w:t>Appendix B: Audit Arithmetic</w:t>
+      </w:r>
+    </w:p>
+    <w:p>
+      <w:pPr>
+        <w:spacing w:after="120" w:line="264"/>
+        <w:jc w:val="both"/>
+      </w:pPr>
+      <w:r>
+        <w:rPr>
+          <w:rFonts w:ascii="Times New Roman" w:cs="Times New Roman" w:eastAsia="Times New Roman" w:hAnsi="Times New Roman"/>
+          <w:sz w:val="20"/>
+          <w:szCs w:val="20"/>
+        </w:rPr>
+        <w:t>This appendix gives the arithmetic behind the attainable classification rate of Section 5.2.</w:t>
+      </w:r>
+    </w:p>
+    <w:p>
+      <w:pPr>
+        <w:spacing w:after="120" w:line="264"/>
+        <w:jc w:val="both"/>
+      </w:pPr>
+      <w:r>
+        <w:rPr>
+          <w:rFonts w:ascii="Times New Roman" w:cs="Times New Roman" w:eastAsia="Times New Roman" w:hAnsi="Times New Roman"/>
+          <w:sz w:val="20"/>
+          <w:szCs w:val="20"/>
+        </w:rPr>
+        <w:t>The sample proportion is 26/50 = 0.520, with a Wilson-score 95% interval of 0.385 to 0.652. Because the sample was drawn from the 383 records with a genuine narrative, the proportion is scaled by that population, not by all 456 unclassified records: 383/1,759 = 0.2177, so the estimated residual miss is 0.520 × 0.2177 = 0.1132, or 11.3 percentage points (approximately 199 DDRs). Adding this to the observed rate (1,303/1,759 = 0.7408) gives an estimated attainable classification rate of 85.4%. Propagating the Wilson interval gives 0.7408 + 0.385 × 0.2177 = 0.825 and 0.7408 + 0.652 × 0.2177 = 0.883, a 95% interval of 82.5 to 88.3%. Weighting the two strata by their population shares (296/383 and 87/383) gives a sample proportion of 0.518 and an attainable rate of 85.3%, so the result does not depend on whether the estimate is stratum-weighted.</w:t>
       </w:r>
     </w:p>
     <w:sectPr>

</xml_diff>

<commit_message>
Manuscript review round 3: Conclusions paragraph, Karnot description, F-12 wording, full example summary in Table 1, decisions 67 to 69; registry 240 entries; PDF
Co-Authored-By: Claude Sonnet 5.5 <noreply@anthropic.com>
</commit_message>
<xml_diff>
--- a/manuscript/paper2_draft.docx
+++ b/manuscript/paper2_draft.docx
@@ -209,7 +209,7 @@
           <w:sz w:val="20"/>
           <w:szCs w:val="20"/>
         </w:rPr>
-        <w:t xml:space="preserve">The nearest comparable published work is Karnot et al. (2025), which applies change-point detection, semi-supervised natural language processing, and sequence mining to root-cause analysis of non-productive time events. That study uses 701 DDRs from 10 wells and states that all analyses were conducted on synthetic datasets constructed for the study, not on an openly available field archive. It leaves quantitative performance assessment (precision, recall, or an equivalent accuracy measure) to future work.</w:t>
+        <w:t>Karnot et al. (2025) combine change-point detection, semi-supervised natural language processing and sequence mining for root-cause analysis of non-productive time, applied to 701 DDRs from 10 wells. Their Dataset section states that "all analyses used synthetic datasets constructed to emulate typical drilling records" and that "rigorous validation and quantitative performance assessment are left for future work", although their abstract and conclusions also report an average 18.5% reduction in non-productive time in field applications.</w:t>
       </w:r>
     </w:p>
     <w:p>
@@ -237,7 +237,7 @@
           <w:sz w:val="20"/>
           <w:szCs w:val="20"/>
         </w:rPr>
-        <w:t>The common limitation across the published DDR work is that it relies on proprietary or synthetic data, so its results cannot be reproduced or extended by others. The present paper differs in three respects: (1) it uses a deterministic, auditable classifier, trading model sophistication for transparency of every decision; (2) it works exclusively with a real, openly licensed archive; and (3) it pairs classification with a stratified audit of the unclassified residual using a documented sampling frame and a Wilson-score interval (Wilson 1927), and with validation of total depth and spud date against a national register for the complete wellbore population.</w:t>
+        <w:t>The common limitation across the published DDR work is that its data are proprietary or synthetic rather than an openly available archive, so its results cannot be reproduced or extended by others. The present paper differs in three respects: (1) it uses a deterministic, auditable classifier, trading model sophistication for transparency of every decision; (2) it works exclusively with a real, openly licensed archive; and (3) it pairs classification with a stratified audit of the unclassified residual using a documented sampling frame and a Wilson-score interval (Wilson 1927), and with validation of total depth and spud date against a national register for the complete wellbore population.</w:t>
       </w:r>
     </w:p>
     <w:p>
@@ -315,7 +315,7 @@
           <w:sz w:val="20"/>
           <w:szCs w:val="20"/>
         </w:rPr>
-        <w:t>Table 1 shows one report as stored in the archive, abridged: the structured fields the pipeline uses and the free-text summary that the classifier reads. The example is a real construction report whose summary contains the one-half sign. Text is quoted in fragments of at most 15 words, and "..." marks omitted text.</w:t>
+        <w:t>Table 1 shows one report as stored in the archive: the structured fields the pipeline uses and the free-text summary that the classifier reads, quoted in full. The example is a real construction report whose summary contains the one-half sign.</w:t>
       </w:r>
     </w:p>
     <w:p>
@@ -331,7 +331,7 @@
           <w:sz w:val="20"/>
           <w:szCs w:val="20"/>
         </w:rPr>
-        <w:t>Table 1: Example DDR as stored in the archive (abridged)</w:t>
+        <w:t>Table 1: Example DDR as stored in the archive</w:t>
       </w:r>
     </w:p>
     <w:tbl>
@@ -926,7 +926,7 @@
                 <w:sz w:val="18"/>
                 <w:szCs w:val="18"/>
               </w:rPr>
-              <w:t xml:space="preserve">kick-off depth field: empty in this report, and populated in only 14.10% of all reports</w:t>
+              <w:t xml:space="preserve">kick-off depth field: empty in this report, as in most reports (Table 3)</w:t>
             </w:r>
           </w:p>
         </w:tc>
@@ -1056,7 +1056,7 @@
                 <w:sz w:val="18"/>
                 <w:szCs w:val="18"/>
               </w:rPr>
-              <w:t xml:space="preserve">forecast24hr</w:t>
+              <w:t xml:space="preserve">forecast24hr (abridged)</w:t>
             </w:r>
           </w:p>
         </w:tc>
@@ -1151,7 +1151,7 @@
                 <w:sz w:val="18"/>
                 <w:szCs w:val="18"/>
               </w:rPr>
-              <w:t xml:space="preserve">sum24Hr (abridged)</w:t>
+              <w:t xml:space="preserve">sum24Hr</w:t>
             </w:r>
           </w:p>
         </w:tc>
@@ -1181,7 +1181,7 @@
                 <w:sz w:val="18"/>
                 <w:szCs w:val="18"/>
               </w:rPr>
-              <w:t xml:space="preserve">Drilled 17 1/2" section from 1101 m to 1415 m MD. Circulated well clean. ... POOH with 17½" BHA. Had tight spot at 1123 m, rotated through. ... Tight spots at 796, 775, 519 and 481m, pulled through with 10-15 MT overpull.</w:t>
+              <w:t xml:space="preserve">“Drilled 17 1/2" section from 1101 m to 1415 m MD. Circulated well clean. Displaced well to 1.40 SG mud. POOH with 17½" BHA. Had tight spot at 1123 m, rotated through. Tight spots at 796, 775, 519 and 481m, pulled through with 10-15 MT overpull. Rack back BHA.”</w:t>
             </w:r>
           </w:p>
         </w:tc>
@@ -1324,7 +1324,7 @@
           <w:sz w:val="18"/>
           <w:szCs w:val="18"/>
         </w:rPr>
-        <w:t>The summary has 49 words, of which 40 are shown. Source file 15_9_F_5_2007_12_21.xml.</w:t>
+        <w:t>Source: Equinor Volve dataset (Equinor 2018), file 15_9_F_5_2007_12_21.xml. The summary of 49 words is quoted in full; the forecast is abridged. The kick-off field is empty in this report, as in most reports (Table 3).</w:t>
       </w:r>
     </w:p>
     <w:p>
@@ -13094,7 +13094,7 @@
           <w:sz w:val="20"/>
           <w:szCs w:val="20"/>
         </w:rPr>
-        <w:t>In the four error cases the structured spud_date contradicts the wellbore's own first DDR and free-text narrative by 91 to 340 days, while the first DDR, the narrative, and the NOD date agree with each other. 15/9-F-12 is the clearest example: three sources agree on 14 June 2007 and only the structured field (15 March 2007) disagrees. Two sidetracks, 15/9-F-11 A and 15/9-F-11 T2, carry a spud_date identical to their parent's, almost certainly an inherited field value rather than a spud event. 15/9-F-11 T2 is excluded from Fig. 4 because NOD does not register it separately.</w:t>
+        <w:t>In the four error cases the structured spud_date contradicts the wellbore's own first report and its narrative by 91 to 340 days, while the first report and the NOD date agree with each other. 15/9-F-12 is the clearest example: the first report (14 June 2007), which describes making up the 36 in. hole opener, and the NOD entry date agree, and only the structured field (15 March 2007) disagrees. Two sidetracks, 15/9-F-11 A and 15/9-F-11 T2, carry a spud_date identical to their parent's, almost certainly an inherited field value rather than a spud event. 15/9-F-11 T2 is excluded from Fig. 4 because NOD does not register it separately.</w:t>
       </w:r>
     </w:p>
     <w:p>
@@ -24629,6 +24629,20 @@
     </w:p>
     <w:p>
       <w:pPr>
+        <w:spacing w:after="120" w:line="264"/>
+        <w:jc w:val="both"/>
+      </w:pPr>
+      <w:r>
+        <w:rPr>
+          <w:rFonts w:ascii="Times New Roman" w:cs="Times New Roman" w:eastAsia="Times New Roman" w:hAnsi="Times New Roman"/>
+          <w:sz w:val="20"/>
+          <w:szCs w:val="20"/>
+        </w:rPr>
+        <w:t>This paper shows three things. First, a field's daily drilling reports can be turned into a construction history that is checked against the regulator's register and whose error is measured, using a method anyone can inspect and rerun. Second, the structured fields of a WITSML archive cannot be trusted on their own: spud dates, kick-off depths and placeholder values all needed the narrative or the national register to correct them, and a kick-off read naively from the narrative can pick up the start of a hole section instead of the point where the sidetrack leaves its parent (3,059 m against 1,364 m for 15/9-F-1 C). Third, the national register alone does not give a complete inventory of what was drilled: abandoned parent legs, shared upper hole and missing campaigns appear only when the reports are reconstructed. For anyone screening old wells for CO2 storage or decommissioning, the practical lesson is to reconstruct the well history from the reports before relying on either source alone.</w:t>
+      </w:r>
+    </w:p>
+    <w:p>
+      <w:pPr>
         <w:pStyle w:val="ListParagraph"/>
         <w:numPr>
           <w:ilvl w:val="0"/>
@@ -24858,7 +24872,7 @@
           <w:sz w:val="20"/>
           <w:szCs w:val="20"/>
         </w:rPr>
-        <w:t>The classifier, the extraction and analysis code, the 1,421-row timeline dataset, the audit labels (file name, wellbore, date, stratum, call and miss reason), the NOD comparison tables, the kick-off and duration tables, and a numbers registry tracing every reported figure to the script that produced it are available at https://github.com/985185/volve-well-construction-timeline. DDR narrative text is not redistributed: the Volve data are available from Equinor under the Equinor Open Data Licence (https://www.equinor.com/energy/volve-data-sharing), and the repository holds only file names, dates, depths, categories and quotes of 15 words or fewer. Comparisons with the author's earlier extraction are reported but are not needed to reproduce any figure.</w:t>
+        <w:t>The classifier, the extraction and analysis code, the 1,421-row timeline dataset, the audit labels (file name, wellbore, date, stratum, call and miss reason), the NOD comparison tables, the kick-off and duration tables, and a numbers registry tracing every reported figure to the script that produced it are available at https://github.com/985185/volve-well-construction-timeline. DDR narrative text is not redistributed: the Volve data are available from Equinor under the Equinor Open Data Licence (https://www.equinor.com/energy/volve-data-sharing), and the data files of the repository hold only file names, dates, depths, categories and quotes of 15 words or fewer. Comparisons with the author's earlier extraction are reported but are not needed to reproduce any figure.</w:t>
       </w:r>
     </w:p>
     <w:p>
@@ -25544,7 +25558,7 @@
           <w:sz w:val="20"/>
           <w:szCs w:val="20"/>
         </w:rPr>
-        <w:t>Every quantitative figure in this paper traces to an entry in the numbers registry published in the repository (239 entries, each with the producing script and function, the SHA-256 of its input files and an execution timestamp). The audit estimates in Section 5.2 are derived arithmetically from registry entries, and the arithmetic is shown in Appendix B.</w:t>
+        <w:t>Every quantitative figure in this paper traces to an entry in the numbers registry published in the repository (240 entries, each with the producing script and function, the SHA-256 of its input files and an execution timestamp). The audit estimates in Section 5.2 are derived arithmetically from registry entries, and the arithmetic is shown in Appendix B.</w:t>
       </w:r>
     </w:p>
     <w:p>

</xml_diff>

<commit_message>
Final review fixes and reference verification: earlier extraction mentioned once, Section 5.2 merged, group wording, Table 2 triggers, abbreviations, abstract closing sentence; Zhang, Hoffimann, Tunkiel, Priyadarshy, Sidahmed corrected; registry 242 entries; PDF
Co-Authored-By: Claude Sonnet 5.5 <noreply@anthropic.com>
</commit_message>
<xml_diff>
--- a/manuscript/paper2_draft.docx
+++ b/manuscript/paper2_draft.docx
@@ -133,7 +133,7 @@
           <w:sz w:val="20"/>
           <w:szCs w:val="20"/>
         </w:rPr>
-        <w:t>Sidetrack kick-off depths were recovered for all 15 sidetracks by one rule; where NOD records a kick-off point (12 of 15), the recovered depth agrees within 10 m for 10. The output is an open depth-time-phase dataset of 1,421 records, with per-wellbore durations to total depth, published with the classifier code. It supports days-versus-depth benchmarking and records-based screening of legacy wellbores, and the method transfers to other WITSML 1.4-series drillReport archives.</w:t>
+        <w:t>Sidetrack kick-off depths were recovered for all 15 sidetracks by one rule; where NOD records a kick-off point (12 of 15), the recovered depth agrees within 10 m for 10. The output is an open depth-time-phase dataset of 1,421 records, with per-wellbore durations to total depth, published with the classifier code. It supports days-versus-depth benchmarking and records-based screening of legacy wellbores, and the method transfers to other WITSML 1.4-series drillReport archives. The results show that neither the structured fields nor the national register alone gives a complete well history; the narrative reports are needed to correct both.</w:t>
       </w:r>
     </w:p>
     <w:p>
@@ -195,7 +195,7 @@
           <w:sz w:val="20"/>
           <w:szCs w:val="20"/>
         </w:rPr>
-        <w:t>Several studies have extracted structured information from the free text of drilling reports. Sidahmed et al. (2015) mined free-text reports from three wells, building a dictionary of rig terms and acronyms with drilling experts and tracking weighted term frequencies over time to flag recurring operational concerns. Priyadarshy et al. (2017) presented a framework for predicting non-productive time causes from unstructured reports. Hoffimann et al. (2017) applied deep natural language processing to classify sentences in drilling reports from hundreds of wells in a single field as events, symptoms, or actions, and noted the difficulty created by technical symbols, abbreviations, misspellings, and incomplete sentences. Zhang et al. (2022) compared keyword-based and embedding-based methods for detecting operational events in drilling remarks and found that accuracy varied across report formats.</w:t>
+        <w:t>Several studies have extracted structured information from the free text of drilling reports. Sidahmed et al. (2015) mined free-text reports from three wells, building a dictionary of rig terms and acronyms with drilling experts and tracking weighted term frequencies over time to flag recurring operational concerns. Priyadarshy et al. (2017) presented a framework for predicting non-productive time causes from unstructured reports. Hoffimann et al. (2018) applied deep natural language processing to classify sentences in 9,670 daily reports from a field of 303 wells as events, symptoms, or actions, and noted the difficulty created by technical symbols, abbreviations, misspellings, and incomplete sentences. Zhang et al. (2022) built a rule-based detector for five unscheduled events (stuck pipe, lost circulation, water influx, gas influx and H2S) in about 128,000 free-text remarks from daily mud reports; the rule-based model was precise but missed events, with accuracy falling to 65.18% on a larger test set, and a hybrid that used its output to train a weakly supervised deep learning model improved detection by more than 20 percentage points.</w:t>
       </w:r>
     </w:p>
     <w:p>
@@ -223,7 +223,7 @@
           <w:sz w:val="20"/>
           <w:szCs w:val="20"/>
         </w:rPr>
-        <w:t xml:space="preserve">The Volve dataset itself is an established benchmark for drilling analytics. Tunkiel et al. (2020), for example, derived a reference dataset for rate-of-penetration benchmarking from Volve's drilling data. Commercial analyses of Volve DDRs for subsets of wells have been described informally, but to the author's knowledge no study has published a validated, field-wide construction timeline from the Volve DDR narratives.</w:t>
+        <w:t>The Volve dataset itself is an established benchmark for drilling analytics. Tunkiel et al. (2021), for example, derived a reference dataset for rate-of-penetration benchmarking from Volve's drilling data. Commercial analyses of Volve DDRs for subsets of wells have been described informally, but to the author's knowledge no study has published a validated, field-wide construction timeline from the Volve DDR narratives.</w:t>
       </w:r>
     </w:p>
     <w:p>
@@ -237,7 +237,7 @@
           <w:sz w:val="20"/>
           <w:szCs w:val="20"/>
         </w:rPr>
-        <w:t>The common limitation across the published DDR work is that its data are proprietary or synthetic rather than an openly available archive, so its results cannot be reproduced or extended by others. The present paper differs in three respects: (1) it uses a deterministic, auditable classifier, trading model sophistication for transparency of every decision; (2) it works exclusively with a real, openly licensed archive; and (3) it pairs classification with a stratified audit of the unclassified residual using a documented sampling frame and a Wilson-score interval (Wilson 1927), and with validation of total depth and spud date against a national register for the complete wellbore population.</w:t>
+        <w:t>The common limitation across the published DDR work is that its data are proprietary or synthetic rather than an openly available archive, so its results cannot be reproduced or extended by others. The present paper differs in three respects: (1) it uses a deterministic, auditable classifier, trading model sophistication for transparency of every decision; (2) it works exclusively with a real, openly licensed archive; and (3) it pairs classification with a stratified audit of the unclassified residual using a documented sampling frame and a Wilson-score interval (Wilson 1927), and with validation of total depth and spud date against a national register for the complete wellbore population. The audit in this paper measures the same weakness of rule-based classification, the events it misses, directly on the unclassified residual.</w:t>
       </w:r>
     </w:p>
     <w:p>
@@ -1306,7 +1306,7 @@
                 <w:sz w:val="18"/>
                 <w:szCs w:val="18"/>
               </w:rPr>
-              <w:t xml:space="preserve">the classifier's result: the 17 1/2 in. section matches the Intermediate drilling patterns, in either spelling of the size</w:t>
+              <w:t xml:space="preserve">the classifier's result: the 17½ in. section matches the Intermediate drilling patterns, in either spelling of the size</w:t>
             </w:r>
           </w:p>
         </w:tc>
@@ -1390,7 +1390,7 @@
           <w:sz w:val="20"/>
           <w:szCs w:val="20"/>
         </w:rPr>
-        <w:t>Each DDR's sum24Hr narrative is classified into one of 13 phases: Spud/Conductor, Surface hole and casing, Intermediate drilling, Intermediate casing, 12¼ in. and smaller hole, Liner/Casing run, Cementing, Completion, P&amp;A, Logging/Testing, Workover, Waiting/Downtime, and Rig move/Setup. A narrative that matches no pattern is left Unclassified. Each phase carries a fixed priority from 1 (highest) to 13 (lowest) and a set of case-insensitive regular expressions, and a DDR is assigned to the highest-priority phase with any matching pattern. Before matching, fraction characters such as ½ and ¼, routine in the mixed units of drilling reports, are stored as single special characters that a pattern written as "1/2" does not match, so they are converted first. The priority order is the order listed above. Hole and casing size separate the drilling phases: 36 in. hole and 30 in. conductor (Spud/Conductor), 26 in. hole and 20 in. casing (Surface hole and casing), 17½ in. hole (Intermediate drilling), 13⅜, 10¾ and 14 in. casing (Intermediate casing), 12¼, 8½ and 6 in. hole and coring (12¼ in. and smaller hole), and 9⅝ and 7 in. liner or casing (Liner/Casing run); the remaining phases are matched on keywords alone. Phase names describe the hole and casing sizes each pattern group matches; on Volve platform wells the 12¼ in. hole is usually the section above the reservoir. Every regular expression is listed in the repository file src/classifier_v3.py.</w:t>
+        <w:t>Each DDR's sum24Hr narrative is classified into one of 13 phases: Spud/Conductor, Surface hole and casing, Intermediate drilling, Intermediate casing, 12¼ in. and smaller hole, Liner/Casing run, Cementing, Completion, P&amp;A, Logging/Testing, Workover, Waiting/Downtime, and Rig move/Setup. A narrative that matches no pattern is left Unclassified. Each phase carries a fixed priority from 1 (highest) to 13 (lowest) and a set of case-insensitive regular expressions, and a DDR is assigned to the highest-priority phase with any matching pattern. Fraction characters such as ½ and ¼, routine in the mixed units of drilling reports, are stored as single special characters that a pattern written as "1/2" does not match, so they are converted to that form before matching. The priority order is the order listed above. Phase names describe the hole and casing sizes each pattern group matches; on Volve platform wells the 12¼ in. hole is usually the section above the reservoir. Every regular expression is listed in the repository file src/classifier_v3.py.</w:t>
       </w:r>
     </w:p>
     <w:p>
@@ -1699,7 +1699,7 @@
                 <w:sz w:val="18"/>
                 <w:szCs w:val="18"/>
               </w:rPr>
-              <w:t xml:space="preserve">spud, tagged sea bt</w:t>
+              <w:t xml:space="preserve">spud, tagged sea bottom</w:t>
             </w:r>
           </w:p>
         </w:tc>
@@ -1824,7 +1824,7 @@
                 <w:sz w:val="18"/>
                 <w:szCs w:val="18"/>
               </w:rPr>
-              <w:t xml:space="preserve">none</w:t>
+              <w:t xml:space="preserve">(size only)</w:t>
             </w:r>
           </w:p>
         </w:tc>
@@ -1919,7 +1919,7 @@
                 <w:sz w:val="18"/>
                 <w:szCs w:val="18"/>
               </w:rPr>
-              <w:t xml:space="preserve">17 1/2</w:t>
+              <w:t xml:space="preserve">17½</w:t>
             </w:r>
           </w:p>
         </w:tc>
@@ -1949,7 +1949,7 @@
                 <w:sz w:val="18"/>
                 <w:szCs w:val="18"/>
               </w:rPr>
-              <w:t xml:space="preserve">none</w:t>
+              <w:t xml:space="preserve">(size only)</w:t>
             </w:r>
           </w:p>
         </w:tc>
@@ -2044,7 +2044,7 @@
                 <w:sz w:val="18"/>
                 <w:szCs w:val="18"/>
               </w:rPr>
-              <w:t xml:space="preserve">13 3/8, 10 3/4, 14</w:t>
+              <w:t xml:space="preserve">13⅜, 10¾, 14</w:t>
             </w:r>
           </w:p>
         </w:tc>
@@ -2074,7 +2074,7 @@
                 <w:sz w:val="18"/>
                 <w:szCs w:val="18"/>
               </w:rPr>
-              <w:t xml:space="preserve">none</w:t>
+              <w:t xml:space="preserve">(size only)</w:t>
             </w:r>
           </w:p>
         </w:tc>
@@ -2169,7 +2169,7 @@
                 <w:sz w:val="18"/>
                 <w:szCs w:val="18"/>
               </w:rPr>
-              <w:t xml:space="preserve">12 1/4, 8 1/2, 6</w:t>
+              <w:t xml:space="preserve">12¼, 8½, 6</w:t>
             </w:r>
           </w:p>
         </w:tc>
@@ -2294,7 +2294,7 @@
                 <w:sz w:val="18"/>
                 <w:szCs w:val="18"/>
               </w:rPr>
-              <w:t xml:space="preserve">9 5/8, 7</w:t>
+              <w:t xml:space="preserve">9⅝, 7</w:t>
             </w:r>
           </w:p>
         </w:tc>
@@ -4882,7 +4882,7 @@
           <w:sz w:val="20"/>
           <w:szCs w:val="20"/>
         </w:rPr>
-        <w:t>A character-level survey of sum24Hr found two non-ASCII characters relevant to classification: the fraction character one-half (½) in 61 DDRs (82 occurrences) and one-quarter (¼) in 10 DDRs (14 occurrences). Both are normalised before pattern matching. One further anomaly is a single record for 15/9-19 A dated 1 January 1980 (filename 15_9_19_A_1980_01_01.xml, narrative "None", no measured depth), 17.6 years before that wellbore's first genuine report on 25 July 1997. It is a date sentinel, not a drilling report. The raw files declare the ISO-8859-1 character encoding; reading them correctly repaired an encoding error that affected 103 narratives in the earlier extraction (for example, the earlier table held 'due to double 3 Â½" DP' where the raw file reads 'due to double 3 ½" DP'), which changes no phase.</w:t>
+        <w:t>A character-level survey of sum24Hr found two non-ASCII characters relevant to classification: the fraction character one-half (½) in 61 DDRs (82 occurrences) and one-quarter (¼) in 10 DDRs (14 occurrences). Both are normalised before pattern matching. One further anomaly is a single record for 15/9-19 A dated 1 January 1980 (filename 15_9_19_A_1980_01_01.xml, narrative "None", no measured depth), 17.6 years before that wellbore's first genuine report on 25 July 1997. It is a date sentinel, not a drilling report. The raw files declare the ISO-8859-1 character encoding; reading them with the wrong encoding turns ½ into Â½ (for example 'due to double 3 Â½" DP' instead of 'due to double 3 ½" DP'), so the encoding must be set explicitly.</w:t>
       </w:r>
     </w:p>
     <w:p>
@@ -4932,7 +4932,7 @@
           <w:sz w:val="20"/>
           <w:szCs w:val="20"/>
         </w:rPr>
-        <w:t>Applying the classifier to all 1,759 DDRs classifies 1,303 records (74.1%) and leaves 456 unclassified (25.9%); 1,303 + 456 = 1,759. The ported classifier was first checked against the earlier extraction: on the narratives of the earlier table it reproduced the 1,303 classified records, every per-phase count, and the earlier phase label of all 1,759 records. Applied to narratives read directly from the raw XML it gave the same phase counts, and the 103 narratives whose encoding was repaired (Section 4) changed no phase. Table 4 gives the phase distribution, and Fig. 1 shows the classified phases on depth-versus-time curves for four representative wellbores.</w:t>
+        <w:t>Applying the classifier to all 1,759 DDRs classifies 1,303 records (74.1%) and leaves 456 unclassified (25.9%); 1,303 + 456 = 1,759. The classifier was also checked against an independent earlier extraction of the same archive by the author, with identical results for all 1,759 reports. Table 4 gives the phase distribution, and Fig. 1 shows the classified phases on depth-versus-time curves for four representative wellbores.</w:t>
       </w:r>
     </w:p>
     <w:p>
@@ -6639,7 +6639,7 @@
           <w:sz w:val="20"/>
           <w:szCs w:val="20"/>
         </w:rPr>
-        <w:t>Of the 50 sampled records, 26 (52%) were labelled CONSTRUCTION and 24 (48%) NON_CONSTRUCTION. The construction-era sample (39 records) split 23 construction to 16 non-construction, and the production-era sample (11 records) split 3 to 8. The 26 misses fall into three groups: NO_HOLE_SIZE, genuine drilling reported without a hole-size dimension (9); OTHER_MISS, operations such as hydraulic fracturing or fishing with no corresponding pattern (10); and NONSTANDARD_TERMINOLOGY, abbreviations such as "CMT" for cement (7); 9 + 10 + 7 = 26.</w:t>
+        <w:t>Of the 50 sampled reports, 26 (52%) were labelled construction and 24 (48%) non-construction. The construction group (39 reports) split 23 construction to 16 non-construction, and the production group (11 reports) split 3 to 8. The 26 construction reports that the classifier missed fall into three kinds: genuine drilling reported without a hole size (9); other operations, such as hydraulic fracturing or fishing, with no corresponding pattern (10); and non-standard terms, such as "CMT" for cement (7); 9 + 10 + 7 = 26. Scaled to the 383-report frame, this is about 199 reports, so a complete pattern set would classify about 85.4% of the 1,759 reports (95% confidence interval 82.5 to 88.3%). The arithmetic, including the stratum-weighted check, is in Appendix B.</w:t>
       </w:r>
     </w:p>
     <w:p>
@@ -6653,21 +6653,7 @@
           <w:sz w:val="20"/>
           <w:szCs w:val="20"/>
         </w:rPr>
-        <w:t>26 of the 50 sampled reports (52%) were construction work. Scaled to the 383-report frame this is about 199 reports, so a complete pattern set would classify about 85.4% of the 1,759 reports (95% confidence interval 82.5 to 88.3%). The arithmetic, including the stratum-weighted check, is in Appendix B.</w:t>
-      </w:r>
-    </w:p>
-    <w:p>
-      <w:pPr>
-        <w:spacing w:after="120" w:line="264"/>
-        <w:jc w:val="both"/>
-      </w:pPr>
-      <w:r>
-        <w:rPr>
-          <w:rFonts w:ascii="Times New Roman" w:cs="Times New Roman" w:eastAsia="Times New Roman" w:hAnsi="Times New Roman"/>
-          <w:sz w:val="20"/>
-          <w:szCs w:val="20"/>
-        </w:rPr>
-        <w:t xml:space="preserve">The 73 EMPTY_RECORD DDRs are excluded from the attainable rate because no text method can classify them. Even a perfect pattern set would therefore leave at least 4.2% of DDRs (73/1,759) unclassified.</w:t>
+        <w:t>The 73 DDRs whose narrative is the literal string "None" are excluded from the attainable rate because no text method can classify them. Even a perfect pattern set would therefore leave at least 4.2% of DDRs (73/1,759) unclassified.</w:t>
       </w:r>
     </w:p>
     <w:p>
@@ -6700,7 +6686,7 @@
           <w:sz w:val="20"/>
           <w:szCs w:val="20"/>
         </w:rPr>
-        <w:t>The timeline dataset contains one row per DDR with a genuine md_m value. Of 1,759 DDRs, 331 carry the sentinel and 7 the zero value, giving 1,759 − 331 − 7 = 1,421 rows; recomputing the dataset from the raw XML gave the same 1,421 rows as the earlier analysis, identical in every column. Each row carries wellbore identifier, report date, days from the wellbore's first report with a recorded depth, measured depth, assigned phase, and source filename. Days are therefore counted from each wellbore's first row with a usable depth, not from its first DDR. Fig. 2 plots report number against measured depth for all 26 wellbores. The report number counts every DDR of a wellbore from its first report (1980 sentinel excluded), with or without a recorded depth, so it is the same count as the reports to TD of Table 8; only reports with a valid depth are plotted. The days_from_first_ddr column of the dataset is unchanged from the earlier analysis.</w:t>
+        <w:t>The timeline dataset contains one row per DDR with a genuine md_m value. Of 1,759 DDRs, 331 carry the sentinel and 7 the zero value, giving 1,759 − 331 − 7 = 1,421 rows. Each row carries wellbore identifier, report date, days from the wellbore's first report with a recorded depth, measured depth, assigned phase, and source filename. Days are therefore counted from each wellbore's first row with a usable depth, not from its first DDR. Fig. 2 plots report number against measured depth for all 26 wellbores. The report number counts every DDR of a wellbore from its first report (1980 sentinel excluded), with or without a recorded depth, so it is the same count as the reports to TD of Table 8; only reports with a valid depth are plotted.</w:t>
       </w:r>
     </w:p>
     <w:p>
@@ -13141,7 +13127,7 @@
           <w:sz w:val="20"/>
           <w:szCs w:val="20"/>
         </w:rPr>
-        <w:t>Because the structured kick-off field is sparse, kick-off depth was recovered from the DDRs. The kick-off depth of a sidetrack is the depth at which it leaves its parent wellbore. Kick-off here means the depth at which a sidetrack departs its parent wellbore, not the depth at which an original wellbore begins to build angle; the structured kick-off field of 15/9-19 S (562 m in all its reports) is consistent with the latter and is not used. It was read from the parent's last and the sidetrack's first reports by one rule applied to all sidetracks: the depth at which the narrative first reports new formation or departure from the parent hole; where none is stated, the depth at which the kick-off or window is started (for casing exits by a milled window, the top of the window); and where the narrative is empty, the measured depth at the parent-to-child transition.</w:t>
+        <w:t>Because the structured kick-off field is sparse, kick-off depth was recovered from the DDRs. Kick-off here means the depth at which a sidetrack departs its parent wellbore, not the depth at which an original wellbore begins to build angle; the structured kick-off field of 15/9-19 S (562 m in all its reports) is consistent with the latter and is not used. The kick-off depth was read from the parent's last and the sidetrack's first reports by one rule applied to all sidetracks: the depth at which the narrative first reports new formation or departure from the parent hole; where none is stated, the depth at which the kick-off or window is started (for casing exits by a milled window, the top of the window); and where the narrative is empty, the measured depth at the parent-to-child transition.</w:t>
       </w:r>
     </w:p>
     <w:p>
@@ -13155,7 +13141,7 @@
           <w:sz w:val="20"/>
           <w:szCs w:val="20"/>
         </w:rPr>
-        <w:t>All 15 sidetracks by designation (15/9-19 A, 19 B, 19 BT2 and 19 ST2, F-1 A, F-1 B and F-1 C, F-9 A, F-11 A, F-11 B and F-11 T2, and F-15 A to F-15 D) yielded a kick-off depth (Table 7). For 11 the depth is written in the narrative; for 3 (15/9-F-1 A, F-1 B and F-15 D) the narrative names the kick-off event but not the depth, which is taken from the measured depth of the same report; for 1 (15/9-19 ST2) both reports at the transition are empty and the depth is the measured depth there, the weakest case. For 15/9-F-1 C the last F-1 B report of 22 February 2014 reads "Commenced time drilling to1364 m. 50% formation obtained at 1364 m.", and the first F-1 C report drills 17 1/2 in. hole from that depth, so the kick-off is 1,364 m. The depth of 3,059 m that the narratives report on 13 March 2014 is the start of the 8 1/2 in. section, after casing was run, not the kick-off. 15/9-19 A is a sidetrack whose kick-off is the top of a milled window at 2,178 m (window milled from 2,178 to 2,183 m), a depth that NOD also records.</w:t>
+        <w:t>All 15 sidetracks by designation (15/9-19 A, 19 B, 19 BT2 and 19 ST2, F-1 A, F-1 B and F-1 C, F-9 A, F-11 A, F-11 B and F-11 T2, and F-15 A to F-15 D) yielded a kick-off depth (Table 7). For 11 the depth is written in the narrative; for 3 (15/9-F-1 A, F-1 B and F-15 D) the narrative names the kick-off event but not the depth, which is taken from the measured depth of the same report; for 1 (15/9-19 ST2) both reports at the transition are empty and the depth is the measured depth there, the weakest case. For 15/9-F-1 C the last F-1 B report of 22 February 2014 reads "Commenced time drilling to1364 m. 50% formation obtained at 1364 m.", and the first F-1 C report drills 17½ in. hole from that depth, so the kick-off is 1,364 m. The depth of 3,059 m that the narratives report on 13 March 2014 is the start of the 8½ in. section, after casing was run, not the kick-off. 15/9-19 A is a sidetrack whose kick-off is the top of a milled window at 2,178 m (window milled from 2,178 to 2,183 m), a depth that NOD also records.</w:t>
       </w:r>
     </w:p>
     <w:p>
@@ -16670,7 +16656,7 @@
           <w:sz w:val="18"/>
           <w:szCs w:val="18"/>
         </w:rPr>
-        <w:t>Depths are m MD. NOD minus DDR is NOD's wlbKickOffPoint minus the recovered depth; blank where NOD has no value. 15/9-19 A: NOD lists 15/9-19 S as its parent wellbore. 15/9-19 S exists as a WITSML wellbore (reports of 1992), but the NOD record that ends on the day 15/9-19 A was entered (15/9-19 SR2, 18 to 25 July 1997) has no WITSML wellbore, so no WITSML parent report precedes the 15/9-19 A reports and its kick-off depth is read from those reports.</w:t>
+        <w:t>Depths are m MD. NOD minus DDR is NOD's wlbKickOffPoint minus the recovered depth; blank where NOD has no value. NOD lists 15/9-19 S as the parent; the re-entry from which 15/9-19 A was drilled (NOD 15/9-19 SR2, 1997) has no WITSML reports, so the kick-off is read from the 15/9-19 A reports.</w:t>
       </w:r>
     </w:p>
     <w:p>
@@ -24537,7 +24523,7 @@
           <w:sz w:val="20"/>
           <w:szCs w:val="20"/>
         </w:rPr>
-        <w:t>The audit labelled construction content only. Unclassified records describing operations that belong to non-construction phases in the classifier (for example waiting or rig moves) were labelled NON_CONSTRUCTION, so the attainable rate is conservative with respect to those phases. The sample of 50 was labelled by a single reviewer, the author, and no inter-rater agreement was measured. The interval of 82.5 to 88.3% reflects the modest sample size.</w:t>
+        <w:t>The audit labelled construction content only. Unclassified records describing operations that belong to non-construction phases in the classifier (for example waiting or rig moves) were labelled non-construction, so the attainable rate is conservative with respect to those phases. The sample of 50 was labelled by a single reviewer, the author, and no inter-rater agreement was measured. The interval of 82.5 to 88.3% reflects the modest sample size.</w:t>
       </w:r>
     </w:p>
     <w:p>
@@ -24551,7 +24537,7 @@
           <w:sz w:val="20"/>
           <w:szCs w:val="20"/>
         </w:rPr>
-        <w:t>Two records were assigned to a stratum that does not reflect their operational context, although both were labelled correctly on content. The 1980 date sentinel for 15/9-19 A places that wellbore's 1997 drilling in the production-era stratum, and 15/9-F-1's 2013 drilling campaign reports also fall into the production-era stratum.</w:t>
+        <w:t>Two records were assigned to a group that does not reflect their operational context, although both were labelled correctly on content. The 1980 date sentinel for 15/9-19 A places that wellbore's 1997 drilling in the production group, and 15/9-F-1's 2013 drilling campaign reports also fall into the production group.</w:t>
       </w:r>
     </w:p>
     <w:p>
@@ -24746,7 +24732,7 @@
           <w:sz w:val="20"/>
           <w:szCs w:val="20"/>
         </w:rPr>
-        <w:t>Sidetrack kick-off depths were recovered for all 15 sidetracks by one rule; for 15/9-F-1 C the kick-off is 1,364 m, not the 3,059 m start of the 8 1/2 in. section, and the four wellbores of the 15/9-F-1 family share their hole above that depth.</w:t>
+        <w:t>Sidetrack kick-off depths were recovered for all 15 sidetracks by one rule; for 15/9-F-1 C the kick-off is 1,364 m, not the 3,059 m start of the 8½ in. section, and the four wellbores of the 15/9-F-1 family share their hole above that depth.</w:t>
       </w:r>
     </w:p>
     <w:p>
@@ -24872,7 +24858,7 @@
           <w:sz w:val="20"/>
           <w:szCs w:val="20"/>
         </w:rPr>
-        <w:t>The classifier, the extraction and analysis code, the 1,421-row timeline dataset, the audit labels (file name, wellbore, date, stratum, call and miss reason), the NOD comparison tables, the kick-off and duration tables, and a numbers registry tracing every reported figure to the script that produced it are available at https://github.com/985185/volve-well-construction-timeline. DDR narrative text is not redistributed: the Volve data are available from Equinor under the Equinor Open Data Licence (https://www.equinor.com/energy/volve-data-sharing), and the data files of the repository hold only file names, dates, depths, categories and quotes of 15 words or fewer. Comparisons with the author's earlier extraction are reported but are not needed to reproduce any figure.</w:t>
+        <w:t>The classifier, the extraction and analysis code, the 1,421-row timeline dataset, the audit labels (file name, wellbore, date, stratum, call and miss reason), the NOD comparison tables, the kick-off and duration tables, and a numbers registry tracing every reported figure to the script that produced it are available at https://github.com/985185/volve-well-construction-timeline. DDR narrative text is not redistributed: the Volve data are available from Equinor under the Equinor Open Data Licence (https://www.equinor.com/energy/volve-data-sharing), and the data files of the repository hold only file names, dates, depths, categories and quotes of 15 words or fewer. The check against the author's earlier extraction (Section 5.1) is reported but is not needed to reproduce any figure.</w:t>
       </w:r>
     </w:p>
     <w:p>
@@ -24890,6 +24876,19 @@
           <w:szCs w:val="22"/>
         </w:rPr>
         <w:t xml:space="preserve">Abbreviations</w:t>
+      </w:r>
+    </w:p>
+    <w:p>
+      <w:pPr>
+        <w:spacing w:after="40"/>
+      </w:pPr>
+      <w:r>
+        <w:rPr>
+          <w:rFonts w:ascii="Times New Roman" w:cs="Times New Roman" w:eastAsia="Times New Roman" w:hAnsi="Times New Roman"/>
+          <w:sz w:val="20"/>
+          <w:szCs w:val="20"/>
+        </w:rPr>
+        <w:t>BHA  =  bottom-hole assembly</w:t>
       </w:r>
     </w:p>
     <w:p>
@@ -24941,7 +24940,72 @@
           <w:sz w:val="20"/>
           <w:szCs w:val="20"/>
         </w:rPr>
+        <w:t>DP  =  drill pipe</w:t>
+      </w:r>
+    </w:p>
+    <w:p>
+      <w:pPr>
+        <w:spacing w:after="40"/>
+      </w:pPr>
+      <w:r>
+        <w:rPr>
+          <w:rFonts w:ascii="Times New Roman" w:cs="Times New Roman" w:eastAsia="Times New Roman" w:hAnsi="Times New Roman"/>
+          <w:sz w:val="20"/>
+          <w:szCs w:val="20"/>
+        </w:rPr>
+        <w:t>EZSV  =  EZ Drill squeeze valve (cement retainer)</w:t>
+      </w:r>
+    </w:p>
+    <w:p>
+      <w:pPr>
+        <w:spacing w:after="40"/>
+      </w:pPr>
+      <w:r>
+        <w:rPr>
+          <w:rFonts w:ascii="Times New Roman" w:cs="Times New Roman" w:eastAsia="Times New Roman" w:hAnsi="Times New Roman"/>
+          <w:sz w:val="20"/>
+          <w:szCs w:val="20"/>
+        </w:rPr>
+        <w:t>LWD  =  logging while drilling</w:t>
+      </w:r>
+    </w:p>
+    <w:p>
+      <w:pPr>
+        <w:spacing w:after="40"/>
+      </w:pPr>
+      <w:r>
+        <w:rPr>
+          <w:rFonts w:ascii="Times New Roman" w:cs="Times New Roman" w:eastAsia="Times New Roman" w:hAnsi="Times New Roman"/>
+          <w:sz w:val="20"/>
+          <w:szCs w:val="20"/>
+        </w:rPr>
         <w:t xml:space="preserve">MD  =  measured depth</w:t>
+      </w:r>
+    </w:p>
+    <w:p>
+      <w:pPr>
+        <w:spacing w:after="40"/>
+      </w:pPr>
+      <w:r>
+        <w:rPr>
+          <w:rFonts w:ascii="Times New Roman" w:cs="Times New Roman" w:eastAsia="Times New Roman" w:hAnsi="Times New Roman"/>
+          <w:sz w:val="20"/>
+          <w:szCs w:val="20"/>
+        </w:rPr>
+        <w:t>MT  =  metric tonnes</w:t>
+      </w:r>
+    </w:p>
+    <w:p>
+      <w:pPr>
+        <w:spacing w:after="40"/>
+      </w:pPr>
+      <w:r>
+        <w:rPr>
+          <w:rFonts w:ascii="Times New Roman" w:cs="Times New Roman" w:eastAsia="Times New Roman" w:hAnsi="Times New Roman"/>
+          <w:sz w:val="20"/>
+          <w:szCs w:val="20"/>
+        </w:rPr>
+        <w:t>MWD  =  measurement while drilling</w:t>
       </w:r>
     </w:p>
     <w:p>
@@ -24980,7 +25044,33 @@
           <w:sz w:val="20"/>
           <w:szCs w:val="20"/>
         </w:rPr>
+        <w:t>POOH  =  pull out of hole</w:t>
+      </w:r>
+    </w:p>
+    <w:p>
+      <w:pPr>
+        <w:spacing w:after="40"/>
+      </w:pPr>
+      <w:r>
+        <w:rPr>
+          <w:rFonts w:ascii="Times New Roman" w:cs="Times New Roman" w:eastAsia="Times New Roman" w:hAnsi="Times New Roman"/>
+          <w:sz w:val="20"/>
+          <w:szCs w:val="20"/>
+        </w:rPr>
         <w:t xml:space="preserve">RKB  =  rotary kelly bushing</w:t>
+      </w:r>
+    </w:p>
+    <w:p>
+      <w:pPr>
+        <w:spacing w:after="40"/>
+      </w:pPr>
+      <w:r>
+        <w:rPr>
+          <w:rFonts w:ascii="Times New Roman" w:cs="Times New Roman" w:eastAsia="Times New Roman" w:hAnsi="Times New Roman"/>
+          <w:sz w:val="20"/>
+          <w:szCs w:val="20"/>
+        </w:rPr>
+        <w:t>SG  =  specific gravity</w:t>
       </w:r>
     </w:p>
     <w:p>
@@ -25019,7 +25109,33 @@
           <w:sz w:val="20"/>
           <w:szCs w:val="20"/>
         </w:rPr>
+        <w:t>VSP  =  vertical seismic profile</w:t>
+      </w:r>
+    </w:p>
+    <w:p>
+      <w:pPr>
+        <w:spacing w:after="40"/>
+      </w:pPr>
+      <w:r>
+        <w:rPr>
+          <w:rFonts w:ascii="Times New Roman" w:cs="Times New Roman" w:eastAsia="Times New Roman" w:hAnsi="Times New Roman"/>
+          <w:sz w:val="20"/>
+          <w:szCs w:val="20"/>
+        </w:rPr>
         <w:t xml:space="preserve">WITSML  =  Wellsite Information Transfer Standard Markup Language</w:t>
+      </w:r>
+    </w:p>
+    <w:p>
+      <w:pPr>
+        <w:spacing w:after="40"/>
+      </w:pPr>
+      <w:r>
+        <w:rPr>
+          <w:rFonts w:ascii="Times New Roman" w:cs="Times New Roman" w:eastAsia="Times New Roman" w:hAnsi="Times New Roman"/>
+          <w:sz w:val="20"/>
+          <w:szCs w:val="20"/>
+        </w:rPr>
+        <w:t>WOW  =  waiting on weather</w:t>
       </w:r>
     </w:p>
     <w:p>
@@ -25096,7 +25212,7 @@
           <w:sz w:val="20"/>
           <w:szCs w:val="20"/>
         </w:rPr>
-        <w:t xml:space="preserve">Hoffimann, J., Mao, Y., Wesley, A., and Taylor, A. 2017. Sequence Mining and Pattern Analysis in Drilling Reports with Deep Natural Language Processing. arXiv:1712.01476. https://doi.org/10.48550/arXiv.1712.01476.</w:t>
+        <w:t>Hoffimann, J., Mao, Y., Wesley, A., and Taylor, A. 2018. Sequence Mining and Pattern Analysis in Drilling Reports with Deep Natural Language Processing. Presented at the SPE Annual Technical Conference and Exhibition, Dallas, Texas, USA, 24–26 September. SPE-191505-MS. https://doi.org/10.2118/191505-MS.</w:t>
       </w:r>
     </w:p>
     <w:p>
@@ -25194,7 +25310,7 @@
           <w:sz w:val="20"/>
           <w:szCs w:val="20"/>
         </w:rPr>
-        <w:t xml:space="preserve">Priyadarshy, S., Taylor, A., Dev, A., Venugopal, S., and Nair, G.G. 2017. Framework for Prediction of NPT Causes Using Unstructured Reports. Presented at the Offshore Technology Conference, Houston, Texas, USA. OTC-27918-MS. https://doi.org/10.4043/27918-MS.</w:t>
+        <w:t>Priyadarshy, S., Taylor, A., Dev, A., Venugopal, S., and Nair, G.G. 2017. Framework for Prediction of NPT Causes Using Unstructured Reports. Presented at the Offshore Technology Conference, Houston, Texas, USA, 1–4 May. OTC-27918-MS. https://doi.org/10.4043/27918-MS.</w:t>
       </w:r>
     </w:p>
     <w:p>
@@ -25208,7 +25324,7 @@
           <w:sz w:val="20"/>
           <w:szCs w:val="20"/>
         </w:rPr>
-        <w:t xml:space="preserve">Sidahmed, M., Coley, C.J., and Shirzadi, S. 2015. Augmenting Operations Monitoring by Mining Unstructured Drilling Reports. Presented at the SPE Digital Energy Conference and Exhibition, The Woodlands, Texas, USA. SPE-173429-MS. https://doi.org/10.2118/173429-MS. </w:t>
+        <w:t xml:space="preserve">Sidahmed, M., Coley, C.J., and Shirzadi, S. 2015. Augmenting Operations Monitoring by Mining Unstructured Drilling Reports. Presented at the SPE Digital Energy Conference and Exhibition, The Woodlands, Texas, USA, 3–5 March. SPE-173429-MS. https://doi.org/10.2118/173429-MS. </w:t>
       </w:r>
     </w:p>
     <w:p>
@@ -25222,7 +25338,7 @@
           <w:sz w:val="20"/>
           <w:szCs w:val="20"/>
         </w:rPr>
-        <w:t xml:space="preserve">Tunkiel, A.T., Sui, D., and Wiktorski, T. 2020. Reference Dataset for Rate of Penetration Benchmarking. </w:t>
+        <w:t xml:space="preserve">Tunkiel, A.T., Sui, D., and Wiktorski, T. 2021. Reference Dataset for Rate of Penetration Benchmarking. </w:t>
       </w:r>
       <w:r>
         <w:rPr>
@@ -25558,7 +25674,7 @@
           <w:sz w:val="20"/>
           <w:szCs w:val="20"/>
         </w:rPr>
-        <w:t>Every quantitative figure in this paper traces to an entry in the numbers registry published in the repository (240 entries, each with the producing script and function, the SHA-256 of its input files and an execution timestamp). The audit estimates in Section 5.2 are derived arithmetically from registry entries, and the arithmetic is shown in Appendix B.</w:t>
+        <w:t>Every quantitative figure in this paper traces to an entry in the numbers registry published in the repository (242 entries, each with the producing script and function, the SHA-256 of its input files and an execution timestamp). The audit estimates in Section 5.2 are derived arithmetically from registry entries, and the arithmetic is shown in Appendix B.</w:t>
       </w:r>
     </w:p>
     <w:p>

</xml_diff>

<commit_message>
EZSV expansion; plain category names in Section 3.4; decision 75; PDF
Co-Authored-By: Claude Sonnet 5.5 <noreply@anthropic.com>
</commit_message>
<xml_diff>
--- a/manuscript/paper2_draft.docx
+++ b/manuscript/paper2_draft.docx
@@ -3250,7 +3250,7 @@
           <w:sz w:val="20"/>
           <w:szCs w:val="20"/>
         </w:rPr>
-        <w:t>The audit estimates how many unclassified DDRs describe construction operations the pattern set failed to catch. First, a leak check reapplied the complete pattern set to every unclassified record to confirm that no pipeline error had mislabelled a record that should have matched; none had. Second, every unclassified record was assigned to one of eleven descriptive categories (for example BOP_RISER, GENERIC_TRIP, PRODUCTION_MON, and EMPTY_RECORD) using patterns built from direct inspection of the unclassified population. The largest category is BOP and marine riser handling (147 of 456 records, 32.2%). The 73 records in EMPTY_RECORD have a sum24Hr field containing the literal string "None" (Section 4) and cannot be classified by any text method, so they were excluded from the sampling frame, leaving 383 records.</w:t>
+        <w:t>The audit estimates how many unclassified DDRs describe construction operations the pattern set failed to catch. First, a leak check reapplied the complete pattern set to every unclassified record to confirm that no pipeline error had mislabelled a record that should have matched; none had. Second, every unclassified record was assigned to one of eleven descriptive categories (for example BOP and riser handling, generic trips, production monitoring, and empty records) using patterns built from direct inspection of the unclassified population. The largest category is BOP and marine riser handling (147 of 456 records, 32.2%). The 73 empty records have a sum24Hr field containing the literal string "None" (Section 4) and cannot be classified by any text method, so they were excluded from the sampling frame, leaving 383 records.</w:t>
       </w:r>
     </w:p>
     <w:p>
@@ -24953,7 +24953,7 @@
           <w:sz w:val="20"/>
           <w:szCs w:val="20"/>
         </w:rPr>
-        <w:t>EZSV  =  EZ Drill squeeze valve (cement retainer)</w:t>
+        <w:t>EZSV  =  drillable cement retainer or bridge plug (Halliburton trade name)</w:t>
       </w:r>
     </w:p>
     <w:p>

</xml_diff>